<commit_message>
Manual rev. 1.2 e informe final con el dashboard rediseñado
- Manual de usuario: capturas nuevas con recortes y globos medidos sobre la pagina, seccion
  3.3 de tema oscuro, y textos al dia (medidor, Ampliar, variables de la leyenda, franja con
  precio y accion, filtro Mostrar, nuevas filas de simbolos y de solucion de problemas).
- Informe final: descripcion del dashboard rediseñado y Figuras 4 a 6 con la vista del 16-oct.
- README: entrada de la bitacora.

Co-Authored-By: Claude Opus 5.5 <noreply@anthropic.com>
</commit_message>
<xml_diff>
--- a/docs/Informe_Final_ABET_Barcelo_Dede.docx
+++ b/docs/Informe_Final_ABET_Barcelo_Dede.docx
@@ -192,8 +192,9 @@
       <w:bookmarkStart w:id="0" w:name="_Toc240440229"/>
       <w:bookmarkStart w:id="1" w:name="_Toc241072106"/>
       <w:bookmarkStart w:id="2" w:name="_Toc241072472"/>
-      <w:bookmarkStart w:id="3" w:name="_Toc242947336"/>
-      <w:r>
+      <w:bookmarkStart w:id="3" w:name="_Toc242977981"/>
+      <w:r>
+        <w:lastRenderedPageBreak/>
         <w:t>Tabla de contenido</w:t>
       </w:r>
       <w:bookmarkEnd w:id="0"/>
@@ -227,7 +228,7 @@
       <w:r>
         <w:fldChar w:fldCharType="separate"/>
       </w:r>
-      <w:hyperlink w:anchor="_Toc242947336" w:history="1">
+      <w:hyperlink w:anchor="_Toc242977981" w:history="1">
         <w:r>
           <w:rPr>
             <w:rStyle w:val="Hyperlink"/>
@@ -254,7 +255,7 @@
             <w:noProof/>
             <w:webHidden/>
           </w:rPr>
-          <w:instrText xml:space="preserve"> PAGEREF _Toc242947336 \h </w:instrText>
+          <w:instrText xml:space="preserve"> PAGEREF _Toc242977981 \h </w:instrText>
         </w:r>
         <w:r>
           <w:rPr>
@@ -303,7 +304,7 @@
           <w:lang w:eastAsia="es-CO"/>
         </w:rPr>
       </w:pPr>
-      <w:hyperlink w:anchor="_Toc242947337" w:history="1">
+      <w:hyperlink w:anchor="_Toc242977982" w:history="1">
         <w:r>
           <w:rPr>
             <w:rStyle w:val="Hyperlink"/>
@@ -350,7 +351,7 @@
             <w:noProof/>
             <w:webHidden/>
           </w:rPr>
-          <w:instrText xml:space="preserve"> PAGEREF _Toc242947337 \h </w:instrText>
+          <w:instrText xml:space="preserve"> PAGEREF _Toc242977982 \h </w:instrText>
         </w:r>
         <w:r>
           <w:rPr>
@@ -397,7 +398,7 @@
           <w:lang w:eastAsia="es-CO"/>
         </w:rPr>
       </w:pPr>
-      <w:hyperlink w:anchor="_Toc242947338" w:history="1">
+      <w:hyperlink w:anchor="_Toc242977983" w:history="1">
         <w:r>
           <w:rPr>
             <w:rStyle w:val="Hyperlink"/>
@@ -442,7 +443,7 @@
             <w:noProof/>
             <w:webHidden/>
           </w:rPr>
-          <w:instrText xml:space="preserve"> PAGEREF _Toc242947338 \h </w:instrText>
+          <w:instrText xml:space="preserve"> PAGEREF _Toc242977983 \h </w:instrText>
         </w:r>
         <w:r>
           <w:rPr>
@@ -489,7 +490,7 @@
           <w:lang w:eastAsia="es-CO"/>
         </w:rPr>
       </w:pPr>
-      <w:hyperlink w:anchor="_Toc242947339" w:history="1">
+      <w:hyperlink w:anchor="_Toc242977984" w:history="1">
         <w:r>
           <w:rPr>
             <w:rStyle w:val="Hyperlink"/>
@@ -534,7 +535,7 @@
             <w:noProof/>
             <w:webHidden/>
           </w:rPr>
-          <w:instrText xml:space="preserve"> PAGEREF _Toc242947339 \h </w:instrText>
+          <w:instrText xml:space="preserve"> PAGEREF _Toc242977984 \h </w:instrText>
         </w:r>
         <w:r>
           <w:rPr>
@@ -581,7 +582,7 @@
           <w:lang w:eastAsia="es-CO"/>
         </w:rPr>
       </w:pPr>
-      <w:hyperlink w:anchor="_Toc242947340" w:history="1">
+      <w:hyperlink w:anchor="_Toc242977985" w:history="1">
         <w:r>
           <w:rPr>
             <w:rStyle w:val="Hyperlink"/>
@@ -626,7 +627,7 @@
             <w:noProof/>
             <w:webHidden/>
           </w:rPr>
-          <w:instrText xml:space="preserve"> PAGEREF _Toc242947340 \h </w:instrText>
+          <w:instrText xml:space="preserve"> PAGEREF _Toc242977985 \h </w:instrText>
         </w:r>
         <w:r>
           <w:rPr>
@@ -675,7 +676,7 @@
           <w:lang w:eastAsia="es-CO"/>
         </w:rPr>
       </w:pPr>
-      <w:hyperlink w:anchor="_Toc242947341" w:history="1">
+      <w:hyperlink w:anchor="_Toc242977986" w:history="1">
         <w:r>
           <w:rPr>
             <w:rStyle w:val="Hyperlink"/>
@@ -722,7 +723,7 @@
             <w:noProof/>
             <w:webHidden/>
           </w:rPr>
-          <w:instrText xml:space="preserve"> PAGEREF _Toc242947341 \h </w:instrText>
+          <w:instrText xml:space="preserve"> PAGEREF _Toc242977986 \h </w:instrText>
         </w:r>
         <w:r>
           <w:rPr>
@@ -771,7 +772,7 @@
           <w:lang w:eastAsia="es-CO"/>
         </w:rPr>
       </w:pPr>
-      <w:hyperlink w:anchor="_Toc242947342" w:history="1">
+      <w:hyperlink w:anchor="_Toc242977987" w:history="1">
         <w:r>
           <w:rPr>
             <w:rStyle w:val="Hyperlink"/>
@@ -818,7 +819,7 @@
             <w:noProof/>
             <w:webHidden/>
           </w:rPr>
-          <w:instrText xml:space="preserve"> PAGEREF _Toc242947342 \h </w:instrText>
+          <w:instrText xml:space="preserve"> PAGEREF _Toc242977987 \h </w:instrText>
         </w:r>
         <w:r>
           <w:rPr>
@@ -865,7 +866,7 @@
           <w:lang w:eastAsia="es-CO"/>
         </w:rPr>
       </w:pPr>
-      <w:hyperlink w:anchor="_Toc242947343" w:history="1">
+      <w:hyperlink w:anchor="_Toc242977988" w:history="1">
         <w:r>
           <w:rPr>
             <w:rStyle w:val="Hyperlink"/>
@@ -910,7 +911,7 @@
             <w:noProof/>
             <w:webHidden/>
           </w:rPr>
-          <w:instrText xml:space="preserve"> PAGEREF _Toc242947343 \h </w:instrText>
+          <w:instrText xml:space="preserve"> PAGEREF _Toc242977988 \h </w:instrText>
         </w:r>
         <w:r>
           <w:rPr>
@@ -957,7 +958,7 @@
           <w:lang w:eastAsia="es-CO"/>
         </w:rPr>
       </w:pPr>
-      <w:hyperlink w:anchor="_Toc242947344" w:history="1">
+      <w:hyperlink w:anchor="_Toc242977989" w:history="1">
         <w:r>
           <w:rPr>
             <w:rStyle w:val="Hyperlink"/>
@@ -1002,7 +1003,7 @@
             <w:noProof/>
             <w:webHidden/>
           </w:rPr>
-          <w:instrText xml:space="preserve"> PAGEREF _Toc242947344 \h </w:instrText>
+          <w:instrText xml:space="preserve"> PAGEREF _Toc242977989 \h </w:instrText>
         </w:r>
         <w:r>
           <w:rPr>
@@ -1051,7 +1052,7 @@
           <w:lang w:eastAsia="es-CO"/>
         </w:rPr>
       </w:pPr>
-      <w:hyperlink w:anchor="_Toc242947345" w:history="1">
+      <w:hyperlink w:anchor="_Toc242977990" w:history="1">
         <w:r>
           <w:rPr>
             <w:rStyle w:val="Hyperlink"/>
@@ -1098,7 +1099,7 @@
             <w:noProof/>
             <w:webHidden/>
           </w:rPr>
-          <w:instrText xml:space="preserve"> PAGEREF _Toc242947345 \h </w:instrText>
+          <w:instrText xml:space="preserve"> PAGEREF _Toc242977990 \h </w:instrText>
         </w:r>
         <w:r>
           <w:rPr>
@@ -1145,7 +1146,7 @@
           <w:lang w:eastAsia="es-CO"/>
         </w:rPr>
       </w:pPr>
-      <w:hyperlink w:anchor="_Toc242947346" w:history="1">
+      <w:hyperlink w:anchor="_Toc242977991" w:history="1">
         <w:r>
           <w:rPr>
             <w:rStyle w:val="Hyperlink"/>
@@ -1190,7 +1191,7 @@
             <w:noProof/>
             <w:webHidden/>
           </w:rPr>
-          <w:instrText xml:space="preserve"> PAGEREF _Toc242947346 \h </w:instrText>
+          <w:instrText xml:space="preserve"> PAGEREF _Toc242977991 \h </w:instrText>
         </w:r>
         <w:r>
           <w:rPr>
@@ -1237,7 +1238,7 @@
           <w:lang w:eastAsia="es-CO"/>
         </w:rPr>
       </w:pPr>
-      <w:hyperlink w:anchor="_Toc242947347" w:history="1">
+      <w:hyperlink w:anchor="_Toc242977992" w:history="1">
         <w:r>
           <w:rPr>
             <w:rStyle w:val="Hyperlink"/>
@@ -1282,7 +1283,7 @@
             <w:noProof/>
             <w:webHidden/>
           </w:rPr>
-          <w:instrText xml:space="preserve"> PAGEREF _Toc242947347 \h </w:instrText>
+          <w:instrText xml:space="preserve"> PAGEREF _Toc242977992 \h </w:instrText>
         </w:r>
         <w:r>
           <w:rPr>
@@ -1329,7 +1330,7 @@
           <w:lang w:eastAsia="es-CO"/>
         </w:rPr>
       </w:pPr>
-      <w:hyperlink w:anchor="_Toc242947348" w:history="1">
+      <w:hyperlink w:anchor="_Toc242977993" w:history="1">
         <w:r>
           <w:rPr>
             <w:rStyle w:val="Hyperlink"/>
@@ -1374,7 +1375,7 @@
             <w:noProof/>
             <w:webHidden/>
           </w:rPr>
-          <w:instrText xml:space="preserve"> PAGEREF _Toc242947348 \h </w:instrText>
+          <w:instrText xml:space="preserve"> PAGEREF _Toc242977993 \h </w:instrText>
         </w:r>
         <w:r>
           <w:rPr>
@@ -1423,7 +1424,7 @@
           <w:lang w:eastAsia="es-CO"/>
         </w:rPr>
       </w:pPr>
-      <w:hyperlink w:anchor="_Toc242947349" w:history="1">
+      <w:hyperlink w:anchor="_Toc242977994" w:history="1">
         <w:r>
           <w:rPr>
             <w:rStyle w:val="Hyperlink"/>
@@ -1470,7 +1471,7 @@
             <w:noProof/>
             <w:webHidden/>
           </w:rPr>
-          <w:instrText xml:space="preserve"> PAGEREF _Toc242947349 \h </w:instrText>
+          <w:instrText xml:space="preserve"> PAGEREF _Toc242977994 \h </w:instrText>
         </w:r>
         <w:r>
           <w:rPr>
@@ -1517,7 +1518,7 @@
           <w:lang w:eastAsia="es-CO"/>
         </w:rPr>
       </w:pPr>
-      <w:hyperlink w:anchor="_Toc242947350" w:history="1">
+      <w:hyperlink w:anchor="_Toc242977995" w:history="1">
         <w:r>
           <w:rPr>
             <w:rStyle w:val="Hyperlink"/>
@@ -1562,7 +1563,7 @@
             <w:noProof/>
             <w:webHidden/>
           </w:rPr>
-          <w:instrText xml:space="preserve"> PAGEREF _Toc242947350 \h </w:instrText>
+          <w:instrText xml:space="preserve"> PAGEREF _Toc242977995 \h </w:instrText>
         </w:r>
         <w:r>
           <w:rPr>
@@ -1609,7 +1610,7 @@
           <w:lang w:eastAsia="es-CO"/>
         </w:rPr>
       </w:pPr>
-      <w:hyperlink w:anchor="_Toc242947351" w:history="1">
+      <w:hyperlink w:anchor="_Toc242977996" w:history="1">
         <w:r>
           <w:rPr>
             <w:rStyle w:val="Hyperlink"/>
@@ -1654,7 +1655,7 @@
             <w:noProof/>
             <w:webHidden/>
           </w:rPr>
-          <w:instrText xml:space="preserve"> PAGEREF _Toc242947351 \h </w:instrText>
+          <w:instrText xml:space="preserve"> PAGEREF _Toc242977996 \h </w:instrText>
         </w:r>
         <w:r>
           <w:rPr>
@@ -1703,7 +1704,7 @@
           <w:lang w:eastAsia="es-CO"/>
         </w:rPr>
       </w:pPr>
-      <w:hyperlink w:anchor="_Toc242947352" w:history="1">
+      <w:hyperlink w:anchor="_Toc242977997" w:history="1">
         <w:r>
           <w:rPr>
             <w:rStyle w:val="Hyperlink"/>
@@ -1750,7 +1751,7 @@
             <w:noProof/>
             <w:webHidden/>
           </w:rPr>
-          <w:instrText xml:space="preserve"> PAGEREF _Toc242947352 \h </w:instrText>
+          <w:instrText xml:space="preserve"> PAGEREF _Toc242977997 \h </w:instrText>
         </w:r>
         <w:r>
           <w:rPr>
@@ -1797,7 +1798,7 @@
           <w:lang w:eastAsia="es-CO"/>
         </w:rPr>
       </w:pPr>
-      <w:hyperlink w:anchor="_Toc242947353" w:history="1">
+      <w:hyperlink w:anchor="_Toc242977998" w:history="1">
         <w:r>
           <w:rPr>
             <w:rStyle w:val="Hyperlink"/>
@@ -1842,7 +1843,7 @@
             <w:noProof/>
             <w:webHidden/>
           </w:rPr>
-          <w:instrText xml:space="preserve"> PAGEREF _Toc242947353 \h </w:instrText>
+          <w:instrText xml:space="preserve"> PAGEREF _Toc242977998 \h </w:instrText>
         </w:r>
         <w:r>
           <w:rPr>
@@ -1889,7 +1890,7 @@
           <w:lang w:eastAsia="es-CO"/>
         </w:rPr>
       </w:pPr>
-      <w:hyperlink w:anchor="_Toc242947354" w:history="1">
+      <w:hyperlink w:anchor="_Toc242977999" w:history="1">
         <w:r>
           <w:rPr>
             <w:rStyle w:val="Hyperlink"/>
@@ -1934,7 +1935,7 @@
             <w:noProof/>
             <w:webHidden/>
           </w:rPr>
-          <w:instrText xml:space="preserve"> PAGEREF _Toc242947354 \h </w:instrText>
+          <w:instrText xml:space="preserve"> PAGEREF _Toc242977999 \h </w:instrText>
         </w:r>
         <w:r>
           <w:rPr>
@@ -1981,7 +1982,7 @@
           <w:lang w:eastAsia="es-CO"/>
         </w:rPr>
       </w:pPr>
-      <w:hyperlink w:anchor="_Toc242947355" w:history="1">
+      <w:hyperlink w:anchor="_Toc242978000" w:history="1">
         <w:r>
           <w:rPr>
             <w:rStyle w:val="Hyperlink"/>
@@ -2026,7 +2027,7 @@
             <w:noProof/>
             <w:webHidden/>
           </w:rPr>
-          <w:instrText xml:space="preserve"> PAGEREF _Toc242947355 \h </w:instrText>
+          <w:instrText xml:space="preserve"> PAGEREF _Toc242978000 \h </w:instrText>
         </w:r>
         <w:r>
           <w:rPr>
@@ -2073,7 +2074,7 @@
           <w:lang w:eastAsia="es-CO"/>
         </w:rPr>
       </w:pPr>
-      <w:hyperlink w:anchor="_Toc242947356" w:history="1">
+      <w:hyperlink w:anchor="_Toc242978001" w:history="1">
         <w:r>
           <w:rPr>
             <w:rStyle w:val="Hyperlink"/>
@@ -2118,7 +2119,7 @@
             <w:noProof/>
             <w:webHidden/>
           </w:rPr>
-          <w:instrText xml:space="preserve"> PAGEREF _Toc242947356 \h </w:instrText>
+          <w:instrText xml:space="preserve"> PAGEREF _Toc242978001 \h </w:instrText>
         </w:r>
         <w:r>
           <w:rPr>
@@ -2165,7 +2166,7 @@
           <w:lang w:eastAsia="es-CO"/>
         </w:rPr>
       </w:pPr>
-      <w:hyperlink w:anchor="_Toc242947357" w:history="1">
+      <w:hyperlink w:anchor="_Toc242978002" w:history="1">
         <w:r>
           <w:rPr>
             <w:rStyle w:val="Hyperlink"/>
@@ -2210,7 +2211,7 @@
             <w:noProof/>
             <w:webHidden/>
           </w:rPr>
-          <w:instrText xml:space="preserve"> PAGEREF _Toc242947357 \h </w:instrText>
+          <w:instrText xml:space="preserve"> PAGEREF _Toc242978002 \h </w:instrText>
         </w:r>
         <w:r>
           <w:rPr>
@@ -2257,7 +2258,7 @@
           <w:lang w:eastAsia="es-CO"/>
         </w:rPr>
       </w:pPr>
-      <w:hyperlink w:anchor="_Toc242947358" w:history="1">
+      <w:hyperlink w:anchor="_Toc242978003" w:history="1">
         <w:r>
           <w:rPr>
             <w:rStyle w:val="Hyperlink"/>
@@ -2302,7 +2303,7 @@
             <w:noProof/>
             <w:webHidden/>
           </w:rPr>
-          <w:instrText xml:space="preserve"> PAGEREF _Toc242947358 \h </w:instrText>
+          <w:instrText xml:space="preserve"> PAGEREF _Toc242978003 \h </w:instrText>
         </w:r>
         <w:r>
           <w:rPr>
@@ -2349,7 +2350,7 @@
           <w:lang w:eastAsia="es-CO"/>
         </w:rPr>
       </w:pPr>
-      <w:hyperlink w:anchor="_Toc242947359" w:history="1">
+      <w:hyperlink w:anchor="_Toc242978004" w:history="1">
         <w:r>
           <w:rPr>
             <w:rStyle w:val="Hyperlink"/>
@@ -2394,7 +2395,7 @@
             <w:noProof/>
             <w:webHidden/>
           </w:rPr>
-          <w:instrText xml:space="preserve"> PAGEREF _Toc242947359 \h </w:instrText>
+          <w:instrText xml:space="preserve"> PAGEREF _Toc242978004 \h </w:instrText>
         </w:r>
         <w:r>
           <w:rPr>
@@ -2443,7 +2444,7 @@
           <w:lang w:eastAsia="es-CO"/>
         </w:rPr>
       </w:pPr>
-      <w:hyperlink w:anchor="_Toc242947360" w:history="1">
+      <w:hyperlink w:anchor="_Toc242978005" w:history="1">
         <w:r>
           <w:rPr>
             <w:rStyle w:val="Hyperlink"/>
@@ -2490,7 +2491,7 @@
             <w:noProof/>
             <w:webHidden/>
           </w:rPr>
-          <w:instrText xml:space="preserve"> PAGEREF _Toc242947360 \h </w:instrText>
+          <w:instrText xml:space="preserve"> PAGEREF _Toc242978005 \h </w:instrText>
         </w:r>
         <w:r>
           <w:rPr>
@@ -2510,7 +2511,7 @@
             <w:noProof/>
             <w:webHidden/>
           </w:rPr>
-          <w:t>21</w:t>
+          <w:t>22</w:t>
         </w:r>
         <w:r>
           <w:rPr>
@@ -2537,7 +2538,7 @@
           <w:lang w:eastAsia="es-CO"/>
         </w:rPr>
       </w:pPr>
-      <w:hyperlink w:anchor="_Toc242947361" w:history="1">
+      <w:hyperlink w:anchor="_Toc242978006" w:history="1">
         <w:r>
           <w:rPr>
             <w:rStyle w:val="Hyperlink"/>
@@ -2582,7 +2583,7 @@
             <w:noProof/>
             <w:webHidden/>
           </w:rPr>
-          <w:instrText xml:space="preserve"> PAGEREF _Toc242947361 \h </w:instrText>
+          <w:instrText xml:space="preserve"> PAGEREF _Toc242978006 \h </w:instrText>
         </w:r>
         <w:r>
           <w:rPr>
@@ -2602,7 +2603,7 @@
             <w:noProof/>
             <w:webHidden/>
           </w:rPr>
-          <w:t>21</w:t>
+          <w:t>22</w:t>
         </w:r>
         <w:r>
           <w:rPr>
@@ -2630,7 +2631,7 @@
           <w:lang w:eastAsia="es-CO"/>
         </w:rPr>
       </w:pPr>
-      <w:hyperlink w:anchor="_Toc242947362" w:history="1">
+      <w:hyperlink w:anchor="_Toc242978007" w:history="1">
         <w:r>
           <w:rPr>
             <w:rStyle w:val="Hyperlink"/>
@@ -2676,7 +2677,7 @@
             <w:noProof/>
             <w:webHidden/>
           </w:rPr>
-          <w:instrText xml:space="preserve"> PAGEREF _Toc242947362 \h </w:instrText>
+          <w:instrText xml:space="preserve"> PAGEREF _Toc242978007 \h </w:instrText>
         </w:r>
         <w:r>
           <w:rPr>
@@ -2696,7 +2697,7 @@
             <w:noProof/>
             <w:webHidden/>
           </w:rPr>
-          <w:t>22</w:t>
+          <w:t>23</w:t>
         </w:r>
         <w:r>
           <w:rPr>
@@ -2724,7 +2725,7 @@
           <w:lang w:eastAsia="es-CO"/>
         </w:rPr>
       </w:pPr>
-      <w:hyperlink w:anchor="_Toc242947363" w:history="1">
+      <w:hyperlink w:anchor="_Toc242978008" w:history="1">
         <w:r>
           <w:rPr>
             <w:rStyle w:val="Hyperlink"/>
@@ -2770,7 +2771,7 @@
             <w:noProof/>
             <w:webHidden/>
           </w:rPr>
-          <w:instrText xml:space="preserve"> PAGEREF _Toc242947363 \h </w:instrText>
+          <w:instrText xml:space="preserve"> PAGEREF _Toc242978008 \h </w:instrText>
         </w:r>
         <w:r>
           <w:rPr>
@@ -2790,7 +2791,7 @@
             <w:noProof/>
             <w:webHidden/>
           </w:rPr>
-          <w:t>22</w:t>
+          <w:t>23</w:t>
         </w:r>
         <w:r>
           <w:rPr>
@@ -2817,7 +2818,7 @@
           <w:lang w:eastAsia="es-CO"/>
         </w:rPr>
       </w:pPr>
-      <w:hyperlink w:anchor="_Toc242947364" w:history="1">
+      <w:hyperlink w:anchor="_Toc242978009" w:history="1">
         <w:r>
           <w:rPr>
             <w:rStyle w:val="Hyperlink"/>
@@ -2862,7 +2863,7 @@
             <w:noProof/>
             <w:webHidden/>
           </w:rPr>
-          <w:instrText xml:space="preserve"> PAGEREF _Toc242947364 \h </w:instrText>
+          <w:instrText xml:space="preserve"> PAGEREF _Toc242978009 \h </w:instrText>
         </w:r>
         <w:r>
           <w:rPr>
@@ -2882,7 +2883,7 @@
             <w:noProof/>
             <w:webHidden/>
           </w:rPr>
-          <w:t>22</w:t>
+          <w:t>23</w:t>
         </w:r>
         <w:r>
           <w:rPr>
@@ -2909,7 +2910,7 @@
           <w:lang w:eastAsia="es-CO"/>
         </w:rPr>
       </w:pPr>
-      <w:hyperlink w:anchor="_Toc242947365" w:history="1">
+      <w:hyperlink w:anchor="_Toc242978010" w:history="1">
         <w:r>
           <w:rPr>
             <w:rStyle w:val="Hyperlink"/>
@@ -2954,7 +2955,7 @@
             <w:noProof/>
             <w:webHidden/>
           </w:rPr>
-          <w:instrText xml:space="preserve"> PAGEREF _Toc242947365 \h </w:instrText>
+          <w:instrText xml:space="preserve"> PAGEREF _Toc242978010 \h </w:instrText>
         </w:r>
         <w:r>
           <w:rPr>
@@ -2974,7 +2975,7 @@
             <w:noProof/>
             <w:webHidden/>
           </w:rPr>
-          <w:t>23</w:t>
+          <w:t>24</w:t>
         </w:r>
         <w:r>
           <w:rPr>
@@ -3001,7 +3002,7 @@
           <w:lang w:eastAsia="es-CO"/>
         </w:rPr>
       </w:pPr>
-      <w:hyperlink w:anchor="_Toc242947366" w:history="1">
+      <w:hyperlink w:anchor="_Toc242978011" w:history="1">
         <w:r>
           <w:rPr>
             <w:rStyle w:val="Hyperlink"/>
@@ -3046,7 +3047,7 @@
             <w:noProof/>
             <w:webHidden/>
           </w:rPr>
-          <w:instrText xml:space="preserve"> PAGEREF _Toc242947366 \h </w:instrText>
+          <w:instrText xml:space="preserve"> PAGEREF _Toc242978011 \h </w:instrText>
         </w:r>
         <w:r>
           <w:rPr>
@@ -3066,7 +3067,7 @@
             <w:noProof/>
             <w:webHidden/>
           </w:rPr>
-          <w:t>28</w:t>
+          <w:t>29</w:t>
         </w:r>
         <w:r>
           <w:rPr>
@@ -3095,7 +3096,7 @@
           <w:lang w:eastAsia="es-CO"/>
         </w:rPr>
       </w:pPr>
-      <w:hyperlink w:anchor="_Toc242947367" w:history="1">
+      <w:hyperlink w:anchor="_Toc242978012" w:history="1">
         <w:r>
           <w:rPr>
             <w:rStyle w:val="Hyperlink"/>
@@ -3142,7 +3143,7 @@
             <w:noProof/>
             <w:webHidden/>
           </w:rPr>
-          <w:instrText xml:space="preserve"> PAGEREF _Toc242947367 \h </w:instrText>
+          <w:instrText xml:space="preserve"> PAGEREF _Toc242978012 \h </w:instrText>
         </w:r>
         <w:r>
           <w:rPr>
@@ -3162,7 +3163,7 @@
             <w:noProof/>
             <w:webHidden/>
           </w:rPr>
-          <w:t>29</w:t>
+          <w:t>30</w:t>
         </w:r>
         <w:r>
           <w:rPr>
@@ -3189,7 +3190,7 @@
           <w:lang w:eastAsia="es-CO"/>
         </w:rPr>
       </w:pPr>
-      <w:hyperlink w:anchor="_Toc242947368" w:history="1">
+      <w:hyperlink w:anchor="_Toc242978013" w:history="1">
         <w:r>
           <w:rPr>
             <w:rStyle w:val="Hyperlink"/>
@@ -3234,7 +3235,7 @@
             <w:noProof/>
             <w:webHidden/>
           </w:rPr>
-          <w:instrText xml:space="preserve"> PAGEREF _Toc242947368 \h </w:instrText>
+          <w:instrText xml:space="preserve"> PAGEREF _Toc242978013 \h </w:instrText>
         </w:r>
         <w:r>
           <w:rPr>
@@ -3254,7 +3255,7 @@
             <w:noProof/>
             <w:webHidden/>
           </w:rPr>
-          <w:t>29</w:t>
+          <w:t>30</w:t>
         </w:r>
         <w:r>
           <w:rPr>
@@ -3281,7 +3282,7 @@
           <w:lang w:eastAsia="es-CO"/>
         </w:rPr>
       </w:pPr>
-      <w:hyperlink w:anchor="_Toc242947369" w:history="1">
+      <w:hyperlink w:anchor="_Toc242978014" w:history="1">
         <w:r>
           <w:rPr>
             <w:rStyle w:val="Hyperlink"/>
@@ -3326,7 +3327,7 @@
             <w:noProof/>
             <w:webHidden/>
           </w:rPr>
-          <w:instrText xml:space="preserve"> PAGEREF _Toc242947369 \h </w:instrText>
+          <w:instrText xml:space="preserve"> PAGEREF _Toc242978014 \h </w:instrText>
         </w:r>
         <w:r>
           <w:rPr>
@@ -3346,7 +3347,7 @@
             <w:noProof/>
             <w:webHidden/>
           </w:rPr>
-          <w:t>29</w:t>
+          <w:t>30</w:t>
         </w:r>
         <w:r>
           <w:rPr>
@@ -3373,7 +3374,7 @@
           <w:lang w:eastAsia="es-CO"/>
         </w:rPr>
       </w:pPr>
-      <w:hyperlink w:anchor="_Toc242947370" w:history="1">
+      <w:hyperlink w:anchor="_Toc242978015" w:history="1">
         <w:r>
           <w:rPr>
             <w:rStyle w:val="Hyperlink"/>
@@ -3418,7 +3419,7 @@
             <w:noProof/>
             <w:webHidden/>
           </w:rPr>
-          <w:instrText xml:space="preserve"> PAGEREF _Toc242947370 \h </w:instrText>
+          <w:instrText xml:space="preserve"> PAGEREF _Toc242978015 \h </w:instrText>
         </w:r>
         <w:r>
           <w:rPr>
@@ -3438,7 +3439,7 @@
             <w:noProof/>
             <w:webHidden/>
           </w:rPr>
-          <w:t>29</w:t>
+          <w:t>30</w:t>
         </w:r>
         <w:r>
           <w:rPr>
@@ -3465,7 +3466,7 @@
           <w:lang w:eastAsia="es-CO"/>
         </w:rPr>
       </w:pPr>
-      <w:hyperlink w:anchor="_Toc242947371" w:history="1">
+      <w:hyperlink w:anchor="_Toc242978016" w:history="1">
         <w:r>
           <w:rPr>
             <w:rStyle w:val="Hyperlink"/>
@@ -3510,7 +3511,7 @@
             <w:noProof/>
             <w:webHidden/>
           </w:rPr>
-          <w:instrText xml:space="preserve"> PAGEREF _Toc242947371 \h </w:instrText>
+          <w:instrText xml:space="preserve"> PAGEREF _Toc242978016 \h </w:instrText>
         </w:r>
         <w:r>
           <w:rPr>
@@ -3530,7 +3531,7 @@
             <w:noProof/>
             <w:webHidden/>
           </w:rPr>
-          <w:t>30</w:t>
+          <w:t>31</w:t>
         </w:r>
         <w:r>
           <w:rPr>
@@ -3559,7 +3560,7 @@
           <w:lang w:eastAsia="es-CO"/>
         </w:rPr>
       </w:pPr>
-      <w:hyperlink w:anchor="_Toc242947372" w:history="1">
+      <w:hyperlink w:anchor="_Toc242978017" w:history="1">
         <w:r>
           <w:rPr>
             <w:rStyle w:val="Hyperlink"/>
@@ -3606,7 +3607,7 @@
             <w:noProof/>
             <w:webHidden/>
           </w:rPr>
-          <w:instrText xml:space="preserve"> PAGEREF _Toc242947372 \h </w:instrText>
+          <w:instrText xml:space="preserve"> PAGEREF _Toc242978017 \h </w:instrText>
         </w:r>
         <w:r>
           <w:rPr>
@@ -3626,7 +3627,7 @@
             <w:noProof/>
             <w:webHidden/>
           </w:rPr>
-          <w:t>30</w:t>
+          <w:t>31</w:t>
         </w:r>
         <w:r>
           <w:rPr>
@@ -3655,7 +3656,7 @@
           <w:lang w:eastAsia="es-CO"/>
         </w:rPr>
       </w:pPr>
-      <w:hyperlink w:anchor="_Toc242947373" w:history="1">
+      <w:hyperlink w:anchor="_Toc242978018" w:history="1">
         <w:r>
           <w:rPr>
             <w:rStyle w:val="Hyperlink"/>
@@ -3702,7 +3703,7 @@
             <w:noProof/>
             <w:webHidden/>
           </w:rPr>
-          <w:instrText xml:space="preserve"> PAGEREF _Toc242947373 \h </w:instrText>
+          <w:instrText xml:space="preserve"> PAGEREF _Toc242978018 \h </w:instrText>
         </w:r>
         <w:r>
           <w:rPr>
@@ -3722,7 +3723,7 @@
             <w:noProof/>
             <w:webHidden/>
           </w:rPr>
-          <w:t>31</w:t>
+          <w:t>32</w:t>
         </w:r>
         <w:r>
           <w:rPr>
@@ -3751,7 +3752,7 @@
           <w:lang w:eastAsia="es-CO"/>
         </w:rPr>
       </w:pPr>
-      <w:hyperlink w:anchor="_Toc242947374" w:history="1">
+      <w:hyperlink w:anchor="_Toc242978019" w:history="1">
         <w:r>
           <w:rPr>
             <w:rStyle w:val="Hyperlink"/>
@@ -3798,7 +3799,7 @@
             <w:noProof/>
             <w:webHidden/>
           </w:rPr>
-          <w:instrText xml:space="preserve"> PAGEREF _Toc242947374 \h </w:instrText>
+          <w:instrText xml:space="preserve"> PAGEREF _Toc242978019 \h </w:instrText>
         </w:r>
         <w:r>
           <w:rPr>
@@ -3818,7 +3819,7 @@
             <w:noProof/>
             <w:webHidden/>
           </w:rPr>
-          <w:t>33</w:t>
+          <w:t>34</w:t>
         </w:r>
         <w:r>
           <w:rPr>
@@ -3852,8 +3853,9 @@
       <w:bookmarkStart w:id="4" w:name="_Toc240440230"/>
       <w:bookmarkStart w:id="5" w:name="_Toc241072107"/>
       <w:bookmarkStart w:id="6" w:name="_Toc241072473"/>
-      <w:bookmarkStart w:id="7" w:name="_Toc242947337"/>
-      <w:r>
+      <w:bookmarkStart w:id="7" w:name="_Toc242977982"/>
+      <w:r>
+        <w:lastRenderedPageBreak/>
         <w:t>Información principal del proyecto</w:t>
       </w:r>
       <w:bookmarkEnd w:id="4"/>
@@ -3874,7 +3876,7 @@
       <w:bookmarkStart w:id="8" w:name="_Toc240440231"/>
       <w:bookmarkStart w:id="9" w:name="_Toc241072108"/>
       <w:bookmarkStart w:id="10" w:name="_Toc241072474"/>
-      <w:bookmarkStart w:id="11" w:name="_Toc242947338"/>
+      <w:bookmarkStart w:id="11" w:name="_Toc242977983"/>
       <w:r>
         <w:t>Título del proyecto</w:t>
       </w:r>
@@ -3908,7 +3910,7 @@
       <w:bookmarkStart w:id="12" w:name="_Toc240440232"/>
       <w:bookmarkStart w:id="13" w:name="_Toc241072109"/>
       <w:bookmarkStart w:id="14" w:name="_Toc241072475"/>
-      <w:bookmarkStart w:id="15" w:name="_Toc242947339"/>
+      <w:bookmarkStart w:id="15" w:name="_Toc242977984"/>
       <w:r>
         <w:t>Resumen ejecutivo</w:t>
       </w:r>
@@ -3960,7 +3962,7 @@
       <w:bookmarkStart w:id="16" w:name="_Toc240440236"/>
       <w:bookmarkStart w:id="17" w:name="_Toc241072110"/>
       <w:bookmarkStart w:id="18" w:name="_Toc241072476"/>
-      <w:bookmarkStart w:id="19" w:name="_Toc242947340"/>
+      <w:bookmarkStart w:id="19" w:name="_Toc242977985"/>
       <w:r>
         <w:t>Costo total del proyecto</w:t>
       </w:r>
@@ -3990,6 +3992,7 @@
           <w:sz w:val="20"/>
           <w:szCs w:val="20"/>
         </w:rPr>
+        <w:lastRenderedPageBreak/>
         <w:t>Tabla 1.</w:t>
       </w:r>
       <w:r>
@@ -4844,8 +4847,9 @@
       <w:bookmarkStart w:id="20" w:name="_Toc240440237"/>
       <w:bookmarkStart w:id="21" w:name="_Toc241072111"/>
       <w:bookmarkStart w:id="22" w:name="_Toc241072477"/>
-      <w:bookmarkStart w:id="23" w:name="_Toc242947341"/>
-      <w:r>
+      <w:bookmarkStart w:id="23" w:name="_Toc242977986"/>
+      <w:r>
+        <w:lastRenderedPageBreak/>
         <w:t>Introducción</w:t>
       </w:r>
       <w:bookmarkEnd w:id="20"/>
@@ -4921,8 +4925,9 @@
       <w:bookmarkStart w:id="24" w:name="_Toc240440238"/>
       <w:bookmarkStart w:id="25" w:name="_Toc241072112"/>
       <w:bookmarkStart w:id="26" w:name="_Toc241072478"/>
-      <w:bookmarkStart w:id="27" w:name="_Toc242947342"/>
-      <w:r>
+      <w:bookmarkStart w:id="27" w:name="_Toc242977987"/>
+      <w:r>
+        <w:lastRenderedPageBreak/>
         <w:t>Objetivos</w:t>
       </w:r>
       <w:bookmarkEnd w:id="24"/>
@@ -4943,7 +4948,7 @@
       <w:bookmarkStart w:id="28" w:name="_Toc240440239"/>
       <w:bookmarkStart w:id="29" w:name="_Toc241072113"/>
       <w:bookmarkStart w:id="30" w:name="_Toc241072479"/>
-      <w:bookmarkStart w:id="31" w:name="_Toc242947343"/>
+      <w:bookmarkStart w:id="31" w:name="_Toc242977988"/>
       <w:r>
         <w:t>Objetivo general</w:t>
       </w:r>
@@ -4974,7 +4979,7 @@
       <w:bookmarkStart w:id="32" w:name="_Toc240440240"/>
       <w:bookmarkStart w:id="33" w:name="_Toc241072114"/>
       <w:bookmarkStart w:id="34" w:name="_Toc241072480"/>
-      <w:bookmarkStart w:id="35" w:name="_Toc242947344"/>
+      <w:bookmarkStart w:id="35" w:name="_Toc242977989"/>
       <w:r>
         <w:t>Objetivos específicos</w:t>
       </w:r>
@@ -5084,7 +5089,7 @@
       <w:bookmarkStart w:id="36" w:name="_Toc240440241"/>
       <w:bookmarkStart w:id="37" w:name="_Toc241072115"/>
       <w:bookmarkStart w:id="38" w:name="_Toc241072481"/>
-      <w:bookmarkStart w:id="39" w:name="_Toc242947345"/>
+      <w:bookmarkStart w:id="39" w:name="_Toc242977990"/>
       <w:r>
         <w:t>Delimitación</w:t>
       </w:r>
@@ -5106,7 +5111,7 @@
       <w:bookmarkStart w:id="40" w:name="_Toc240440242"/>
       <w:bookmarkStart w:id="41" w:name="_Toc241072116"/>
       <w:bookmarkStart w:id="42" w:name="_Toc241072482"/>
-      <w:bookmarkStart w:id="43" w:name="_Toc242947346"/>
+      <w:bookmarkStart w:id="43" w:name="_Toc242977991"/>
       <w:r>
         <w:t>Alcances</w:t>
       </w:r>
@@ -5578,6 +5583,7 @@
                 <w:sz w:val="17"/>
                 <w:szCs w:val="17"/>
               </w:rPr>
+              <w:lastRenderedPageBreak/>
               <w:t>OE4</w:t>
             </w:r>
           </w:p>
@@ -5662,7 +5668,7 @@
       <w:bookmarkStart w:id="44" w:name="_Toc240440243"/>
       <w:bookmarkStart w:id="45" w:name="_Toc241072117"/>
       <w:bookmarkStart w:id="46" w:name="_Toc241072483"/>
-      <w:bookmarkStart w:id="47" w:name="_Toc242947347"/>
+      <w:bookmarkStart w:id="47" w:name="_Toc242977992"/>
       <w:r>
         <w:t>Limitaciones</w:t>
       </w:r>
@@ -6063,7 +6069,7 @@
       <w:bookmarkStart w:id="48" w:name="_Toc240440244"/>
       <w:bookmarkStart w:id="49" w:name="_Toc241072118"/>
       <w:bookmarkStart w:id="50" w:name="_Toc241072484"/>
-      <w:bookmarkStart w:id="51" w:name="_Toc242947348"/>
+      <w:bookmarkStart w:id="51" w:name="_Toc242977993"/>
       <w:r>
         <w:t>Entregables</w:t>
       </w:r>
@@ -6251,6 +6257,7 @@
         <w:jc w:val="both"/>
       </w:pPr>
       <w:r>
+        <w:lastRenderedPageBreak/>
         <w:t>•</w:t>
       </w:r>
       <w:r>
@@ -6314,7 +6321,7 @@
       </w:pPr>
       <w:bookmarkStart w:id="53" w:name="_Toc241072119"/>
       <w:bookmarkStart w:id="54" w:name="_Toc241072485"/>
-      <w:bookmarkStart w:id="55" w:name="_Toc242947349"/>
+      <w:bookmarkStart w:id="55" w:name="_Toc242977994"/>
       <w:r>
         <w:t>Revisión bibliográfica</w:t>
       </w:r>
@@ -6339,7 +6346,7 @@
       <w:bookmarkStart w:id="56" w:name="_Toc240440246"/>
       <w:bookmarkStart w:id="57" w:name="_Toc241072120"/>
       <w:bookmarkStart w:id="58" w:name="_Toc241072486"/>
-      <w:bookmarkStart w:id="59" w:name="_Toc242947350"/>
+      <w:bookmarkStart w:id="59" w:name="_Toc242977995"/>
       <w:r>
         <w:t>Planteamiento del problema</w:t>
       </w:r>
@@ -6377,7 +6384,7 @@
           <w:noProof/>
         </w:rPr>
         <w:drawing>
-          <wp:inline distT="0" distB="0" distL="0" distR="0" wp14:anchorId="30469C56" wp14:editId="1FE86A35">
+          <wp:inline distT="0" distB="0" distL="0" distR="0" wp14:anchorId="7BC142C7" wp14:editId="402BBBB6">
             <wp:extent cx="4320000" cy="1753663"/>
             <wp:effectExtent l="0" t="0" r="0" b="0"/>
             <wp:docPr id="1" name="Picture 1"/>
@@ -6485,7 +6492,11 @@
         <w:jc w:val="both"/>
       </w:pPr>
       <w:r>
-        <w:t>Además, el diseño exigió tomar decisiones que la literatura no fija para este caso: qué variables construir a partir de las series públicas (Tabla 11), qué información está realmente disponible en el momento de pronosticar, qué modelos usar y cómo combinarlos (de más de quince familias evaluadas, el diseño definitivo usa el predespacho de XM y tres CatBoost; Tabla 12), el rango de años del histórico, la forma de sincronizar series de resolución distinta y la codificación del ONI (Tabla 13). Cada decisión se tomó formulando alternativas, evaluándolas fuera de muestra y eligiendo con criterios explícitos (Sección 6.8).</w:t>
+        <w:t xml:space="preserve">Además, el diseño exigió tomar decisiones que la literatura no fija para este caso: qué variables construir a partir de las series públicas (Tabla 11), qué información está realmente disponible en el momento de pronosticar, qué modelos usar y cómo combinarlos (de más de quince familias evaluadas, el diseño </w:t>
+      </w:r>
+      <w:r>
+        <w:lastRenderedPageBreak/>
+        <w:t>definitivo usa el predespacho de XM y tres CatBoost; Tabla 12), el rango de años del histórico, la forma de sincronizar series de resolución distinta y la codificación del ONI (Tabla 13). Cada decisión se tomó formulando alternativas, evaluándolas fuera de muestra y eligiendo con criterios explícitos (Sección 6.8).</w:t>
       </w:r>
     </w:p>
     <w:p>
@@ -6501,7 +6512,7 @@
       <w:bookmarkStart w:id="60" w:name="_Toc240440247"/>
       <w:bookmarkStart w:id="61" w:name="_Toc241072121"/>
       <w:bookmarkStart w:id="62" w:name="_Toc241072487"/>
-      <w:bookmarkStart w:id="63" w:name="_Toc242947351"/>
+      <w:bookmarkStart w:id="63" w:name="_Toc242977996"/>
       <w:r>
         <w:t>Descripción de avances tecnológicos</w:t>
       </w:r>
@@ -7503,6 +7514,7 @@
         <w:jc w:val="both"/>
       </w:pPr>
       <w:r>
+        <w:lastRenderedPageBreak/>
         <w:t>Los tres referentes internacionales aportan algo distinto: no compiten en exactitud, sino que definen cómo medirla. Gallón y Barrientos tratan las 24 horas de un día no como 24 números sueltos, sino como una sola curva continua, que descomponen en sus formas dominantes (componentes principales funcionales) para pronosticar la forma completa del día siguiente; logran un MAPE de 6,7 % a un día, pero en 2000-2017, un período sin los eventos climáticos extremos de 2023-2026 que enfrenta este proyecto. Lago et al. no proponen un modelo para un mercado específico: fijan el protocolo que sigue toda la comunidad de pronóstico de precios eléctricos, con el LEAR (una regresión lineal cuyas variables se seleccionan automáticamente por LASSO) como referencia mínima exigible y la prueba de Diebold-Mariano para decidir si una mejora es real o es ruido estadístico — el mismo protocolo que sigue este proyecto (Sección 7.1). Kapoor y Wichitaksorn prueban 33 combinaciones de modelo y método de selección de variables en Nueva Zelanda, un mercado también dominado por la hidroelectricidad; su resultado, y la razón de citarlo en este informe, es que ninguna de las 33 logra un MASE (el error del modelo dividido entre el de la referencia más simple posible, repetir el precio del día anterior) menor a 1 — ninguna le gana de forma consistente a esa referencia, evidencia de lo difícil que es pronosticar el precio en un mercado hidro-dominado incluso con métodos sofisticados.</w:t>
       </w:r>
     </w:p>
@@ -7534,7 +7546,7 @@
       </w:pPr>
       <w:bookmarkStart w:id="65" w:name="_Toc241072122"/>
       <w:bookmarkStart w:id="66" w:name="_Toc241072488"/>
-      <w:bookmarkStart w:id="67" w:name="_Toc242947352"/>
+      <w:bookmarkStart w:id="67" w:name="_Toc242977997"/>
       <w:r>
         <w:t>Descripción detallada del diseño en ingeniería</w:t>
       </w:r>
@@ -7556,7 +7568,7 @@
       <w:bookmarkStart w:id="68" w:name="_Toc240440249"/>
       <w:bookmarkStart w:id="69" w:name="_Toc241072123"/>
       <w:bookmarkStart w:id="70" w:name="_Toc241072489"/>
-      <w:bookmarkStart w:id="71" w:name="_Toc242947353"/>
+      <w:bookmarkStart w:id="71" w:name="_Toc242977998"/>
       <w:r>
         <w:t>Problema</w:t>
       </w:r>
@@ -7589,7 +7601,11 @@
         <w:jc w:val="both"/>
       </w:pPr>
       <w:r>
-        <w:t>La disponibilidad de los datos es parte del problema. A las 00:00 del día D, cuando se emite el pronóstico, la API pública de XM solo tiene el precio, la demanda y la generación hasta las 23:00 de D-4 (unos tres días de rezago), los embalses y aportes hasta D-2 y el ONI con unos dos meses de rezago. En cambio, el predespacho ideal del día D, que XM calcula con las ofertas de los generadores, se publica hacia las 10:30 de D-1 en la biblioteca pública de su portal [39]. Un diseño que suponga conocido el precio del día anterior no se puede operar con fuentes públicas; por eso el diseño definitivo se evaluó en este escenario realista.</w:t>
+        <w:t xml:space="preserve">La disponibilidad de los datos es parte del problema. A las 00:00 del día D, cuando se emite el pronóstico, la API pública de XM solo tiene el precio, la demanda y la generación hasta las 23:00 de D-4 (unos tres días de rezago), los embalses y aportes hasta D-2 y el ONI con unos dos meses de rezago. En cambio, el predespacho ideal del día D, que XM calcula con las ofertas de los generadores, se publica hacia las 10:30 </w:t>
+      </w:r>
+      <w:r>
+        <w:lastRenderedPageBreak/>
+        <w:t>de D-1 en la biblioteca pública de su portal [39]. Un diseño que suponga conocido el precio del día anterior no se puede operar con fuentes públicas; por eso el diseño definitivo se evaluó en este escenario realista.</w:t>
       </w:r>
     </w:p>
     <w:p>
@@ -7605,7 +7621,7 @@
       <w:bookmarkStart w:id="72" w:name="_Toc240440250"/>
       <w:bookmarkStart w:id="73" w:name="_Toc241072124"/>
       <w:bookmarkStart w:id="74" w:name="_Toc241072490"/>
-      <w:bookmarkStart w:id="75" w:name="_Toc242947354"/>
+      <w:bookmarkStart w:id="75" w:name="_Toc242977999"/>
       <w:r>
         <w:t>Análisis de requerimientos</w:t>
       </w:r>
@@ -8483,7 +8499,7 @@
       <w:bookmarkStart w:id="76" w:name="_Toc240440251"/>
       <w:bookmarkStart w:id="77" w:name="_Toc241072125"/>
       <w:bookmarkStart w:id="78" w:name="_Toc241072491"/>
-      <w:bookmarkStart w:id="79" w:name="_Toc242947355"/>
+      <w:bookmarkStart w:id="79" w:name="_Toc242978000"/>
       <w:r>
         <w:t>Estándares, normas y regulaciones</w:t>
       </w:r>
@@ -8662,6 +8678,7 @@
                 <w:sz w:val="18"/>
                 <w:szCs w:val="18"/>
               </w:rPr>
+              <w:lastRenderedPageBreak/>
               <w:t>Resolución CREG 101 018 de 2022 [21]</w:t>
             </w:r>
           </w:p>
@@ -8856,7 +8873,7 @@
       <w:bookmarkStart w:id="80" w:name="_Toc240440252"/>
       <w:bookmarkStart w:id="81" w:name="_Toc241072126"/>
       <w:bookmarkStart w:id="82" w:name="_Toc241072492"/>
-      <w:bookmarkStart w:id="83" w:name="_Toc242947356"/>
+      <w:bookmarkStart w:id="83" w:name="_Toc242978001"/>
       <w:r>
         <w:t>Alternativas de solución</w:t>
       </w:r>
@@ -9148,6 +9165,7 @@
                 <w:sz w:val="18"/>
                 <w:szCs w:val="18"/>
               </w:rPr>
+              <w:lastRenderedPageBreak/>
               <w:t>Ventajas:</w:t>
             </w:r>
             <w:r>
@@ -9324,7 +9342,7 @@
       <w:bookmarkStart w:id="84" w:name="_Toc240440253"/>
       <w:bookmarkStart w:id="85" w:name="_Toc241072127"/>
       <w:bookmarkStart w:id="86" w:name="_Toc241072493"/>
-      <w:bookmarkStart w:id="87" w:name="_Toc242947357"/>
+      <w:bookmarkStart w:id="87" w:name="_Toc242978002"/>
       <w:r>
         <w:t>Evaluación y selección de la alternativa óptima</w:t>
       </w:r>
@@ -9900,6 +9918,7 @@
           <w:sz w:val="25"/>
           <w:szCs w:val="25"/>
         </w:rPr>
+        <w:lastRenderedPageBreak/>
         <w:t>Matriz de decisión</w:t>
       </w:r>
     </w:p>
@@ -10723,7 +10742,7 @@
       <w:bookmarkStart w:id="88" w:name="_Toc240440255"/>
       <w:bookmarkStart w:id="89" w:name="_Toc241072130"/>
       <w:bookmarkStart w:id="90" w:name="_Toc241072496"/>
-      <w:bookmarkStart w:id="91" w:name="_Toc242947358"/>
+      <w:bookmarkStart w:id="91" w:name="_Toc242978003"/>
       <w:r>
         <w:t>Análisis de riesgo del diseño definitivo</w:t>
       </w:r>
@@ -11692,8 +11711,9 @@
       <w:bookmarkStart w:id="92" w:name="_Toc240440254"/>
       <w:bookmarkStart w:id="93" w:name="_Toc241072129"/>
       <w:bookmarkStart w:id="94" w:name="_Toc241072495"/>
-      <w:bookmarkStart w:id="95" w:name="_Toc242947359"/>
-      <w:r>
+      <w:bookmarkStart w:id="95" w:name="_Toc242978004"/>
+      <w:r>
+        <w:lastRenderedPageBreak/>
         <w:t>Diseño definitivo</w:t>
       </w:r>
       <w:bookmarkEnd w:id="92"/>
@@ -11727,7 +11747,7 @@
           <w:noProof/>
         </w:rPr>
         <w:drawing>
-          <wp:inline distT="0" distB="0" distL="0" distR="0" wp14:anchorId="323F3A5D" wp14:editId="3EAEC3B9">
+          <wp:inline distT="0" distB="0" distL="0" distR="0" wp14:anchorId="68CD12DA" wp14:editId="1E5917F4">
             <wp:extent cx="3780000" cy="2888781"/>
             <wp:effectExtent l="0" t="0" r="0" b="0"/>
             <wp:docPr id="14" name="Picture 14"/>
@@ -11820,6 +11840,7 @@
           <w:sz w:val="20"/>
           <w:szCs w:val="20"/>
         </w:rPr>
+        <w:lastRenderedPageBreak/>
         <w:t>Tabla 11.</w:t>
       </w:r>
       <w:r>
@@ -13527,6 +13548,7 @@
                 <w:sz w:val="16"/>
                 <w:szCs w:val="16"/>
               </w:rPr>
+              <w:lastRenderedPageBreak/>
               <w:t>Detector de eventos</w:t>
             </w:r>
           </w:p>
@@ -14718,6 +14740,7 @@
                 <w:sz w:val="16"/>
                 <w:szCs w:val="16"/>
               </w:rPr>
+              <w:lastRenderedPageBreak/>
               <w:t>Combinador por franjas de 6 h con objetivo MAE y 5 días de margen</w:t>
             </w:r>
           </w:p>
@@ -15220,8 +15243,9 @@
         <w:rPr>
           <w:noProof/>
         </w:rPr>
+        <w:lastRenderedPageBreak/>
         <w:drawing>
-          <wp:inline distT="0" distB="0" distL="0" distR="0" wp14:anchorId="5197640D" wp14:editId="37E62A61">
+          <wp:inline distT="0" distB="0" distL="0" distR="0" wp14:anchorId="5AF8AE8D" wp14:editId="114D38EF">
             <wp:extent cx="4500000" cy="2592528"/>
             <wp:effectExtent l="0" t="0" r="0" b="0"/>
             <wp:docPr id="15" name="Picture 15"/>
@@ -15290,7 +15314,7 @@
         <w:t>Dashboard.</w:t>
       </w:r>
       <w:r>
-        <w:t xml:space="preserve"> Se publicó en Streamlit Community Cloud (augurpredictor.streamlit.app) con la marca augur. La vista Operador aplica el método que elige el criterio de estabilidad y muestra, para el día y la hora elegidos, la acción recomendada, la posición del precio esperado entre los umbrales, un nivel de confianza según el ancho relativo de la banda y la probabilidad de pico o desplome; la acompañan la franja de 24 horas, el mapa de calor día-hora, tres indicadores del backtest y la semana de referencia, cada imagen con sus metadatos (unidad, periodo, confianza y versión del modelo). La vista Analista permite fijar el método, los percentiles, el rango de fechas y el filtro intradía. La interfaz se verificó con pruebas automatizadas de Streamlit en las 16 combinaciones de tema, vista, rol y horizonte, y en un navegador.</w:t>
+        <w:t xml:space="preserve"> Se publicó en Streamlit Community Cloud (augurpredictor.streamlit.app) con la marca augur. La vista Operador aplica el método que elige el criterio de estabilidad y muestra, para el día y la hora elegidos, la acción recomendada con una insignia (favorable, desfavorable o neutral), un medidor que ubica el precio esperado entre los tramos barato, normal y caro, un nivel de confianza según el ancho relativo de la banda y la probabilidad de pico o desplome; la acompañan la gráfica del día (con un botón para ampliarla y variables que se ocultan o muestran desde la leyenda), la franja de 24 horas con el precio y la acción de cada hora, el mapa de calor día-hora, tres indicadores del backtest y la semana de referencia, cada imagen con sus metadatos (unidad, periodo, confianza y versión del modelo). La vista Analista permite fijar el método, los percentiles, el rango de fechas y el filtro intradía. La presentación se rediseñó el 15 de octubre con la retroalimentación del equipo (tarjetas, tema oscuro de alto contraste y diseño adaptable a pantallas angostas) sin cambiar el motor ni los datos. La interfaz se verificó con pruebas automatizadas de Streamlit en las 16 combinaciones de tema, vista, rol y horizonte, y en un navegador a varios anchos de pantalla.</w:t>
       </w:r>
     </w:p>
     <w:p>
@@ -15320,7 +15344,11 @@
         <w:t>Vista Operador.</w:t>
       </w:r>
       <w:r>
-        <w:t xml:space="preserve"> La Figura 4 muestra la vista Operador el 15 de octubre de 2026 a las 08:00 h para el generador, con el pronóstico emitido la víspera. La tarjeta recomienda «Retener generación»: el precio esperado, 429 COP/kWh, está por debajo del umbral barato (≤ 503) y lejos del caro (≥ 723), con confianza alta (banda de ±34 COP/kWh, más ancha que solo el 21 % de las horas anteriores). El riesgo de desplome a esa hora es de 16 % y el detector anticipa un posible pico entre las 15:00 y las 22:00, que la gráfica del día marca con ▲. Ese día el generador tenía 7 de 24 horas para despachar y vender, y la regla activa, «rodante», tiene una ventaja histórica de +244 COP/kWh y actúa en el 22 % de las horas.</w:t>
+        <w:t xml:space="preserve"> La Figura 4 muestra la vista Operador el 16 de octubre de 2026 a las 08:00 h para el generador, con el pronóstico emitido la víspera. La tarjeta recomienda «Retener generación»: el medidor ubica el precio esperado, 431 COP/kWh, en el tramo barato (≤ 503) y lejos del caro (≥ 720), con confianza alta (banda de ±42 COP/kWh, más ancha que el 35 % de las horas anteriores). El riesgo de desplome a esa hora es de 49 %: el detector anticipa un posible desplome entre las 08:00 y las 11:00 y un posible pico entre las 16:00 y las 21:00, que la gráfica del día marca con ▼ y ▲. Ese día el generador tiene 6 de 24 </w:t>
+      </w:r>
+      <w:r>
+        <w:lastRenderedPageBreak/>
+        <w:t>horas para despachar y vender, y la regla activa, «rodante», tiene una ventaja histórica de +244 COP/kWh y actúa en el 22 % de las horas.</w:t>
       </w:r>
     </w:p>
     <w:p>
@@ -15334,8 +15362,8 @@
           <w:noProof/>
         </w:rPr>
         <w:drawing>
-          <wp:inline distT="0" distB="0" distL="0" distR="0" wp14:anchorId="13F4950C" wp14:editId="29069D9D">
-            <wp:extent cx="5760720" cy="2757678"/>
+          <wp:inline distT="0" distB="0" distL="0" distR="0" wp14:anchorId="5A8DD6E7" wp14:editId="0E7A50F6">
+            <wp:extent cx="5760720" cy="3227070"/>
             <wp:effectExtent l="0" t="0" r="0" b="0"/>
             <wp:docPr id="16" name="Picture 16"/>
             <wp:cNvGraphicFramePr>
@@ -15357,7 +15385,7 @@
                   <pic:spPr>
                     <a:xfrm>
                       <a:off x="0" y="0"/>
-                      <a:ext cx="5760720" cy="2757678"/>
+                      <a:ext cx="5760720" cy="3227070"/>
                     </a:xfrm>
                     <a:prstGeom prst="rect">
                       <a:avLst/>
@@ -15388,7 +15416,7 @@
           <w:sz w:val="20"/>
           <w:szCs w:val="20"/>
         </w:rPr>
-        <w:t xml:space="preserve"> Dashboard publicado, vista Operador (15 de octubre de 2026, 08:00 h, rol generador, horizonte 24 h).</w:t>
+        <w:t xml:space="preserve"> Dashboard publicado, vista Operador (16 de octubre de 2026, 08:00 h, rol generador, horizonte 24 h).</w:t>
       </w:r>
     </w:p>
     <w:p>
@@ -15416,9 +15444,10 @@
         <w:rPr>
           <w:noProof/>
         </w:rPr>
+        <w:lastRenderedPageBreak/>
         <w:drawing>
-          <wp:inline distT="0" distB="0" distL="0" distR="0" wp14:anchorId="7DD968F9" wp14:editId="189D099A">
-            <wp:extent cx="5486400" cy="3426451"/>
+          <wp:inline distT="0" distB="0" distL="0" distR="0" wp14:anchorId="05809635" wp14:editId="310F2282">
+            <wp:extent cx="5486400" cy="3700558"/>
             <wp:effectExtent l="0" t="0" r="0" b="0"/>
             <wp:docPr id="17" name="Picture 17"/>
             <wp:cNvGraphicFramePr>
@@ -15440,7 +15469,7 @@
                   <pic:spPr>
                     <a:xfrm>
                       <a:off x="0" y="0"/>
-                      <a:ext cx="5486400" cy="3426451"/>
+                      <a:ext cx="5486400" cy="3700558"/>
                     </a:xfrm>
                     <a:prstGeom prst="rect">
                       <a:avLst/>
@@ -15471,7 +15500,7 @@
           <w:sz w:val="20"/>
           <w:szCs w:val="20"/>
         </w:rPr>
-        <w:t xml:space="preserve"> Mapa de calor día-hora de la señal del motor (2 al 15 de octubre de 2026, rol generador).</w:t>
+        <w:t xml:space="preserve"> Mapa de calor día-hora de la señal del motor (3 al 16 de octubre de 2026, rol generador).</w:t>
       </w:r>
     </w:p>
     <w:p>
@@ -15486,7 +15515,7 @@
         <w:t>Vista Analista.</w:t>
       </w:r>
       <w:r>
-        <w:t xml:space="preserve"> La Figura 6 muestra la vista Analista para el generador a 24 h con todo el periodo publicado (1 de enero al 16 de octubre de 2026). La tabla compara los cuatro métodos por ventaja y frecuencia de acción en el rango elegido: «banda» queda sugerido por ventaja (+323 COP/kWh en el 18 % de las horas), pero la vista Operador usa el criterio de estabilidad, que elige «rodante» porque «banda» y «fijo» casi no actúan en la primera mitad del año (Tabla 20). Debajo, la tabla «Ver datos filtrados» permite auditar cada recomendación hora a hora y descargarla.</w:t>
+        <w:t xml:space="preserve"> La Figura 6 muestra la vista Analista para el generador a 24 h con todo el periodo publicado (1 de enero al 17 de octubre de 2026). La tabla compara los cuatro métodos por ventaja y frecuencia de acción en el rango elegido: «banda» queda sugerido por ventaja (+323 COP/kWh en el 18 % de las horas), pero la vista Operador usa el criterio de estabilidad, que elige «rodante» porque «banda» y «fijo» casi no actúan en la primera mitad del año (Tabla 20). Debajo, la tabla «Ver datos filtrados» permite auditar cada recomendación hora a hora y descargarla.</w:t>
       </w:r>
     </w:p>
     <w:p>
@@ -15499,9 +15528,10 @@
         <w:rPr>
           <w:noProof/>
         </w:rPr>
+        <w:lastRenderedPageBreak/>
         <w:drawing>
-          <wp:inline distT="0" distB="0" distL="0" distR="0" wp14:anchorId="5B861736" wp14:editId="42354A49">
-            <wp:extent cx="3931920" cy="3522345"/>
+          <wp:inline distT="0" distB="0" distL="0" distR="0" wp14:anchorId="2CAB91FF" wp14:editId="4D0CA307">
+            <wp:extent cx="3931920" cy="4004733"/>
             <wp:effectExtent l="0" t="0" r="0" b="0"/>
             <wp:docPr id="18" name="Picture 18"/>
             <wp:cNvGraphicFramePr>
@@ -15523,7 +15553,7 @@
                   <pic:spPr>
                     <a:xfrm>
                       <a:off x="0" y="0"/>
-                      <a:ext cx="3931920" cy="3522345"/>
+                      <a:ext cx="3931920" cy="4004733"/>
                     </a:xfrm>
                     <a:prstGeom prst="rect">
                       <a:avLst/>
@@ -15554,7 +15584,7 @@
           <w:sz w:val="20"/>
           <w:szCs w:val="20"/>
         </w:rPr>
-        <w:t xml:space="preserve"> Dashboard publicado, vista Analista (rol generador, horizonte 24 h, 1 de enero al 16 de octubre de 2026).</w:t>
+        <w:t xml:space="preserve"> Dashboard publicado, vista Analista (rol generador, horizonte 24 h, 1 de enero al 17 de octubre de 2026).</w:t>
       </w:r>
     </w:p>
     <w:p>
@@ -15581,7 +15611,7 @@
       </w:pPr>
       <w:bookmarkStart w:id="97" w:name="_Toc241072132"/>
       <w:bookmarkStart w:id="98" w:name="_Toc241072498"/>
-      <w:bookmarkStart w:id="99" w:name="_Toc242947360"/>
+      <w:bookmarkStart w:id="99" w:name="_Toc242978005"/>
       <w:r>
         <w:t>Pruebas, resultados y análisis de resultados</w:t>
       </w:r>
@@ -15603,7 +15633,7 @@
       <w:bookmarkStart w:id="100" w:name="_Toc240440258"/>
       <w:bookmarkStart w:id="101" w:name="_Toc241072133"/>
       <w:bookmarkStart w:id="102" w:name="_Toc241072499"/>
-      <w:bookmarkStart w:id="103" w:name="_Toc242947361"/>
+      <w:bookmarkStart w:id="103" w:name="_Toc242978006"/>
       <w:r>
         <w:t>Planeación del diseño del experimento</w:t>
       </w:r>
@@ -15654,7 +15684,11 @@
         <w:t>Variables.</w:t>
       </w:r>
       <w:r>
-        <w:t xml:space="preserve"> La variable dependiente es el error absoluto horario |yt − ŷt| (COP/kWh), resumido en MAE, RMSE, MAPE y sMAPE. Los factores son: modelo (11 niveles: persistencia, seis modelos del diseño inicial, su ensamble, el predespacho, el ensamble con predespacho y el diseño definitivo), escenario de información (con el precio del día anterior o solo con lo publicado), horizonte (3 tramos de 24 h), origen temporal (6 regímenes ENSO) y, en el motor, rol (2) y método (4). El método es una evaluación fuera de muestra con origen móvil (walk-forward) [19] con comparaciones pareadas hora a hora.</w:t>
+        <w:t xml:space="preserve"> La variable dependiente es el error absoluto horario |yt − ŷt| (COP/kWh), resumido en MAE, RMSE, MAPE y sMAPE. Los factores son: modelo (11 niveles: persistencia, seis modelos del diseño inicial, su ensamble, el predespacho, el ensamble con predespacho y el diseño definitivo), escenario de información (con el precio del día anterior o solo con lo publicado), horizonte (3 tramos de 24 h), origen </w:t>
+      </w:r>
+      <w:r>
+        <w:lastRenderedPageBreak/>
+        <w:t>temporal (6 regímenes ENSO) y, en el motor, rol (2) y método (4). El método es una evaluación fuera de muestra con origen móvil (walk-forward) [19] con comparaciones pareadas hora a hora.</w:t>
       </w:r>
     </w:p>
     <w:p>
@@ -15674,7 +15708,7 @@
       <w:bookmarkStart w:id="104" w:name="_Toc240440261"/>
       <w:bookmarkStart w:id="105" w:name="_Toc241072136"/>
       <w:bookmarkStart w:id="106" w:name="_Toc241072500"/>
-      <w:bookmarkStart w:id="107" w:name="_Toc242947362"/>
+      <w:bookmarkStart w:id="107" w:name="_Toc242978007"/>
       <w:r>
         <w:t>Instrumentación y validación</w:t>
       </w:r>
@@ -15719,7 +15753,7 @@
       <w:bookmarkStart w:id="108" w:name="_Toc240440262"/>
       <w:bookmarkStart w:id="109" w:name="_Toc241072137"/>
       <w:bookmarkStart w:id="110" w:name="_Toc241072501"/>
-      <w:bookmarkStart w:id="111" w:name="_Toc242947363"/>
+      <w:bookmarkStart w:id="111" w:name="_Toc242978008"/>
       <w:r>
         <w:t>Marco normativo de las pruebas</w:t>
       </w:r>
@@ -15750,7 +15784,7 @@
       <w:bookmarkStart w:id="112" w:name="_Toc240440263"/>
       <w:bookmarkStart w:id="113" w:name="_Toc241072138"/>
       <w:bookmarkStart w:id="114" w:name="_Toc241072502"/>
-      <w:bookmarkStart w:id="115" w:name="_Toc242947364"/>
+      <w:bookmarkStart w:id="115" w:name="_Toc242978009"/>
       <w:r>
         <w:t>Ejecución del plan experimental</w:t>
       </w:r>
@@ -17627,7 +17661,7 @@
       <w:bookmarkStart w:id="116" w:name="_Toc240440264"/>
       <w:bookmarkStart w:id="117" w:name="_Toc241072139"/>
       <w:bookmarkStart w:id="118" w:name="_Toc241072503"/>
-      <w:bookmarkStart w:id="119" w:name="_Toc242947365"/>
+      <w:bookmarkStart w:id="119" w:name="_Toc242978010"/>
       <w:r>
         <w:t>Resultados</w:t>
       </w:r>
@@ -17662,7 +17696,7 @@
           <w:noProof/>
         </w:rPr>
         <w:drawing>
-          <wp:inline distT="0" distB="0" distL="0" distR="0" wp14:anchorId="116F99EE" wp14:editId="0170F6E9">
+          <wp:inline distT="0" distB="0" distL="0" distR="0" wp14:anchorId="78D710A4" wp14:editId="6DA66042">
             <wp:extent cx="4140000" cy="1776493"/>
             <wp:effectExtent l="0" t="0" r="0" b="0"/>
             <wp:docPr id="10" name="Picture 10"/>
@@ -18395,6 +18429,7 @@
                 <w:sz w:val="17"/>
                 <w:szCs w:val="17"/>
               </w:rPr>
+              <w:lastRenderedPageBreak/>
               <w:t>ARX+GARCH</w:t>
             </w:r>
           </w:p>
@@ -21358,7 +21393,11 @@
         <w:t>Validación histórica.</w:t>
       </w:r>
       <w:r>
-        <w:t xml:space="preserve"> Con el precio del día anterior ningún modelo individual supera de forma consistente a la persistencia (Tabla 15): N-BEATSx le gana a ARX+GARCH en 4 de 6 orígenes y frente a la persistencia gana en 2 y pierde en 2. El ensamble de seis votantes, en cambio, le gana a la persistencia con significancia en 4 de 5 años (Tabla 16). El diseño definitivo, con solo información pública, mejora al predespacho solo en los cinco años y reduce el error de la persistencia realista entre 65 % y 76 %.</w:t>
+        <w:t xml:space="preserve"> Con el precio del día anterior ningún modelo individual supera de forma consistente a la persistencia (Tabla 15): N-BEATSx le gana a ARX+GARCH en 4 de 6 orígenes y frente a la persistencia gana en 2 y pierde en 2. El ensamble de seis votantes, en cambio, le gana a la persistencia con significancia </w:t>
+      </w:r>
+      <w:r>
+        <w:lastRenderedPageBreak/>
+        <w:t>en 4 de 5 años (Tabla 16). El diseño definitivo, con solo información pública, mejora al predespacho solo en los cinco años y reduce el error de la persistencia realista entre 65 % y 76 %.</w:t>
       </w:r>
     </w:p>
     <w:p>
@@ -24419,7 +24458,11 @@
         <w:t>OE3 y OE4 — Motor de decisión.</w:t>
       </w:r>
       <w:r>
-        <w:t xml:space="preserve"> La ventaja es la diferencia entre el precio medio en las horas en que el motor recomienda actuar y el del periodo (precio medio 2026: 394,9 COP/kWh). Con el criterio de ventaja promedio ganarían «fijo» o «banda» en los cuatro casos (de 274 a 366 COP/kWh), pero al evaluar por separado las dos mitades del periodo (corte: 19 de abril) ese resultado no se sostiene: para el generador a 24 h, «fijo» actúa en el 2,7 % de las horas de la primera mitad y en el 39,7 % de la segunda, y para el comercializador, en el 23,5 % y en el 1,1 % (Tabla 20, Figura 8). La causa es la referencia fija: el precio de 2026 se alejó del rango 2019-2025, de modo que casi todas las horas quedan por encima o por debajo de los percentiles históricos. Con el criterio de estabilidad y el filtro intradía, el motor elige «rodante» en los cuatro casos, con ventaja positiva y frecuencia válida en las dos mitades (Tabla 19). Su ventaja promedio es menor (187,5 a 244,7 COP/kWh), pero se mantiene en todo el año. Con un pronóstico mejor la ventaja de las reglas de umbral casi no cambia, porque premia sobre todo actuar en los meses caros; el filtro intradía es el que mejora la mitad más débil del generador a 24 h, de 73,4 a 109,3 COP/kWh.</w:t>
+        <w:t xml:space="preserve"> La ventaja es la diferencia entre el precio medio en las horas en que el motor recomienda actuar y el del periodo (precio medio 2026: 394,9 COP/kWh). Con el criterio de ventaja promedio ganarían «fijo» o «banda» en los cuatro casos (de 274 a 366 COP/kWh), pero al evaluar por separado las dos mitades del periodo (corte: 19 de abril) ese resultado no se sostiene: para el generador a 24 h, «fijo» actúa en el 2,7 % de las horas de la primera mitad y en el 39,7 % de la segunda, y para el comercializador, en el 23,5 % y en el 1,1 % (Tabla 20, Figura 8). La causa es la referencia fija: el precio de </w:t>
+      </w:r>
+      <w:r>
+        <w:lastRenderedPageBreak/>
+        <w:t>2026 se alejó del rango 2019-2025, de modo que casi todas las horas quedan por encima o por debajo de los percentiles históricos. Con el criterio de estabilidad y el filtro intradía, el motor elige «rodante» en los cuatro casos, con ventaja positiva y frecuencia válida en las dos mitades (Tabla 19). Su ventaja promedio es menor (187,5 a 244,7 COP/kWh), pero se mantiene en todo el año. Con un pronóstico mejor la ventaja de las reglas de umbral casi no cambia, porque premia sobre todo actuar en los meses caros; el filtro intradía es el que mejora la mitad más débil del generador a 24 h, de 73,4 a 109,3 COP/kWh.</w:t>
       </w:r>
     </w:p>
     <w:p>
@@ -26753,7 +26796,7 @@
           <w:noProof/>
         </w:rPr>
         <w:drawing>
-          <wp:inline distT="0" distB="0" distL="0" distR="0" wp14:anchorId="65BD0C01" wp14:editId="20826785">
+          <wp:inline distT="0" distB="0" distL="0" distR="0" wp14:anchorId="22C7A769" wp14:editId="606E1C1E">
             <wp:extent cx="4482000" cy="1859524"/>
             <wp:effectExtent l="0" t="0" r="0" b="0"/>
             <wp:docPr id="19" name="Picture 19"/>
@@ -26822,7 +26865,11 @@
         <w:t>Sensibilidad de los umbrales.</w:t>
       </w:r>
       <w:r>
-        <w:t xml:space="preserve"> Se barrieron seis pares de percentiles (10/90 a 35/65) con el método elegido para el generador a 24 h (Figura 9). No aparece un óptimo interior: los pares más extremos dan más ventaja por hora de acción pero actúan menos (294,0 COP/kWh en el 14,8 % de las horas con 10/90, frente a 207,3 en el 27,5 % con 35/65), y el par 25/75 queda en un punto intermedio (244,7 COP/kWh, 22,1 %). En el barrido de la bitácora también se probaron ventanas rodantes de 7 a 90 días, percentiles del filtro de ancho de 60 a 90, histéresis y lógica difusa: ninguna configuración ajustada en una mitad de 2026 mejoró a la actual en la otra, por lo que se conservaron los valores por defecto.</w:t>
+        <w:t xml:space="preserve"> Se barrieron seis pares de percentiles (10/90 a 35/65) con el método elegido para el generador a 24 h (Figura 9). No aparece un óptimo interior: los pares más extremos dan más ventaja por hora de acción pero actúan menos (294,0 COP/kWh en el 14,8 % de las horas con 10/90, frente a 207,3 en el 27,5 % con 35/65), y el par 25/75 queda en un punto intermedio (244,7 COP/kWh, 22,1 %). </w:t>
+      </w:r>
+      <w:r>
+        <w:lastRenderedPageBreak/>
+        <w:t>En el barrido de la bitácora también se probaron ventanas rodantes de 7 a 90 días, percentiles del filtro de ancho de 60 a 90, histéresis y lógica difusa: ninguna configuración ajustada en una mitad de 2026 mejoró a la actual en la otra, por lo que se conservaron los valores por defecto.</w:t>
       </w:r>
     </w:p>
     <w:p>
@@ -26836,7 +26883,7 @@
           <w:noProof/>
         </w:rPr>
         <w:drawing>
-          <wp:inline distT="0" distB="0" distL="0" distR="0" wp14:anchorId="45CA2080" wp14:editId="764D9767">
+          <wp:inline distT="0" distB="0" distL="0" distR="0" wp14:anchorId="7B3994D8" wp14:editId="6B101C86">
             <wp:extent cx="4482000" cy="1859524"/>
             <wp:effectExtent l="0" t="0" r="0" b="0"/>
             <wp:docPr id="20" name="Picture 20"/>
@@ -26919,7 +26966,7 @@
           <w:noProof/>
         </w:rPr>
         <w:drawing>
-          <wp:inline distT="0" distB="0" distL="0" distR="0" wp14:anchorId="19B64082" wp14:editId="7FD578E4">
+          <wp:inline distT="0" distB="0" distL="0" distR="0" wp14:anchorId="64233CD6" wp14:editId="36E1B6D5">
             <wp:extent cx="4482000" cy="1859524"/>
             <wp:effectExtent l="0" t="0" r="0" b="0"/>
             <wp:docPr id="21" name="Picture 21"/>
@@ -27027,7 +27074,11 @@
         <w:t>N</w:t>
       </w:r>
       <w:r>
-        <w:t xml:space="preserve"> usuarios mediante un cuestionario anónimo en Microsoft Forms: perfil (relación con el sector, familiaridad con el mercado y dispositivo), once afirmaciones sobre la comprensión y la utilidad de cada imagen de decisión con una escala de acuerdo de cinco niveles, una nota global de 1 a 10 y tres preguntas abiertas (lo más útil, lo que cambiarían y lo que agregarían). </w:t>
+        <w:t xml:space="preserve"> usuarios mediante un cuestionario anónimo en Microsoft Forms: perfil (relación con el sector, familiaridad con el mercado y dispositivo), once </w:t>
+      </w:r>
+      <w:r>
+        <w:lastRenderedPageBreak/>
+        <w:t xml:space="preserve">afirmaciones sobre la comprensión y la utilidad de cada imagen de decisión con una escala de acuerdo de cinco niveles, una nota global de 1 a 10 y tres preguntas abiertas (lo más útil, lo que cambiarían y lo que agregarían). </w:t>
       </w:r>
       <w:r>
         <w:rPr>
@@ -28079,7 +28130,7 @@
       <w:bookmarkStart w:id="120" w:name="_Toc240440265"/>
       <w:bookmarkStart w:id="121" w:name="_Toc241072140"/>
       <w:bookmarkStart w:id="122" w:name="_Toc241072504"/>
-      <w:bookmarkStart w:id="123" w:name="_Toc242947366"/>
+      <w:bookmarkStart w:id="123" w:name="_Toc242978011"/>
       <w:r>
         <w:t>Análisis e interpretación de resultados</w:t>
       </w:r>
@@ -28142,6 +28193,7 @@
         <w:rPr>
           <w:b/>
         </w:rPr>
+        <w:lastRenderedPageBreak/>
         <w:t>Validación externa (Tabla 4).</w:t>
       </w:r>
       <w:r>
@@ -28197,7 +28249,7 @@
       <w:bookmarkStart w:id="124" w:name="_Toc241072141"/>
       <w:bookmarkStart w:id="125" w:name="_Toc241072505"/>
       <w:bookmarkStart w:id="126" w:name="_Toc240440266"/>
-      <w:bookmarkStart w:id="127" w:name="_Toc242947367"/>
+      <w:bookmarkStart w:id="127" w:name="_Toc242978012"/>
       <w:r>
         <w:t>Análisis de impacto del proyecto</w:t>
       </w:r>
@@ -28219,7 +28271,7 @@
         </w:numPr>
         <w:spacing w:before="300"/>
       </w:pPr>
-      <w:bookmarkStart w:id="128" w:name="_Toc242947368"/>
+      <w:bookmarkStart w:id="128" w:name="_Toc242978013"/>
       <w:r>
         <w:t>Impacto social</w:t>
       </w:r>
@@ -28244,7 +28296,7 @@
         </w:numPr>
         <w:spacing w:before="300"/>
       </w:pPr>
-      <w:bookmarkStart w:id="129" w:name="_Toc242947369"/>
+      <w:bookmarkStart w:id="129" w:name="_Toc242978014"/>
       <w:r>
         <w:t>Impacto ambiental</w:t>
       </w:r>
@@ -28269,7 +28321,7 @@
         </w:numPr>
         <w:spacing w:before="300"/>
       </w:pPr>
-      <w:bookmarkStart w:id="130" w:name="_Toc242947370"/>
+      <w:bookmarkStart w:id="130" w:name="_Toc242978015"/>
       <w:r>
         <w:t>Impacto legal y regulatorio</w:t>
       </w:r>
@@ -28294,8 +28346,9 @@
         </w:numPr>
         <w:spacing w:before="300"/>
       </w:pPr>
-      <w:bookmarkStart w:id="131" w:name="_Toc242947371"/>
-      <w:r>
+      <w:bookmarkStart w:id="131" w:name="_Toc242978016"/>
+      <w:r>
+        <w:lastRenderedPageBreak/>
         <w:t>Impacto económico y financiero</w:t>
       </w:r>
       <w:bookmarkEnd w:id="131"/>
@@ -28322,7 +28375,7 @@
       <w:bookmarkStart w:id="132" w:name="_Toc240440267"/>
       <w:bookmarkStart w:id="133" w:name="_Toc241072142"/>
       <w:bookmarkStart w:id="134" w:name="_Toc241072506"/>
-      <w:bookmarkStart w:id="135" w:name="_Toc242947372"/>
+      <w:bookmarkStart w:id="135" w:name="_Toc242978017"/>
       <w:r>
         <w:t>Conclusiones y recomendaciones</w:t>
       </w:r>
@@ -28398,8 +28451,9 @@
       <w:bookmarkStart w:id="136" w:name="_Toc240440268"/>
       <w:bookmarkStart w:id="137" w:name="_Toc241072143"/>
       <w:bookmarkStart w:id="138" w:name="_Toc241072507"/>
-      <w:bookmarkStart w:id="139" w:name="_Toc242947373"/>
-      <w:r>
+      <w:bookmarkStart w:id="139" w:name="_Toc242978018"/>
+      <w:r>
+        <w:lastRenderedPageBreak/>
         <w:t>Bibliografía (formato IEEE)</w:t>
       </w:r>
       <w:bookmarkEnd w:id="136"/>
@@ -29005,6 +29059,7 @@
           <w:sz w:val="20"/>
           <w:szCs w:val="20"/>
         </w:rPr>
+        <w:lastRenderedPageBreak/>
         <w:t>[19]</w:t>
       </w:r>
       <w:r>
@@ -29722,6 +29777,7 @@
           <w:sz w:val="20"/>
           <w:szCs w:val="20"/>
         </w:rPr>
+        <w:lastRenderedPageBreak/>
         <w:t>[41]</w:t>
       </w:r>
       <w:r>
@@ -29746,7 +29802,7 @@
       <w:bookmarkStart w:id="140" w:name="_Toc240440270"/>
       <w:bookmarkStart w:id="141" w:name="_Toc241072144"/>
       <w:bookmarkStart w:id="142" w:name="_Toc241072508"/>
-      <w:bookmarkStart w:id="143" w:name="_Toc242947374"/>
+      <w:bookmarkStart w:id="143" w:name="_Toc242978019"/>
       <w:r>
         <w:t>Anexos</w:t>
       </w:r>

</xml_diff>

<commit_message>
Manual e informe con la franja de tintes nuevos y la vista del 16-oct actualizada
Capturas regeneradas (franja horaria con los tintes mas fuertes del modo claro). El pronostico del
16-oct se recalculo en la corrida de las 20:46, asi que el texto de la Figura 4 pasa a 441 COP/kWh,
riesgo de desplome de 56 % y 7 de 24 horas para vender.

Co-Authored-By: Claude Opus 5.5 <noreply@anthropic.com>
</commit_message>
<xml_diff>
--- a/docs/Informe_Final_ABET_Barcelo_Dede.docx
+++ b/docs/Informe_Final_ABET_Barcelo_Dede.docx
@@ -192,7 +192,7 @@
       <w:bookmarkStart w:id="0" w:name="_Toc240440229"/>
       <w:bookmarkStart w:id="1" w:name="_Toc241072106"/>
       <w:bookmarkStart w:id="2" w:name="_Toc241072472"/>
-      <w:bookmarkStart w:id="3" w:name="_Toc242977981"/>
+      <w:bookmarkStart w:id="3" w:name="_Toc242994533"/>
       <w:r>
         <w:lastRenderedPageBreak/>
         <w:t>Tabla de contenido</w:t>
@@ -228,7 +228,7 @@
       <w:r>
         <w:fldChar w:fldCharType="separate"/>
       </w:r>
-      <w:hyperlink w:anchor="_Toc242977981" w:history="1">
+      <w:hyperlink w:anchor="_Toc242994533" w:history="1">
         <w:r>
           <w:rPr>
             <w:rStyle w:val="Hyperlink"/>
@@ -255,7 +255,7 @@
             <w:noProof/>
             <w:webHidden/>
           </w:rPr>
-          <w:instrText xml:space="preserve"> PAGEREF _Toc242977981 \h </w:instrText>
+          <w:instrText xml:space="preserve"> PAGEREF _Toc242994533 \h </w:instrText>
         </w:r>
         <w:r>
           <w:rPr>
@@ -304,7 +304,7 @@
           <w:lang w:eastAsia="es-CO"/>
         </w:rPr>
       </w:pPr>
-      <w:hyperlink w:anchor="_Toc242977982" w:history="1">
+      <w:hyperlink w:anchor="_Toc242994534" w:history="1">
         <w:r>
           <w:rPr>
             <w:rStyle w:val="Hyperlink"/>
@@ -351,7 +351,7 @@
             <w:noProof/>
             <w:webHidden/>
           </w:rPr>
-          <w:instrText xml:space="preserve"> PAGEREF _Toc242977982 \h </w:instrText>
+          <w:instrText xml:space="preserve"> PAGEREF _Toc242994534 \h </w:instrText>
         </w:r>
         <w:r>
           <w:rPr>
@@ -398,7 +398,7 @@
           <w:lang w:eastAsia="es-CO"/>
         </w:rPr>
       </w:pPr>
-      <w:hyperlink w:anchor="_Toc242977983" w:history="1">
+      <w:hyperlink w:anchor="_Toc242994535" w:history="1">
         <w:r>
           <w:rPr>
             <w:rStyle w:val="Hyperlink"/>
@@ -443,7 +443,7 @@
             <w:noProof/>
             <w:webHidden/>
           </w:rPr>
-          <w:instrText xml:space="preserve"> PAGEREF _Toc242977983 \h </w:instrText>
+          <w:instrText xml:space="preserve"> PAGEREF _Toc242994535 \h </w:instrText>
         </w:r>
         <w:r>
           <w:rPr>
@@ -490,7 +490,7 @@
           <w:lang w:eastAsia="es-CO"/>
         </w:rPr>
       </w:pPr>
-      <w:hyperlink w:anchor="_Toc242977984" w:history="1">
+      <w:hyperlink w:anchor="_Toc242994536" w:history="1">
         <w:r>
           <w:rPr>
             <w:rStyle w:val="Hyperlink"/>
@@ -535,7 +535,7 @@
             <w:noProof/>
             <w:webHidden/>
           </w:rPr>
-          <w:instrText xml:space="preserve"> PAGEREF _Toc242977984 \h </w:instrText>
+          <w:instrText xml:space="preserve"> PAGEREF _Toc242994536 \h </w:instrText>
         </w:r>
         <w:r>
           <w:rPr>
@@ -582,7 +582,7 @@
           <w:lang w:eastAsia="es-CO"/>
         </w:rPr>
       </w:pPr>
-      <w:hyperlink w:anchor="_Toc242977985" w:history="1">
+      <w:hyperlink w:anchor="_Toc242994537" w:history="1">
         <w:r>
           <w:rPr>
             <w:rStyle w:val="Hyperlink"/>
@@ -627,7 +627,7 @@
             <w:noProof/>
             <w:webHidden/>
           </w:rPr>
-          <w:instrText xml:space="preserve"> PAGEREF _Toc242977985 \h </w:instrText>
+          <w:instrText xml:space="preserve"> PAGEREF _Toc242994537 \h </w:instrText>
         </w:r>
         <w:r>
           <w:rPr>
@@ -676,7 +676,7 @@
           <w:lang w:eastAsia="es-CO"/>
         </w:rPr>
       </w:pPr>
-      <w:hyperlink w:anchor="_Toc242977986" w:history="1">
+      <w:hyperlink w:anchor="_Toc242994538" w:history="1">
         <w:r>
           <w:rPr>
             <w:rStyle w:val="Hyperlink"/>
@@ -723,7 +723,7 @@
             <w:noProof/>
             <w:webHidden/>
           </w:rPr>
-          <w:instrText xml:space="preserve"> PAGEREF _Toc242977986 \h </w:instrText>
+          <w:instrText xml:space="preserve"> PAGEREF _Toc242994538 \h </w:instrText>
         </w:r>
         <w:r>
           <w:rPr>
@@ -772,7 +772,7 @@
           <w:lang w:eastAsia="es-CO"/>
         </w:rPr>
       </w:pPr>
-      <w:hyperlink w:anchor="_Toc242977987" w:history="1">
+      <w:hyperlink w:anchor="_Toc242994539" w:history="1">
         <w:r>
           <w:rPr>
             <w:rStyle w:val="Hyperlink"/>
@@ -819,7 +819,7 @@
             <w:noProof/>
             <w:webHidden/>
           </w:rPr>
-          <w:instrText xml:space="preserve"> PAGEREF _Toc242977987 \h </w:instrText>
+          <w:instrText xml:space="preserve"> PAGEREF _Toc242994539 \h </w:instrText>
         </w:r>
         <w:r>
           <w:rPr>
@@ -866,7 +866,7 @@
           <w:lang w:eastAsia="es-CO"/>
         </w:rPr>
       </w:pPr>
-      <w:hyperlink w:anchor="_Toc242977988" w:history="1">
+      <w:hyperlink w:anchor="_Toc242994540" w:history="1">
         <w:r>
           <w:rPr>
             <w:rStyle w:val="Hyperlink"/>
@@ -911,7 +911,7 @@
             <w:noProof/>
             <w:webHidden/>
           </w:rPr>
-          <w:instrText xml:space="preserve"> PAGEREF _Toc242977988 \h </w:instrText>
+          <w:instrText xml:space="preserve"> PAGEREF _Toc242994540 \h </w:instrText>
         </w:r>
         <w:r>
           <w:rPr>
@@ -958,7 +958,7 @@
           <w:lang w:eastAsia="es-CO"/>
         </w:rPr>
       </w:pPr>
-      <w:hyperlink w:anchor="_Toc242977989" w:history="1">
+      <w:hyperlink w:anchor="_Toc242994541" w:history="1">
         <w:r>
           <w:rPr>
             <w:rStyle w:val="Hyperlink"/>
@@ -1003,7 +1003,7 @@
             <w:noProof/>
             <w:webHidden/>
           </w:rPr>
-          <w:instrText xml:space="preserve"> PAGEREF _Toc242977989 \h </w:instrText>
+          <w:instrText xml:space="preserve"> PAGEREF _Toc242994541 \h </w:instrText>
         </w:r>
         <w:r>
           <w:rPr>
@@ -1052,7 +1052,7 @@
           <w:lang w:eastAsia="es-CO"/>
         </w:rPr>
       </w:pPr>
-      <w:hyperlink w:anchor="_Toc242977990" w:history="1">
+      <w:hyperlink w:anchor="_Toc242994542" w:history="1">
         <w:r>
           <w:rPr>
             <w:rStyle w:val="Hyperlink"/>
@@ -1099,7 +1099,7 @@
             <w:noProof/>
             <w:webHidden/>
           </w:rPr>
-          <w:instrText xml:space="preserve"> PAGEREF _Toc242977990 \h </w:instrText>
+          <w:instrText xml:space="preserve"> PAGEREF _Toc242994542 \h </w:instrText>
         </w:r>
         <w:r>
           <w:rPr>
@@ -1146,7 +1146,7 @@
           <w:lang w:eastAsia="es-CO"/>
         </w:rPr>
       </w:pPr>
-      <w:hyperlink w:anchor="_Toc242977991" w:history="1">
+      <w:hyperlink w:anchor="_Toc242994543" w:history="1">
         <w:r>
           <w:rPr>
             <w:rStyle w:val="Hyperlink"/>
@@ -1191,7 +1191,7 @@
             <w:noProof/>
             <w:webHidden/>
           </w:rPr>
-          <w:instrText xml:space="preserve"> PAGEREF _Toc242977991 \h </w:instrText>
+          <w:instrText xml:space="preserve"> PAGEREF _Toc242994543 \h </w:instrText>
         </w:r>
         <w:r>
           <w:rPr>
@@ -1238,7 +1238,7 @@
           <w:lang w:eastAsia="es-CO"/>
         </w:rPr>
       </w:pPr>
-      <w:hyperlink w:anchor="_Toc242977992" w:history="1">
+      <w:hyperlink w:anchor="_Toc242994544" w:history="1">
         <w:r>
           <w:rPr>
             <w:rStyle w:val="Hyperlink"/>
@@ -1283,7 +1283,7 @@
             <w:noProof/>
             <w:webHidden/>
           </w:rPr>
-          <w:instrText xml:space="preserve"> PAGEREF _Toc242977992 \h </w:instrText>
+          <w:instrText xml:space="preserve"> PAGEREF _Toc242994544 \h </w:instrText>
         </w:r>
         <w:r>
           <w:rPr>
@@ -1330,7 +1330,7 @@
           <w:lang w:eastAsia="es-CO"/>
         </w:rPr>
       </w:pPr>
-      <w:hyperlink w:anchor="_Toc242977993" w:history="1">
+      <w:hyperlink w:anchor="_Toc242994545" w:history="1">
         <w:r>
           <w:rPr>
             <w:rStyle w:val="Hyperlink"/>
@@ -1375,7 +1375,7 @@
             <w:noProof/>
             <w:webHidden/>
           </w:rPr>
-          <w:instrText xml:space="preserve"> PAGEREF _Toc242977993 \h </w:instrText>
+          <w:instrText xml:space="preserve"> PAGEREF _Toc242994545 \h </w:instrText>
         </w:r>
         <w:r>
           <w:rPr>
@@ -1424,7 +1424,7 @@
           <w:lang w:eastAsia="es-CO"/>
         </w:rPr>
       </w:pPr>
-      <w:hyperlink w:anchor="_Toc242977994" w:history="1">
+      <w:hyperlink w:anchor="_Toc242994546" w:history="1">
         <w:r>
           <w:rPr>
             <w:rStyle w:val="Hyperlink"/>
@@ -1471,7 +1471,7 @@
             <w:noProof/>
             <w:webHidden/>
           </w:rPr>
-          <w:instrText xml:space="preserve"> PAGEREF _Toc242977994 \h </w:instrText>
+          <w:instrText xml:space="preserve"> PAGEREF _Toc242994546 \h </w:instrText>
         </w:r>
         <w:r>
           <w:rPr>
@@ -1518,7 +1518,7 @@
           <w:lang w:eastAsia="es-CO"/>
         </w:rPr>
       </w:pPr>
-      <w:hyperlink w:anchor="_Toc242977995" w:history="1">
+      <w:hyperlink w:anchor="_Toc242994547" w:history="1">
         <w:r>
           <w:rPr>
             <w:rStyle w:val="Hyperlink"/>
@@ -1563,7 +1563,7 @@
             <w:noProof/>
             <w:webHidden/>
           </w:rPr>
-          <w:instrText xml:space="preserve"> PAGEREF _Toc242977995 \h </w:instrText>
+          <w:instrText xml:space="preserve"> PAGEREF _Toc242994547 \h </w:instrText>
         </w:r>
         <w:r>
           <w:rPr>
@@ -1610,7 +1610,7 @@
           <w:lang w:eastAsia="es-CO"/>
         </w:rPr>
       </w:pPr>
-      <w:hyperlink w:anchor="_Toc242977996" w:history="1">
+      <w:hyperlink w:anchor="_Toc242994548" w:history="1">
         <w:r>
           <w:rPr>
             <w:rStyle w:val="Hyperlink"/>
@@ -1655,7 +1655,7 @@
             <w:noProof/>
             <w:webHidden/>
           </w:rPr>
-          <w:instrText xml:space="preserve"> PAGEREF _Toc242977996 \h </w:instrText>
+          <w:instrText xml:space="preserve"> PAGEREF _Toc242994548 \h </w:instrText>
         </w:r>
         <w:r>
           <w:rPr>
@@ -1704,7 +1704,7 @@
           <w:lang w:eastAsia="es-CO"/>
         </w:rPr>
       </w:pPr>
-      <w:hyperlink w:anchor="_Toc242977997" w:history="1">
+      <w:hyperlink w:anchor="_Toc242994549" w:history="1">
         <w:r>
           <w:rPr>
             <w:rStyle w:val="Hyperlink"/>
@@ -1751,7 +1751,7 @@
             <w:noProof/>
             <w:webHidden/>
           </w:rPr>
-          <w:instrText xml:space="preserve"> PAGEREF _Toc242977997 \h </w:instrText>
+          <w:instrText xml:space="preserve"> PAGEREF _Toc242994549 \h </w:instrText>
         </w:r>
         <w:r>
           <w:rPr>
@@ -1798,7 +1798,7 @@
           <w:lang w:eastAsia="es-CO"/>
         </w:rPr>
       </w:pPr>
-      <w:hyperlink w:anchor="_Toc242977998" w:history="1">
+      <w:hyperlink w:anchor="_Toc242994550" w:history="1">
         <w:r>
           <w:rPr>
             <w:rStyle w:val="Hyperlink"/>
@@ -1843,7 +1843,7 @@
             <w:noProof/>
             <w:webHidden/>
           </w:rPr>
-          <w:instrText xml:space="preserve"> PAGEREF _Toc242977998 \h </w:instrText>
+          <w:instrText xml:space="preserve"> PAGEREF _Toc242994550 \h </w:instrText>
         </w:r>
         <w:r>
           <w:rPr>
@@ -1890,7 +1890,7 @@
           <w:lang w:eastAsia="es-CO"/>
         </w:rPr>
       </w:pPr>
-      <w:hyperlink w:anchor="_Toc242977999" w:history="1">
+      <w:hyperlink w:anchor="_Toc242994551" w:history="1">
         <w:r>
           <w:rPr>
             <w:rStyle w:val="Hyperlink"/>
@@ -1935,7 +1935,7 @@
             <w:noProof/>
             <w:webHidden/>
           </w:rPr>
-          <w:instrText xml:space="preserve"> PAGEREF _Toc242977999 \h </w:instrText>
+          <w:instrText xml:space="preserve"> PAGEREF _Toc242994551 \h </w:instrText>
         </w:r>
         <w:r>
           <w:rPr>
@@ -1982,7 +1982,7 @@
           <w:lang w:eastAsia="es-CO"/>
         </w:rPr>
       </w:pPr>
-      <w:hyperlink w:anchor="_Toc242978000" w:history="1">
+      <w:hyperlink w:anchor="_Toc242994552" w:history="1">
         <w:r>
           <w:rPr>
             <w:rStyle w:val="Hyperlink"/>
@@ -2027,7 +2027,7 @@
             <w:noProof/>
             <w:webHidden/>
           </w:rPr>
-          <w:instrText xml:space="preserve"> PAGEREF _Toc242978000 \h </w:instrText>
+          <w:instrText xml:space="preserve"> PAGEREF _Toc242994552 \h </w:instrText>
         </w:r>
         <w:r>
           <w:rPr>
@@ -2074,7 +2074,7 @@
           <w:lang w:eastAsia="es-CO"/>
         </w:rPr>
       </w:pPr>
-      <w:hyperlink w:anchor="_Toc242978001" w:history="1">
+      <w:hyperlink w:anchor="_Toc242994553" w:history="1">
         <w:r>
           <w:rPr>
             <w:rStyle w:val="Hyperlink"/>
@@ -2119,7 +2119,7 @@
             <w:noProof/>
             <w:webHidden/>
           </w:rPr>
-          <w:instrText xml:space="preserve"> PAGEREF _Toc242978001 \h </w:instrText>
+          <w:instrText xml:space="preserve"> PAGEREF _Toc242994553 \h </w:instrText>
         </w:r>
         <w:r>
           <w:rPr>
@@ -2166,7 +2166,7 @@
           <w:lang w:eastAsia="es-CO"/>
         </w:rPr>
       </w:pPr>
-      <w:hyperlink w:anchor="_Toc242978002" w:history="1">
+      <w:hyperlink w:anchor="_Toc242994554" w:history="1">
         <w:r>
           <w:rPr>
             <w:rStyle w:val="Hyperlink"/>
@@ -2211,7 +2211,7 @@
             <w:noProof/>
             <w:webHidden/>
           </w:rPr>
-          <w:instrText xml:space="preserve"> PAGEREF _Toc242978002 \h </w:instrText>
+          <w:instrText xml:space="preserve"> PAGEREF _Toc242994554 \h </w:instrText>
         </w:r>
         <w:r>
           <w:rPr>
@@ -2258,7 +2258,7 @@
           <w:lang w:eastAsia="es-CO"/>
         </w:rPr>
       </w:pPr>
-      <w:hyperlink w:anchor="_Toc242978003" w:history="1">
+      <w:hyperlink w:anchor="_Toc242994555" w:history="1">
         <w:r>
           <w:rPr>
             <w:rStyle w:val="Hyperlink"/>
@@ -2303,7 +2303,7 @@
             <w:noProof/>
             <w:webHidden/>
           </w:rPr>
-          <w:instrText xml:space="preserve"> PAGEREF _Toc242978003 \h </w:instrText>
+          <w:instrText xml:space="preserve"> PAGEREF _Toc242994555 \h </w:instrText>
         </w:r>
         <w:r>
           <w:rPr>
@@ -2350,7 +2350,7 @@
           <w:lang w:eastAsia="es-CO"/>
         </w:rPr>
       </w:pPr>
-      <w:hyperlink w:anchor="_Toc242978004" w:history="1">
+      <w:hyperlink w:anchor="_Toc242994556" w:history="1">
         <w:r>
           <w:rPr>
             <w:rStyle w:val="Hyperlink"/>
@@ -2395,7 +2395,7 @@
             <w:noProof/>
             <w:webHidden/>
           </w:rPr>
-          <w:instrText xml:space="preserve"> PAGEREF _Toc242978004 \h </w:instrText>
+          <w:instrText xml:space="preserve"> PAGEREF _Toc242994556 \h </w:instrText>
         </w:r>
         <w:r>
           <w:rPr>
@@ -2444,7 +2444,7 @@
           <w:lang w:eastAsia="es-CO"/>
         </w:rPr>
       </w:pPr>
-      <w:hyperlink w:anchor="_Toc242978005" w:history="1">
+      <w:hyperlink w:anchor="_Toc242994557" w:history="1">
         <w:r>
           <w:rPr>
             <w:rStyle w:val="Hyperlink"/>
@@ -2491,7 +2491,7 @@
             <w:noProof/>
             <w:webHidden/>
           </w:rPr>
-          <w:instrText xml:space="preserve"> PAGEREF _Toc242978005 \h </w:instrText>
+          <w:instrText xml:space="preserve"> PAGEREF _Toc242994557 \h </w:instrText>
         </w:r>
         <w:r>
           <w:rPr>
@@ -2538,7 +2538,7 @@
           <w:lang w:eastAsia="es-CO"/>
         </w:rPr>
       </w:pPr>
-      <w:hyperlink w:anchor="_Toc242978006" w:history="1">
+      <w:hyperlink w:anchor="_Toc242994558" w:history="1">
         <w:r>
           <w:rPr>
             <w:rStyle w:val="Hyperlink"/>
@@ -2583,7 +2583,7 @@
             <w:noProof/>
             <w:webHidden/>
           </w:rPr>
-          <w:instrText xml:space="preserve"> PAGEREF _Toc242978006 \h </w:instrText>
+          <w:instrText xml:space="preserve"> PAGEREF _Toc242994558 \h </w:instrText>
         </w:r>
         <w:r>
           <w:rPr>
@@ -2631,7 +2631,7 @@
           <w:lang w:eastAsia="es-CO"/>
         </w:rPr>
       </w:pPr>
-      <w:hyperlink w:anchor="_Toc242978007" w:history="1">
+      <w:hyperlink w:anchor="_Toc242994559" w:history="1">
         <w:r>
           <w:rPr>
             <w:rStyle w:val="Hyperlink"/>
@@ -2677,7 +2677,7 @@
             <w:noProof/>
             <w:webHidden/>
           </w:rPr>
-          <w:instrText xml:space="preserve"> PAGEREF _Toc242978007 \h </w:instrText>
+          <w:instrText xml:space="preserve"> PAGEREF _Toc242994559 \h </w:instrText>
         </w:r>
         <w:r>
           <w:rPr>
@@ -2725,7 +2725,7 @@
           <w:lang w:eastAsia="es-CO"/>
         </w:rPr>
       </w:pPr>
-      <w:hyperlink w:anchor="_Toc242978008" w:history="1">
+      <w:hyperlink w:anchor="_Toc242994560" w:history="1">
         <w:r>
           <w:rPr>
             <w:rStyle w:val="Hyperlink"/>
@@ -2771,7 +2771,7 @@
             <w:noProof/>
             <w:webHidden/>
           </w:rPr>
-          <w:instrText xml:space="preserve"> PAGEREF _Toc242978008 \h </w:instrText>
+          <w:instrText xml:space="preserve"> PAGEREF _Toc242994560 \h </w:instrText>
         </w:r>
         <w:r>
           <w:rPr>
@@ -2818,7 +2818,7 @@
           <w:lang w:eastAsia="es-CO"/>
         </w:rPr>
       </w:pPr>
-      <w:hyperlink w:anchor="_Toc242978009" w:history="1">
+      <w:hyperlink w:anchor="_Toc242994561" w:history="1">
         <w:r>
           <w:rPr>
             <w:rStyle w:val="Hyperlink"/>
@@ -2863,7 +2863,7 @@
             <w:noProof/>
             <w:webHidden/>
           </w:rPr>
-          <w:instrText xml:space="preserve"> PAGEREF _Toc242978009 \h </w:instrText>
+          <w:instrText xml:space="preserve"> PAGEREF _Toc242994561 \h </w:instrText>
         </w:r>
         <w:r>
           <w:rPr>
@@ -2910,7 +2910,7 @@
           <w:lang w:eastAsia="es-CO"/>
         </w:rPr>
       </w:pPr>
-      <w:hyperlink w:anchor="_Toc242978010" w:history="1">
+      <w:hyperlink w:anchor="_Toc242994562" w:history="1">
         <w:r>
           <w:rPr>
             <w:rStyle w:val="Hyperlink"/>
@@ -2955,7 +2955,7 @@
             <w:noProof/>
             <w:webHidden/>
           </w:rPr>
-          <w:instrText xml:space="preserve"> PAGEREF _Toc242978010 \h </w:instrText>
+          <w:instrText xml:space="preserve"> PAGEREF _Toc242994562 \h </w:instrText>
         </w:r>
         <w:r>
           <w:rPr>
@@ -3002,7 +3002,7 @@
           <w:lang w:eastAsia="es-CO"/>
         </w:rPr>
       </w:pPr>
-      <w:hyperlink w:anchor="_Toc242978011" w:history="1">
+      <w:hyperlink w:anchor="_Toc242994563" w:history="1">
         <w:r>
           <w:rPr>
             <w:rStyle w:val="Hyperlink"/>
@@ -3047,7 +3047,7 @@
             <w:noProof/>
             <w:webHidden/>
           </w:rPr>
-          <w:instrText xml:space="preserve"> PAGEREF _Toc242978011 \h </w:instrText>
+          <w:instrText xml:space="preserve"> PAGEREF _Toc242994563 \h </w:instrText>
         </w:r>
         <w:r>
           <w:rPr>
@@ -3096,7 +3096,7 @@
           <w:lang w:eastAsia="es-CO"/>
         </w:rPr>
       </w:pPr>
-      <w:hyperlink w:anchor="_Toc242978012" w:history="1">
+      <w:hyperlink w:anchor="_Toc242994564" w:history="1">
         <w:r>
           <w:rPr>
             <w:rStyle w:val="Hyperlink"/>
@@ -3143,7 +3143,7 @@
             <w:noProof/>
             <w:webHidden/>
           </w:rPr>
-          <w:instrText xml:space="preserve"> PAGEREF _Toc242978012 \h </w:instrText>
+          <w:instrText xml:space="preserve"> PAGEREF _Toc242994564 \h </w:instrText>
         </w:r>
         <w:r>
           <w:rPr>
@@ -3190,7 +3190,7 @@
           <w:lang w:eastAsia="es-CO"/>
         </w:rPr>
       </w:pPr>
-      <w:hyperlink w:anchor="_Toc242978013" w:history="1">
+      <w:hyperlink w:anchor="_Toc242994565" w:history="1">
         <w:r>
           <w:rPr>
             <w:rStyle w:val="Hyperlink"/>
@@ -3235,7 +3235,7 @@
             <w:noProof/>
             <w:webHidden/>
           </w:rPr>
-          <w:instrText xml:space="preserve"> PAGEREF _Toc242978013 \h </w:instrText>
+          <w:instrText xml:space="preserve"> PAGEREF _Toc242994565 \h </w:instrText>
         </w:r>
         <w:r>
           <w:rPr>
@@ -3282,7 +3282,7 @@
           <w:lang w:eastAsia="es-CO"/>
         </w:rPr>
       </w:pPr>
-      <w:hyperlink w:anchor="_Toc242978014" w:history="1">
+      <w:hyperlink w:anchor="_Toc242994566" w:history="1">
         <w:r>
           <w:rPr>
             <w:rStyle w:val="Hyperlink"/>
@@ -3327,7 +3327,7 @@
             <w:noProof/>
             <w:webHidden/>
           </w:rPr>
-          <w:instrText xml:space="preserve"> PAGEREF _Toc242978014 \h </w:instrText>
+          <w:instrText xml:space="preserve"> PAGEREF _Toc242994566 \h </w:instrText>
         </w:r>
         <w:r>
           <w:rPr>
@@ -3374,7 +3374,7 @@
           <w:lang w:eastAsia="es-CO"/>
         </w:rPr>
       </w:pPr>
-      <w:hyperlink w:anchor="_Toc242978015" w:history="1">
+      <w:hyperlink w:anchor="_Toc242994567" w:history="1">
         <w:r>
           <w:rPr>
             <w:rStyle w:val="Hyperlink"/>
@@ -3419,7 +3419,7 @@
             <w:noProof/>
             <w:webHidden/>
           </w:rPr>
-          <w:instrText xml:space="preserve"> PAGEREF _Toc242978015 \h </w:instrText>
+          <w:instrText xml:space="preserve"> PAGEREF _Toc242994567 \h </w:instrText>
         </w:r>
         <w:r>
           <w:rPr>
@@ -3466,7 +3466,7 @@
           <w:lang w:eastAsia="es-CO"/>
         </w:rPr>
       </w:pPr>
-      <w:hyperlink w:anchor="_Toc242978016" w:history="1">
+      <w:hyperlink w:anchor="_Toc242994568" w:history="1">
         <w:r>
           <w:rPr>
             <w:rStyle w:val="Hyperlink"/>
@@ -3511,7 +3511,7 @@
             <w:noProof/>
             <w:webHidden/>
           </w:rPr>
-          <w:instrText xml:space="preserve"> PAGEREF _Toc242978016 \h </w:instrText>
+          <w:instrText xml:space="preserve"> PAGEREF _Toc242994568 \h </w:instrText>
         </w:r>
         <w:r>
           <w:rPr>
@@ -3560,7 +3560,7 @@
           <w:lang w:eastAsia="es-CO"/>
         </w:rPr>
       </w:pPr>
-      <w:hyperlink w:anchor="_Toc242978017" w:history="1">
+      <w:hyperlink w:anchor="_Toc242994569" w:history="1">
         <w:r>
           <w:rPr>
             <w:rStyle w:val="Hyperlink"/>
@@ -3607,7 +3607,7 @@
             <w:noProof/>
             <w:webHidden/>
           </w:rPr>
-          <w:instrText xml:space="preserve"> PAGEREF _Toc242978017 \h </w:instrText>
+          <w:instrText xml:space="preserve"> PAGEREF _Toc242994569 \h </w:instrText>
         </w:r>
         <w:r>
           <w:rPr>
@@ -3656,7 +3656,7 @@
           <w:lang w:eastAsia="es-CO"/>
         </w:rPr>
       </w:pPr>
-      <w:hyperlink w:anchor="_Toc242978018" w:history="1">
+      <w:hyperlink w:anchor="_Toc242994570" w:history="1">
         <w:r>
           <w:rPr>
             <w:rStyle w:val="Hyperlink"/>
@@ -3703,7 +3703,7 @@
             <w:noProof/>
             <w:webHidden/>
           </w:rPr>
-          <w:instrText xml:space="preserve"> PAGEREF _Toc242978018 \h </w:instrText>
+          <w:instrText xml:space="preserve"> PAGEREF _Toc242994570 \h </w:instrText>
         </w:r>
         <w:r>
           <w:rPr>
@@ -3752,7 +3752,7 @@
           <w:lang w:eastAsia="es-CO"/>
         </w:rPr>
       </w:pPr>
-      <w:hyperlink w:anchor="_Toc242978019" w:history="1">
+      <w:hyperlink w:anchor="_Toc242994571" w:history="1">
         <w:r>
           <w:rPr>
             <w:rStyle w:val="Hyperlink"/>
@@ -3799,7 +3799,7 @@
             <w:noProof/>
             <w:webHidden/>
           </w:rPr>
-          <w:instrText xml:space="preserve"> PAGEREF _Toc242978019 \h </w:instrText>
+          <w:instrText xml:space="preserve"> PAGEREF _Toc242994571 \h </w:instrText>
         </w:r>
         <w:r>
           <w:rPr>
@@ -3853,7 +3853,7 @@
       <w:bookmarkStart w:id="4" w:name="_Toc240440230"/>
       <w:bookmarkStart w:id="5" w:name="_Toc241072107"/>
       <w:bookmarkStart w:id="6" w:name="_Toc241072473"/>
-      <w:bookmarkStart w:id="7" w:name="_Toc242977982"/>
+      <w:bookmarkStart w:id="7" w:name="_Toc242994534"/>
       <w:r>
         <w:lastRenderedPageBreak/>
         <w:t>Información principal del proyecto</w:t>
@@ -3876,7 +3876,7 @@
       <w:bookmarkStart w:id="8" w:name="_Toc240440231"/>
       <w:bookmarkStart w:id="9" w:name="_Toc241072108"/>
       <w:bookmarkStart w:id="10" w:name="_Toc241072474"/>
-      <w:bookmarkStart w:id="11" w:name="_Toc242977983"/>
+      <w:bookmarkStart w:id="11" w:name="_Toc242994535"/>
       <w:r>
         <w:t>Título del proyecto</w:t>
       </w:r>
@@ -3910,7 +3910,7 @@
       <w:bookmarkStart w:id="12" w:name="_Toc240440232"/>
       <w:bookmarkStart w:id="13" w:name="_Toc241072109"/>
       <w:bookmarkStart w:id="14" w:name="_Toc241072475"/>
-      <w:bookmarkStart w:id="15" w:name="_Toc242977984"/>
+      <w:bookmarkStart w:id="15" w:name="_Toc242994536"/>
       <w:r>
         <w:t>Resumen ejecutivo</w:t>
       </w:r>
@@ -3962,7 +3962,7 @@
       <w:bookmarkStart w:id="16" w:name="_Toc240440236"/>
       <w:bookmarkStart w:id="17" w:name="_Toc241072110"/>
       <w:bookmarkStart w:id="18" w:name="_Toc241072476"/>
-      <w:bookmarkStart w:id="19" w:name="_Toc242977985"/>
+      <w:bookmarkStart w:id="19" w:name="_Toc242994537"/>
       <w:r>
         <w:t>Costo total del proyecto</w:t>
       </w:r>
@@ -4847,7 +4847,7 @@
       <w:bookmarkStart w:id="20" w:name="_Toc240440237"/>
       <w:bookmarkStart w:id="21" w:name="_Toc241072111"/>
       <w:bookmarkStart w:id="22" w:name="_Toc241072477"/>
-      <w:bookmarkStart w:id="23" w:name="_Toc242977986"/>
+      <w:bookmarkStart w:id="23" w:name="_Toc242994538"/>
       <w:r>
         <w:lastRenderedPageBreak/>
         <w:t>Introducción</w:t>
@@ -4925,7 +4925,7 @@
       <w:bookmarkStart w:id="24" w:name="_Toc240440238"/>
       <w:bookmarkStart w:id="25" w:name="_Toc241072112"/>
       <w:bookmarkStart w:id="26" w:name="_Toc241072478"/>
-      <w:bookmarkStart w:id="27" w:name="_Toc242977987"/>
+      <w:bookmarkStart w:id="27" w:name="_Toc242994539"/>
       <w:r>
         <w:lastRenderedPageBreak/>
         <w:t>Objetivos</w:t>
@@ -4948,7 +4948,7 @@
       <w:bookmarkStart w:id="28" w:name="_Toc240440239"/>
       <w:bookmarkStart w:id="29" w:name="_Toc241072113"/>
       <w:bookmarkStart w:id="30" w:name="_Toc241072479"/>
-      <w:bookmarkStart w:id="31" w:name="_Toc242977988"/>
+      <w:bookmarkStart w:id="31" w:name="_Toc242994540"/>
       <w:r>
         <w:t>Objetivo general</w:t>
       </w:r>
@@ -4979,7 +4979,7 @@
       <w:bookmarkStart w:id="32" w:name="_Toc240440240"/>
       <w:bookmarkStart w:id="33" w:name="_Toc241072114"/>
       <w:bookmarkStart w:id="34" w:name="_Toc241072480"/>
-      <w:bookmarkStart w:id="35" w:name="_Toc242977989"/>
+      <w:bookmarkStart w:id="35" w:name="_Toc242994541"/>
       <w:r>
         <w:t>Objetivos específicos</w:t>
       </w:r>
@@ -5089,7 +5089,7 @@
       <w:bookmarkStart w:id="36" w:name="_Toc240440241"/>
       <w:bookmarkStart w:id="37" w:name="_Toc241072115"/>
       <w:bookmarkStart w:id="38" w:name="_Toc241072481"/>
-      <w:bookmarkStart w:id="39" w:name="_Toc242977990"/>
+      <w:bookmarkStart w:id="39" w:name="_Toc242994542"/>
       <w:r>
         <w:t>Delimitación</w:t>
       </w:r>
@@ -5111,7 +5111,7 @@
       <w:bookmarkStart w:id="40" w:name="_Toc240440242"/>
       <w:bookmarkStart w:id="41" w:name="_Toc241072116"/>
       <w:bookmarkStart w:id="42" w:name="_Toc241072482"/>
-      <w:bookmarkStart w:id="43" w:name="_Toc242977991"/>
+      <w:bookmarkStart w:id="43" w:name="_Toc242994543"/>
       <w:r>
         <w:t>Alcances</w:t>
       </w:r>
@@ -5668,7 +5668,7 @@
       <w:bookmarkStart w:id="44" w:name="_Toc240440243"/>
       <w:bookmarkStart w:id="45" w:name="_Toc241072117"/>
       <w:bookmarkStart w:id="46" w:name="_Toc241072483"/>
-      <w:bookmarkStart w:id="47" w:name="_Toc242977992"/>
+      <w:bookmarkStart w:id="47" w:name="_Toc242994544"/>
       <w:r>
         <w:t>Limitaciones</w:t>
       </w:r>
@@ -6069,7 +6069,7 @@
       <w:bookmarkStart w:id="48" w:name="_Toc240440244"/>
       <w:bookmarkStart w:id="49" w:name="_Toc241072118"/>
       <w:bookmarkStart w:id="50" w:name="_Toc241072484"/>
-      <w:bookmarkStart w:id="51" w:name="_Toc242977993"/>
+      <w:bookmarkStart w:id="51" w:name="_Toc242994545"/>
       <w:r>
         <w:t>Entregables</w:t>
       </w:r>
@@ -6321,7 +6321,7 @@
       </w:pPr>
       <w:bookmarkStart w:id="53" w:name="_Toc241072119"/>
       <w:bookmarkStart w:id="54" w:name="_Toc241072485"/>
-      <w:bookmarkStart w:id="55" w:name="_Toc242977994"/>
+      <w:bookmarkStart w:id="55" w:name="_Toc242994546"/>
       <w:r>
         <w:t>Revisión bibliográfica</w:t>
       </w:r>
@@ -6346,7 +6346,7 @@
       <w:bookmarkStart w:id="56" w:name="_Toc240440246"/>
       <w:bookmarkStart w:id="57" w:name="_Toc241072120"/>
       <w:bookmarkStart w:id="58" w:name="_Toc241072486"/>
-      <w:bookmarkStart w:id="59" w:name="_Toc242977995"/>
+      <w:bookmarkStart w:id="59" w:name="_Toc242994547"/>
       <w:r>
         <w:t>Planteamiento del problema</w:t>
       </w:r>
@@ -6384,7 +6384,7 @@
           <w:noProof/>
         </w:rPr>
         <w:drawing>
-          <wp:inline distT="0" distB="0" distL="0" distR="0" wp14:anchorId="7BC142C7" wp14:editId="402BBBB6">
+          <wp:inline distT="0" distB="0" distL="0" distR="0" wp14:anchorId="2DB2291D" wp14:editId="26E0095D">
             <wp:extent cx="4320000" cy="1753663"/>
             <wp:effectExtent l="0" t="0" r="0" b="0"/>
             <wp:docPr id="1" name="Picture 1"/>
@@ -6512,7 +6512,7 @@
       <w:bookmarkStart w:id="60" w:name="_Toc240440247"/>
       <w:bookmarkStart w:id="61" w:name="_Toc241072121"/>
       <w:bookmarkStart w:id="62" w:name="_Toc241072487"/>
-      <w:bookmarkStart w:id="63" w:name="_Toc242977996"/>
+      <w:bookmarkStart w:id="63" w:name="_Toc242994548"/>
       <w:r>
         <w:t>Descripción de avances tecnológicos</w:t>
       </w:r>
@@ -7546,7 +7546,7 @@
       </w:pPr>
       <w:bookmarkStart w:id="65" w:name="_Toc241072122"/>
       <w:bookmarkStart w:id="66" w:name="_Toc241072488"/>
-      <w:bookmarkStart w:id="67" w:name="_Toc242977997"/>
+      <w:bookmarkStart w:id="67" w:name="_Toc242994549"/>
       <w:r>
         <w:t>Descripción detallada del diseño en ingeniería</w:t>
       </w:r>
@@ -7568,7 +7568,7 @@
       <w:bookmarkStart w:id="68" w:name="_Toc240440249"/>
       <w:bookmarkStart w:id="69" w:name="_Toc241072123"/>
       <w:bookmarkStart w:id="70" w:name="_Toc241072489"/>
-      <w:bookmarkStart w:id="71" w:name="_Toc242977998"/>
+      <w:bookmarkStart w:id="71" w:name="_Toc242994550"/>
       <w:r>
         <w:t>Problema</w:t>
       </w:r>
@@ -7621,7 +7621,7 @@
       <w:bookmarkStart w:id="72" w:name="_Toc240440250"/>
       <w:bookmarkStart w:id="73" w:name="_Toc241072124"/>
       <w:bookmarkStart w:id="74" w:name="_Toc241072490"/>
-      <w:bookmarkStart w:id="75" w:name="_Toc242977999"/>
+      <w:bookmarkStart w:id="75" w:name="_Toc242994551"/>
       <w:r>
         <w:t>Análisis de requerimientos</w:t>
       </w:r>
@@ -8499,7 +8499,7 @@
       <w:bookmarkStart w:id="76" w:name="_Toc240440251"/>
       <w:bookmarkStart w:id="77" w:name="_Toc241072125"/>
       <w:bookmarkStart w:id="78" w:name="_Toc241072491"/>
-      <w:bookmarkStart w:id="79" w:name="_Toc242978000"/>
+      <w:bookmarkStart w:id="79" w:name="_Toc242994552"/>
       <w:r>
         <w:t>Estándares, normas y regulaciones</w:t>
       </w:r>
@@ -8873,7 +8873,7 @@
       <w:bookmarkStart w:id="80" w:name="_Toc240440252"/>
       <w:bookmarkStart w:id="81" w:name="_Toc241072126"/>
       <w:bookmarkStart w:id="82" w:name="_Toc241072492"/>
-      <w:bookmarkStart w:id="83" w:name="_Toc242978001"/>
+      <w:bookmarkStart w:id="83" w:name="_Toc242994553"/>
       <w:r>
         <w:t>Alternativas de solución</w:t>
       </w:r>
@@ -9342,7 +9342,7 @@
       <w:bookmarkStart w:id="84" w:name="_Toc240440253"/>
       <w:bookmarkStart w:id="85" w:name="_Toc241072127"/>
       <w:bookmarkStart w:id="86" w:name="_Toc241072493"/>
-      <w:bookmarkStart w:id="87" w:name="_Toc242978002"/>
+      <w:bookmarkStart w:id="87" w:name="_Toc242994554"/>
       <w:r>
         <w:t>Evaluación y selección de la alternativa óptima</w:t>
       </w:r>
@@ -10742,7 +10742,7 @@
       <w:bookmarkStart w:id="88" w:name="_Toc240440255"/>
       <w:bookmarkStart w:id="89" w:name="_Toc241072130"/>
       <w:bookmarkStart w:id="90" w:name="_Toc241072496"/>
-      <w:bookmarkStart w:id="91" w:name="_Toc242978003"/>
+      <w:bookmarkStart w:id="91" w:name="_Toc242994555"/>
       <w:r>
         <w:t>Análisis de riesgo del diseño definitivo</w:t>
       </w:r>
@@ -11711,7 +11711,7 @@
       <w:bookmarkStart w:id="92" w:name="_Toc240440254"/>
       <w:bookmarkStart w:id="93" w:name="_Toc241072129"/>
       <w:bookmarkStart w:id="94" w:name="_Toc241072495"/>
-      <w:bookmarkStart w:id="95" w:name="_Toc242978004"/>
+      <w:bookmarkStart w:id="95" w:name="_Toc242994556"/>
       <w:r>
         <w:lastRenderedPageBreak/>
         <w:t>Diseño definitivo</w:t>
@@ -11747,7 +11747,7 @@
           <w:noProof/>
         </w:rPr>
         <w:drawing>
-          <wp:inline distT="0" distB="0" distL="0" distR="0" wp14:anchorId="68CD12DA" wp14:editId="1E5917F4">
+          <wp:inline distT="0" distB="0" distL="0" distR="0" wp14:anchorId="7BD407BA" wp14:editId="10396DB3">
             <wp:extent cx="3780000" cy="2888781"/>
             <wp:effectExtent l="0" t="0" r="0" b="0"/>
             <wp:docPr id="14" name="Picture 14"/>
@@ -15245,7 +15245,7 @@
         </w:rPr>
         <w:lastRenderedPageBreak/>
         <w:drawing>
-          <wp:inline distT="0" distB="0" distL="0" distR="0" wp14:anchorId="5AF8AE8D" wp14:editId="114D38EF">
+          <wp:inline distT="0" distB="0" distL="0" distR="0" wp14:anchorId="06321AB6" wp14:editId="4B3771D0">
             <wp:extent cx="4500000" cy="2592528"/>
             <wp:effectExtent l="0" t="0" r="0" b="0"/>
             <wp:docPr id="15" name="Picture 15"/>
@@ -15344,7 +15344,7 @@
         <w:t>Vista Operador.</w:t>
       </w:r>
       <w:r>
-        <w:t xml:space="preserve"> La Figura 4 muestra la vista Operador el 16 de octubre de 2026 a las 08:00 h para el generador, con el pronóstico emitido la víspera. La tarjeta recomienda «Retener generación»: el medidor ubica el precio esperado, 431 COP/kWh, en el tramo barato (≤ 503) y lejos del caro (≥ 720), con confianza alta (banda de ±42 COP/kWh, más ancha que el 35 % de las horas anteriores). El riesgo de desplome a esa hora es de 49 %: el detector anticipa un posible desplome entre las 08:00 y las 11:00 y un posible pico entre las 16:00 y las 21:00, que la gráfica del día marca con ▼ y ▲. Ese día el generador tiene 6 de 24 </w:t>
+        <w:t xml:space="preserve"> La Figura 4 muestra la vista Operador el 16 de octubre de 2026 a las 08:00 h para el generador, con el pronóstico emitido la víspera. La tarjeta recomienda «Retener generación»: el medidor ubica el precio esperado, 441 COP/kWh, en el tramo barato (≤ 503) y lejos del caro (≥ 720), con confianza alta (banda de ±42 COP/kWh, más ancha que el 35 % de las horas anteriores). El riesgo de desplome a esa hora es de 56 %: el detector anticipa un posible desplome entre las 08:00 y las 11:00 y un posible pico entre las 16:00 y las 21:00, que la gráfica del día marca con ▼ y ▲. Ese día el generador tiene 7 de 24 </w:t>
       </w:r>
       <w:r>
         <w:lastRenderedPageBreak/>
@@ -15362,7 +15362,7 @@
           <w:noProof/>
         </w:rPr>
         <w:drawing>
-          <wp:inline distT="0" distB="0" distL="0" distR="0" wp14:anchorId="5A8DD6E7" wp14:editId="0E7A50F6">
+          <wp:inline distT="0" distB="0" distL="0" distR="0" wp14:anchorId="29160D29" wp14:editId="4E039424">
             <wp:extent cx="5760720" cy="3227070"/>
             <wp:effectExtent l="0" t="0" r="0" b="0"/>
             <wp:docPr id="16" name="Picture 16"/>
@@ -15446,7 +15446,7 @@
         </w:rPr>
         <w:lastRenderedPageBreak/>
         <w:drawing>
-          <wp:inline distT="0" distB="0" distL="0" distR="0" wp14:anchorId="05809635" wp14:editId="310F2282">
+          <wp:inline distT="0" distB="0" distL="0" distR="0" wp14:anchorId="7A571665" wp14:editId="7A03216A">
             <wp:extent cx="5486400" cy="3700558"/>
             <wp:effectExtent l="0" t="0" r="0" b="0"/>
             <wp:docPr id="17" name="Picture 17"/>
@@ -15530,7 +15530,7 @@
         </w:rPr>
         <w:lastRenderedPageBreak/>
         <w:drawing>
-          <wp:inline distT="0" distB="0" distL="0" distR="0" wp14:anchorId="2CAB91FF" wp14:editId="4D0CA307">
+          <wp:inline distT="0" distB="0" distL="0" distR="0" wp14:anchorId="6525E21B" wp14:editId="796016B9">
             <wp:extent cx="3931920" cy="4004733"/>
             <wp:effectExtent l="0" t="0" r="0" b="0"/>
             <wp:docPr id="18" name="Picture 18"/>
@@ -15611,7 +15611,7 @@
       </w:pPr>
       <w:bookmarkStart w:id="97" w:name="_Toc241072132"/>
       <w:bookmarkStart w:id="98" w:name="_Toc241072498"/>
-      <w:bookmarkStart w:id="99" w:name="_Toc242978005"/>
+      <w:bookmarkStart w:id="99" w:name="_Toc242994557"/>
       <w:r>
         <w:t>Pruebas, resultados y análisis de resultados</w:t>
       </w:r>
@@ -15633,7 +15633,7 @@
       <w:bookmarkStart w:id="100" w:name="_Toc240440258"/>
       <w:bookmarkStart w:id="101" w:name="_Toc241072133"/>
       <w:bookmarkStart w:id="102" w:name="_Toc241072499"/>
-      <w:bookmarkStart w:id="103" w:name="_Toc242978006"/>
+      <w:bookmarkStart w:id="103" w:name="_Toc242994558"/>
       <w:r>
         <w:t>Planeación del diseño del experimento</w:t>
       </w:r>
@@ -15708,7 +15708,7 @@
       <w:bookmarkStart w:id="104" w:name="_Toc240440261"/>
       <w:bookmarkStart w:id="105" w:name="_Toc241072136"/>
       <w:bookmarkStart w:id="106" w:name="_Toc241072500"/>
-      <w:bookmarkStart w:id="107" w:name="_Toc242978007"/>
+      <w:bookmarkStart w:id="107" w:name="_Toc242994559"/>
       <w:r>
         <w:t>Instrumentación y validación</w:t>
       </w:r>
@@ -15753,7 +15753,7 @@
       <w:bookmarkStart w:id="108" w:name="_Toc240440262"/>
       <w:bookmarkStart w:id="109" w:name="_Toc241072137"/>
       <w:bookmarkStart w:id="110" w:name="_Toc241072501"/>
-      <w:bookmarkStart w:id="111" w:name="_Toc242978008"/>
+      <w:bookmarkStart w:id="111" w:name="_Toc242994560"/>
       <w:r>
         <w:t>Marco normativo de las pruebas</w:t>
       </w:r>
@@ -15784,7 +15784,7 @@
       <w:bookmarkStart w:id="112" w:name="_Toc240440263"/>
       <w:bookmarkStart w:id="113" w:name="_Toc241072138"/>
       <w:bookmarkStart w:id="114" w:name="_Toc241072502"/>
-      <w:bookmarkStart w:id="115" w:name="_Toc242978009"/>
+      <w:bookmarkStart w:id="115" w:name="_Toc242994561"/>
       <w:r>
         <w:t>Ejecución del plan experimental</w:t>
       </w:r>
@@ -17661,7 +17661,7 @@
       <w:bookmarkStart w:id="116" w:name="_Toc240440264"/>
       <w:bookmarkStart w:id="117" w:name="_Toc241072139"/>
       <w:bookmarkStart w:id="118" w:name="_Toc241072503"/>
-      <w:bookmarkStart w:id="119" w:name="_Toc242978010"/>
+      <w:bookmarkStart w:id="119" w:name="_Toc242994562"/>
       <w:r>
         <w:t>Resultados</w:t>
       </w:r>
@@ -17696,7 +17696,7 @@
           <w:noProof/>
         </w:rPr>
         <w:drawing>
-          <wp:inline distT="0" distB="0" distL="0" distR="0" wp14:anchorId="78D710A4" wp14:editId="6DA66042">
+          <wp:inline distT="0" distB="0" distL="0" distR="0" wp14:anchorId="7654AD24" wp14:editId="29833AB0">
             <wp:extent cx="4140000" cy="1776493"/>
             <wp:effectExtent l="0" t="0" r="0" b="0"/>
             <wp:docPr id="10" name="Picture 10"/>
@@ -26796,7 +26796,7 @@
           <w:noProof/>
         </w:rPr>
         <w:drawing>
-          <wp:inline distT="0" distB="0" distL="0" distR="0" wp14:anchorId="22C7A769" wp14:editId="606E1C1E">
+          <wp:inline distT="0" distB="0" distL="0" distR="0" wp14:anchorId="2A6F281D" wp14:editId="0562A087">
             <wp:extent cx="4482000" cy="1859524"/>
             <wp:effectExtent l="0" t="0" r="0" b="0"/>
             <wp:docPr id="19" name="Picture 19"/>
@@ -26883,7 +26883,7 @@
           <w:noProof/>
         </w:rPr>
         <w:drawing>
-          <wp:inline distT="0" distB="0" distL="0" distR="0" wp14:anchorId="7B3994D8" wp14:editId="6B101C86">
+          <wp:inline distT="0" distB="0" distL="0" distR="0" wp14:anchorId="33B5132A" wp14:editId="44AD0DF8">
             <wp:extent cx="4482000" cy="1859524"/>
             <wp:effectExtent l="0" t="0" r="0" b="0"/>
             <wp:docPr id="20" name="Picture 20"/>
@@ -26966,7 +26966,7 @@
           <w:noProof/>
         </w:rPr>
         <w:drawing>
-          <wp:inline distT="0" distB="0" distL="0" distR="0" wp14:anchorId="64233CD6" wp14:editId="36E1B6D5">
+          <wp:inline distT="0" distB="0" distL="0" distR="0" wp14:anchorId="3DFDC985" wp14:editId="4C28D8C5">
             <wp:extent cx="4482000" cy="1859524"/>
             <wp:effectExtent l="0" t="0" r="0" b="0"/>
             <wp:docPr id="21" name="Picture 21"/>
@@ -28130,7 +28130,7 @@
       <w:bookmarkStart w:id="120" w:name="_Toc240440265"/>
       <w:bookmarkStart w:id="121" w:name="_Toc241072140"/>
       <w:bookmarkStart w:id="122" w:name="_Toc241072504"/>
-      <w:bookmarkStart w:id="123" w:name="_Toc242978011"/>
+      <w:bookmarkStart w:id="123" w:name="_Toc242994563"/>
       <w:r>
         <w:t>Análisis e interpretación de resultados</w:t>
       </w:r>
@@ -28249,7 +28249,7 @@
       <w:bookmarkStart w:id="124" w:name="_Toc241072141"/>
       <w:bookmarkStart w:id="125" w:name="_Toc241072505"/>
       <w:bookmarkStart w:id="126" w:name="_Toc240440266"/>
-      <w:bookmarkStart w:id="127" w:name="_Toc242978012"/>
+      <w:bookmarkStart w:id="127" w:name="_Toc242994564"/>
       <w:r>
         <w:t>Análisis de impacto del proyecto</w:t>
       </w:r>
@@ -28271,7 +28271,7 @@
         </w:numPr>
         <w:spacing w:before="300"/>
       </w:pPr>
-      <w:bookmarkStart w:id="128" w:name="_Toc242978013"/>
+      <w:bookmarkStart w:id="128" w:name="_Toc242994565"/>
       <w:r>
         <w:t>Impacto social</w:t>
       </w:r>
@@ -28296,7 +28296,7 @@
         </w:numPr>
         <w:spacing w:before="300"/>
       </w:pPr>
-      <w:bookmarkStart w:id="129" w:name="_Toc242978014"/>
+      <w:bookmarkStart w:id="129" w:name="_Toc242994566"/>
       <w:r>
         <w:t>Impacto ambiental</w:t>
       </w:r>
@@ -28321,7 +28321,7 @@
         </w:numPr>
         <w:spacing w:before="300"/>
       </w:pPr>
-      <w:bookmarkStart w:id="130" w:name="_Toc242978015"/>
+      <w:bookmarkStart w:id="130" w:name="_Toc242994567"/>
       <w:r>
         <w:t>Impacto legal y regulatorio</w:t>
       </w:r>
@@ -28346,7 +28346,7 @@
         </w:numPr>
         <w:spacing w:before="300"/>
       </w:pPr>
-      <w:bookmarkStart w:id="131" w:name="_Toc242978016"/>
+      <w:bookmarkStart w:id="131" w:name="_Toc242994568"/>
       <w:r>
         <w:lastRenderedPageBreak/>
         <w:t>Impacto económico y financiero</w:t>
@@ -28375,7 +28375,7 @@
       <w:bookmarkStart w:id="132" w:name="_Toc240440267"/>
       <w:bookmarkStart w:id="133" w:name="_Toc241072142"/>
       <w:bookmarkStart w:id="134" w:name="_Toc241072506"/>
-      <w:bookmarkStart w:id="135" w:name="_Toc242978017"/>
+      <w:bookmarkStart w:id="135" w:name="_Toc242994569"/>
       <w:r>
         <w:t>Conclusiones y recomendaciones</w:t>
       </w:r>
@@ -28451,7 +28451,7 @@
       <w:bookmarkStart w:id="136" w:name="_Toc240440268"/>
       <w:bookmarkStart w:id="137" w:name="_Toc241072143"/>
       <w:bookmarkStart w:id="138" w:name="_Toc241072507"/>
-      <w:bookmarkStart w:id="139" w:name="_Toc242978018"/>
+      <w:bookmarkStart w:id="139" w:name="_Toc242994570"/>
       <w:r>
         <w:lastRenderedPageBreak/>
         <w:t>Bibliografía (formato IEEE)</w:t>
@@ -29802,7 +29802,7 @@
       <w:bookmarkStart w:id="140" w:name="_Toc240440270"/>
       <w:bookmarkStart w:id="141" w:name="_Toc241072144"/>
       <w:bookmarkStart w:id="142" w:name="_Toc241072508"/>
-      <w:bookmarkStart w:id="143" w:name="_Toc242978019"/>
+      <w:bookmarkStart w:id="143" w:name="_Toc242994571"/>
       <w:r>
         <w:t>Anexos</w:t>
       </w:r>

</xml_diff>

<commit_message>
Nombre oficial Augur con mayuscula; manual rev. 1.3 e informe con la interfaz actual; nuevas referencias
- Dashboard, manual, informe, README y comentarios: Augur (direcciones y nombres de archivo sin cambio)
- Manual rev. 1.3: vista Metodologia, tema Pizarra, controles e interacciones nuevas; recortes y globos
  calculados con la posicion real de cada elemento (ya no coordenadas fijas)
- Informe: figuras 4 a 6 del 19-oct y su texto; vista Metodologia y auditoria del 19-oct; horario de actualizacion
- REFERENCIAS.md: tesis UNAL, USTA y Uninorte; regulacion CREG (liquidacion TX, escasez, 101 127 de 2026)

Co-Authored-By: Claude Opus 5.5 <noreply@anthropic.com>
</commit_message>
<xml_diff>
--- a/docs/Informe_Final_ABET_Barcelo_Dede.docx
+++ b/docs/Informe_Final_ABET_Barcelo_Dede.docx
@@ -72,7 +72,17 @@
           <w:sz w:val="32"/>
           <w:szCs w:val="32"/>
         </w:rPr>
-        <w:t>Diseño de una plataforma de procesamiento y analítica de datos para el pronóstico del precio de la energía y el apoyo en la toma de decisiones</w:t>
+        <w:t xml:space="preserve">Diseño de una plataforma de procesamiento y analítica de datos para el pronóstico del precio de la energía y el apoyo en </w:t>
+      </w:r>
+      <w:r>
+        <w:rPr>
+          <w:b/>
+          <w:bCs/>
+          <w:color w:val="1F4E79"/>
+          <w:sz w:val="32"/>
+          <w:szCs w:val="32"/>
+        </w:rPr>
+        <w:t>la toma de decisiones</w:t>
       </w:r>
     </w:p>
     <w:p>
@@ -192,7 +202,7 @@
       <w:bookmarkStart w:id="0" w:name="_Toc240440229"/>
       <w:bookmarkStart w:id="1" w:name="_Toc241072106"/>
       <w:bookmarkStart w:id="2" w:name="_Toc241072472"/>
-      <w:bookmarkStart w:id="3" w:name="_Toc242994533"/>
+      <w:bookmarkStart w:id="3" w:name="_Toc241697459"/>
       <w:r>
         <w:lastRenderedPageBreak/>
         <w:t>Tabla de contenido</w:t>
@@ -228,7 +238,7 @@
       <w:r>
         <w:fldChar w:fldCharType="separate"/>
       </w:r>
-      <w:hyperlink w:anchor="_Toc242994533" w:history="1">
+      <w:hyperlink w:anchor="_Toc241697459" w:history="1">
         <w:r>
           <w:rPr>
             <w:rStyle w:val="Hyperlink"/>
@@ -255,7 +265,7 @@
             <w:noProof/>
             <w:webHidden/>
           </w:rPr>
-          <w:instrText xml:space="preserve"> PAGEREF _Toc242994533 \h </w:instrText>
+          <w:instrText xml:space="preserve"> PAGEREF _Toc241697459 \h </w:instrText>
         </w:r>
         <w:r>
           <w:rPr>
@@ -304,7 +314,7 @@
           <w:lang w:eastAsia="es-CO"/>
         </w:rPr>
       </w:pPr>
-      <w:hyperlink w:anchor="_Toc242994534" w:history="1">
+      <w:hyperlink w:anchor="_Toc241697460" w:history="1">
         <w:r>
           <w:rPr>
             <w:rStyle w:val="Hyperlink"/>
@@ -351,7 +361,7 @@
             <w:noProof/>
             <w:webHidden/>
           </w:rPr>
-          <w:instrText xml:space="preserve"> PAGEREF _Toc242994534 \h </w:instrText>
+          <w:instrText xml:space="preserve"> PAGEREF _Toc241697460 \h </w:instrText>
         </w:r>
         <w:r>
           <w:rPr>
@@ -398,7 +408,7 @@
           <w:lang w:eastAsia="es-CO"/>
         </w:rPr>
       </w:pPr>
-      <w:hyperlink w:anchor="_Toc242994535" w:history="1">
+      <w:hyperlink w:anchor="_Toc241697461" w:history="1">
         <w:r>
           <w:rPr>
             <w:rStyle w:val="Hyperlink"/>
@@ -443,7 +453,7 @@
             <w:noProof/>
             <w:webHidden/>
           </w:rPr>
-          <w:instrText xml:space="preserve"> PAGEREF _Toc242994535 \h </w:instrText>
+          <w:instrText xml:space="preserve"> PAGEREF _Toc241697461 \h </w:instrText>
         </w:r>
         <w:r>
           <w:rPr>
@@ -490,7 +500,7 @@
           <w:lang w:eastAsia="es-CO"/>
         </w:rPr>
       </w:pPr>
-      <w:hyperlink w:anchor="_Toc242994536" w:history="1">
+      <w:hyperlink w:anchor="_Toc241697462" w:history="1">
         <w:r>
           <w:rPr>
             <w:rStyle w:val="Hyperlink"/>
@@ -535,7 +545,7 @@
             <w:noProof/>
             <w:webHidden/>
           </w:rPr>
-          <w:instrText xml:space="preserve"> PAGEREF _Toc242994536 \h </w:instrText>
+          <w:instrText xml:space="preserve"> PAGEREF _Toc241697462 \h </w:instrText>
         </w:r>
         <w:r>
           <w:rPr>
@@ -582,7 +592,7 @@
           <w:lang w:eastAsia="es-CO"/>
         </w:rPr>
       </w:pPr>
-      <w:hyperlink w:anchor="_Toc242994537" w:history="1">
+      <w:hyperlink w:anchor="_Toc241697463" w:history="1">
         <w:r>
           <w:rPr>
             <w:rStyle w:val="Hyperlink"/>
@@ -627,7 +637,7 @@
             <w:noProof/>
             <w:webHidden/>
           </w:rPr>
-          <w:instrText xml:space="preserve"> PAGEREF _Toc242994537 \h </w:instrText>
+          <w:instrText xml:space="preserve"> PAGEREF _Toc241697463 \h </w:instrText>
         </w:r>
         <w:r>
           <w:rPr>
@@ -676,7 +686,7 @@
           <w:lang w:eastAsia="es-CO"/>
         </w:rPr>
       </w:pPr>
-      <w:hyperlink w:anchor="_Toc242994538" w:history="1">
+      <w:hyperlink w:anchor="_Toc241697464" w:history="1">
         <w:r>
           <w:rPr>
             <w:rStyle w:val="Hyperlink"/>
@@ -723,7 +733,7 @@
             <w:noProof/>
             <w:webHidden/>
           </w:rPr>
-          <w:instrText xml:space="preserve"> PAGEREF _Toc242994538 \h </w:instrText>
+          <w:instrText xml:space="preserve"> PAGEREF _Toc241697464 \h </w:instrText>
         </w:r>
         <w:r>
           <w:rPr>
@@ -743,7 +753,7 @@
             <w:noProof/>
             <w:webHidden/>
           </w:rPr>
-          <w:t>5</w:t>
+          <w:t>4</w:t>
         </w:r>
         <w:r>
           <w:rPr>
@@ -772,7 +782,7 @@
           <w:lang w:eastAsia="es-CO"/>
         </w:rPr>
       </w:pPr>
-      <w:hyperlink w:anchor="_Toc242994539" w:history="1">
+      <w:hyperlink w:anchor="_Toc241697465" w:history="1">
         <w:r>
           <w:rPr>
             <w:rStyle w:val="Hyperlink"/>
@@ -819,7 +829,7 @@
             <w:noProof/>
             <w:webHidden/>
           </w:rPr>
-          <w:instrText xml:space="preserve"> PAGEREF _Toc242994539 \h </w:instrText>
+          <w:instrText xml:space="preserve"> PAGEREF _Toc241697465 \h </w:instrText>
         </w:r>
         <w:r>
           <w:rPr>
@@ -839,7 +849,7 @@
             <w:noProof/>
             <w:webHidden/>
           </w:rPr>
-          <w:t>6</w:t>
+          <w:t>5</w:t>
         </w:r>
         <w:r>
           <w:rPr>
@@ -866,7 +876,7 @@
           <w:lang w:eastAsia="es-CO"/>
         </w:rPr>
       </w:pPr>
-      <w:hyperlink w:anchor="_Toc242994540" w:history="1">
+      <w:hyperlink w:anchor="_Toc241697466" w:history="1">
         <w:r>
           <w:rPr>
             <w:rStyle w:val="Hyperlink"/>
@@ -911,7 +921,7 @@
             <w:noProof/>
             <w:webHidden/>
           </w:rPr>
-          <w:instrText xml:space="preserve"> PAGEREF _Toc242994540 \h </w:instrText>
+          <w:instrText xml:space="preserve"> PAGEREF _Toc241697466 \h </w:instrText>
         </w:r>
         <w:r>
           <w:rPr>
@@ -931,7 +941,7 @@
             <w:noProof/>
             <w:webHidden/>
           </w:rPr>
-          <w:t>6</w:t>
+          <w:t>5</w:t>
         </w:r>
         <w:r>
           <w:rPr>
@@ -958,7 +968,7 @@
           <w:lang w:eastAsia="es-CO"/>
         </w:rPr>
       </w:pPr>
-      <w:hyperlink w:anchor="_Toc242994541" w:history="1">
+      <w:hyperlink w:anchor="_Toc241697467" w:history="1">
         <w:r>
           <w:rPr>
             <w:rStyle w:val="Hyperlink"/>
@@ -1003,7 +1013,7 @@
             <w:noProof/>
             <w:webHidden/>
           </w:rPr>
-          <w:instrText xml:space="preserve"> PAGEREF _Toc242994541 \h </w:instrText>
+          <w:instrText xml:space="preserve"> PAGEREF _Toc241697467 \h </w:instrText>
         </w:r>
         <w:r>
           <w:rPr>
@@ -1023,7 +1033,7 @@
             <w:noProof/>
             <w:webHidden/>
           </w:rPr>
-          <w:t>6</w:t>
+          <w:t>5</w:t>
         </w:r>
         <w:r>
           <w:rPr>
@@ -1052,7 +1062,7 @@
           <w:lang w:eastAsia="es-CO"/>
         </w:rPr>
       </w:pPr>
-      <w:hyperlink w:anchor="_Toc242994542" w:history="1">
+      <w:hyperlink w:anchor="_Toc241697468" w:history="1">
         <w:r>
           <w:rPr>
             <w:rStyle w:val="Hyperlink"/>
@@ -1099,7 +1109,7 @@
             <w:noProof/>
             <w:webHidden/>
           </w:rPr>
-          <w:instrText xml:space="preserve"> PAGEREF _Toc242994542 \h </w:instrText>
+          <w:instrText xml:space="preserve"> PAGEREF _Toc241697468 \h </w:instrText>
         </w:r>
         <w:r>
           <w:rPr>
@@ -1119,7 +1129,7 @@
             <w:noProof/>
             <w:webHidden/>
           </w:rPr>
-          <w:t>6</w:t>
+          <w:t>5</w:t>
         </w:r>
         <w:r>
           <w:rPr>
@@ -1146,7 +1156,7 @@
           <w:lang w:eastAsia="es-CO"/>
         </w:rPr>
       </w:pPr>
-      <w:hyperlink w:anchor="_Toc242994543" w:history="1">
+      <w:hyperlink w:anchor="_Toc241697469" w:history="1">
         <w:r>
           <w:rPr>
             <w:rStyle w:val="Hyperlink"/>
@@ -1191,7 +1201,7 @@
             <w:noProof/>
             <w:webHidden/>
           </w:rPr>
-          <w:instrText xml:space="preserve"> PAGEREF _Toc242994543 \h </w:instrText>
+          <w:instrText xml:space="preserve"> PAGEREF _Toc241697469 \h </w:instrText>
         </w:r>
         <w:r>
           <w:rPr>
@@ -1211,7 +1221,7 @@
             <w:noProof/>
             <w:webHidden/>
           </w:rPr>
-          <w:t>6</w:t>
+          <w:t>5</w:t>
         </w:r>
         <w:r>
           <w:rPr>
@@ -1238,7 +1248,7 @@
           <w:lang w:eastAsia="es-CO"/>
         </w:rPr>
       </w:pPr>
-      <w:hyperlink w:anchor="_Toc242994544" w:history="1">
+      <w:hyperlink w:anchor="_Toc241697470" w:history="1">
         <w:r>
           <w:rPr>
             <w:rStyle w:val="Hyperlink"/>
@@ -1283,7 +1293,7 @@
             <w:noProof/>
             <w:webHidden/>
           </w:rPr>
-          <w:instrText xml:space="preserve"> PAGEREF _Toc242994544 \h </w:instrText>
+          <w:instrText xml:space="preserve"> PAGEREF _Toc241697470 \h </w:instrText>
         </w:r>
         <w:r>
           <w:rPr>
@@ -1303,7 +1313,7 @@
             <w:noProof/>
             <w:webHidden/>
           </w:rPr>
-          <w:t>7</w:t>
+          <w:t>6</w:t>
         </w:r>
         <w:r>
           <w:rPr>
@@ -1330,7 +1340,7 @@
           <w:lang w:eastAsia="es-CO"/>
         </w:rPr>
       </w:pPr>
-      <w:hyperlink w:anchor="_Toc242994545" w:history="1">
+      <w:hyperlink w:anchor="_Toc241697471" w:history="1">
         <w:r>
           <w:rPr>
             <w:rStyle w:val="Hyperlink"/>
@@ -1375,7 +1385,7 @@
             <w:noProof/>
             <w:webHidden/>
           </w:rPr>
-          <w:instrText xml:space="preserve"> PAGEREF _Toc242994545 \h </w:instrText>
+          <w:instrText xml:space="preserve"> PAGEREF _Toc241697471 \h </w:instrText>
         </w:r>
         <w:r>
           <w:rPr>
@@ -1395,7 +1405,7 @@
             <w:noProof/>
             <w:webHidden/>
           </w:rPr>
-          <w:t>7</w:t>
+          <w:t>6</w:t>
         </w:r>
         <w:r>
           <w:rPr>
@@ -1424,7 +1434,7 @@
           <w:lang w:eastAsia="es-CO"/>
         </w:rPr>
       </w:pPr>
-      <w:hyperlink w:anchor="_Toc242994546" w:history="1">
+      <w:hyperlink w:anchor="_Toc241697472" w:history="1">
         <w:r>
           <w:rPr>
             <w:rStyle w:val="Hyperlink"/>
@@ -1471,7 +1481,7 @@
             <w:noProof/>
             <w:webHidden/>
           </w:rPr>
-          <w:instrText xml:space="preserve"> PAGEREF _Toc242994546 \h </w:instrText>
+          <w:instrText xml:space="preserve"> PAGEREF _Toc241697472 \h </w:instrText>
         </w:r>
         <w:r>
           <w:rPr>
@@ -1491,7 +1501,7 @@
             <w:noProof/>
             <w:webHidden/>
           </w:rPr>
-          <w:t>8</w:t>
+          <w:t>7</w:t>
         </w:r>
         <w:r>
           <w:rPr>
@@ -1518,7 +1528,7 @@
           <w:lang w:eastAsia="es-CO"/>
         </w:rPr>
       </w:pPr>
-      <w:hyperlink w:anchor="_Toc242994547" w:history="1">
+      <w:hyperlink w:anchor="_Toc241697473" w:history="1">
         <w:r>
           <w:rPr>
             <w:rStyle w:val="Hyperlink"/>
@@ -1563,7 +1573,7 @@
             <w:noProof/>
             <w:webHidden/>
           </w:rPr>
-          <w:instrText xml:space="preserve"> PAGEREF _Toc242994547 \h </w:instrText>
+          <w:instrText xml:space="preserve"> PAGEREF _Toc241697473 \h </w:instrText>
         </w:r>
         <w:r>
           <w:rPr>
@@ -1583,7 +1593,7 @@
             <w:noProof/>
             <w:webHidden/>
           </w:rPr>
-          <w:t>8</w:t>
+          <w:t>7</w:t>
         </w:r>
         <w:r>
           <w:rPr>
@@ -1610,7 +1620,7 @@
           <w:lang w:eastAsia="es-CO"/>
         </w:rPr>
       </w:pPr>
-      <w:hyperlink w:anchor="_Toc242994548" w:history="1">
+      <w:hyperlink w:anchor="_Toc241697474" w:history="1">
         <w:r>
           <w:rPr>
             <w:rStyle w:val="Hyperlink"/>
@@ -1655,7 +1665,7 @@
             <w:noProof/>
             <w:webHidden/>
           </w:rPr>
-          <w:instrText xml:space="preserve"> PAGEREF _Toc242994548 \h </w:instrText>
+          <w:instrText xml:space="preserve"> PAGEREF _Toc241697474 \h </w:instrText>
         </w:r>
         <w:r>
           <w:rPr>
@@ -1675,7 +1685,7 @@
             <w:noProof/>
             <w:webHidden/>
           </w:rPr>
-          <w:t>9</w:t>
+          <w:t>8</w:t>
         </w:r>
         <w:r>
           <w:rPr>
@@ -1704,7 +1714,7 @@
           <w:lang w:eastAsia="es-CO"/>
         </w:rPr>
       </w:pPr>
-      <w:hyperlink w:anchor="_Toc242994549" w:history="1">
+      <w:hyperlink w:anchor="_Toc241697475" w:history="1">
         <w:r>
           <w:rPr>
             <w:rStyle w:val="Hyperlink"/>
@@ -1751,7 +1761,7 @@
             <w:noProof/>
             <w:webHidden/>
           </w:rPr>
-          <w:instrText xml:space="preserve"> PAGEREF _Toc242994549 \h </w:instrText>
+          <w:instrText xml:space="preserve"> PAGEREF _Toc241697475 \h </w:instrText>
         </w:r>
         <w:r>
           <w:rPr>
@@ -1771,7 +1781,7 @@
             <w:noProof/>
             <w:webHidden/>
           </w:rPr>
-          <w:t>10</w:t>
+          <w:t>9</w:t>
         </w:r>
         <w:r>
           <w:rPr>
@@ -1798,7 +1808,7 @@
           <w:lang w:eastAsia="es-CO"/>
         </w:rPr>
       </w:pPr>
-      <w:hyperlink w:anchor="_Toc242994550" w:history="1">
+      <w:hyperlink w:anchor="_Toc241697476" w:history="1">
         <w:r>
           <w:rPr>
             <w:rStyle w:val="Hyperlink"/>
@@ -1843,7 +1853,7 @@
             <w:noProof/>
             <w:webHidden/>
           </w:rPr>
-          <w:instrText xml:space="preserve"> PAGEREF _Toc242994550 \h </w:instrText>
+          <w:instrText xml:space="preserve"> PAGEREF _Toc241697476 \h </w:instrText>
         </w:r>
         <w:r>
           <w:rPr>
@@ -1863,7 +1873,7 @@
             <w:noProof/>
             <w:webHidden/>
           </w:rPr>
-          <w:t>10</w:t>
+          <w:t>9</w:t>
         </w:r>
         <w:r>
           <w:rPr>
@@ -1890,7 +1900,7 @@
           <w:lang w:eastAsia="es-CO"/>
         </w:rPr>
       </w:pPr>
-      <w:hyperlink w:anchor="_Toc242994551" w:history="1">
+      <w:hyperlink w:anchor="_Toc241697477" w:history="1">
         <w:r>
           <w:rPr>
             <w:rStyle w:val="Hyperlink"/>
@@ -1935,7 +1945,7 @@
             <w:noProof/>
             <w:webHidden/>
           </w:rPr>
-          <w:instrText xml:space="preserve"> PAGEREF _Toc242994551 \h </w:instrText>
+          <w:instrText xml:space="preserve"> PAGEREF _Toc241697477 \h </w:instrText>
         </w:r>
         <w:r>
           <w:rPr>
@@ -1955,7 +1965,7 @@
             <w:noProof/>
             <w:webHidden/>
           </w:rPr>
-          <w:t>11</w:t>
+          <w:t>9</w:t>
         </w:r>
         <w:r>
           <w:rPr>
@@ -1982,7 +1992,7 @@
           <w:lang w:eastAsia="es-CO"/>
         </w:rPr>
       </w:pPr>
-      <w:hyperlink w:anchor="_Toc242994552" w:history="1">
+      <w:hyperlink w:anchor="_Toc241697478" w:history="1">
         <w:r>
           <w:rPr>
             <w:rStyle w:val="Hyperlink"/>
@@ -2027,7 +2037,7 @@
             <w:noProof/>
             <w:webHidden/>
           </w:rPr>
-          <w:instrText xml:space="preserve"> PAGEREF _Toc242994552 \h </w:instrText>
+          <w:instrText xml:space="preserve"> PAGEREF _Toc241697478 \h </w:instrText>
         </w:r>
         <w:r>
           <w:rPr>
@@ -2047,7 +2057,7 @@
             <w:noProof/>
             <w:webHidden/>
           </w:rPr>
-          <w:t>11</w:t>
+          <w:t>10</w:t>
         </w:r>
         <w:r>
           <w:rPr>
@@ -2074,7 +2084,7 @@
           <w:lang w:eastAsia="es-CO"/>
         </w:rPr>
       </w:pPr>
-      <w:hyperlink w:anchor="_Toc242994553" w:history="1">
+      <w:hyperlink w:anchor="_Toc241697479" w:history="1">
         <w:r>
           <w:rPr>
             <w:rStyle w:val="Hyperlink"/>
@@ -2119,7 +2129,7 @@
             <w:noProof/>
             <w:webHidden/>
           </w:rPr>
-          <w:instrText xml:space="preserve"> PAGEREF _Toc242994553 \h </w:instrText>
+          <w:instrText xml:space="preserve"> PAGEREF _Toc241697479 \h </w:instrText>
         </w:r>
         <w:r>
           <w:rPr>
@@ -2139,7 +2149,7 @@
             <w:noProof/>
             <w:webHidden/>
           </w:rPr>
-          <w:t>12</w:t>
+          <w:t>10</w:t>
         </w:r>
         <w:r>
           <w:rPr>
@@ -2166,7 +2176,7 @@
           <w:lang w:eastAsia="es-CO"/>
         </w:rPr>
       </w:pPr>
-      <w:hyperlink w:anchor="_Toc242994554" w:history="1">
+      <w:hyperlink w:anchor="_Toc241697480" w:history="1">
         <w:r>
           <w:rPr>
             <w:rStyle w:val="Hyperlink"/>
@@ -2211,7 +2221,7 @@
             <w:noProof/>
             <w:webHidden/>
           </w:rPr>
-          <w:instrText xml:space="preserve"> PAGEREF _Toc242994554 \h </w:instrText>
+          <w:instrText xml:space="preserve"> PAGEREF _Toc241697480 \h </w:instrText>
         </w:r>
         <w:r>
           <w:rPr>
@@ -2231,7 +2241,7 @@
             <w:noProof/>
             <w:webHidden/>
           </w:rPr>
-          <w:t>13</w:t>
+          <w:t>11</w:t>
         </w:r>
         <w:r>
           <w:rPr>
@@ -2258,7 +2268,7 @@
           <w:lang w:eastAsia="es-CO"/>
         </w:rPr>
       </w:pPr>
-      <w:hyperlink w:anchor="_Toc242994555" w:history="1">
+      <w:hyperlink w:anchor="_Toc241697481" w:history="1">
         <w:r>
           <w:rPr>
             <w:rStyle w:val="Hyperlink"/>
@@ -2303,7 +2313,7 @@
             <w:noProof/>
             <w:webHidden/>
           </w:rPr>
-          <w:instrText xml:space="preserve"> PAGEREF _Toc242994555 \h </w:instrText>
+          <w:instrText xml:space="preserve"> PAGEREF _Toc241697481 \h </w:instrText>
         </w:r>
         <w:r>
           <w:rPr>
@@ -2323,7 +2333,7 @@
             <w:noProof/>
             <w:webHidden/>
           </w:rPr>
-          <w:t>14</w:t>
+          <w:t>12</w:t>
         </w:r>
         <w:r>
           <w:rPr>
@@ -2350,7 +2360,7 @@
           <w:lang w:eastAsia="es-CO"/>
         </w:rPr>
       </w:pPr>
-      <w:hyperlink w:anchor="_Toc242994556" w:history="1">
+      <w:hyperlink w:anchor="_Toc241697482" w:history="1">
         <w:r>
           <w:rPr>
             <w:rStyle w:val="Hyperlink"/>
@@ -2395,7 +2405,7 @@
             <w:noProof/>
             <w:webHidden/>
           </w:rPr>
-          <w:instrText xml:space="preserve"> PAGEREF _Toc242994556 \h </w:instrText>
+          <w:instrText xml:space="preserve"> PAGEREF _Toc241697482 \h </w:instrText>
         </w:r>
         <w:r>
           <w:rPr>
@@ -2415,7 +2425,7 @@
             <w:noProof/>
             <w:webHidden/>
           </w:rPr>
-          <w:t>15</w:t>
+          <w:t>13</w:t>
         </w:r>
         <w:r>
           <w:rPr>
@@ -2444,7 +2454,7 @@
           <w:lang w:eastAsia="es-CO"/>
         </w:rPr>
       </w:pPr>
-      <w:hyperlink w:anchor="_Toc242994557" w:history="1">
+      <w:hyperlink w:anchor="_Toc241697483" w:history="1">
         <w:r>
           <w:rPr>
             <w:rStyle w:val="Hyperlink"/>
@@ -2491,7 +2501,7 @@
             <w:noProof/>
             <w:webHidden/>
           </w:rPr>
-          <w:instrText xml:space="preserve"> PAGEREF _Toc242994557 \h </w:instrText>
+          <w:instrText xml:space="preserve"> PAGEREF _Toc241697483 \h </w:instrText>
         </w:r>
         <w:r>
           <w:rPr>
@@ -2511,7 +2521,7 @@
             <w:noProof/>
             <w:webHidden/>
           </w:rPr>
-          <w:t>22</w:t>
+          <w:t>21</w:t>
         </w:r>
         <w:r>
           <w:rPr>
@@ -2538,7 +2548,7 @@
           <w:lang w:eastAsia="es-CO"/>
         </w:rPr>
       </w:pPr>
-      <w:hyperlink w:anchor="_Toc242994558" w:history="1">
+      <w:hyperlink w:anchor="_Toc241697484" w:history="1">
         <w:r>
           <w:rPr>
             <w:rStyle w:val="Hyperlink"/>
@@ -2583,7 +2593,7 @@
             <w:noProof/>
             <w:webHidden/>
           </w:rPr>
-          <w:instrText xml:space="preserve"> PAGEREF _Toc242994558 \h </w:instrText>
+          <w:instrText xml:space="preserve"> PAGEREF _Toc241697484 \h </w:instrText>
         </w:r>
         <w:r>
           <w:rPr>
@@ -2603,7 +2613,7 @@
             <w:noProof/>
             <w:webHidden/>
           </w:rPr>
-          <w:t>22</w:t>
+          <w:t>21</w:t>
         </w:r>
         <w:r>
           <w:rPr>
@@ -2631,7 +2641,7 @@
           <w:lang w:eastAsia="es-CO"/>
         </w:rPr>
       </w:pPr>
-      <w:hyperlink w:anchor="_Toc242994559" w:history="1">
+      <w:hyperlink w:anchor="_Toc241697485" w:history="1">
         <w:r>
           <w:rPr>
             <w:rStyle w:val="Hyperlink"/>
@@ -2677,7 +2687,7 @@
             <w:noProof/>
             <w:webHidden/>
           </w:rPr>
-          <w:instrText xml:space="preserve"> PAGEREF _Toc242994559 \h </w:instrText>
+          <w:instrText xml:space="preserve"> PAGEREF _Toc241697485 \h </w:instrText>
         </w:r>
         <w:r>
           <w:rPr>
@@ -2697,7 +2707,7 @@
             <w:noProof/>
             <w:webHidden/>
           </w:rPr>
-          <w:t>23</w:t>
+          <w:t>21</w:t>
         </w:r>
         <w:r>
           <w:rPr>
@@ -2725,7 +2735,7 @@
           <w:lang w:eastAsia="es-CO"/>
         </w:rPr>
       </w:pPr>
-      <w:hyperlink w:anchor="_Toc242994560" w:history="1">
+      <w:hyperlink w:anchor="_Toc241697486" w:history="1">
         <w:r>
           <w:rPr>
             <w:rStyle w:val="Hyperlink"/>
@@ -2771,7 +2781,7 @@
             <w:noProof/>
             <w:webHidden/>
           </w:rPr>
-          <w:instrText xml:space="preserve"> PAGEREF _Toc242994560 \h </w:instrText>
+          <w:instrText xml:space="preserve"> PAGEREF _Toc241697486 \h </w:instrText>
         </w:r>
         <w:r>
           <w:rPr>
@@ -2791,7 +2801,7 @@
             <w:noProof/>
             <w:webHidden/>
           </w:rPr>
-          <w:t>23</w:t>
+          <w:t>21</w:t>
         </w:r>
         <w:r>
           <w:rPr>
@@ -2818,7 +2828,7 @@
           <w:lang w:eastAsia="es-CO"/>
         </w:rPr>
       </w:pPr>
-      <w:hyperlink w:anchor="_Toc242994561" w:history="1">
+      <w:hyperlink w:anchor="_Toc241697487" w:history="1">
         <w:r>
           <w:rPr>
             <w:rStyle w:val="Hyperlink"/>
@@ -2863,7 +2873,7 @@
             <w:noProof/>
             <w:webHidden/>
           </w:rPr>
-          <w:instrText xml:space="preserve"> PAGEREF _Toc242994561 \h </w:instrText>
+          <w:instrText xml:space="preserve"> PAGEREF _Toc241697487 \h </w:instrText>
         </w:r>
         <w:r>
           <w:rPr>
@@ -2883,7 +2893,7 @@
             <w:noProof/>
             <w:webHidden/>
           </w:rPr>
-          <w:t>23</w:t>
+          <w:t>21</w:t>
         </w:r>
         <w:r>
           <w:rPr>
@@ -2910,7 +2920,7 @@
           <w:lang w:eastAsia="es-CO"/>
         </w:rPr>
       </w:pPr>
-      <w:hyperlink w:anchor="_Toc242994562" w:history="1">
+      <w:hyperlink w:anchor="_Toc241697488" w:history="1">
         <w:r>
           <w:rPr>
             <w:rStyle w:val="Hyperlink"/>
@@ -2955,7 +2965,7 @@
             <w:noProof/>
             <w:webHidden/>
           </w:rPr>
-          <w:instrText xml:space="preserve"> PAGEREF _Toc242994562 \h </w:instrText>
+          <w:instrText xml:space="preserve"> PAGEREF _Toc241697488 \h </w:instrText>
         </w:r>
         <w:r>
           <w:rPr>
@@ -2975,7 +2985,7 @@
             <w:noProof/>
             <w:webHidden/>
           </w:rPr>
-          <w:t>24</w:t>
+          <w:t>22</w:t>
         </w:r>
         <w:r>
           <w:rPr>
@@ -3002,7 +3012,7 @@
           <w:lang w:eastAsia="es-CO"/>
         </w:rPr>
       </w:pPr>
-      <w:hyperlink w:anchor="_Toc242994563" w:history="1">
+      <w:hyperlink w:anchor="_Toc241697489" w:history="1">
         <w:r>
           <w:rPr>
             <w:rStyle w:val="Hyperlink"/>
@@ -3047,7 +3057,7 @@
             <w:noProof/>
             <w:webHidden/>
           </w:rPr>
-          <w:instrText xml:space="preserve"> PAGEREF _Toc242994563 \h </w:instrText>
+          <w:instrText xml:space="preserve"> PAGEREF _Toc241697489 \h </w:instrText>
         </w:r>
         <w:r>
           <w:rPr>
@@ -3067,7 +3077,7 @@
             <w:noProof/>
             <w:webHidden/>
           </w:rPr>
-          <w:t>29</w:t>
+          <w:t>26</w:t>
         </w:r>
         <w:r>
           <w:rPr>
@@ -3096,7 +3106,7 @@
           <w:lang w:eastAsia="es-CO"/>
         </w:rPr>
       </w:pPr>
-      <w:hyperlink w:anchor="_Toc242994564" w:history="1">
+      <w:hyperlink w:anchor="_Toc241697490" w:history="1">
         <w:r>
           <w:rPr>
             <w:rStyle w:val="Hyperlink"/>
@@ -3143,7 +3153,7 @@
             <w:noProof/>
             <w:webHidden/>
           </w:rPr>
-          <w:instrText xml:space="preserve"> PAGEREF _Toc242994564 \h </w:instrText>
+          <w:instrText xml:space="preserve"> PAGEREF _Toc241697490 \h </w:instrText>
         </w:r>
         <w:r>
           <w:rPr>
@@ -3163,7 +3173,7 @@
             <w:noProof/>
             <w:webHidden/>
           </w:rPr>
-          <w:t>30</w:t>
+          <w:t>27</w:t>
         </w:r>
         <w:r>
           <w:rPr>
@@ -3190,7 +3200,7 @@
           <w:lang w:eastAsia="es-CO"/>
         </w:rPr>
       </w:pPr>
-      <w:hyperlink w:anchor="_Toc242994565" w:history="1">
+      <w:hyperlink w:anchor="_Toc241697491" w:history="1">
         <w:r>
           <w:rPr>
             <w:rStyle w:val="Hyperlink"/>
@@ -3235,7 +3245,7 @@
             <w:noProof/>
             <w:webHidden/>
           </w:rPr>
-          <w:instrText xml:space="preserve"> PAGEREF _Toc242994565 \h </w:instrText>
+          <w:instrText xml:space="preserve"> PAGEREF _Toc241697491 \h </w:instrText>
         </w:r>
         <w:r>
           <w:rPr>
@@ -3255,7 +3265,7 @@
             <w:noProof/>
             <w:webHidden/>
           </w:rPr>
-          <w:t>30</w:t>
+          <w:t>27</w:t>
         </w:r>
         <w:r>
           <w:rPr>
@@ -3282,7 +3292,7 @@
           <w:lang w:eastAsia="es-CO"/>
         </w:rPr>
       </w:pPr>
-      <w:hyperlink w:anchor="_Toc242994566" w:history="1">
+      <w:hyperlink w:anchor="_Toc241697492" w:history="1">
         <w:r>
           <w:rPr>
             <w:rStyle w:val="Hyperlink"/>
@@ -3327,7 +3337,7 @@
             <w:noProof/>
             <w:webHidden/>
           </w:rPr>
-          <w:instrText xml:space="preserve"> PAGEREF _Toc242994566 \h </w:instrText>
+          <w:instrText xml:space="preserve"> PAGEREF _Toc241697492 \h </w:instrText>
         </w:r>
         <w:r>
           <w:rPr>
@@ -3347,7 +3357,7 @@
             <w:noProof/>
             <w:webHidden/>
           </w:rPr>
-          <w:t>30</w:t>
+          <w:t>27</w:t>
         </w:r>
         <w:r>
           <w:rPr>
@@ -3374,7 +3384,7 @@
           <w:lang w:eastAsia="es-CO"/>
         </w:rPr>
       </w:pPr>
-      <w:hyperlink w:anchor="_Toc242994567" w:history="1">
+      <w:hyperlink w:anchor="_Toc241697493" w:history="1">
         <w:r>
           <w:rPr>
             <w:rStyle w:val="Hyperlink"/>
@@ -3419,7 +3429,7 @@
             <w:noProof/>
             <w:webHidden/>
           </w:rPr>
-          <w:instrText xml:space="preserve"> PAGEREF _Toc242994567 \h </w:instrText>
+          <w:instrText xml:space="preserve"> PAGEREF _Toc241697493 \h </w:instrText>
         </w:r>
         <w:r>
           <w:rPr>
@@ -3439,7 +3449,7 @@
             <w:noProof/>
             <w:webHidden/>
           </w:rPr>
-          <w:t>30</w:t>
+          <w:t>27</w:t>
         </w:r>
         <w:r>
           <w:rPr>
@@ -3466,7 +3476,7 @@
           <w:lang w:eastAsia="es-CO"/>
         </w:rPr>
       </w:pPr>
-      <w:hyperlink w:anchor="_Toc242994568" w:history="1">
+      <w:hyperlink w:anchor="_Toc241697494" w:history="1">
         <w:r>
           <w:rPr>
             <w:rStyle w:val="Hyperlink"/>
@@ -3511,7 +3521,7 @@
             <w:noProof/>
             <w:webHidden/>
           </w:rPr>
-          <w:instrText xml:space="preserve"> PAGEREF _Toc242994568 \h </w:instrText>
+          <w:instrText xml:space="preserve"> PAGEREF _Toc241697494 \h </w:instrText>
         </w:r>
         <w:r>
           <w:rPr>
@@ -3531,7 +3541,7 @@
             <w:noProof/>
             <w:webHidden/>
           </w:rPr>
-          <w:t>31</w:t>
+          <w:t>27</w:t>
         </w:r>
         <w:r>
           <w:rPr>
@@ -3560,7 +3570,7 @@
           <w:lang w:eastAsia="es-CO"/>
         </w:rPr>
       </w:pPr>
-      <w:hyperlink w:anchor="_Toc242994569" w:history="1">
+      <w:hyperlink w:anchor="_Toc241697495" w:history="1">
         <w:r>
           <w:rPr>
             <w:rStyle w:val="Hyperlink"/>
@@ -3607,7 +3617,7 @@
             <w:noProof/>
             <w:webHidden/>
           </w:rPr>
-          <w:instrText xml:space="preserve"> PAGEREF _Toc242994569 \h </w:instrText>
+          <w:instrText xml:space="preserve"> PAGEREF _Toc241697495 \h </w:instrText>
         </w:r>
         <w:r>
           <w:rPr>
@@ -3627,7 +3637,7 @@
             <w:noProof/>
             <w:webHidden/>
           </w:rPr>
-          <w:t>31</w:t>
+          <w:t>27</w:t>
         </w:r>
         <w:r>
           <w:rPr>
@@ -3656,7 +3666,7 @@
           <w:lang w:eastAsia="es-CO"/>
         </w:rPr>
       </w:pPr>
-      <w:hyperlink w:anchor="_Toc242994570" w:history="1">
+      <w:hyperlink w:anchor="_Toc241697496" w:history="1">
         <w:r>
           <w:rPr>
             <w:rStyle w:val="Hyperlink"/>
@@ -3703,7 +3713,7 @@
             <w:noProof/>
             <w:webHidden/>
           </w:rPr>
-          <w:instrText xml:space="preserve"> PAGEREF _Toc242994570 \h </w:instrText>
+          <w:instrText xml:space="preserve"> PAGEREF _Toc241697496 \h </w:instrText>
         </w:r>
         <w:r>
           <w:rPr>
@@ -3723,7 +3733,7 @@
             <w:noProof/>
             <w:webHidden/>
           </w:rPr>
-          <w:t>32</w:t>
+          <w:t>28</w:t>
         </w:r>
         <w:r>
           <w:rPr>
@@ -3752,7 +3762,7 @@
           <w:lang w:eastAsia="es-CO"/>
         </w:rPr>
       </w:pPr>
-      <w:hyperlink w:anchor="_Toc242994571" w:history="1">
+      <w:hyperlink w:anchor="_Toc241697497" w:history="1">
         <w:r>
           <w:rPr>
             <w:rStyle w:val="Hyperlink"/>
@@ -3799,7 +3809,7 @@
             <w:noProof/>
             <w:webHidden/>
           </w:rPr>
-          <w:instrText xml:space="preserve"> PAGEREF _Toc242994571 \h </w:instrText>
+          <w:instrText xml:space="preserve"> PAGEREF _Toc241697497 \h </w:instrText>
         </w:r>
         <w:r>
           <w:rPr>
@@ -3819,7 +3829,7 @@
             <w:noProof/>
             <w:webHidden/>
           </w:rPr>
-          <w:t>34</w:t>
+          <w:t>30</w:t>
         </w:r>
         <w:r>
           <w:rPr>
@@ -3853,7 +3863,7 @@
       <w:bookmarkStart w:id="4" w:name="_Toc240440230"/>
       <w:bookmarkStart w:id="5" w:name="_Toc241072107"/>
       <w:bookmarkStart w:id="6" w:name="_Toc241072473"/>
-      <w:bookmarkStart w:id="7" w:name="_Toc242994534"/>
+      <w:bookmarkStart w:id="7" w:name="_Toc241697460"/>
       <w:r>
         <w:lastRenderedPageBreak/>
         <w:t>Información principal del proyecto</w:t>
@@ -3876,7 +3886,7 @@
       <w:bookmarkStart w:id="8" w:name="_Toc240440231"/>
       <w:bookmarkStart w:id="9" w:name="_Toc241072108"/>
       <w:bookmarkStart w:id="10" w:name="_Toc241072474"/>
-      <w:bookmarkStart w:id="11" w:name="_Toc242994535"/>
+      <w:bookmarkStart w:id="11" w:name="_Toc241697461"/>
       <w:r>
         <w:t>Título del proyecto</w:t>
       </w:r>
@@ -3910,7 +3920,7 @@
       <w:bookmarkStart w:id="12" w:name="_Toc240440232"/>
       <w:bookmarkStart w:id="13" w:name="_Toc241072109"/>
       <w:bookmarkStart w:id="14" w:name="_Toc241072475"/>
-      <w:bookmarkStart w:id="15" w:name="_Toc242994536"/>
+      <w:bookmarkStart w:id="15" w:name="_Toc241697462"/>
       <w:r>
         <w:t>Resumen ejecutivo</w:t>
       </w:r>
@@ -3931,6 +3941,7 @@
         <w:t>Resumen.</w:t>
       </w:r>
       <w:r>
+        <w:rPr/>
         <w:t xml:space="preserve"> El precio de bolsa de la energía eléctrica en Colombia se fija cada hora sobre una matriz mayoritariamente hidroeléctrica [1] y puede multiplicarse durante semanas en presencia del fenómeno de El Niño. Se diseñó una plataforma que adquiere y sincroniza los datos públicos del mercado (XM) y el índice climático ONI (NOAA), los caracteriza en tiempo y frecuencia, pronostica el precio de las siguientes 24 a 72 horas con bandas de incertidumbre y traduce el pronóstico en recomendaciones de comprar, vender o esperar para generadores y comercializadores, en un dashboard publicado que se actualiza cada día. Al medir qué datos son públicos en el momento de pronosticar se encontró que XM publica el precio con unos tres días de rezago, lo que anulaba la ventaja del ensamble de seis modelos del diseño inicial; el diseño definitivo corrige el predespacho ideal que XM publica la víspera con tres modelos CatBoost reentrenados cada mes. La validación fue fuera de muestra, en 2026 y en cinco años históricos, con la prueba de Diebold-Mariano, y el motor de decisión se evaluó por backtesting. Con solo información pública, el error absoluto medio a 24 h es 33,7 COP/kWh (MAPE 10,0 %), 68 % menor que el de la persistencia con el último precio publicado y 11 % menor que el del predespacho solo (p &lt; 0,001); a 72 h es 52,2 COP/kWh. Las bandas cubren el 80,6 % de las horas (objetivo 80 %) y el motor obtiene ventaja positiva en las dos mitades del periodo para los dos roles y los dos horizontes.</w:t>
       </w:r>
     </w:p>
@@ -3946,6 +3957,7 @@
         <w:t>Abstract.</w:t>
       </w:r>
       <w:r>
+        <w:rPr/>
         <w:t xml:space="preserve"> The hourly spot price of electricity in Colombia is set on a mostly hydroelectric mix and can multiply for weeks during El Niño. We designed a platform that acquires and synchronizes public market data (XM) and the ONI climate index (NOAA), characterizes them in the time and frequency domains, forecasts the price 24 to 72 hours ahead with uncertainty bands, and turns the forecast into buy, sell or wait recommendations for generators and retailers in a public dashboard updated every day. Measuring which data are public at forecast time showed that XM publishes the price with about a three-day lag, which erased the advantage of the initial six-model ensemble; the final design corrects the ideal pre-dispatch that XM publishes the day before with three CatBoost models retrained every month. It was validated out of sample in 2026 and in five historical years with the Diebold-Mariano test, and the decision engine was backtested. Using only public information, the 24-hour mean absolute error is 33.7 COP/kWh (MAPE 10.0 %), 68 % lower than persistence with the latest published price and 11 % lower than the pre-dispatch alone (p &lt; 0.001); at 72 hours it is 52.2 COP/kWh. The bands cover 80.6 % of the hours (target 80 %) and the engine keeps a positive advantage in both halves of the period for both roles and horizons.</w:t>
       </w:r>
     </w:p>
@@ -3962,7 +3974,7 @@
       <w:bookmarkStart w:id="16" w:name="_Toc240440236"/>
       <w:bookmarkStart w:id="17" w:name="_Toc241072110"/>
       <w:bookmarkStart w:id="18" w:name="_Toc241072476"/>
-      <w:bookmarkStart w:id="19" w:name="_Toc242994537"/>
+      <w:bookmarkStart w:id="19" w:name="_Toc241697463"/>
       <w:r>
         <w:t>Costo total del proyecto</w:t>
       </w:r>
@@ -3992,7 +4004,6 @@
           <w:sz w:val="20"/>
           <w:szCs w:val="20"/>
         </w:rPr>
-        <w:lastRenderedPageBreak/>
         <w:t>Tabla 1.</w:t>
       </w:r>
       <w:r>
@@ -4847,7 +4858,7 @@
       <w:bookmarkStart w:id="20" w:name="_Toc240440237"/>
       <w:bookmarkStart w:id="21" w:name="_Toc241072111"/>
       <w:bookmarkStart w:id="22" w:name="_Toc241072477"/>
-      <w:bookmarkStart w:id="23" w:name="_Toc242994538"/>
+      <w:bookmarkStart w:id="23" w:name="_Toc241697464"/>
       <w:r>
         <w:lastRenderedPageBreak/>
         <w:t>Introducción</w:t>
@@ -4863,7 +4874,16 @@
         <w:jc w:val="both"/>
       </w:pPr>
       <w:r>
-        <w:t>El Mercado de Energía Mayorista (MEM) en Colombia, administrado por XM, establece un precio de bolsa de la energía eléctrica para cada hora del día. Dado que cerca del 72 % de la generación proviene de centrales hidroeléctricas [1], este precio está condicionado por diversos factores, entre ellos los hidrológicos (como el nivel de los embalses y los aportes de los ríos) y su variabilidad asociada al fenómeno de El Niño. Esta dependencia de las condiciones hidrológicas y climáticas introduce altos niveles de incertidumbre en el comportamiento del precio. Por ejemplo, entre 2023 y 2024 el promedio diario osciló entre 107 y 2.499 COP/kWh [4]. Los agentes (vendedores y compradores) que participan en el mercado deben decidir sus operaciones hora a hora bajo esa incertidumbre. Por otro lado, los estudios sobre el pronóstico de precios eléctricos mediante series de tiempo evidencian que estas presentan saltos, estacionalidad múltiple y cambios de régimen [5].</w:t>
+        <w:t>El Mercado de Energía Mayorista (MEM) en Colombia, administrado por XM, establece un precio de bolsa de la energía eléctrica para cada hora del día. Dado que cerca del 72 % de la generación proviene de centrales hidroeléctricas [1], este precio está condic</w:t>
+      </w:r>
+      <w:r>
+        <w:t>ionado por diversos factores, entre ellos los hidrológicos (como el nivel de los embalses y los aportes de los ríos) y su variabilidad asociada al fenómeno de El Niño. Esta dependencia de las condiciones hidrológicas y climáticas introduce altos niveles de</w:t>
+      </w:r>
+      <w:r>
+        <w:t xml:space="preserve"> incertidumbre en el comportamiento del precio. Por ejemplo, entre 2023 y 2024 el promedio diario osciló entre 107 y 2.499 COP/kWh [4]. Los agentes (vendedores y compradores) que participan en el mercado deben decidir sus operaciones hora a hora bajo esa i</w:t>
+      </w:r>
+      <w:r>
+        <w:t>ncertidumbre. Por otro lado, los estudios sobre el pronóstico de precios eléctricos mediante series de tiempo evidencian que estas presentan saltos, estacionalidad múltiple y cambios de régimen [5].</w:t>
       </w:r>
     </w:p>
     <w:p>
@@ -4872,7 +4892,13 @@
         <w:jc w:val="both"/>
       </w:pPr>
       <w:r>
-        <w:t xml:space="preserve">Para pronosticar este tipo de series se usan principalmente tres familias de métodos [5], [6]: los modelos estadísticos, como ARIMA y sus extensiones con volatilidad GARCH, que explican el precio a partir de sus valores pasados y de variables externas; los modelos de aprendizaje automático, como los árboles de decisión potenciados; y las redes neuronales profundas diseñadas para series de tiempo. Todos se comparan contra una referencia mínima, la </w:t>
+        <w:t>Para pronosticar este tipo de series se usan principalmen</w:t>
+      </w:r>
+      <w:r>
+        <w:t>te tres familias de métodos [5], [6]: los modelos estadísticos, como ARIMA y sus extensiones con volatilidad GARCH, que explican el precio a partir de sus valores pasados y de variables externas; los modelos de aprendizaje automático, como los árboles de d</w:t>
+      </w:r>
+      <w:r>
+        <w:t xml:space="preserve">ecisión potenciados; y las redes neuronales profundas diseñadas para series de tiempo. Todos se comparan contra una referencia mínima, la </w:t>
       </w:r>
       <w:r>
         <w:rPr>
@@ -4881,7 +4907,10 @@
         <w:t>persistencia</w:t>
       </w:r>
       <w:r>
-        <w:t>, que pronostica que el precio de cada hora será igual al de la misma hora del día anterior. Aunque es el pronóstico más simple posible, es difícil de superar en un mercado con un ciclo diario tan marcado como el colombiano; por eso un modelo solo aporta valor si su error es significativamente menor que el de la persistencia.</w:t>
+        <w:t xml:space="preserve">, que pronostica que el precio de cada hora será igual al de la misma hora del día anterior. Aunque es el </w:t>
+      </w:r>
+      <w:r>
+        <w:t>pronóstico más simple posible, es difícil de superar en un mercado con un ciclo diario tan marcado como el colombiano; por eso un modelo solo aporta valor si su error es significativamente menor que el de la persistencia.</w:t>
       </w:r>
     </w:p>
     <w:p>
@@ -4899,7 +4928,13 @@
         <w:jc w:val="both"/>
       </w:pPr>
       <w:r>
-        <w:t>El valor práctico de la plataforma no está solo en la exactitud del pronóstico. Un pronóstico puntual no indica cuánto confiar en él, y la literatura reciente advierte que un menor error no se traduce automáticamente en mejores decisiones de mercado [8]. Por eso el diseño incluye bandas de incertidumbre calibradas y un motor de decisión que se evalúa por la ventaja económica de sus recomendaciones, y no solo por el error del modelo que lo alimenta.</w:t>
+        <w:t>El valor práctico de la plataforma no está solo en la exact</w:t>
+      </w:r>
+      <w:r>
+        <w:t>itud del pronóstico. Un pronóstico puntual no indica cuánto confiar en él, y la literatura reciente advierte que un menor error no se traduce automáticamente en mejores decisiones de mercado [8]. Por eso el diseño incluye bandas de incertidumbre calibradas</w:t>
+      </w:r>
+      <w:r>
+        <w:t xml:space="preserve"> y un motor de decisión que se evalúa por la ventaja económica de sus recomendaciones, y no solo por el error del modelo que lo alimenta.</w:t>
       </w:r>
     </w:p>
     <w:p>
@@ -4925,7 +4960,7 @@
       <w:bookmarkStart w:id="24" w:name="_Toc240440238"/>
       <w:bookmarkStart w:id="25" w:name="_Toc241072112"/>
       <w:bookmarkStart w:id="26" w:name="_Toc241072478"/>
-      <w:bookmarkStart w:id="27" w:name="_Toc242994539"/>
+      <w:bookmarkStart w:id="27" w:name="_Toc241697465"/>
       <w:r>
         <w:lastRenderedPageBreak/>
         <w:t>Objetivos</w:t>
@@ -4948,7 +4983,7 @@
       <w:bookmarkStart w:id="28" w:name="_Toc240440239"/>
       <w:bookmarkStart w:id="29" w:name="_Toc241072113"/>
       <w:bookmarkStart w:id="30" w:name="_Toc241072479"/>
-      <w:bookmarkStart w:id="31" w:name="_Toc242994540"/>
+      <w:bookmarkStart w:id="31" w:name="_Toc241697466"/>
       <w:r>
         <w:t>Objetivo general</w:t>
       </w:r>
@@ -4979,7 +5014,7 @@
       <w:bookmarkStart w:id="32" w:name="_Toc240440240"/>
       <w:bookmarkStart w:id="33" w:name="_Toc241072114"/>
       <w:bookmarkStart w:id="34" w:name="_Toc241072480"/>
-      <w:bookmarkStart w:id="35" w:name="_Toc242994541"/>
+      <w:bookmarkStart w:id="35" w:name="_Toc241697467"/>
       <w:r>
         <w:t>Objetivos específicos</w:t>
       </w:r>
@@ -5007,6 +5042,7 @@
         <w:t>OE1.</w:t>
       </w:r>
       <w:r>
+        <w:rPr/>
         <w:t xml:space="preserve"> Adquirir, sincronizar y caracterizar temporal y espectralmente las series históricas de las variables del mercado, mediante técnicas de procesamiento de datos, para seleccionar variables predictoras.</w:t>
       </w:r>
     </w:p>
@@ -5029,6 +5065,7 @@
         <w:t>OE2.</w:t>
       </w:r>
       <w:r>
+        <w:rPr/>
         <w:t xml:space="preserve"> Implementar y evaluar diferentes modelos de pronóstico del precio de bolsa, comparando precisión frente a persistencia, robustez, costo computacional e interpretabilidad.</w:t>
       </w:r>
     </w:p>
@@ -5051,6 +5088,7 @@
         <w:t>OE3.</w:t>
       </w:r>
       <w:r>
+        <w:rPr/>
         <w:t xml:space="preserve"> Diseñar e implementar un motor de decisión que traduzca los pronósticos y su incertidumbre en señales de compra, venta o espera.</w:t>
       </w:r>
     </w:p>
@@ -5073,6 +5111,7 @@
         <w:t>OE4.</w:t>
       </w:r>
       <w:r>
+        <w:rPr/>
         <w:t xml:space="preserve"> Validar el funcionamiento del motor para la toma de decisiones.</w:t>
       </w:r>
     </w:p>
@@ -5089,9 +5128,12 @@
       <w:bookmarkStart w:id="36" w:name="_Toc240440241"/>
       <w:bookmarkStart w:id="37" w:name="_Toc241072115"/>
       <w:bookmarkStart w:id="38" w:name="_Toc241072481"/>
-      <w:bookmarkStart w:id="39" w:name="_Toc242994542"/>
-      <w:r>
-        <w:t>Delimitación</w:t>
+      <w:bookmarkStart w:id="39" w:name="_Toc241697468"/>
+      <w:r>
+        <w:t>Deli</w:t>
+      </w:r>
+      <w:r>
+        <w:t>mitación</w:t>
       </w:r>
       <w:bookmarkEnd w:id="36"/>
       <w:bookmarkEnd w:id="37"/>
@@ -5111,7 +5153,7 @@
       <w:bookmarkStart w:id="40" w:name="_Toc240440242"/>
       <w:bookmarkStart w:id="41" w:name="_Toc241072116"/>
       <w:bookmarkStart w:id="42" w:name="_Toc241072482"/>
-      <w:bookmarkStart w:id="43" w:name="_Toc242994543"/>
+      <w:bookmarkStart w:id="43" w:name="_Toc241697469"/>
       <w:r>
         <w:t>Alcances</w:t>
       </w:r>
@@ -5322,16 +5364,30 @@
                 <w:sz w:val="17"/>
                 <w:szCs w:val="17"/>
               </w:rPr>
-              <w:t>3. La sincronización e integración se hará mínimo a resolución horaria, e incluirá, entre otras, las siguientes variables: precio de bolsa, demanda, generación, volumen de embalses y aportes hídricos.</w:t>
-            </w:r>
-          </w:p>
-          <w:p>
-            <w:r>
-              <w:rPr>
-                <w:sz w:val="17"/>
-                <w:szCs w:val="17"/>
-              </w:rPr>
-              <w:t>4. Se utilizarán datos históricos de enero de 2019 a agosto de 2026 de las variables mencionadas.</w:t>
+              <w:t>3. La sincronización e i</w:t>
+            </w:r>
+            <w:r>
+              <w:rPr>
+                <w:sz w:val="17"/>
+                <w:szCs w:val="17"/>
+              </w:rPr>
+              <w:t>ntegración se hará mínimo a resolución horaria, e incluirá, entre otras, las siguientes variables: precio de bolsa, demanda, generación, volumen de embalses y aportes hídricos.</w:t>
+            </w:r>
+          </w:p>
+          <w:p>
+            <w:r>
+              <w:rPr>
+                <w:sz w:val="17"/>
+                <w:szCs w:val="17"/>
+              </w:rPr>
+              <w:t>4. Se utilizarán datos históricos de enero de 2019 a agosto de 2026 de las vari</w:t>
+            </w:r>
+            <w:r>
+              <w:rPr>
+                <w:sz w:val="17"/>
+                <w:szCs w:val="17"/>
+              </w:rPr>
+              <w:t>ables mencionadas.</w:t>
             </w:r>
           </w:p>
           <w:p>
@@ -5431,7 +5487,14 @@
                 <w:sz w:val="17"/>
                 <w:szCs w:val="17"/>
               </w:rPr>
-              <w:t>3. Se realizará la evaluación de los modelos utilizando métricas de precisión y error (MAE, RMSE y MAPE), persistencia, y costo computacional.</w:t>
+              <w:t>3. Se realizará la eva</w:t>
+            </w:r>
+            <w:r>
+              <w:rPr>
+                <w:sz w:val="17"/>
+                <w:szCs w:val="17"/>
+              </w:rPr>
+              <w:t>luación de los modelos utilizando métricas de precisión y error (MAE, RMSE y MAPE), persistencia, y costo computacional.</w:t>
             </w:r>
           </w:p>
         </w:tc>
@@ -5504,16 +5567,30 @@
                 <w:sz w:val="17"/>
                 <w:szCs w:val="17"/>
               </w:rPr>
-              <w:t>1. El motor de decisión contará con reglas basadas en percentiles del precio y su incertidumbre, diferenciando el rol comprador y vendedor.</w:t>
-            </w:r>
-          </w:p>
-          <w:p>
-            <w:r>
-              <w:rPr>
-                <w:sz w:val="17"/>
-                <w:szCs w:val="17"/>
-              </w:rPr>
-              <w:t>2. Se generará material visual de apoyo a la decisión: semáforo de compra/venta/espera, mapa de calor día-hora, bandas de incertidumbre y comparación real-vs-pronóstico, con sus metadatos (unidad, período, confianza, versión del modelo).</w:t>
+              <w:t>1. El motor de decisión contará con reglas basadas en percentiles del precio y su incertidumbre</w:t>
+            </w:r>
+            <w:r>
+              <w:rPr>
+                <w:sz w:val="17"/>
+                <w:szCs w:val="17"/>
+              </w:rPr>
+              <w:t>, diferenciando el rol comprador y vendedor.</w:t>
+            </w:r>
+          </w:p>
+          <w:p>
+            <w:r>
+              <w:rPr>
+                <w:sz w:val="17"/>
+                <w:szCs w:val="17"/>
+              </w:rPr>
+              <w:t>2. Se generará material visual de apoyo a la decisión: semáforo de compra/venta/espera, mapa de calor día-hora, bandas de incertidumbre y comparación real-vs-pronóstico, con sus metadatos (unidad, período, confi</w:t>
+            </w:r>
+            <w:r>
+              <w:rPr>
+                <w:sz w:val="17"/>
+                <w:szCs w:val="17"/>
+              </w:rPr>
+              <w:t>anza, versión del modelo).</w:t>
             </w:r>
           </w:p>
           <w:p>
@@ -5668,7 +5745,7 @@
       <w:bookmarkStart w:id="44" w:name="_Toc240440243"/>
       <w:bookmarkStart w:id="45" w:name="_Toc241072117"/>
       <w:bookmarkStart w:id="46" w:name="_Toc241072483"/>
-      <w:bookmarkStart w:id="47" w:name="_Toc242994544"/>
+      <w:bookmarkStart w:id="47" w:name="_Toc241697470"/>
       <w:r>
         <w:t>Limitaciones</w:t>
       </w:r>
@@ -5698,7 +5775,15 @@
           <w:sz w:val="20"/>
           <w:szCs w:val="20"/>
         </w:rPr>
-        <w:t>Tabla 3.</w:t>
+        <w:t xml:space="preserve">Tabla </w:t>
+      </w:r>
+      <w:r>
+        <w:rPr>
+          <w:b/>
+          <w:sz w:val="20"/>
+          <w:szCs w:val="20"/>
+        </w:rPr>
+        <w:t>3.</w:t>
       </w:r>
       <w:r>
         <w:rPr>
@@ -5965,7 +6050,14 @@
                 <w:sz w:val="17"/>
                 <w:szCs w:val="17"/>
               </w:rPr>
-              <w:t>1. El sistema no ejecuta transacciones automáticas ni se integra con los sistemas de despacho de XM.</w:t>
+              <w:t>1. El sistema no ejecuta transacciones automáticas ni se integra con los sistemas de d</w:t>
+            </w:r>
+            <w:r>
+              <w:rPr>
+                <w:sz w:val="17"/>
+                <w:szCs w:val="17"/>
+              </w:rPr>
+              <w:t>espacho de XM.</w:t>
             </w:r>
           </w:p>
           <w:p>
@@ -5983,7 +6075,14 @@
                 <w:sz w:val="17"/>
                 <w:szCs w:val="17"/>
               </w:rPr>
-              <w:t>3. No se realizará simulación estructural de nivel 2, es decir, no se construirá un modelo que simule el mecanismo físico y económico del despacho eléctrico colombiano.</w:t>
+              <w:t>3. No se realizará simulación estructural de nivel 2, es decir, no se construirá un modelo que simule el mecanismo físico y económico del d</w:t>
+            </w:r>
+            <w:r>
+              <w:rPr>
+                <w:sz w:val="17"/>
+                <w:szCs w:val="17"/>
+              </w:rPr>
+              <w:t>espacho eléctrico colombiano.</w:t>
             </w:r>
           </w:p>
         </w:tc>
@@ -6044,7 +6143,14 @@
                 <w:sz w:val="17"/>
                 <w:szCs w:val="17"/>
               </w:rPr>
-              <w:t>2. La validación mediante backtesting se basa en datos históricos y no garantiza el desempeño ante condiciones de mercado no observadas previamente (cambios regulatorios o hidrológicos extremos fuera del rango histórico).</w:t>
+              <w:t>2. La validación mediante backtesting se basa en datos históricos y no garantiza el desempeño ante condiciones de mercado n</w:t>
+            </w:r>
+            <w:r>
+              <w:rPr>
+                <w:sz w:val="17"/>
+                <w:szCs w:val="17"/>
+              </w:rPr>
+              <w:t>o observadas previamente (cambios regulatorios o hidrológicos extremos fuera del rango histórico).</w:t>
             </w:r>
           </w:p>
         </w:tc>
@@ -6069,7 +6175,7 @@
       <w:bookmarkStart w:id="48" w:name="_Toc240440244"/>
       <w:bookmarkStart w:id="49" w:name="_Toc241072118"/>
       <w:bookmarkStart w:id="50" w:name="_Toc241072484"/>
-      <w:bookmarkStart w:id="51" w:name="_Toc242994545"/>
+      <w:bookmarkStart w:id="51" w:name="_Toc241697471"/>
       <w:r>
         <w:t>Entregables</w:t>
       </w:r>
@@ -6098,7 +6204,11 @@
       </w:r>
       <w:r>
         <w:tab/>
-        <w:t>Anexo 1 – Formulación del proyecto (Anexo 1 – Formulación del proyecto (entregado).</w:t>
+        <w:t>Anexo 1 – Formulación del proyecto (</w:t>
+      </w:r>
+      <w:r>
+        <w:rPr/>
+        <w:t>Anexo 1 – Formulación del proyecto (entregado).</w:t>
       </w:r>
     </w:p>
     <w:p>
@@ -6112,7 +6222,11 @@
       </w:r>
       <w:r>
         <w:tab/>
-        <w:t>Dataset integrado y limpio (enero de 2019 – agosto de 2026) (Dataset integrado y limpio (enero de 2019 – agosto de 2026) (entregado, en el repositorio).</w:t>
+        <w:t>Dataset integrado y limpio (enero de 2019 – agosto de 2026) (</w:t>
+      </w:r>
+      <w:r>
+        <w:rPr/>
+        <w:t>Dataset integrado y limpio (enero de 2019 – agosto de 2026) (entregado, en el repositorio).</w:t>
       </w:r>
     </w:p>
     <w:p>
@@ -6126,7 +6240,11 @@
       </w:r>
       <w:r>
         <w:tab/>
-        <w:t>Notebooks de análisis exploratorio y de modelado (Notebooks de análisis exploratorio y de modelado (entregados, en el repositorio).</w:t>
+        <w:t>Notebooks de análisis exploratorio y de modelado (</w:t>
+      </w:r>
+      <w:r>
+        <w:rPr/>
+        <w:t>Notebooks de análisis exploratorio y de modelado (entregados, en el repositorio).</w:t>
       </w:r>
     </w:p>
     <w:p>
@@ -6140,7 +6258,11 @@
       </w:r>
       <w:r>
         <w:tab/>
-        <w:t>Biblioteca de imágenes de apoyo a la decisión (Biblioteca de imágenes de apoyo a la decisión (entregada en el dashboard: semáforo, mapa de calor día-hora, bandas de incertidumbre y real frente a pronóstico, con metadatos).</w:t>
+        <w:t>Biblioteca de imágenes de apoyo a la decisión (</w:t>
+      </w:r>
+      <w:r>
+        <w:rPr/>
+        <w:t>Biblioteca de imágenes de apoyo a la decisión (entregada en el dashboard: semáforo, mapa de calor día-hora, bandas de incertidumbre y real frente a pronóstico, con metadatos).</w:t>
       </w:r>
     </w:p>
     <w:p>
@@ -6154,7 +6276,11 @@
       </w:r>
       <w:r>
         <w:tab/>
-        <w:t>Módulo de recomendación y resultados de backtesting (Módulo de recomendación y resultados de backtesting (entregados: src/motor_decision.py y Sección 7.3).</w:t>
+        <w:t>Módulo de recomendación y resultados de backtesting (</w:t>
+      </w:r>
+      <w:r>
+        <w:rPr/>
+        <w:t>Módulo de recomendación y resultados de backtesting (entregados: src/motor_decision.py y Sección 7.3).</w:t>
       </w:r>
     </w:p>
     <w:p>
@@ -6168,7 +6294,11 @@
       </w:r>
       <w:r>
         <w:tab/>
-        <w:t>Dashboard (Dashboard (publicado en augurpredictor.streamlit.app, con actualización diaria).</w:t>
+        <w:t>Dashboard (</w:t>
+      </w:r>
+      <w:r>
+        <w:rPr/>
+        <w:t>Dashboard (publicado en augurpredictor.streamlit.app, con actualización diaria).</w:t>
       </w:r>
     </w:p>
     <w:p>
@@ -6182,7 +6312,11 @@
       </w:r>
       <w:r>
         <w:tab/>
-        <w:t>Informe final y repositorio en GitHub (Informe final y repositorio en GitHub (github.com/Ziskito/xm-spot-price-predictor).</w:t>
+        <w:t>Informe final y repositorio en GitHub (</w:t>
+      </w:r>
+      <w:r>
+        <w:rPr/>
+        <w:t>Informe final y repositorio en GitHub (github.com/Ziskito/xm-spot-price-predictor).</w:t>
       </w:r>
     </w:p>
     <w:p>
@@ -6196,7 +6330,11 @@
       </w:r>
       <w:r>
         <w:tab/>
-        <w:t>Informe de avance – Semana 10 (Informe de avance – Semana 10 (entregado).</w:t>
+        <w:t>Informe de avance – Semana 10 (</w:t>
+      </w:r>
+      <w:r>
+        <w:rPr/>
+        <w:t>Informe de avance – Semana 10 (entregado).</w:t>
       </w:r>
     </w:p>
     <w:p>
@@ -6210,7 +6348,10 @@
       </w:r>
       <w:r>
         <w:tab/>
-        <w:t>ManualManual de uso del motor de decisión (entregado: manual de usuario MU-AUG-001, Anexo 4).</w:t>
+        <w:t>Manual</w:t>
+      </w:r>
+      <w:r>
+        <w:t>Manual de uso del motor de decisión (entregado: manual de usuario MU-AUG-001, Anexo 4).</w:t>
       </w:r>
     </w:p>
     <w:p>
@@ -6224,7 +6365,11 @@
       </w:r>
       <w:r>
         <w:tab/>
-        <w:t>Informe final – Semana 16 (Informe final – entrega el 20 de noviembre de 2026 (este documento), con el resumen y el abstract de la Sección 1.2 para la biblioteca (Manglar/DSpace).</w:t>
+        <w:t>Informe final – Semana 16 (</w:t>
+      </w:r>
+      <w:r>
+        <w:rPr/>
+        <w:t>Informe final – entrega el 20 de noviembre de 2026 (este documento), con el resumen y el abstract de la Sección 1.2 para la biblioteca (Manglar/DSpace).</w:t>
       </w:r>
     </w:p>
     <w:p>
@@ -6238,7 +6383,11 @@
       </w:r>
       <w:r>
         <w:tab/>
-        <w:t>Póster – Semana 16 (Póster – entrega el 20 de noviembre; exposición abierta al público en el coliseo el 27 de noviembre (</w:t>
+        <w:t>Póster – Semana 16 (</w:t>
+      </w:r>
+      <w:r>
+        <w:rPr/>
+        <w:t>Póster – entrega el 20 de noviembre; exposición abierta al público en el coliseo el 27 de noviembre (</w:t>
       </w:r>
       <w:r>
         <w:rPr>
@@ -6247,6 +6396,7 @@
         <w:t>completar</w:t>
       </w:r>
       <w:r>
+        <w:rPr/>
         <w:t>).</w:t>
       </w:r>
     </w:p>
@@ -6257,12 +6407,15 @@
         <w:jc w:val="both"/>
       </w:pPr>
       <w:r>
-        <w:lastRenderedPageBreak/>
         <w:t>•</w:t>
       </w:r>
       <w:r>
         <w:tab/>
-        <w:t>Presentación final – Semana 16 (Presentación final – entrega el 20 de noviembre; sustentación ante el jurado el 24 de noviembre (</w:t>
+        <w:t>Presentación final – Semana 16 (</w:t>
+      </w:r>
+      <w:r>
+        <w:rPr/>
+        <w:t>Presentación final – entrega el 20 de noviembre; sustentación ante el jurado el 24 de noviembre (</w:t>
       </w:r>
       <w:r>
         <w:rPr>
@@ -6271,6 +6424,7 @@
         <w:t>completar</w:t>
       </w:r>
       <w:r>
+        <w:rPr/>
         <w:t>).</w:t>
       </w:r>
     </w:p>
@@ -6285,7 +6439,11 @@
       </w:r>
       <w:r>
         <w:tab/>
-        <w:t>Video – Semana 16 (Video de 2 minutos con el funcionamiento del sistema – entrega el 20 de noviembre (</w:t>
+        <w:t>Video – Semana 16 (</w:t>
+      </w:r>
+      <w:r>
+        <w:rPr/>
+        <w:t>Video de 2 minutos con el funcionamiento del sistema – entrega el 20 de noviembre (</w:t>
       </w:r>
       <w:r>
         <w:rPr>
@@ -6294,6 +6452,7 @@
         <w:t>completar</w:t>
       </w:r>
       <w:r>
+        <w:rPr/>
         <w:t>).</w:t>
       </w:r>
     </w:p>
@@ -6321,8 +6480,9 @@
       </w:pPr>
       <w:bookmarkStart w:id="53" w:name="_Toc241072119"/>
       <w:bookmarkStart w:id="54" w:name="_Toc241072485"/>
-      <w:bookmarkStart w:id="55" w:name="_Toc242994546"/>
-      <w:r>
+      <w:bookmarkStart w:id="55" w:name="_Toc241697472"/>
+      <w:r>
+        <w:lastRenderedPageBreak/>
         <w:t>Revisión bibliográfica</w:t>
       </w:r>
       <w:bookmarkEnd w:id="52"/>
@@ -6346,7 +6506,7 @@
       <w:bookmarkStart w:id="56" w:name="_Toc240440246"/>
       <w:bookmarkStart w:id="57" w:name="_Toc241072120"/>
       <w:bookmarkStart w:id="58" w:name="_Toc241072486"/>
-      <w:bookmarkStart w:id="59" w:name="_Toc242994547"/>
+      <w:bookmarkStart w:id="59" w:name="_Toc241697473"/>
       <w:r>
         <w:t>Planteamiento del problema</w:t>
       </w:r>
@@ -6361,7 +6521,10 @@
         <w:jc w:val="both"/>
       </w:pPr>
       <w:r>
-        <w:t>El precio de bolsa colombiano se puede representar como una serie de tiempo a resolución horaria con saltos y cambios de régimen. De la plataforma de XM [4] se obtuvieron 66.576 muestras horarias entre enero de 2019 y agosto de 2026. En una revisión preliminar se encontró que la mediana del precio es 242,28 COP/kWh, pero el percentil 99 llega a 1.449,73 COP/kWh y el máximo a 2.675,65 COP/kWh: una cola larga que el promedio no describe apropiadamente.</w:t>
+        <w:t xml:space="preserve">El precio de bolsa colombiano se puede representar como una serie de tiempo a resolución horaria con saltos y cambios de régimen. De la plataforma de XM [4] se obtuvieron 66.576 muestras horarias entre enero de 2019 </w:t>
+      </w:r>
+      <w:r>
+        <w:t>y agosto de 2026. En una revisión preliminar se encontró que la mediana del precio es 242,28 COP/kWh, pero el percentil 99 llega a 1.449,73 COP/kWh y el máximo a 2.675,65 COP/kWh: una cola larga que el promedio no describe apropiadamente.</w:t>
       </w:r>
     </w:p>
     <w:p>
@@ -6370,7 +6533,16 @@
         <w:jc w:val="both"/>
       </w:pPr>
       <w:r>
-        <w:t>La Figura 1 muestra el promedio diario del precio (cada punto de la curva resume las 24 horas de un día) entre 2019 y 2026. Las franjas de color marcan los episodios del fenómeno ENSO según el índice ONI de NOAA [9]: naranja para El Niño (ONI ≥ 0,5) y azul para La Niña (ONI ≤ −0,5). Los tramos de precio alto coinciden en buena parte con El Niño (2023-2024 y 2026). Sin embargo, el mayor pico, un promedio diario de 2.499 COP/kWh el 30 de septiembre de 2024, ocurrió con ONI neutro, cuando el volumen útil de los embalses era el más bajo de todos los septiembres de 2019 a 2025. Por tanto, el precio también depende de la hidrología acumulada, no solo del índice climático.</w:t>
+        <w:t>La Figura 1 muest</w:t>
+      </w:r>
+      <w:r>
+        <w:t>ra el promedio diario del precio (cada punto de la curva resume las 24 horas de un día) entre 2019 y 2026. Las franjas de color marcan los episodios del fenómeno ENSO según el índice ONI de NOAA [9]: naranja para El Niño (ONI ≥ 0,5) y azul para La Niña (ON</w:t>
+      </w:r>
+      <w:r>
+        <w:t>I ≤ −0,5). Los tramos de precio alto coinciden en buena parte con El Niño (2023-2024 y 2026). Sin embargo, el mayor pico, un promedio diario de 2.499 COP/kWh el 30 de septiembre de 2024, ocurrió con ONI neutro, cuando el volumen útil de los embalses era el</w:t>
+      </w:r>
+      <w:r>
+        <w:t xml:space="preserve"> más bajo de todos los septiembres de 2019 a 2025. Por tanto, el precio también depende de la hidrología acumulada, no solo del índice climático.</w:t>
       </w:r>
     </w:p>
     <w:p>
@@ -6384,7 +6556,7 @@
           <w:noProof/>
         </w:rPr>
         <w:drawing>
-          <wp:inline distT="0" distB="0" distL="0" distR="0" wp14:anchorId="2DB2291D" wp14:editId="26E0095D">
+          <wp:inline distT="0" distB="0" distL="0" distR="0" wp14:anchorId="78D1B76C" wp14:editId="2076B574">
             <wp:extent cx="4320000" cy="1753663"/>
             <wp:effectExtent l="0" t="0" r="0" b="0"/>
             <wp:docPr id="1" name="Picture 1"/>
@@ -6438,7 +6610,14 @@
           <w:sz w:val="20"/>
           <w:szCs w:val="20"/>
         </w:rPr>
-        <w:t xml:space="preserve"> Precio de bolsa promedio diario entre 2019 y 2026. Franjas naranja: El Niño (ONI ≥ 0,5); franjas azules: La Niña (ONI ≤ −0,5). Fuente: elaboración propia con datos de XM y NOAA.</w:t>
+        <w:t xml:space="preserve"> Precio de bolsa promedio diario entre 2019 y 2026. Franjas naranja: El Niño (ONI ≥ 0,5); franjas a</w:t>
+      </w:r>
+      <w:r>
+        <w:rPr>
+          <w:sz w:val="20"/>
+          <w:szCs w:val="20"/>
+        </w:rPr>
+        <w:t>zules: La Niña (ONI ≤ −0,5). Fuente: elaboración propia con datos de XM y NOAA.</w:t>
       </w:r>
     </w:p>
     <w:p>
@@ -6447,7 +6626,10 @@
         <w:jc w:val="both"/>
       </w:pPr>
       <w:r>
-        <w:t xml:space="preserve">El problema impacta a generadores y comercializadores del MEM, en especial a empresas medianas sin herramientas analíticas: comprar en bolsa en la hora equivocada de un evento seco puede costar varias veces el precio típico. Ocurre todos los días y se agudiza en temporadas climáticas extremas [2]. Es un problema complejo de ingeniería (ABET) porque tiene </w:t>
+        <w:t xml:space="preserve">El problema impacta a generadores y comercializadores del MEM, en especial a empresas medianas sin herramientas analíticas: comprar en bolsa en la hora equivocada de un evento </w:t>
+      </w:r>
+      <w:r>
+        <w:t xml:space="preserve">seco puede costar varias veces el precio típico. Ocurre todos los días y se agudiza en temporadas climáticas extremas [2]. Es un problema complejo de ingeniería (ABET) porque tiene </w:t>
       </w:r>
       <w:r>
         <w:rPr>
@@ -6456,7 +6638,10 @@
         <w:t>requerimientos en conflicto</w:t>
       </w:r>
       <w:r>
-        <w:t xml:space="preserve"> (precisión frente a costo computacional e interpretabilidad), </w:t>
+        <w:t xml:space="preserve"> (precisión frente a costo computacional e inter</w:t>
+      </w:r>
+      <w:r>
+        <w:t xml:space="preserve">pretabilidad), </w:t>
       </w:r>
       <w:r>
         <w:rPr>
@@ -6483,7 +6668,10 @@
         <w:t>no tiene solución única</w:t>
       </w:r>
       <w:r>
-        <w:t>: ningún modelo predomina en todos los regímenes (Sección 7).</w:t>
+        <w:t xml:space="preserve">: </w:t>
+      </w:r>
+      <w:r>
+        <w:t>ningún modelo predomina en todos los regímenes (Sección 7).</w:t>
       </w:r>
     </w:p>
     <w:p>
@@ -6492,11 +6680,7 @@
         <w:jc w:val="both"/>
       </w:pPr>
       <w:r>
-        <w:t xml:space="preserve">Además, el diseño exigió tomar decisiones que la literatura no fija para este caso: qué variables construir a partir de las series públicas (Tabla 11), qué información está realmente disponible en el momento de pronosticar, qué modelos usar y cómo combinarlos (de más de quince familias evaluadas, el diseño </w:t>
-      </w:r>
-      <w:r>
-        <w:lastRenderedPageBreak/>
-        <w:t>definitivo usa el predespacho de XM y tres CatBoost; Tabla 12), el rango de años del histórico, la forma de sincronizar series de resolución distinta y la codificación del ONI (Tabla 13). Cada decisión se tomó formulando alternativas, evaluándolas fuera de muestra y eligiendo con criterios explícitos (Sección 6.8).</w:t>
+        <w:t>Además, el diseño exigió tomar decisiones que la literatura no fija para este caso: qué variables construir a partir de las series públicas (Tabla 11), qué información está realmente disponible en el momento de pronosticar, qué modelos usar y cómo combinarlos (de más de quince familias evaluadas, el diseño definitivo usa el predespacho de XM y tres CatBoost; Tabla 12), el rango de años del histórico, la forma de sincronizar series de resolución distinta y la codificación del ONI (Tabla 13). Cada decisión se tomó formulando alternativas, evaluándolas fuera de muestra y eligiendo con criterios explícitos (Sección 6.8).</w:t>
       </w:r>
     </w:p>
     <w:p>
@@ -6512,8 +6696,9 @@
       <w:bookmarkStart w:id="60" w:name="_Toc240440247"/>
       <w:bookmarkStart w:id="61" w:name="_Toc241072121"/>
       <w:bookmarkStart w:id="62" w:name="_Toc241072487"/>
-      <w:bookmarkStart w:id="63" w:name="_Toc242994548"/>
-      <w:r>
+      <w:bookmarkStart w:id="63" w:name="_Toc241697474"/>
+      <w:r>
+        <w:lastRenderedPageBreak/>
         <w:t>Descripción de avances tecnológicos</w:t>
       </w:r>
       <w:bookmarkEnd w:id="60"/>
@@ -6527,7 +6712,19 @@
         <w:jc w:val="both"/>
       </w:pPr>
       <w:r>
-        <w:t>El pronóstico de precios eléctricos (EPF, por sus siglas en inglés) migró de modelos econométricos univariados hacia modelos multivariados con selección de variables y redes profundas especializadas [5], [6]. En una primera etapa predominaron los modelos autorregresivos tipo ARIMA y sus extensiones con volatilidad condicional (GARCH), que explican el precio a partir de su propio pasado. Luego se incorporaron variables externas, como la demanda, la hidrología o el precio de los combustibles, junto con métodos de regularización como LASSO [10], que seleccionan automáticamente las variables que aportan, y modelos de aprendizaje automático (árboles potenciados y redes neuronales) capaces de representar relaciones no lineales. En los últimos años el interés se desplazó del pronóstico puntual al probabilístico, que entrega también un intervalo de incertidumbre [11], y a evaluar los pronósticos por su utilidad en decisiones de mercado y no solo por su error [8]. La Tabla 4 compara los trabajos más afines a este proyecto.</w:t>
+        <w:t>El pronóstico de precios eléctricos (EPF, por sus siglas en inglés) migró de modelos econométricos un</w:t>
+      </w:r>
+      <w:r>
+        <w:t>ivariados hacia modelos multivariados con selección de variables y redes profundas especializadas [5], [6]. En una primera etapa predominaron los modelos autorregresivos tipo ARIMA y sus extensiones con volatilidad condicional (GARCH), que explican el prec</w:t>
+      </w:r>
+      <w:r>
+        <w:t>io a partir de su propio pasado. Luego se incorporaron variables externas, como la demanda, la hidrología o el precio de los combustibles, junto con métodos de regularización como LASSO [10], que seleccionan automáticamente las variables que aportan, y mod</w:t>
+      </w:r>
+      <w:r>
+        <w:t>elos de aprendizaje automático (árboles potenciados y redes neuronales) capaces de representar relaciones no lineales. En los últimos años el interés se desplazó del pronóstico puntual al probabilístico, que entrega también un intervalo de incertidumbre [1</w:t>
+      </w:r>
+      <w:r>
+        <w:t>1], y a evaluar los pronósticos por su utilidad en decisiones de mercado y no solo por su error [8]. La Tabla 4 compara los trabajos más afines a este proyecto.</w:t>
       </w:r>
     </w:p>
     <w:p>
@@ -6959,7 +7156,14 @@
                 <w:sz w:val="16"/>
                 <w:szCs w:val="16"/>
               </w:rPr>
-              <w:t>Barrientos Marín et al. 2018 [14]</w:t>
+              <w:t>Barrientos Marín et al. 2018</w:t>
+            </w:r>
+            <w:r>
+              <w:rPr>
+                <w:sz w:val="16"/>
+                <w:szCs w:val="16"/>
+              </w:rPr>
+              <w:t xml:space="preserve"> [14]</w:t>
             </w:r>
           </w:p>
         </w:tc>
@@ -7505,7 +7709,19 @@
         <w:jc w:val="both"/>
       </w:pPr>
       <w:r>
-        <w:t>Los tres antecedentes colombianos usan variantes de dos familias clásicas. Agudelo et al. entrenan una red neuronal NARX (autorregresiva no lineal con entradas exógenas): la red predice el precio de la hora siguiente a partir de sus propios valores recientes más variables externas, y entrega un solo número por hora, sin margen de incertidumbre. Muñoz-Santiago et al. combinan un ARIMA, que modela el nivel del precio a partir de su propio historial, con un GARCH integrado, que modela cómo la volatilidad del error se agrupa en el tiempo sin disiparse — el mismo principio del ARX+GARCH de este proyecto (Tabla 12). Barrientos Marín et al. comparan ese enfoque econométrico contra una red NARX y un modelo híbrido de ambos, y con la prueba de Diebold-Mariano [7] no encuentran diferencia estadística entre los tres: ni el modelo más simple ni el más complejo gana con claridad, el mismo patrón que este proyecto confirma en la Sección 7.</w:t>
+        <w:t>Los tres antecedentes colombianos usan variantes de dos familias clásicas. Agudelo et al. entrenan una red neuronal NARX (autor</w:t>
+      </w:r>
+      <w:r>
+        <w:t>regresiva no lineal con entradas exógenas): la red predice el precio de la hora siguiente a partir de sus propios valores recientes más variables externas, y entrega un solo número por hora, sin margen de incertidumbre. Muñoz-Santiago et al. combinan un AR</w:t>
+      </w:r>
+      <w:r>
+        <w:t>IMA, que modela el nivel del precio a partir de su propio historial, con un GARCH integrado, que modela cómo la volatilidad del error se agrupa en el tiempo sin disiparse — el mismo principio del ARX+GARCH de este proyecto (Tabla 12). Barrientos Marín et a</w:t>
+      </w:r>
+      <w:r>
+        <w:t>l. comparan ese enfoque econométrico contra una red NARX y un modelo híbrido de ambos, y con la prueba de Diebold-Mariano [7] no encuentran diferencia estadística entre los tres: ni el modelo más simple ni el más complejo gana con claridad, el mismo patrón</w:t>
+      </w:r>
+      <w:r>
+        <w:t xml:space="preserve"> que este proyecto confirma en la Sección 7.</w:t>
       </w:r>
     </w:p>
     <w:p>
@@ -7514,8 +7730,26 @@
         <w:jc w:val="both"/>
       </w:pPr>
       <w:r>
+        <w:t>Los tres referentes internacionales aportan algo distinto: no compiten en exactitud, sino que definen cómo medirla. Gallón y Barrientos tratan las 24 horas de un día no como 24 números sueltos, sino como una sol</w:t>
+      </w:r>
+      <w:r>
+        <w:t>a curva continua, que descomponen en sus formas dominantes (componentes principales funcionales) para pronosticar la forma completa del día siguiente; logran un MAPE de 6,7 % a un día, pero en 2000-2017, un período sin los eventos climáticos extremos de 20</w:t>
+      </w:r>
+      <w:r>
+        <w:t xml:space="preserve">23-2026 que enfrenta este proyecto. Lago et al. no proponen un modelo para un mercado específico: fijan el protocolo que sigue toda la </w:t>
+      </w:r>
+      <w:r>
         <w:lastRenderedPageBreak/>
-        <w:t>Los tres referentes internacionales aportan algo distinto: no compiten en exactitud, sino que definen cómo medirla. Gallón y Barrientos tratan las 24 horas de un día no como 24 números sueltos, sino como una sola curva continua, que descomponen en sus formas dominantes (componentes principales funcionales) para pronosticar la forma completa del día siguiente; logran un MAPE de 6,7 % a un día, pero en 2000-2017, un período sin los eventos climáticos extremos de 2023-2026 que enfrenta este proyecto. Lago et al. no proponen un modelo para un mercado específico: fijan el protocolo que sigue toda la comunidad de pronóstico de precios eléctricos, con el LEAR (una regresión lineal cuyas variables se seleccionan automáticamente por LASSO) como referencia mínima exigible y la prueba de Diebold-Mariano para decidir si una mejora es real o es ruido estadístico — el mismo protocolo que sigue este proyecto (Sección 7.1). Kapoor y Wichitaksorn prueban 33 combinaciones de modelo y método de selección de variables en Nueva Zelanda, un mercado también dominado por la hidroelectricidad; su resultado, y la razón de citarlo en este informe, es que ninguna de las 33 logra un MASE (el error del modelo dividido entre el de la referencia más simple posible, repetir el precio del día anterior) menor a 1 — ninguna le gana de forma consistente a esa referencia, evidencia de lo difícil que es pronosticar el precio en un mercado hidro-dominado incluso con métodos sofisticados.</w:t>
+        <w:t>comunidad de pronóstico de precios eléctricos, con el LEAR (una regresión lineal cuyas variables se seleccionan automátic</w:t>
+      </w:r>
+      <w:r>
+        <w:t xml:space="preserve">amente por LASSO) como referencia mínima exigible y la prueba de Diebold-Mariano para decidir si una mejora es real o es ruido estadístico — el mismo protocolo que sigue este proyecto (Sección 7.1). Kapoor y Wichitaksorn prueban 33 combinaciones de modelo </w:t>
+      </w:r>
+      <w:r>
+        <w:t>y método de selección de variables en Nueva Zelanda, un mercado también dominado por la hidroelectricidad; su resultado, y la razón de citarlo en este informe, es que ninguna de las 33 logra un MASE (el error del modelo dividido entre el de la referencia m</w:t>
+      </w:r>
+      <w:r>
+        <w:t>ás simple posible, repetir el precio del día anterior) menor a 1 — ninguna le gana de forma consistente a esa referencia, evidencia de lo difícil que es pronosticar el precio en un mercado hidro-dominado incluso con métodos sofisticados.</w:t>
       </w:r>
     </w:p>
     <w:p>
@@ -7546,7 +7780,7 @@
       </w:pPr>
       <w:bookmarkStart w:id="65" w:name="_Toc241072122"/>
       <w:bookmarkStart w:id="66" w:name="_Toc241072488"/>
-      <w:bookmarkStart w:id="67" w:name="_Toc242994549"/>
+      <w:bookmarkStart w:id="67" w:name="_Toc241697475"/>
       <w:r>
         <w:t>Descripción detallada del diseño en ingeniería</w:t>
       </w:r>
@@ -7568,7 +7802,7 @@
       <w:bookmarkStart w:id="68" w:name="_Toc240440249"/>
       <w:bookmarkStart w:id="69" w:name="_Toc241072123"/>
       <w:bookmarkStart w:id="70" w:name="_Toc241072489"/>
-      <w:bookmarkStart w:id="71" w:name="_Toc242994550"/>
+      <w:bookmarkStart w:id="71" w:name="_Toc241697476"/>
       <w:r>
         <w:t>Problema</w:t>
       </w:r>
@@ -7583,7 +7817,13 @@
         <w:jc w:val="both"/>
       </w:pPr>
       <w:r>
-        <w:t>Desde el diseño, el problema es la ausencia de un sistema de procesamiento de señales y de gestión que integre los datos del mercado. La información existe y es pública, pero está dispersa en fuentes con resoluciones distintas: XM publica el precio, la demanda y la generación por hora, y el volumen de los embalses y los aportes hídricos por día, mientras que NOAA publica el ONI como un promedio trimestral que se actualiza cada mes. Las plataformas públicas permiten consultar y descargar cada serie por separado, pero no las sincronizan entre sí ni las convierten en un pronóstico o en una recomendación: un agente que quiera decidir con ellas debe alinearlas a mano y estimar por su cuenta el riesgo de cada hora.</w:t>
+        <w:t>Desde el diseño, el problema es la ausencia de un sistema de procesamiento de señales y de gestión que integre los datos del mercado. La información existe y es pública, pero está dispersa en fuentes con resoluciones distintas: XM publica el precio, la dem</w:t>
+      </w:r>
+      <w:r>
+        <w:t>anda y la generación por hora, y el volumen de los embalses y los aportes hídricos por día, mientras que NOAA publica el ONI como un promedio trimestral que se actualiza cada mes. Las plataformas públicas permiten consultar y descargar cada serie por separ</w:t>
+      </w:r>
+      <w:r>
+        <w:t>ado, pero no las sincronizan entre sí ni las convierten en un pronóstico o en una recomendación: un agente que quiera decidir con ellas debe alinearlas a mano y estimar por su cuenta el riesgo de cada hora.</w:t>
       </w:r>
     </w:p>
     <w:p>
@@ -7592,7 +7832,16 @@
         <w:jc w:val="both"/>
       </w:pPr>
       <w:r>
-        <w:t>El diseño resuelve esa ausencia con un sistema de procesamiento de señales y decisión de tres bloques acoplados: (1) una cadena de adquisición y acondicionamiento que convierta cinco fuentes de resolución distinta (horaria, diaria y mensual) en una señal multivariada horaria continua, sin huecos ni fugas de información; (2) un estimador que, con la información disponible en el instante de corte, produzca la mediana y los cuantiles del precio para las siguientes 1 a 72 horas; y (3) una lógica que convierta ese pronóstico probabilístico en una acción discreta por rol.</w:t>
+        <w:t>El diseño resuelve esa ausencia con un sistema de</w:t>
+      </w:r>
+      <w:r>
+        <w:t xml:space="preserve"> procesamiento de señales y decisión de tres bloques acoplados: (1) una cadena de adquisición y acondicionamiento que convierta cinco fuentes de resolución distinta (horaria, diaria y mensual) en una señal multivariada horaria continua, sin huecos ni fugas</w:t>
+      </w:r>
+      <w:r>
+        <w:t xml:space="preserve"> de información; (2) un estimador que, con la información disponible en el instante de corte, produzca la mediana y los cuantiles del precio para las siguientes 1 a 72 horas; y (3) una lógica que convierta ese pronóstico probabilístico en una acción discre</w:t>
+      </w:r>
+      <w:r>
+        <w:t>ta por rol.</w:t>
       </w:r>
     </w:p>
     <w:p>
@@ -7601,11 +7850,7 @@
         <w:jc w:val="both"/>
       </w:pPr>
       <w:r>
-        <w:t xml:space="preserve">La disponibilidad de los datos es parte del problema. A las 00:00 del día D, cuando se emite el pronóstico, la API pública de XM solo tiene el precio, la demanda y la generación hasta las 23:00 de D-4 (unos tres días de rezago), los embalses y aportes hasta D-2 y el ONI con unos dos meses de rezago. En cambio, el predespacho ideal del día D, que XM calcula con las ofertas de los generadores, se publica hacia las 10:30 </w:t>
-      </w:r>
-      <w:r>
-        <w:lastRenderedPageBreak/>
-        <w:t>de D-1 en la biblioteca pública de su portal [39]. Un diseño que suponga conocido el precio del día anterior no se puede operar con fuentes públicas; por eso el diseño definitivo se evaluó en este escenario realista.</w:t>
+        <w:t>La disponibilidad de los datos es parte del problema. A las 00:00 del día D, cuando se emite el pronóstico, la API pública de XM solo tiene el precio, la demanda y la generación hasta las 23:00 de D-4 (unos tres días de rezago), los embalses y aportes hasta D-2 y el ONI con unos dos meses de rezago. En cambio, el predespacho ideal del día D, que XM calcula con las ofertas de los generadores, se publica hacia las 10:30 de D-1 en la biblioteca pública de su portal [39]. Un diseño que suponga conocido el precio del día anterior no se puede operar con fuentes públicas; por eso el diseño definitivo se evaluó en este escenario realista.</w:t>
       </w:r>
     </w:p>
     <w:p>
@@ -7621,7 +7866,7 @@
       <w:bookmarkStart w:id="72" w:name="_Toc240440250"/>
       <w:bookmarkStart w:id="73" w:name="_Toc241072124"/>
       <w:bookmarkStart w:id="74" w:name="_Toc241072490"/>
-      <w:bookmarkStart w:id="75" w:name="_Toc242994551"/>
+      <w:bookmarkStart w:id="75" w:name="_Toc241697477"/>
       <w:r>
         <w:t>Análisis de requerimientos</w:t>
       </w:r>
@@ -7675,7 +7920,10 @@
         <w:t>social</w:t>
       </w:r>
       <w:r>
-        <w:t xml:space="preserve"> (el sistema apoya la decisión, no la sustituye), </w:t>
+        <w:t xml:space="preserve"> (el sistema apoya la decisión, no la sustituye</w:t>
+      </w:r>
+      <w:r>
+        <w:t xml:space="preserve">), </w:t>
       </w:r>
       <w:r>
         <w:rPr>
@@ -7711,7 +7959,10 @@
         <w:t>Factores</w:t>
       </w:r>
       <w:r>
-        <w:t>: salud pública (las escaladas de precio afectan a instituciones como las IPS), seguridad (acceso a las APIs), cultural (resistencia a recomendaciones basadas en IA), social (usuarios sin formación en probabilidad) y económico (tasa de cambio, precios de nube).</w:t>
+        <w:t>: salud pública (las escaladas de precio afectan a instituciones como las IPS), seguridad (acceso a las APIs), cu</w:t>
+      </w:r>
+      <w:r>
+        <w:t>ltural (resistencia a recomendaciones basadas en IA), social (usuarios sin formación en probabilidad) y económico (tasa de cambio, precios de nube).</w:t>
       </w:r>
     </w:p>
     <w:p>
@@ -7726,7 +7977,14 @@
         <w:t>Requerimientos del cliente.</w:t>
       </w:r>
       <w:r>
-        <w:t xml:space="preserve"> Generadores y comercializadores medianos piden pronósticos de 24 a 72 h con una recomendación según su rol, un nivel de confianza visible y un dashboard usable sin conocimientos técnicos. La Tabla 5 muestra su traducción a especificaciones medibles y la evidencia de cada criterio.</w:t>
+        <w:t xml:space="preserve"> Generadores y comercializadores medianos piden pronósticos de 24 a 72 h con una</w:t>
+      </w:r>
+      <w:r>
+        <w:t xml:space="preserve"> recomendación según su rol, un nivel de confianza visible y un dashboard usable sin </w:t>
+      </w:r>
+      <w:r>
+        <w:lastRenderedPageBreak/>
+        <w:t>conocimientos técnicos. La Tabla 5 muestra su traducción a especificaciones medibles y la evidencia de cada criterio.</w:t>
       </w:r>
     </w:p>
     <w:p>
@@ -7748,7 +8006,14 @@
           <w:sz w:val="20"/>
           <w:szCs w:val="20"/>
         </w:rPr>
-        <w:t xml:space="preserve"> Traducción de requerimientos y restricciones en especificaciones técnicas medibles.</w:t>
+        <w:t xml:space="preserve"> Traducción de requerimientos y restricciones</w:t>
+      </w:r>
+      <w:r>
+        <w:rPr>
+          <w:sz w:val="20"/>
+          <w:szCs w:val="20"/>
+        </w:rPr>
+        <w:t xml:space="preserve"> en especificaciones técnicas medibles.</w:t>
       </w:r>
     </w:p>
     <w:tbl>
@@ -8499,7 +8764,7 @@
       <w:bookmarkStart w:id="76" w:name="_Toc240440251"/>
       <w:bookmarkStart w:id="77" w:name="_Toc241072125"/>
       <w:bookmarkStart w:id="78" w:name="_Toc241072491"/>
-      <w:bookmarkStart w:id="79" w:name="_Toc242994552"/>
+      <w:bookmarkStart w:id="79" w:name="_Toc241697478"/>
       <w:r>
         <w:t>Estándares, normas y regulaciones</w:t>
       </w:r>
@@ -8678,7 +8943,6 @@
                 <w:sz w:val="18"/>
                 <w:szCs w:val="18"/>
               </w:rPr>
-              <w:lastRenderedPageBreak/>
               <w:t>Resolución CREG 101 018 de 2022 [21]</w:t>
             </w:r>
           </w:p>
@@ -8873,9 +9137,12 @@
       <w:bookmarkStart w:id="80" w:name="_Toc240440252"/>
       <w:bookmarkStart w:id="81" w:name="_Toc241072126"/>
       <w:bookmarkStart w:id="82" w:name="_Toc241072492"/>
-      <w:bookmarkStart w:id="83" w:name="_Toc242994553"/>
-      <w:r>
-        <w:t>Alternativas de solución</w:t>
+      <w:bookmarkStart w:id="83" w:name="_Toc241697479"/>
+      <w:r>
+        <w:t>Altern</w:t>
+      </w:r>
+      <w:r>
+        <w:t>ativas de solución</w:t>
       </w:r>
       <w:bookmarkEnd w:id="80"/>
       <w:bookmarkEnd w:id="81"/>
@@ -8903,6 +9170,7 @@
         <w:t>Solución 1: ensamble heterogéneo de seis modelos (diseño del informe de avance).</w:t>
       </w:r>
       <w:r>
+        <w:rPr/>
         <w:t xml:space="preserve"> Combina persistencia, árboles de gradiente (XGBoost), un modelo econométrico ARX con varianza GARCH [13], dos redes neuronales (N-BEATSx y N-HiTS) y un GARCH con selección LASSO, con un peso no negativo por modelo y por franja horaria de 6 h [11]. El principio es el de diversificar un portafolio: si los errores de los modelos no están perfectamente correlacionados, su combinación reduce el error total. Con el precio del día anterior su MAE era 43,1 COP/kWh, 27 % menor que el de la persistencia; pero ese precio no es público al corte. Con lo publicado, los modelos trabajan con información de hace cuatro días y el MAE sube a 100,7 COP/kWh.</w:t>
       </w:r>
     </w:p>
@@ -8918,6 +9186,7 @@
         <w:t>Solución 2: ensamble de seis modelos más el predespacho.</w:t>
       </w:r>
       <w:r>
+        <w:rPr/>
         <w:t xml:space="preserve"> Agrega como séptimo votante el predespacho ideal que XM publica la víspera, una estimación del precio de cada hora del día siguiente hecha con las ofertas reales. El combinador aprende a darle el mayor peso y el MAE baja a 36,7 COP/kWh. Mantiene, sin embargo, el costo de entrenar seis modelos, incluidas dos redes neuronales, cuya contribución con datos públicos es marginal.</w:t>
       </w:r>
     </w:p>
@@ -8933,6 +9202,7 @@
         <w:t>Solución 3: predespacho corregido con tres CatBoost.</w:t>
       </w:r>
       <w:r>
+        <w:rPr/>
         <w:t xml:space="preserve"> Tres modelos de árboles CatBoost [38] aprenden a corregir el predespacho: en lugar del precio pronostican el logaritmo de la razón entre el precio y el predespacho, con pérdida de error absoluto y con conjuntos de variables distintos (las variables públicas y las del predespacho; además, la forma intradía del predespacho y el despacho programado; o el error reciente del predespacho). Se reentrenan cada mes con lo publicado y su promedio se combina con el predespacho por regresión cuantílica (QRA). Es la alternativa más liviana, pero depende de que XM publique el predespacho.</w:t>
       </w:r>
     </w:p>
@@ -9165,7 +9435,6 @@
                 <w:sz w:val="18"/>
                 <w:szCs w:val="18"/>
               </w:rPr>
-              <w:lastRenderedPageBreak/>
               <w:t>Ventajas:</w:t>
             </w:r>
             <w:r>
@@ -9342,7 +9611,7 @@
       <w:bookmarkStart w:id="84" w:name="_Toc240440253"/>
       <w:bookmarkStart w:id="85" w:name="_Toc241072127"/>
       <w:bookmarkStart w:id="86" w:name="_Toc241072493"/>
-      <w:bookmarkStart w:id="87" w:name="_Toc242994554"/>
+      <w:bookmarkStart w:id="87" w:name="_Toc241697480"/>
       <w:r>
         <w:t>Evaluación y selección de la alternativa óptima</w:t>
       </w:r>
@@ -9357,7 +9626,10 @@
         <w:jc w:val="both"/>
       </w:pPr>
       <w:r>
-        <w:t>Se definieron cinco criterios técnicos más el costo (Tabla 8), con rangos derivados de la Tabla 5.</w:t>
+        <w:t>Se definieron cinco criterios técnicos más e</w:t>
+      </w:r>
+      <w:r>
+        <w:t>l costo (Tabla 8), con rangos derivados de la Tabla 5.</w:t>
       </w:r>
     </w:p>
     <w:p>
@@ -9918,7 +10190,6 @@
           <w:sz w:val="25"/>
           <w:szCs w:val="25"/>
         </w:rPr>
-        <w:lastRenderedPageBreak/>
         <w:t>Matriz de decisión</w:t>
       </w:r>
     </w:p>
@@ -10726,6 +10997,7 @@
         <w:t>Selección.</w:t>
       </w:r>
       <w:r>
+        <w:rPr/>
         <w:t xml:space="preserve"> El predespacho corregido con CatBoost obtiene 4,55 frente a 4,15 y 2,00. Con solo información pública, el ensamble de seis modelos pierde frente a la persistencia del día anterior (rMAE 1,737) y en su peor mes llega a 2,63. Las dos alternativas con predespacho cumplen la precisión con holgura; la tercera además tiene el menor error (35,0 frente a 36,7 COP/kWh, Diebold-Mariano t = 5,7, p &lt; 0,001), cumple la robustez en todos los meses de 2026 (peor mes 0,828) y se reentrena en ≈ 1,1 min. Los rMAE de la tabla usan la persistencia del día anterior, más exigente que la que se puede calcular al corte con el último precio publicado (frente a esta última, el rMAE del diseño definitivo es 0,32).</w:t>
       </w:r>
     </w:p>
@@ -10742,7 +11014,7 @@
       <w:bookmarkStart w:id="88" w:name="_Toc240440255"/>
       <w:bookmarkStart w:id="89" w:name="_Toc241072130"/>
       <w:bookmarkStart w:id="90" w:name="_Toc241072496"/>
-      <w:bookmarkStart w:id="91" w:name="_Toc242994555"/>
+      <w:bookmarkStart w:id="91" w:name="_Toc241697481"/>
       <w:r>
         <w:t>Análisis de riesgo del diseño definitivo</w:t>
       </w:r>
@@ -11711,9 +11983,8 @@
       <w:bookmarkStart w:id="92" w:name="_Toc240440254"/>
       <w:bookmarkStart w:id="93" w:name="_Toc241072129"/>
       <w:bookmarkStart w:id="94" w:name="_Toc241072495"/>
-      <w:bookmarkStart w:id="95" w:name="_Toc242994556"/>
-      <w:r>
-        <w:lastRenderedPageBreak/>
+      <w:bookmarkStart w:id="95" w:name="_Toc241697482"/>
+      <w:r>
         <w:t>Diseño definitivo</w:t>
       </w:r>
       <w:bookmarkEnd w:id="92"/>
@@ -11733,6 +12004,7 @@
         <w:t>Metodología de diseño.</w:t>
       </w:r>
       <w:r>
+        <w:rPr/>
         <w:t xml:space="preserve"> Cada elemento del sistema (variable, modelo, combinador, calibración y regla de decisión) se definió con el mismo procedimiento: (1) se formula frente a una alternativa o línea base; (2) se evalúa fuera de muestra, con entrenamiento en 2019-2025 y prueba en 2026, usando solo la información pública disponible al corte; (3) se adopta solo si mejora con significancia en la prueba de Diebold-Mariano (p &lt; 0,05) y, si la variante se eligió observando 2026, se valida además en los cinco años históricos; y (4) se documenta en la bitácora del repositorio, incluidos los intentos fallidos. La Figura 2 muestra el resultado de ese proceso y las Tablas 11 a 13 documentan cada definición.</w:t>
       </w:r>
     </w:p>
@@ -11743,26 +12015,22 @@
         <w:jc w:val="center"/>
       </w:pPr>
       <w:r>
-        <w:rPr>
-          <w:noProof/>
-        </w:rPr>
         <w:drawing>
-          <wp:inline distT="0" distB="0" distL="0" distR="0" wp14:anchorId="7BD407BA" wp14:editId="10396DB3">
+          <wp:inline xmlns:a="http://schemas.openxmlformats.org/drawingml/2006/main" xmlns:pic="http://schemas.openxmlformats.org/drawingml/2006/picture">
             <wp:extent cx="3780000" cy="2888781"/>
-            <wp:effectExtent l="0" t="0" r="0" b="0"/>
             <wp:docPr id="14" name="Picture 14"/>
             <wp:cNvGraphicFramePr>
-              <a:graphicFrameLocks xmlns:a="http://schemas.openxmlformats.org/drawingml/2006/main" noChangeAspect="1"/>
+              <a:graphicFrameLocks noChangeAspect="1"/>
             </wp:cNvGraphicFramePr>
-            <a:graphic xmlns:a="http://schemas.openxmlformats.org/drawingml/2006/main">
+            <a:graphic>
               <a:graphicData uri="http://schemas.openxmlformats.org/drawingml/2006/picture">
-                <pic:pic xmlns:pic="http://schemas.openxmlformats.org/drawingml/2006/picture">
+                <pic:pic>
                   <pic:nvPicPr>
                     <pic:cNvPr id="0" name="diagrama_bloques.png"/>
                     <pic:cNvPicPr/>
                   </pic:nvPicPr>
                   <pic:blipFill>
-                    <a:blip r:embed="rId8"/>
+                    <a:blip r:embed="rId24"/>
                     <a:stretch>
                       <a:fillRect/>
                     </a:stretch>
@@ -11772,9 +12040,7 @@
                       <a:off x="0" y="0"/>
                       <a:ext cx="3780000" cy="2888781"/>
                     </a:xfrm>
-                    <a:prstGeom prst="rect">
-                      <a:avLst/>
-                    </a:prstGeom>
+                    <a:prstGeom prst="rect"/>
                   </pic:spPr>
                 </pic:pic>
               </a:graphicData>
@@ -11816,6 +12082,7 @@
         <w:t>Definición de variables.</w:t>
       </w:r>
       <w:r>
+        <w:rPr/>
         <w:t xml:space="preserve"> Todas las variables usan solo información publicada antes del instante de corte (00:00 del día pronosticado): el precio y la demanda entran con un rezago mínimo de 73 h, la hidrología con el valor diario de D-2, el ONI con el del mes M-2 y el predespacho con el archivo publicado la víspera. Cada familia se justificó con un resultado de la caracterización de OE1 o de la evaluación fuera de muestra (Tabla 11).</w:t>
       </w:r>
     </w:p>
@@ -11840,7 +12107,6 @@
           <w:sz w:val="20"/>
           <w:szCs w:val="20"/>
         </w:rPr>
-        <w:lastRenderedPageBreak/>
         <w:t>Tabla 11.</w:t>
       </w:r>
       <w:r>
@@ -12736,6 +13002,7 @@
         <w:t>Definición de modelos.</w:t>
       </w:r>
       <w:r>
+        <w:rPr/>
         <w:t xml:space="preserve"> El diseño definitivo tiene cinco componentes de pronóstico y un detector de eventos. La Tabla 12 resume su fundamento, configuración y forma de ajuste.</w:t>
       </w:r>
     </w:p>
@@ -13548,7 +13815,6 @@
                 <w:sz w:val="16"/>
                 <w:szCs w:val="16"/>
               </w:rPr>
-              <w:lastRenderedPageBreak/>
               <w:t>Detector de eventos</w:t>
             </w:r>
           </w:p>
@@ -13637,7 +13903,6 @@
           <w:insideV w:val="nil"/>
         </w:tblBorders>
         <w:tblLayout w:type="fixed"/>
-        <w:tblLook w:val="04A0" w:firstRow="1" w:lastRow="0" w:firstColumn="1" w:lastColumn="0" w:noHBand="0" w:noVBand="1"/>
       </w:tblPr>
       <w:tblGrid>
         <w:gridCol w:w="935"/>
@@ -13647,14 +13912,18 @@
       <w:tr>
         <w:trPr>
           <w:cantSplit/>
-          <w:jc w:val="center"/>
         </w:trPr>
         <w:tc>
           <w:tcPr>
             <w:tcW w:w="935" w:type="dxa"/>
             <w:vAlign w:val="center"/>
           </w:tcPr>
-          <w:p/>
+          <w:p>
+            <w:pPr>
+              <w:spacing w:before="0" w:after="0"/>
+              <w:jc w:val="left"/>
+            </w:pPr>
+          </w:p>
         </w:tc>
         <w:tc>
           <w:tcPr>
@@ -13663,46 +13932,25 @@
           </w:tcPr>
           <w:p>
             <w:pPr>
+              <w:spacing w:before="0" w:after="0"/>
               <w:jc w:val="center"/>
             </w:pPr>
             <m:oMathPara>
-              <m:oMath>
+              <m:oMath xmlns:mml="http://www.w3.org/1998/Math/MathML">
                 <m:sSub>
-                  <m:sSubPr>
-                    <m:ctrlPr>
-                      <w:rPr>
-                        <w:rFonts w:ascii="Cambria Math" w:hAnsi="Cambria Math"/>
-                      </w:rPr>
-                    </m:ctrlPr>
-                  </m:sSubPr>
                   <m:e>
                     <m:r>
                       <m:rPr>
                         <m:sty m:val="p"/>
                       </m:rPr>
-                      <w:rPr>
-                        <w:rFonts w:ascii="Cambria Math" w:hAnsi="Cambria Math"/>
-                      </w:rPr>
                       <m:t>min</m:t>
                     </m:r>
                   </m:e>
                   <m:sub>
                     <m:r>
-                      <w:rPr>
-                        <w:rFonts w:ascii="Cambria Math" w:hAnsi="Cambria Math"/>
-                      </w:rPr>
-                      <m:t>w</m:t>
+                      <m:t>w≥0,</m:t>
                     </m:r>
                     <m:r>
-                      <w:rPr>
-                        <w:rFonts w:ascii="Cambria Math" w:hAnsi="Cambria Math"/>
-                      </w:rPr>
-                      <m:t>≥0,</m:t>
-                    </m:r>
-                    <m:r>
-                      <w:rPr>
-                        <w:rFonts w:ascii="Cambria Math" w:hAnsi="Cambria Math"/>
-                      </w:rPr>
                       <m:t>b</m:t>
                     </m:r>
                   </m:sub>
@@ -13712,153 +13960,69 @@
                     <m:chr m:val="∑"/>
                     <m:limLoc m:val="undOvr"/>
                     <m:grow m:val="1"/>
-                    <m:supHide m:val="1"/>
-                    <m:ctrlPr>
-                      <w:rPr>
-                        <w:rFonts w:ascii="Cambria Math" w:hAnsi="Cambria Math"/>
-                      </w:rPr>
-                    </m:ctrlPr>
+                    <m:subHide m:val="off"/>
+                    <m:supHide m:val="on"/>
                   </m:naryPr>
                   <m:sub>
                     <m:r>
-                      <w:rPr>
-                        <w:rFonts w:ascii="Cambria Math" w:hAnsi="Cambria Math"/>
-                      </w:rPr>
-                      <m:t>t</m:t>
-                    </m:r>
-                    <m:r>
-                      <w:rPr>
-                        <w:rFonts w:ascii="Cambria Math" w:hAnsi="Cambria Math"/>
-                      </w:rPr>
-                      <m:t>∈</m:t>
-                    </m:r>
-                    <m:r>
-                      <w:rPr>
-                        <w:rFonts w:ascii="Cambria Math" w:hAnsi="Cambria Math"/>
-                      </w:rPr>
-                      <m:t>g</m:t>
+                      <m:t>t∈g</m:t>
                     </m:r>
                   </m:sub>
                   <m:sup/>
                   <m:e>
                     <m:r>
-                      <w:rPr>
-                        <w:rFonts w:ascii="Cambria Math" w:hAnsi="Cambria Math"/>
-                      </w:rPr>
                       <m:t>|</m:t>
                     </m:r>
                     <m:sSub>
-                      <m:sSubPr>
-                        <m:ctrlPr>
-                          <w:rPr>
-                            <w:rFonts w:ascii="Cambria Math" w:hAnsi="Cambria Math"/>
-                          </w:rPr>
-                        </m:ctrlPr>
-                      </m:sSubPr>
                       <m:e>
                         <m:r>
-                          <w:rPr>
-                            <w:rFonts w:ascii="Cambria Math" w:hAnsi="Cambria Math"/>
-                          </w:rPr>
                           <m:t>y</m:t>
                         </m:r>
                       </m:e>
                       <m:sub>
                         <m:r>
-                          <w:rPr>
-                            <w:rFonts w:ascii="Cambria Math" w:hAnsi="Cambria Math"/>
-                          </w:rPr>
                           <m:t>t</m:t>
                         </m:r>
                       </m:sub>
                     </m:sSub>
                     <m:r>
-                      <w:rPr>
-                        <w:rFonts w:ascii="Cambria Math" w:hAnsi="Cambria Math"/>
-                      </w:rPr>
-                      <m:t>-</m:t>
-                    </m:r>
-                    <m:r>
-                      <w:rPr>
-                        <w:rFonts w:ascii="Cambria Math" w:hAnsi="Cambria Math"/>
-                      </w:rPr>
-                      <m:t>b</m:t>
-                    </m:r>
-                    <m:r>
-                      <w:rPr>
-                        <w:rFonts w:ascii="Cambria Math" w:hAnsi="Cambria Math"/>
-                      </w:rPr>
-                      <m:t>-</m:t>
+                      <m:t>−b−</m:t>
                     </m:r>
                     <m:nary>
                       <m:naryPr>
                         <m:chr m:val="∑"/>
                         <m:limLoc m:val="subSup"/>
                         <m:grow m:val="1"/>
-                        <m:supHide m:val="1"/>
-                        <m:ctrlPr>
-                          <w:rPr>
-                            <w:rFonts w:ascii="Cambria Math" w:hAnsi="Cambria Math"/>
-                          </w:rPr>
-                        </m:ctrlPr>
+                        <m:subHide m:val="off"/>
+                        <m:supHide m:val="on"/>
                       </m:naryPr>
                       <m:sub>
                         <m:r>
-                          <w:rPr>
-                            <w:rFonts w:ascii="Cambria Math" w:hAnsi="Cambria Math"/>
-                          </w:rPr>
                           <m:t>k</m:t>
                         </m:r>
                       </m:sub>
                       <m:sup/>
                       <m:e>
                         <m:sSub>
-                          <m:sSubPr>
-                            <m:ctrlPr>
-                              <w:rPr>
-                                <w:rFonts w:ascii="Cambria Math" w:hAnsi="Cambria Math"/>
-                              </w:rPr>
-                            </m:ctrlPr>
-                          </m:sSubPr>
                           <m:e>
                             <m:r>
-                              <w:rPr>
-                                <w:rFonts w:ascii="Cambria Math" w:hAnsi="Cambria Math"/>
-                              </w:rPr>
                               <m:t>w</m:t>
                             </m:r>
                           </m:e>
                           <m:sub>
                             <m:r>
-                              <w:rPr>
-                                <w:rFonts w:ascii="Cambria Math" w:hAnsi="Cambria Math"/>
-                              </w:rPr>
                               <m:t>k</m:t>
                             </m:r>
                           </m:sub>
                         </m:sSub>
                         <m:sSub>
-                          <m:sSubPr>
-                            <m:ctrlPr>
-                              <w:rPr>
-                                <w:rFonts w:ascii="Cambria Math" w:hAnsi="Cambria Math"/>
-                              </w:rPr>
-                            </m:ctrlPr>
-                          </m:sSubPr>
                           <m:e>
                             <m:acc>
                               <m:accPr>
-                                <m:ctrlPr>
-                                  <w:rPr>
-                                    <w:rFonts w:ascii="Cambria Math" w:hAnsi="Cambria Math"/>
-                                  </w:rPr>
-                                </m:ctrlPr>
+                                <m:chr m:val="̂"/>
                               </m:accPr>
                               <m:e>
                                 <m:r>
-                                  <w:rPr>
-                                    <w:rFonts w:ascii="Cambria Math" w:hAnsi="Cambria Math"/>
-                                  </w:rPr>
                                   <m:t>y</m:t>
                                 </m:r>
                               </m:e>
@@ -13866,31 +14030,13 @@
                           </m:e>
                           <m:sub>
                             <m:r>
-                              <w:rPr>
-                                <w:rFonts w:ascii="Cambria Math" w:hAnsi="Cambria Math"/>
-                              </w:rPr>
-                              <m:t>k</m:t>
-                            </m:r>
-                            <m:r>
-                              <w:rPr>
-                                <w:rFonts w:ascii="Cambria Math" w:hAnsi="Cambria Math"/>
-                              </w:rPr>
-                              <m:t>,</m:t>
-                            </m:r>
-                            <m:r>
-                              <w:rPr>
-                                <w:rFonts w:ascii="Cambria Math" w:hAnsi="Cambria Math"/>
-                              </w:rPr>
-                              <m:t>t</m:t>
+                              <m:t>k,t</m:t>
                             </m:r>
                           </m:sub>
                         </m:sSub>
                       </m:e>
                     </m:nary>
                     <m:r>
-                      <w:rPr>
-                        <w:rFonts w:ascii="Cambria Math" w:hAnsi="Cambria Math"/>
-                      </w:rPr>
                       <m:t>|</m:t>
                     </m:r>
                   </m:e>
@@ -13906,9 +14052,13 @@
           </w:tcPr>
           <w:p>
             <w:pPr>
+              <w:spacing w:before="0" w:after="0"/>
               <w:jc w:val="right"/>
             </w:pPr>
             <w:r>
+              <w:rPr>
+                <w:rFonts w:ascii="Calibri" w:hAnsi="Calibri" w:cs="Calibri"/>
+              </w:rPr>
               <w:t>(1)</w:t>
             </w:r>
           </w:p>
@@ -13950,6 +14100,7 @@
         <w:t>Modelos evaluados y descartados.</w:t>
       </w:r>
       <w:r>
+        <w:rPr/>
         <w:t xml:space="preserve"> Con solo la información pública, los seis modelos del diseño inicial pierden su ventaja (Tabla 14): XGBoost, ARX+GARCH y GARCH-ged quedan apenas por debajo de la persistencia y las dos redes neuronales, por encima. Antes ya se habían descartado, por no mejorar a la persistencia o al ensamble, CatBoost sobre el precio, un modelo hurdle, Markov-Switching, mínimos cuadrados recursivos, TFT, LSTM, LightGBM y Prophet. Sobre el predespacho tampoco mejoraron: XGBoost (MAE de 38 a 46 COP/kWh), el LEAR por hora (40,8), las redes neuronales con el predespacho como variable futura (58), los precios de oferta por planta (las ofertas OFEI, que XM completa después del corte y serían fuga de información), un votante especialista en días baratos (35,07 frente a 35,01) ni reducir la amplitud de los picos del predespacho (de 35,10 a 37,24). La lección de diseño es que la información disponible al corte pesa más que la complejidad del modelo.</w:t>
       </w:r>
     </w:p>
@@ -13965,7 +14116,10 @@
         <w:t>Decisiones de diseño.</w:t>
       </w:r>
       <w:r>
-        <w:t xml:space="preserve"> La Tabla 13 documenta las decisiones principales, incluidas las seis que el Anexo 1 exige registrar (sección ABET): cada una con la alternativa descartada y la evidencia que la sustenta.</w:t>
+        <w:t xml:space="preserve"> La Tabla 13 documenta las decisiones principales, incluidas las seis que el Anexo 1 exige registrar (sección ABET): cada una con la alternativa descartada y la evidencia que l</w:t>
+      </w:r>
+      <w:r>
+        <w:t>a sustenta.</w:t>
       </w:r>
     </w:p>
     <w:p>
@@ -14416,7 +14570,14 @@
                 <w:sz w:val="16"/>
                 <w:szCs w:val="16"/>
               </w:rPr>
-              <w:t>Escalón mensual o interpolación con el mes siguiente</w:t>
+              <w:t>Escalón mensu</w:t>
+            </w:r>
+            <w:r>
+              <w:rPr>
+                <w:sz w:val="16"/>
+                <w:szCs w:val="16"/>
+              </w:rPr>
+              <w:t>al o interpolación con el mes siguiente</w:t>
             </w:r>
           </w:p>
         </w:tc>
@@ -14506,7 +14667,14 @@
                 <w:sz w:val="16"/>
                 <w:szCs w:val="16"/>
               </w:rPr>
-              <w:t>Las categorías difusas empeoraron N-BEATSx (56,11 → 58,47) y N-HiTS (57,08 → 60,53); la bandera binaria pierde la intensidad del evento (no se probó)</w:t>
+              <w:t>Las categorías dif</w:t>
+            </w:r>
+            <w:r>
+              <w:rPr>
+                <w:sz w:val="16"/>
+                <w:szCs w:val="16"/>
+              </w:rPr>
+              <w:t>usas empeoraron N-BEATSx (56,11 → 58,47) y N-HiTS (57,08 → 60,53); la bandera binaria pierde la intensidad del evento (no se probó)</w:t>
             </w:r>
           </w:p>
         </w:tc>
@@ -14671,7 +14839,14 @@
                 <w:sz w:val="16"/>
                 <w:szCs w:val="16"/>
               </w:rPr>
-              <w:t>Walk-forward de 6 orígenes con regímenes ENSO distintos</w:t>
+              <w:t xml:space="preserve">Walk-forward de 6 orígenes con regímenes </w:t>
+            </w:r>
+            <w:r>
+              <w:rPr>
+                <w:sz w:val="16"/>
+                <w:szCs w:val="16"/>
+              </w:rPr>
+              <w:t>ENSO distintos</w:t>
             </w:r>
           </w:p>
         </w:tc>
@@ -14740,7 +14915,6 @@
                 <w:sz w:val="16"/>
                 <w:szCs w:val="16"/>
               </w:rPr>
-              <w:lastRenderedPageBreak/>
               <w:t>Combinador por franjas de 6 h con objetivo MAE y 5 días de margen</w:t>
             </w:r>
           </w:p>
@@ -15221,6 +15395,7 @@
         <w:t>Motor de decisión (cuatro métodos, filtro intradía y selección por estabilidad).</w:t>
       </w:r>
       <w:r>
+        <w:rPr/>
         <w:t xml:space="preserve"> (1) Cada método fija un umbral bajo y uno alto y compara con ellos la mediana q50 de cada hora: por debajo del bajo el comercializador recibe «comprar» y el generador «retener»; por encima del alto, «evitar compra» y «vender»; en otro caso, «esperar». Los umbrales por defecto son los percentiles 25 y 75, el rango intercuartílico convencional para separar valores típicos de extremos [31]. (2) Los métodos difieren en la referencia: «fijo» usa los percentiles del precio de 2019-2025; «rodante», los de una ventana móvil causal de 30 días sobre q50, que se adapta al régimen vigente [32]; «banda» es el fijo más un filtro que emite «esperar» cuando el ancho relativo de la banda supera su percentil 75 en las horas anteriores; e «híbrido» combina el umbral rodante con ese filtro de confianza. (3) Un filtro intradía conserva la señal favorable (vender o comprar) solo en la mitad del día que el pronóstico ubica más cara (generador) o más barata (comercializador), y la desfavorable solo en la mitad opuesta: los umbrales deciden en qué temporada conviene la bolsa y el filtro, a qué hora del día actuar. (4) El método activo se elige por backtesting: solo son admisibles los que actúan entre 10 % y 40 % de las horas y, entre ellos, gana el de mayor ventaja en la mitad más débil del periodo (criterio maximin [33]), no el de mayor ventaja promedio.</w:t>
       </w:r>
     </w:p>
@@ -15240,27 +15415,22 @@
         <w:jc w:val="center"/>
       </w:pPr>
       <w:r>
-        <w:rPr>
-          <w:noProof/>
-        </w:rPr>
-        <w:lastRenderedPageBreak/>
         <w:drawing>
-          <wp:inline distT="0" distB="0" distL="0" distR="0" wp14:anchorId="06321AB6" wp14:editId="4B3771D0">
+          <wp:inline xmlns:a="http://schemas.openxmlformats.org/drawingml/2006/main" xmlns:pic="http://schemas.openxmlformats.org/drawingml/2006/picture">
             <wp:extent cx="4500000" cy="2592528"/>
-            <wp:effectExtent l="0" t="0" r="0" b="0"/>
             <wp:docPr id="15" name="Picture 15"/>
             <wp:cNvGraphicFramePr>
-              <a:graphicFrameLocks xmlns:a="http://schemas.openxmlformats.org/drawingml/2006/main" noChangeAspect="1"/>
+              <a:graphicFrameLocks noChangeAspect="1"/>
             </wp:cNvGraphicFramePr>
-            <a:graphic xmlns:a="http://schemas.openxmlformats.org/drawingml/2006/main">
+            <a:graphic>
               <a:graphicData uri="http://schemas.openxmlformats.org/drawingml/2006/picture">
-                <pic:pic xmlns:pic="http://schemas.openxmlformats.org/drawingml/2006/picture">
+                <pic:pic>
                   <pic:nvPicPr>
                     <pic:cNvPr id="0" name="motor_operacion.png"/>
                     <pic:cNvPicPr/>
                   </pic:nvPicPr>
                   <pic:blipFill>
-                    <a:blip r:embed="rId9"/>
+                    <a:blip r:embed="rId25"/>
                     <a:stretch>
                       <a:fillRect/>
                     </a:stretch>
@@ -15270,9 +15440,7 @@
                       <a:off x="0" y="0"/>
                       <a:ext cx="4500000" cy="2592528"/>
                     </a:xfrm>
-                    <a:prstGeom prst="rect">
-                      <a:avLst/>
-                    </a:prstGeom>
+                    <a:prstGeom prst="rect"/>
                   </pic:spPr>
                 </pic:pic>
               </a:graphicData>
@@ -15314,7 +15482,8 @@
         <w:t>Dashboard.</w:t>
       </w:r>
       <w:r>
-        <w:t xml:space="preserve"> Se publicó en Streamlit Community Cloud (augurpredictor.streamlit.app) con la marca augur. La vista Operador aplica el método que elige el criterio de estabilidad y muestra, para el día y la hora elegidos, la acción recomendada con una insignia (favorable, desfavorable o neutral), un medidor que ubica el precio esperado entre los tramos barato, normal y caro, un nivel de confianza según el ancho relativo de la banda y la probabilidad de pico o desplome; la acompañan la gráfica del día (con un botón para ampliarla y variables que se ocultan o muestran desde la leyenda), la franja de 24 horas con el precio y la acción de cada hora, el mapa de calor día-hora, tres indicadores del backtest y la semana de referencia, cada imagen con sus metadatos (unidad, periodo, confianza y versión del modelo). La vista Analista permite fijar el método, los percentiles, el rango de fechas y el filtro intradía. La presentación se rediseñó el 15 de octubre con la retroalimentación del equipo (tarjetas, tema oscuro de alto contraste y diseño adaptable a pantallas angostas) sin cambiar el motor ni los datos. La interfaz se verificó con pruebas automatizadas de Streamlit en las 16 combinaciones de tema, vista, rol y horizonte, y en un navegador a varios anchos de pantalla.</w:t>
+        <w:rPr/>
+        <w:t xml:space="preserve"> Se publicó en Streamlit Community Cloud (augurpredictor.streamlit.app) con la marca Augur. La vista Operador aplica el método que elige el criterio de estabilidad y muestra, para el día y la hora elegidos, la acción recomendada con una insignia (favorable, desfavorable o neutral), un medidor que ubica el precio esperado entre los tramos barato, normal y caro, un nivel de confianza según el ancho relativo de la banda y la probabilidad de pico o desplome; la acompañan la gráfica del día (con un botón para ampliarla y variables que se ocultan o muestran desde la leyenda), la franja de 24 horas con el precio y la acción de cada hora, el mapa de calor día-hora, tres indicadores del backtest y la semana de referencia, cada imagen con sus metadatos (unidad, periodo, confianza y versión del modelo). La vista Analista permite fijar el método, los percentiles, el rango de fechas y el filtro intradía, y la vista Metodología muestra el desempeño en vivo del pronóstico frente al predespacho de XM y explica el flujo, las fórmulas y la validación. La presentación se rediseñó el 15 de octubre con la retroalimentación del equipo (tarjetas, tema oscuro y diseño adaptable a pantallas angostas) y el 19 de octubre tras una auditoría de diseño y accesibilidad (contraste WCAG de al menos 4,5:1, números y fechas en formato colombiano, gráficas que se acercan con Ctrl + rueda o pellizco y se recorren con dos dedos), sin cambiar el motor ni los datos: las recomendaciones, precios, umbrales y tablas se verificaron idénticos a la versión anterior. La interfaz se verificó con pruebas automatizadas de Streamlit en las combinaciones de tema, vista, rol y horizonte, y en un navegador a varios anchos de pantalla.</w:t>
       </w:r>
     </w:p>
     <w:p>
@@ -15329,7 +15498,8 @@
         <w:t>Funcionamiento del prototipo y operación diaria.</w:t>
       </w:r>
       <w:r>
-        <w:t xml:space="preserve"> El sistema funciona de principio a fin sin intervención manual. Todos los días a las 15:40 y a las 18:40, un flujo de GitHub Actions descarga los datos nuevos de XM y NOAA, reentrena los CatBoost del mes, pronostica la ventana del día siguiente con el predespacho recién publicado y sube los resultados al repositorio, con lo que el dashboard se actualiza; en el servidor de GitHub la corrida completa tarda unos 9 minutos. Lo ya pronosticado no se reescribe y el precio real se completa a medida que XM lo publica. El dataset oficial del proyecto (enero de 2019 a agosto de 2026) no se modifica, de modo que las cifras de este informe son reproducibles. El código completo está en el Anexo 3, el manual de usuario en el Anexo 4 y los resultados que demuestran el funcionamiento de cada bloque, en la Sección 7.</w:t>
+        <w:rPr/>
+        <w:t xml:space="preserve"> El sistema funciona de principio a fin sin intervención manual. Todos los días hacia las 12:00, las 15:40 y las 18:40, un flujo de GitHub Actions descarga los datos nuevos de XM y NOAA, reentrena los CatBoost del mes, pronostica la ventana del día siguiente con el predespacho recién publicado y sube los resultados al repositorio, con lo que el dashboard se actualiza; en el servidor de GitHub la corrida completa tarda unos 9 minutos. Lo ya pronosticado no se reescribe y el precio real se completa a medida que XM lo publica. El dataset oficial del proyecto (enero de 2019 a agosto de 2026) no se modifica, de modo que las cifras de este informe son reproducibles. El código completo está en el Anexo 3, el manual de usuario en el Anexo 4 y los resultados que demuestran el funcionamiento de cada bloque, en la Sección 7.</w:t>
       </w:r>
     </w:p>
     <w:p>
@@ -15344,11 +15514,8 @@
         <w:t>Vista Operador.</w:t>
       </w:r>
       <w:r>
-        <w:t xml:space="preserve"> La Figura 4 muestra la vista Operador el 16 de octubre de 2026 a las 08:00 h para el generador, con el pronóstico emitido la víspera. La tarjeta recomienda «Retener generación»: el medidor ubica el precio esperado, 441 COP/kWh, en el tramo barato (≤ 503) y lejos del caro (≥ 720), con confianza alta (banda de ±42 COP/kWh, más ancha que el 35 % de las horas anteriores). El riesgo de desplome a esa hora es de 56 %: el detector anticipa un posible desplome entre las 08:00 y las 11:00 y un posible pico entre las 16:00 y las 21:00, que la gráfica del día marca con ▼ y ▲. Ese día el generador tiene 7 de 24 </w:t>
-      </w:r>
-      <w:r>
-        <w:lastRenderedPageBreak/>
-        <w:t>horas para despachar y vender, y la regla activa, «rodante», tiene una ventaja histórica de +244 COP/kWh y actúa en el 22 % de las horas.</w:t>
+        <w:rPr/>
+        <w:t xml:space="preserve"> La Figura 4 muestra la vista Operador el 19 de octubre de 2026 a las 08:00 h para el generador, con el pronóstico emitido la víspera. La tarjeta recomienda «Retener generación»: el medidor ubica el precio esperado, 410,5 COP/kWh, en el tramo barato (≤ 503) y lejos del caro (≥ 706), con confianza alta (banda de ±40 COP/kWh, más ancha que el 35 % de las horas anteriores). El riesgo de salto a esa hora es bajo (desplome 5 %, pico 0 %), pero el detector anticipa un posible pico a las 00:00 y entre las 16:00 y las 22:00, que la gráfica del día marca con ▲. Ese día el generador tiene 3 de 24 horas para despachar y vender (18:00 a 20:00), y la regla activa, «rodante», tiene una ventaja histórica de +243 COP/kWh y actúa en el 22 % de las horas.</w:t>
       </w:r>
     </w:p>
     <w:p>
@@ -15358,26 +15525,22 @@
         <w:jc w:val="center"/>
       </w:pPr>
       <w:r>
-        <w:rPr>
-          <w:noProof/>
-        </w:rPr>
         <w:drawing>
-          <wp:inline distT="0" distB="0" distL="0" distR="0" wp14:anchorId="29160D29" wp14:editId="4E039424">
-            <wp:extent cx="5760720" cy="3227070"/>
-            <wp:effectExtent l="0" t="0" r="0" b="0"/>
+          <wp:inline xmlns:a="http://schemas.openxmlformats.org/drawingml/2006/main" xmlns:pic="http://schemas.openxmlformats.org/drawingml/2006/picture">
+            <wp:extent cx="5760720" cy="3245739"/>
             <wp:docPr id="16" name="Picture 16"/>
             <wp:cNvGraphicFramePr>
-              <a:graphicFrameLocks xmlns:a="http://schemas.openxmlformats.org/drawingml/2006/main" noChangeAspect="1"/>
+              <a:graphicFrameLocks noChangeAspect="1"/>
             </wp:cNvGraphicFramePr>
-            <a:graphic xmlns:a="http://schemas.openxmlformats.org/drawingml/2006/main">
+            <a:graphic>
               <a:graphicData uri="http://schemas.openxmlformats.org/drawingml/2006/picture">
-                <pic:pic xmlns:pic="http://schemas.openxmlformats.org/drawingml/2006/picture">
+                <pic:pic>
                   <pic:nvPicPr>
                     <pic:cNvPr id="0" name="dash_operador.png"/>
                     <pic:cNvPicPr/>
                   </pic:nvPicPr>
                   <pic:blipFill>
-                    <a:blip r:embed="rId10"/>
+                    <a:blip r:embed="rId26"/>
                     <a:stretch>
                       <a:fillRect/>
                     </a:stretch>
@@ -15385,11 +15548,9 @@
                   <pic:spPr>
                     <a:xfrm>
                       <a:off x="0" y="0"/>
-                      <a:ext cx="5760720" cy="3227070"/>
+                      <a:ext cx="5760720" cy="3245739"/>
                     </a:xfrm>
-                    <a:prstGeom prst="rect">
-                      <a:avLst/>
-                    </a:prstGeom>
+                    <a:prstGeom prst="rect"/>
                   </pic:spPr>
                 </pic:pic>
               </a:graphicData>
@@ -15416,7 +15577,7 @@
           <w:sz w:val="20"/>
           <w:szCs w:val="20"/>
         </w:rPr>
-        <w:t xml:space="preserve"> Dashboard publicado, vista Operador (16 de octubre de 2026, 08:00 h, rol generador, horizonte 24 h).</w:t>
+        <w:t xml:space="preserve"> Dashboard publicado, vista Operador (19 de octubre de 2026, 08:00 h, rol generador, horizonte 24 h).</w:t>
       </w:r>
     </w:p>
     <w:p>
@@ -15431,7 +15592,8 @@
         <w:t>Mapa de calor día-hora.</w:t>
       </w:r>
       <w:r>
-        <w:t xml:space="preserve"> El mapa de calor (Figura 5) resume la señal de los 14 días anteriores hora por hora: en la primera semana de octubre el motor recomendó vender en las horas de la tarde y de la noche y retener al mediodía, y desde el 11 de octubre, con precios más bajos, retener en buena parte de la mañana y del mediodía. Las fechas de los extremos se escriben o se eligen en un calendario, y el modo «Precio esperado» colorea las celdas con la escala de color del precio de bolsa que usa XM.</w:t>
+        <w:rPr/>
+        <w:t xml:space="preserve"> El mapa de calor (Figura 5) resume la señal de los 14 días anteriores hora por hora: en la primera semana del periodo el motor recomendó vender en las horas de la tarde y de la noche y retener en la mañana, y desde el 11 de octubre, con precios más bajos, retener en buena parte de la mañana y del mediodía, dejando la venta para las horas de mayor demanda (18:00 a 21:00). Una leyenda bajo el mapa indica el color de cada acción. Las fechas de los extremos se escriben o se eligen en un calendario, y el modo «Precio esperado» colorea las celdas con la escala de color del precio de bolsa que usa XM.</w:t>
       </w:r>
     </w:p>
     <w:p>
@@ -15441,27 +15603,22 @@
         <w:jc w:val="center"/>
       </w:pPr>
       <w:r>
-        <w:rPr>
-          <w:noProof/>
-        </w:rPr>
-        <w:lastRenderedPageBreak/>
         <w:drawing>
-          <wp:inline distT="0" distB="0" distL="0" distR="0" wp14:anchorId="7A571665" wp14:editId="7A03216A">
-            <wp:extent cx="5486400" cy="3700558"/>
-            <wp:effectExtent l="0" t="0" r="0" b="0"/>
+          <wp:inline xmlns:a="http://schemas.openxmlformats.org/drawingml/2006/main" xmlns:pic="http://schemas.openxmlformats.org/drawingml/2006/picture">
+            <wp:extent cx="5486400" cy="3837542"/>
             <wp:docPr id="17" name="Picture 17"/>
             <wp:cNvGraphicFramePr>
-              <a:graphicFrameLocks xmlns:a="http://schemas.openxmlformats.org/drawingml/2006/main" noChangeAspect="1"/>
+              <a:graphicFrameLocks noChangeAspect="1"/>
             </wp:cNvGraphicFramePr>
-            <a:graphic xmlns:a="http://schemas.openxmlformats.org/drawingml/2006/main">
+            <a:graphic>
               <a:graphicData uri="http://schemas.openxmlformats.org/drawingml/2006/picture">
-                <pic:pic xmlns:pic="http://schemas.openxmlformats.org/drawingml/2006/picture">
+                <pic:pic>
                   <pic:nvPicPr>
                     <pic:cNvPr id="0" name="dash_calor.png"/>
                     <pic:cNvPicPr/>
                   </pic:nvPicPr>
                   <pic:blipFill>
-                    <a:blip r:embed="rId11"/>
+                    <a:blip r:embed="rId27"/>
                     <a:stretch>
                       <a:fillRect/>
                     </a:stretch>
@@ -15469,11 +15626,9 @@
                   <pic:spPr>
                     <a:xfrm>
                       <a:off x="0" y="0"/>
-                      <a:ext cx="5486400" cy="3700558"/>
+                      <a:ext cx="5486400" cy="3837542"/>
                     </a:xfrm>
-                    <a:prstGeom prst="rect">
-                      <a:avLst/>
-                    </a:prstGeom>
+                    <a:prstGeom prst="rect"/>
                   </pic:spPr>
                 </pic:pic>
               </a:graphicData>
@@ -15500,7 +15655,7 @@
           <w:sz w:val="20"/>
           <w:szCs w:val="20"/>
         </w:rPr>
-        <w:t xml:space="preserve"> Mapa de calor día-hora de la señal del motor (3 al 16 de octubre de 2026, rol generador).</w:t>
+        <w:t xml:space="preserve"> Mapa de calor día-hora de la señal del motor (6 al 19 de octubre de 2026, rol generador).</w:t>
       </w:r>
     </w:p>
     <w:p>
@@ -15515,7 +15670,8 @@
         <w:t>Vista Analista.</w:t>
       </w:r>
       <w:r>
-        <w:t xml:space="preserve"> La Figura 6 muestra la vista Analista para el generador a 24 h con todo el periodo publicado (1 de enero al 17 de octubre de 2026). La tabla compara los cuatro métodos por ventaja y frecuencia de acción en el rango elegido: «banda» queda sugerido por ventaja (+323 COP/kWh en el 18 % de las horas), pero la vista Operador usa el criterio de estabilidad, que elige «rodante» porque «banda» y «fijo» casi no actúan en la primera mitad del año (Tabla 20). Debajo, la tabla «Ver datos filtrados» permite auditar cada recomendación hora a hora y descargarla.</w:t>
+        <w:rPr/>
+        <w:t xml:space="preserve"> La Figura 6 muestra la vista Analista para el generador a 24 h con todo el periodo publicado (1 de enero al 20 de octubre de 2026). La tabla compara los cuatro métodos por ventaja y frecuencia de acción en el rango elegido: «banda» queda sugerido por ventaja (+316 COP/kWh en el 18 % de las horas), pero la vista Operador usa el criterio de estabilidad, que elige «rodante» porque «banda» y «fijo» casi no actúan en la primera mitad del año (Tabla 20). Debajo, la tabla «Ver datos filtrados» permite auditar cada recomendación hora a hora y descargarla.</w:t>
       </w:r>
     </w:p>
     <w:p>
@@ -15525,27 +15681,22 @@
         <w:jc w:val="center"/>
       </w:pPr>
       <w:r>
-        <w:rPr>
-          <w:noProof/>
-        </w:rPr>
-        <w:lastRenderedPageBreak/>
         <w:drawing>
-          <wp:inline distT="0" distB="0" distL="0" distR="0" wp14:anchorId="6525E21B" wp14:editId="796016B9">
-            <wp:extent cx="3931920" cy="4004733"/>
-            <wp:effectExtent l="0" t="0" r="0" b="0"/>
+          <wp:inline xmlns:a="http://schemas.openxmlformats.org/drawingml/2006/main" xmlns:pic="http://schemas.openxmlformats.org/drawingml/2006/picture">
+            <wp:extent cx="3931920" cy="4081187"/>
             <wp:docPr id="18" name="Picture 18"/>
             <wp:cNvGraphicFramePr>
-              <a:graphicFrameLocks xmlns:a="http://schemas.openxmlformats.org/drawingml/2006/main" noChangeAspect="1"/>
+              <a:graphicFrameLocks noChangeAspect="1"/>
             </wp:cNvGraphicFramePr>
-            <a:graphic xmlns:a="http://schemas.openxmlformats.org/drawingml/2006/main">
+            <a:graphic>
               <a:graphicData uri="http://schemas.openxmlformats.org/drawingml/2006/picture">
-                <pic:pic xmlns:pic="http://schemas.openxmlformats.org/drawingml/2006/picture">
+                <pic:pic>
                   <pic:nvPicPr>
                     <pic:cNvPr id="0" name="dash_analista.png"/>
                     <pic:cNvPicPr/>
                   </pic:nvPicPr>
                   <pic:blipFill>
-                    <a:blip r:embed="rId12"/>
+                    <a:blip r:embed="rId28"/>
                     <a:stretch>
                       <a:fillRect/>
                     </a:stretch>
@@ -15553,11 +15704,9 @@
                   <pic:spPr>
                     <a:xfrm>
                       <a:off x="0" y="0"/>
-                      <a:ext cx="3931920" cy="4004733"/>
+                      <a:ext cx="3931920" cy="4081187"/>
                     </a:xfrm>
-                    <a:prstGeom prst="rect">
-                      <a:avLst/>
-                    </a:prstGeom>
+                    <a:prstGeom prst="rect"/>
                   </pic:spPr>
                 </pic:pic>
               </a:graphicData>
@@ -15584,7 +15733,7 @@
           <w:sz w:val="20"/>
           <w:szCs w:val="20"/>
         </w:rPr>
-        <w:t xml:space="preserve"> Dashboard publicado, vista Analista (rol generador, horizonte 24 h, 1 de enero al 17 de octubre de 2026).</w:t>
+        <w:t xml:space="preserve"> Dashboard publicado, vista Analista (rol generador, horizonte 24 h, 1 de enero al 20 de octubre de 2026).</w:t>
       </w:r>
     </w:p>
     <w:p>
@@ -15611,8 +15760,9 @@
       </w:pPr>
       <w:bookmarkStart w:id="97" w:name="_Toc241072132"/>
       <w:bookmarkStart w:id="98" w:name="_Toc241072498"/>
-      <w:bookmarkStart w:id="99" w:name="_Toc242994557"/>
-      <w:r>
+      <w:bookmarkStart w:id="99" w:name="_Toc241697483"/>
+      <w:r>
+        <w:lastRenderedPageBreak/>
         <w:t>Pruebas, resultados y análisis de resultados</w:t>
       </w:r>
       <w:bookmarkEnd w:id="96"/>
@@ -15633,7 +15783,7 @@
       <w:bookmarkStart w:id="100" w:name="_Toc240440258"/>
       <w:bookmarkStart w:id="101" w:name="_Toc241072133"/>
       <w:bookmarkStart w:id="102" w:name="_Toc241072499"/>
-      <w:bookmarkStart w:id="103" w:name="_Toc242994558"/>
+      <w:bookmarkStart w:id="103" w:name="_Toc241697484"/>
       <w:r>
         <w:t>Planeación del diseño del experimento</w:t>
       </w:r>
@@ -15654,6 +15804,7 @@
         <w:t>Pregunta técnica.</w:t>
       </w:r>
       <w:r>
+        <w:rPr/>
         <w:t xml:space="preserve"> Con solo la información pública disponible al momento de pronosticar, ¿la plataforma pronostica el precio de bolsa horario a 24-72 h con un error significativamente menor que la persistencia (rMAE &lt; 1) y con bandas cuya cobertura esté cerca del 80 %? ¿Y el motor obtiene una ventaja positiva y estable con sus recomendaciones?</w:t>
       </w:r>
     </w:p>
@@ -15669,6 +15820,7 @@
         <w:t>Hipótesis.</w:t>
       </w:r>
       <w:r>
+        <w:rPr/>
         <w:t xml:space="preserve"> Para cada hora t, dt = |etpers| − |etmod| es la diferencia entre el error absoluto de la persistencia y el del modelo. H0: E[dt] = 0 (el modelo no es más preciso). H1: E[dt] &gt; 0 (el modelo tiene menor error). La prueba es de una cola, porque la especificación exige superar a la referencia; se aplica a 24 h y a 72 h. La persistencia es el precio publicado más recientemente para la misma hora (hace 96 h), la referencia ingenua que se puede calcular al corte; también se reporta la del día anterior, que no es pública pero es la referencia usual de la literatura. Para los modelos individuales en cada origen se usa la prueba de dos colas, para detectar si ganan o pierden.</w:t>
       </w:r>
     </w:p>
@@ -15684,11 +15836,8 @@
         <w:t>Variables.</w:t>
       </w:r>
       <w:r>
-        <w:t xml:space="preserve"> La variable dependiente es el error absoluto horario |yt − ŷt| (COP/kWh), resumido en MAE, RMSE, MAPE y sMAPE. Los factores son: modelo (11 niveles: persistencia, seis modelos del diseño inicial, su ensamble, el predespacho, el ensamble con predespacho y el diseño definitivo), escenario de información (con el precio del día anterior o solo con lo publicado), horizonte (3 tramos de 24 h), origen </w:t>
-      </w:r>
-      <w:r>
-        <w:lastRenderedPageBreak/>
-        <w:t>temporal (6 regímenes ENSO) y, en el motor, rol (2) y método (4). El método es una evaluación fuera de muestra con origen móvil (walk-forward) [19] con comparaciones pareadas hora a hora.</w:t>
+        <w:rPr/>
+        <w:t xml:space="preserve"> La variable dependiente es el error absoluto horario |yt − ŷt| (COP/kWh), resumido en MAE, RMSE, MAPE y sMAPE. Los factores son: modelo (11 niveles: persistencia, seis modelos del diseño inicial, su ensamble, el predespacho, el ensamble con predespacho y el diseño definitivo), escenario de información (con el precio del día anterior o solo con lo publicado), horizonte (3 tramos de 24 h), origen temporal (6 regímenes ENSO) y, en el motor, rol (2) y método (4). El método es una evaluación fuera de muestra con origen móvil (walk-forward) [19] con comparaciones pareadas hora a hora.</w:t>
       </w:r>
     </w:p>
     <w:p>
@@ -15708,7 +15857,7 @@
       <w:bookmarkStart w:id="104" w:name="_Toc240440261"/>
       <w:bookmarkStart w:id="105" w:name="_Toc241072136"/>
       <w:bookmarkStart w:id="106" w:name="_Toc241072500"/>
-      <w:bookmarkStart w:id="107" w:name="_Toc242994559"/>
+      <w:bookmarkStart w:id="107" w:name="_Toc241697485"/>
       <w:r>
         <w:t>Instrumentación y validación</w:t>
       </w:r>
@@ -15723,6 +15872,7 @@
         <w:jc w:val="both"/>
       </w:pPr>
       <w:r>
+        <w:rPr/>
         <w:t>Instrumento: la serie oficial de precio de XM [4], horaria y con hasta cinco decimales en COP/kWh; su error es despreciable frente a los de pronóstico. Equipo: AMD Ryzen 7 7730U, 15,4 GB de RAM, sin GPU. Repeticiones: 4.848 pares hora a hora en las mismas horas de 2026 para comparar modelos (202 días, del 15 de enero al 5 de agosto) y 5.184 en el contrato completo, muy por encima de 30; la autocorrelación se corrige con la varianza de Newey-West [34]. El walk-forward suma seis orígenes de 5.184 a 8.784 horas. Significancia: α = 0,05.</w:t>
       </w:r>
     </w:p>
@@ -15738,6 +15888,7 @@
         <w:t>Invalidación interna controlada.</w:t>
       </w:r>
       <w:r>
+        <w:rPr/>
         <w:t xml:space="preserve"> Historia y maduración: seis orígenes con regímenes distintos. Instrumentación: mismo dataset, periodo y código de métricas para todos; las auditorías de reproducibilidad detectaron y corrigieron la demanda del 4-5 de agosto de 2026 y, después, la revisión de XM de esos días y la actualización del ONI de NOAA, con las que se reentrenaron todos los modelos. Regresión estadística: se usa todo 2026, sin elegir periodos extremos. Fuga: solo información publicada al corte, verificada con la fecha de creación y de modificación de cada archivo, y un placebo con el predespacho de 7 días antes no mejora el pronóstico. Selección: las variantes del diseño definitivo se eligieron observando 2026, por lo que se validaron además en los cinco orígenes históricos (Tabla 16).</w:t>
       </w:r>
     </w:p>
@@ -15753,7 +15904,7 @@
       <w:bookmarkStart w:id="108" w:name="_Toc240440262"/>
       <w:bookmarkStart w:id="109" w:name="_Toc241072137"/>
       <w:bookmarkStart w:id="110" w:name="_Toc241072501"/>
-      <w:bookmarkStart w:id="111" w:name="_Toc242994560"/>
+      <w:bookmarkStart w:id="111" w:name="_Toc241697486"/>
       <w:r>
         <w:t>Marco normativo de las pruebas</w:t>
       </w:r>
@@ -15768,7 +15919,10 @@
         <w:jc w:val="both"/>
       </w:pPr>
       <w:r>
-        <w:t>No existe una norma IEC o IEEE para evaluar pronósticos de precio de electricidad. Se sigue el protocolo del benchmark abierto de Lago et al. [6], referente de la comunidad EPF: evaluación fuera de muestra, referencia ingenua, error relativo y prueba de Diebold-Mariano [7] con varianza HAC [34]; las métricas adimensionales siguen a Hyndman y Koehler [26] y las fechas, la ISO 8601 [20].</w:t>
+        <w:t xml:space="preserve">No existe una norma IEC o IEEE para evaluar pronósticos de precio de electricidad. Se sigue el protocolo del benchmark abierto de Lago et al. [6], referente </w:t>
+      </w:r>
+      <w:r>
+        <w:t>de la comunidad EPF: evaluación fuera de muestra, referencia ingenua, error relativo y prueba de Diebold-Mariano [7] con varianza HAC [34]; las métricas adimensionales siguen a Hyndman y Koehler [26] y las fechas, la ISO 8601 [20].</w:t>
       </w:r>
     </w:p>
     <w:p>
@@ -15784,9 +15938,12 @@
       <w:bookmarkStart w:id="112" w:name="_Toc240440263"/>
       <w:bookmarkStart w:id="113" w:name="_Toc241072138"/>
       <w:bookmarkStart w:id="114" w:name="_Toc241072502"/>
-      <w:bookmarkStart w:id="115" w:name="_Toc242994561"/>
-      <w:r>
-        <w:t>Ejecución del plan experimental</w:t>
+      <w:bookmarkStart w:id="115" w:name="_Toc241697487"/>
+      <w:r>
+        <w:t>Ejecución del plan exper</w:t>
+      </w:r>
+      <w:r>
+        <w:t>imental</w:t>
       </w:r>
       <w:bookmarkEnd w:id="112"/>
       <w:bookmarkEnd w:id="113"/>
@@ -16901,7 +17058,19 @@
                           <w:rPr>
                             <w:rFonts w:ascii="Cambria Math" w:hAnsi="Cambria Math"/>
                           </w:rPr>
-                          <m:t>T-24</m:t>
+                          <m:t>T</m:t>
+                        </m:r>
+                        <m:r>
+                          <w:rPr>
+                            <w:rFonts w:ascii="Cambria Math" w:hAnsi="Cambria Math"/>
+                          </w:rPr>
+                          <m:t>-</m:t>
+                        </m:r>
+                        <m:r>
+                          <w:rPr>
+                            <w:rFonts w:ascii="Cambria Math" w:hAnsi="Cambria Math"/>
+                          </w:rPr>
+                          <m:t>24</m:t>
                         </m:r>
                       </m:den>
                     </m:f>
@@ -16985,7 +17154,19 @@
                               <w:rPr>
                                 <w:rFonts w:ascii="Cambria Math" w:hAnsi="Cambria Math"/>
                               </w:rPr>
-                              <m:t>t-24</m:t>
+                              <m:t>t</m:t>
+                            </m:r>
+                            <m:r>
+                              <w:rPr>
+                                <w:rFonts w:ascii="Cambria Math" w:hAnsi="Cambria Math"/>
+                              </w:rPr>
+                              <m:t>-</m:t>
+                            </m:r>
+                            <m:r>
+                              <w:rPr>
+                                <w:rFonts w:ascii="Cambria Math" w:hAnsi="Cambria Math"/>
+                              </w:rPr>
+                              <m:t>24</m:t>
                             </m:r>
                           </m:sub>
                         </m:sSub>
@@ -17071,7 +17252,13 @@
                   <w:rPr>
                     <w:rFonts w:ascii="Cambria Math" w:hAnsi="Cambria Math"/>
                   </w:rPr>
-                  <m:t>DM=</m:t>
+                  <m:t>DM</m:t>
+                </m:r>
+                <m:r>
+                  <w:rPr>
+                    <w:rFonts w:ascii="Cambria Math" w:hAnsi="Cambria Math"/>
+                  </w:rPr>
+                  <m:t>=</m:t>
                 </m:r>
                 <m:f>
                   <m:fPr>
@@ -17379,7 +17566,13 @@
                   <w:rPr>
                     <w:rFonts w:ascii="Cambria Math" w:hAnsi="Cambria Math"/>
                   </w:rPr>
-                  <m:t>P(</m:t>
+                  <m:t>P</m:t>
+                </m:r>
+                <m:r>
+                  <w:rPr>
+                    <w:rFonts w:ascii="Cambria Math" w:hAnsi="Cambria Math"/>
+                  </w:rPr>
+                  <m:t>(</m:t>
                 </m:r>
                 <m:sSub>
                   <m:sSubPr>
@@ -17468,7 +17661,13 @@
                           <w:rPr>
                             <w:rFonts w:ascii="Cambria Math" w:hAnsi="Cambria Math"/>
                           </w:rPr>
-                          <m:t>n=0</m:t>
+                          <m:t>n</m:t>
+                        </m:r>
+                        <m:r>
+                          <w:rPr>
+                            <w:rFonts w:ascii="Cambria Math" w:hAnsi="Cambria Math"/>
+                          </w:rPr>
+                          <m:t>=0</m:t>
                         </m:r>
                       </m:sub>
                       <m:sup>
@@ -17476,7 +17675,19 @@
                           <w:rPr>
                             <w:rFonts w:ascii="Cambria Math" w:hAnsi="Cambria Math"/>
                           </w:rPr>
-                          <m:t>N-1</m:t>
+                          <m:t>N</m:t>
+                        </m:r>
+                        <m:r>
+                          <w:rPr>
+                            <w:rFonts w:ascii="Cambria Math" w:hAnsi="Cambria Math"/>
+                          </w:rPr>
+                          <m:t>-</m:t>
+                        </m:r>
+                        <m:r>
+                          <w:rPr>
+                            <w:rFonts w:ascii="Cambria Math" w:hAnsi="Cambria Math"/>
+                          </w:rPr>
+                          <m:t>1</m:t>
                         </m:r>
                       </m:sup>
                       <m:e>
@@ -17484,7 +17695,25 @@
                           <w:rPr>
                             <w:rFonts w:ascii="Cambria Math" w:hAnsi="Cambria Math"/>
                           </w:rPr>
-                          <m:t>x[n]</m:t>
+                          <m:t>x</m:t>
+                        </m:r>
+                        <m:r>
+                          <w:rPr>
+                            <w:rFonts w:ascii="Cambria Math" w:hAnsi="Cambria Math"/>
+                          </w:rPr>
+                          <m:t>[</m:t>
+                        </m:r>
+                        <m:r>
+                          <w:rPr>
+                            <w:rFonts w:ascii="Cambria Math" w:hAnsi="Cambria Math"/>
+                          </w:rPr>
+                          <m:t>n</m:t>
+                        </m:r>
+                        <m:r>
+                          <w:rPr>
+                            <w:rFonts w:ascii="Cambria Math" w:hAnsi="Cambria Math"/>
+                          </w:rPr>
+                          <m:t>]</m:t>
                         </m:r>
                         <m:sSup>
                           <m:sSupPr>
@@ -17507,7 +17736,37 @@
                               <w:rPr>
                                 <w:rFonts w:ascii="Cambria Math" w:hAnsi="Cambria Math"/>
                               </w:rPr>
-                              <m:t>-j2πkn/N</m:t>
+                              <m:t>-</m:t>
+                            </m:r>
+                            <m:r>
+                              <w:rPr>
+                                <w:rFonts w:ascii="Cambria Math" w:hAnsi="Cambria Math"/>
+                              </w:rPr>
+                              <m:t>j</m:t>
+                            </m:r>
+                            <m:r>
+                              <w:rPr>
+                                <w:rFonts w:ascii="Cambria Math" w:hAnsi="Cambria Math"/>
+                              </w:rPr>
+                              <m:t>2</m:t>
+                            </m:r>
+                            <m:r>
+                              <w:rPr>
+                                <w:rFonts w:ascii="Cambria Math" w:hAnsi="Cambria Math"/>
+                              </w:rPr>
+                              <m:t>πkn</m:t>
+                            </m:r>
+                            <m:r>
+                              <w:rPr>
+                                <w:rFonts w:ascii="Cambria Math" w:hAnsi="Cambria Math"/>
+                              </w:rPr>
+                              <m:t>/</m:t>
+                            </m:r>
+                            <m:r>
+                              <w:rPr>
+                                <w:rFonts w:ascii="Cambria Math" w:hAnsi="Cambria Math"/>
+                              </w:rPr>
+                              <m:t>N</m:t>
                             </m:r>
                           </m:sup>
                         </m:sSup>
@@ -17636,7 +17895,10 @@
         <w:t>s</w:t>
       </w:r>
       <w:r>
-        <w:t xml:space="preserve"> = 1 muestra/h, el período en horas es 1/f. El filtro de Savitzky-Golay [36] ajusta en cada ventana de 721 h un polinomio de orden 3 por mínimos cuadrados; en la Ecuación 4, T es el número de horas de entrenamiento. La cobertura es el porcentaje de horas con q10 ≤ y</w:t>
+        <w:t xml:space="preserve"> = 1 muestra/h, el período en horas es 1/f. El filtro de Savitzky-Golay [36] ajusta en cada ventana de 721 h un polinomio de orden 3 por mínimos cuadrados; en la Ecuación 4, T es el número de horas de entrenamiento. La cobertura es el porcentaje de horas c</w:t>
+      </w:r>
+      <w:r>
+        <w:t>on q10 ≤ y</w:t>
       </w:r>
       <w:r>
         <w:rPr>
@@ -17661,7 +17923,7 @@
       <w:bookmarkStart w:id="116" w:name="_Toc240440264"/>
       <w:bookmarkStart w:id="117" w:name="_Toc241072139"/>
       <w:bookmarkStart w:id="118" w:name="_Toc241072503"/>
-      <w:bookmarkStart w:id="119" w:name="_Toc242994562"/>
+      <w:bookmarkStart w:id="119" w:name="_Toc241697488"/>
       <w:r>
         <w:t>Resultados</w:t>
       </w:r>
@@ -17682,6 +17944,7 @@
         <w:t>OE1 — Datos y caracterización.</w:t>
       </w:r>
       <w:r>
+        <w:rPr/>
         <w:t xml:space="preserve"> El dataset tiene 66.576 horas continuas (1-ene-2019 a 5-ago-2026), sin huecos ni duplicados. En el periodograma (Figura 7) la componente de 24 h es la dominante: su pico concentra por sí solo el 6,8 % de la potencia entre 2 y 2.000 h, el mayor del espectro; le siguen el armónico de 12 h, una componente semanal de 168 h y ciclos de 20 a 42 días asociados a la hidrología. En la comparación de filtros de tendencia sobre El Niño 2023-2024, Savitzky-Golay alcanzó el 90 % de la subida real 376 h antes que el promedio móvil (348 h frente a 724 h) y dejó menos ruido residual (desviación estándar de 117,70 frente a 138,03 COP/kWh). La correlación con el precio fue positiva para el ONI (0,387), la demanda (0,325) y la generación (0,323), y negativa para aportes (−0,286) y embalses (−0,164). Una comparación posterior con un filtro de Butterworth de fase cero, el suavizador de Kalman y wavelets confirmó la elección: a igual suavizado, Butterworth y Kalman dejan un residuo algo menor (111 frente a 118 COP/kWh), pero llegan después a la subida (382 y 407 h frente a 348 h).</w:t>
       </w:r>
     </w:p>
@@ -17695,8 +17958,9 @@
         <w:rPr>
           <w:noProof/>
         </w:rPr>
+        <w:lastRenderedPageBreak/>
         <w:drawing>
-          <wp:inline distT="0" distB="0" distL="0" distR="0" wp14:anchorId="7654AD24" wp14:editId="29833AB0">
+          <wp:inline distT="0" distB="0" distL="0" distR="0" wp14:anchorId="2E615697" wp14:editId="6743AE34">
             <wp:extent cx="4140000" cy="1776493"/>
             <wp:effectExtent l="0" t="0" r="0" b="0"/>
             <wp:docPr id="10" name="Picture 10"/>
@@ -17711,7 +17975,7 @@
                     <pic:cNvPicPr/>
                   </pic:nvPicPr>
                   <pic:blipFill>
-                    <a:blip r:embed="rId13"/>
+                    <a:blip r:embed="rId16"/>
                     <a:stretch>
                       <a:fillRect/>
                     </a:stretch>
@@ -17765,6 +18029,7 @@
         <w:t>OE2 — Pronóstico de 24 h.</w:t>
       </w:r>
       <w:r>
+        <w:rPr/>
         <w:t xml:space="preserve"> La Tabla 14 compara, en las mismas 4.848 horas de 2026 y con solo la información pública al corte, los modelos individuales, el ensamble del diseño inicial, el predespacho de XM y las dos alternativas que lo usan.</w:t>
       </w:r>
     </w:p>
@@ -18429,7 +18694,6 @@
                 <w:sz w:val="17"/>
                 <w:szCs w:val="17"/>
               </w:rPr>
-              <w:lastRenderedPageBreak/>
               <w:t>ARX+GARCH</w:t>
             </w:r>
           </w:p>
@@ -19980,6 +20244,7 @@
         <w:t>Error diario e intervalos de confianza.</w:t>
       </w:r>
       <w:r>
+        <w:rPr/>
         <w:t xml:space="preserve"> El MAE del diseño definitivo es un promedio de 202 días con comportamientos muy distintos, por lo que también se analizó el error de cada día. El MAE diario tiene media 35,0 COP/kWh y desviación estándar 28,2. Como los días de error alto vienen en rachas (autocorrelación de 0,50 entre días consecutivos), el intervalo de confianza del 95 % para la media se calculó con bootstrap por bloques de 7 días: [28,0; 42,9] COP/kWh, frente a [84,5; 134,9] de la persistencia. En el 80 % de los días el MAE estuvo entre 6,8 y 68,8 COP/kWh y fue menor que 50 COP/kWh en el 78,7 % de los días (28,2 % para la persistencia). El MAPE diario tiene media 10,0 % con intervalo [8,4 %; 11,8 %]. La diferencia diaria de MAE entre la persistencia y el diseño definitivo tiene media 73,8 COP/kWh, con un intervalo [54,4; 95,2] que no incluye el cero, y el diseño definitivo tuvo menor error en el 92,6 % de los días. El error medio con signo es de −0,1 COP/kWh [−7,3; 5,9]: no hay sesgo significativo. Por régimen, entre enero y abril el MAE es 22,8 frente a 30,1 del predespacho solo (t = 12,7), y en El Niño (mayo a agosto), 48,5 frente a 49,2, una diferencia no significativa (p = 0,18).</w:t>
       </w:r>
     </w:p>
@@ -19995,6 +20260,7 @@
         <w:t>Robustez entre regímenes.</w:t>
       </w:r>
       <w:r>
+        <w:rPr/>
         <w:t xml:space="preserve"> La Tabla 15 muestra el MAE de los modelos individuales del diseño inicial en los seis orígenes walk-forward, con el precio del día anterior (O1 a O5: 12 meses cada uno con corte a las 23:00; O6: 2026), y el resultado de Diebold-Mariano frente a la persistencia.</w:t>
       </w:r>
     </w:p>
@@ -20010,6 +20276,7 @@
           <w:sz w:val="20"/>
           <w:szCs w:val="20"/>
         </w:rPr>
+        <w:lastRenderedPageBreak/>
         <w:t>Tabla 15.</w:t>
       </w:r>
       <w:r>
@@ -21393,11 +21660,8 @@
         <w:t>Validación histórica.</w:t>
       </w:r>
       <w:r>
-        <w:t xml:space="preserve"> Con el precio del día anterior ningún modelo individual supera de forma consistente a la persistencia (Tabla 15): N-BEATSx le gana a ARX+GARCH en 4 de 6 orígenes y frente a la persistencia gana en 2 y pierde en 2. El ensamble de seis votantes, en cambio, le gana a la persistencia con significancia </w:t>
-      </w:r>
-      <w:r>
-        <w:lastRenderedPageBreak/>
-        <w:t>en 4 de 5 años (Tabla 16). El diseño definitivo, con solo información pública, mejora al predespacho solo en los cinco años y reduce el error de la persistencia realista entre 65 % y 76 %.</w:t>
+        <w:rPr/>
+        <w:t xml:space="preserve"> Con el precio del día anterior ningún modelo individual supera de forma consistente a la persistencia (Tabla 15): N-BEATSx le gana a ARX+GARCH en 4 de 6 orígenes y frente a la persistencia gana en 2 y pierde en 2. El ensamble de seis votantes, en cambio, le gana a la persistencia con significancia en 4 de 5 años (Tabla 16). El diseño definitivo, con solo información pública, mejora al predespacho solo en los cinco años y reduce el error de la persistencia realista entre 65 % y 76 %.</w:t>
       </w:r>
     </w:p>
     <w:p>
@@ -22551,6 +22815,7 @@
         <w:t>Horizonte de 72 h.</w:t>
       </w:r>
       <w:r>
+        <w:rPr/>
         <w:t xml:space="preserve"> La Tabla 17 compara el producto de 72 h con la persistencia realista medida desde el mismo corte (71 cortes, uno cada 3 días).</w:t>
       </w:r>
     </w:p>
@@ -23525,6 +23790,7 @@
         <w:t>Incertidumbre y costo.</w:t>
       </w:r>
       <w:r>
+        <w:rPr/>
         <w:t xml:space="preserve"> La Tabla 18 reúne la cobertura de las bandas y el costo computacional del diseño definitivo en el mismo equipo.</w:t>
       </w:r>
     </w:p>
@@ -23657,7 +23923,16 @@
                 <w:sz w:val="17"/>
                 <w:szCs w:val="17"/>
               </w:rPr>
-              <w:t>Ancho (COP/kWh)</w:t>
+              <w:t xml:space="preserve">Ancho </w:t>
+            </w:r>
+            <w:r>
+              <w:rPr>
+                <w:b/>
+                <w:color w:val="FFFFFF"/>
+                <w:sz w:val="17"/>
+                <w:szCs w:val="17"/>
+              </w:rPr>
+              <w:t>(COP/kWh)</w:t>
             </w:r>
           </w:p>
         </w:tc>
@@ -24458,11 +24733,8 @@
         <w:t>OE3 y OE4 — Motor de decisión.</w:t>
       </w:r>
       <w:r>
-        <w:t xml:space="preserve"> La ventaja es la diferencia entre el precio medio en las horas en que el motor recomienda actuar y el del periodo (precio medio 2026: 394,9 COP/kWh). Con el criterio de ventaja promedio ganarían «fijo» o «banda» en los cuatro casos (de 274 a 366 COP/kWh), pero al evaluar por separado las dos mitades del periodo (corte: 19 de abril) ese resultado no se sostiene: para el generador a 24 h, «fijo» actúa en el 2,7 % de las horas de la primera mitad y en el 39,7 % de la segunda, y para el comercializador, en el 23,5 % y en el 1,1 % (Tabla 20, Figura 8). La causa es la referencia fija: el precio de </w:t>
-      </w:r>
-      <w:r>
-        <w:lastRenderedPageBreak/>
-        <w:t>2026 se alejó del rango 2019-2025, de modo que casi todas las horas quedan por encima o por debajo de los percentiles históricos. Con el criterio de estabilidad y el filtro intradía, el motor elige «rodante» en los cuatro casos, con ventaja positiva y frecuencia válida en las dos mitades (Tabla 19). Su ventaja promedio es menor (187,5 a 244,7 COP/kWh), pero se mantiene en todo el año. Con un pronóstico mejor la ventaja de las reglas de umbral casi no cambia, porque premia sobre todo actuar en los meses caros; el filtro intradía es el que mejora la mitad más débil del generador a 24 h, de 73,4 a 109,3 COP/kWh.</w:t>
+        <w:rPr/>
+        <w:t xml:space="preserve"> La ventaja es la diferencia entre el precio medio en las horas en que el motor recomienda actuar y el del periodo (precio medio 2026: 394,9 COP/kWh). Con el criterio de ventaja promedio ganarían «fijo» o «banda» en los cuatro casos (de 274 a 366 COP/kWh), pero al evaluar por separado las dos mitades del periodo (corte: 19 de abril) ese resultado no se sostiene: para el generador a 24 h, «fijo» actúa en el 2,7 % de las horas de la primera mitad y en el 39,7 % de la segunda, y para el comercializador, en el 23,5 % y en el 1,1 % (Tabla 20, Figura 8). La causa es la referencia fija: el precio de 2026 se alejó del rango 2019-2025, de modo que casi todas las horas quedan por encima o por debajo de los percentiles históricos. Con el criterio de estabilidad y el filtro intradía, el motor elige «rodante» en los cuatro casos, con ventaja positiva y frecuencia válida en las dos mitades (Tabla 19). Su ventaja promedio es menor (187,5 a 244,7 COP/kWh), pero se mantiene en todo el año. Con un pronóstico mejor la ventaja de las reglas de umbral casi no cambia, porque premia sobre todo actuar en los meses caros; el filtro intradía es el que mejora la mitad más débil del generador a 24 h, de 73,4 a 109,3 COP/kWh.</w:t>
       </w:r>
     </w:p>
     <w:p>
@@ -26792,26 +27064,22 @@
         <w:jc w:val="center"/>
       </w:pPr>
       <w:r>
-        <w:rPr>
-          <w:noProof/>
-        </w:rPr>
         <w:drawing>
-          <wp:inline distT="0" distB="0" distL="0" distR="0" wp14:anchorId="2A6F281D" wp14:editId="0562A087">
+          <wp:inline xmlns:a="http://schemas.openxmlformats.org/drawingml/2006/main" xmlns:pic="http://schemas.openxmlformats.org/drawingml/2006/picture">
             <wp:extent cx="4482000" cy="1859524"/>
-            <wp:effectExtent l="0" t="0" r="0" b="0"/>
             <wp:docPr id="19" name="Picture 19"/>
             <wp:cNvGraphicFramePr>
-              <a:graphicFrameLocks xmlns:a="http://schemas.openxmlformats.org/drawingml/2006/main" noChangeAspect="1"/>
+              <a:graphicFrameLocks noChangeAspect="1"/>
             </wp:cNvGraphicFramePr>
-            <a:graphic xmlns:a="http://schemas.openxmlformats.org/drawingml/2006/main">
+            <a:graphic>
               <a:graphicData uri="http://schemas.openxmlformats.org/drawingml/2006/picture">
-                <pic:pic xmlns:pic="http://schemas.openxmlformats.org/drawingml/2006/picture">
+                <pic:pic>
                   <pic:nvPicPr>
                     <pic:cNvPr id="0" name="frecuencia_mitades.png"/>
                     <pic:cNvPicPr/>
                   </pic:nvPicPr>
                   <pic:blipFill>
-                    <a:blip r:embed="rId14"/>
+                    <a:blip r:embed="rId29"/>
                     <a:stretch>
                       <a:fillRect/>
                     </a:stretch>
@@ -26821,9 +27089,7 @@
                       <a:off x="0" y="0"/>
                       <a:ext cx="4482000" cy="1859524"/>
                     </a:xfrm>
-                    <a:prstGeom prst="rect">
-                      <a:avLst/>
-                    </a:prstGeom>
+                    <a:prstGeom prst="rect"/>
                   </pic:spPr>
                 </pic:pic>
               </a:graphicData>
@@ -26865,11 +27131,8 @@
         <w:t>Sensibilidad de los umbrales.</w:t>
       </w:r>
       <w:r>
-        <w:t xml:space="preserve"> Se barrieron seis pares de percentiles (10/90 a 35/65) con el método elegido para el generador a 24 h (Figura 9). No aparece un óptimo interior: los pares más extremos dan más ventaja por hora de acción pero actúan menos (294,0 COP/kWh en el 14,8 % de las horas con 10/90, frente a 207,3 en el 27,5 % con 35/65), y el par 25/75 queda en un punto intermedio (244,7 COP/kWh, 22,1 %). </w:t>
-      </w:r>
-      <w:r>
-        <w:lastRenderedPageBreak/>
-        <w:t>En el barrido de la bitácora también se probaron ventanas rodantes de 7 a 90 días, percentiles del filtro de ancho de 60 a 90, histéresis y lógica difusa: ninguna configuración ajustada en una mitad de 2026 mejoró a la actual en la otra, por lo que se conservaron los valores por defecto.</w:t>
+        <w:rPr/>
+        <w:t xml:space="preserve"> Se barrieron seis pares de percentiles (10/90 a 35/65) con el método elegido para el generador a 24 h (Figura 9). No aparece un óptimo interior: los pares más extremos dan más ventaja por hora de acción pero actúan menos (294,0 COP/kWh en el 14,8 % de las horas con 10/90, frente a 207,3 en el 27,5 % con 35/65), y el par 25/75 queda en un punto intermedio (244,7 COP/kWh, 22,1 %). En el barrido de la bitácora también se probaron ventanas rodantes de 7 a 90 días, percentiles del filtro de ancho de 60 a 90, histéresis y lógica difusa: ninguna configuración ajustada en una mitad de 2026 mejoró a la actual en la otra, por lo que se conservaron los valores por defecto.</w:t>
       </w:r>
     </w:p>
     <w:p>
@@ -26879,26 +27142,22 @@
         <w:jc w:val="center"/>
       </w:pPr>
       <w:r>
-        <w:rPr>
-          <w:noProof/>
-        </w:rPr>
         <w:drawing>
-          <wp:inline distT="0" distB="0" distL="0" distR="0" wp14:anchorId="33B5132A" wp14:editId="44AD0DF8">
+          <wp:inline xmlns:a="http://schemas.openxmlformats.org/drawingml/2006/main" xmlns:pic="http://schemas.openxmlformats.org/drawingml/2006/picture">
             <wp:extent cx="4482000" cy="1859524"/>
-            <wp:effectExtent l="0" t="0" r="0" b="0"/>
             <wp:docPr id="20" name="Picture 20"/>
             <wp:cNvGraphicFramePr>
-              <a:graphicFrameLocks xmlns:a="http://schemas.openxmlformats.org/drawingml/2006/main" noChangeAspect="1"/>
+              <a:graphicFrameLocks noChangeAspect="1"/>
             </wp:cNvGraphicFramePr>
-            <a:graphic xmlns:a="http://schemas.openxmlformats.org/drawingml/2006/main">
+            <a:graphic>
               <a:graphicData uri="http://schemas.openxmlformats.org/drawingml/2006/picture">
-                <pic:pic xmlns:pic="http://schemas.openxmlformats.org/drawingml/2006/picture">
+                <pic:pic>
                   <pic:nvPicPr>
                     <pic:cNvPr id="0" name="barrido_percentiles.png"/>
                     <pic:cNvPicPr/>
                   </pic:nvPicPr>
                   <pic:blipFill>
-                    <a:blip r:embed="rId15"/>
+                    <a:blip r:embed="rId30"/>
                     <a:stretch>
                       <a:fillRect/>
                     </a:stretch>
@@ -26908,9 +27167,7 @@
                       <a:off x="0" y="0"/>
                       <a:ext cx="4482000" cy="1859524"/>
                     </a:xfrm>
-                    <a:prstGeom prst="rect">
-                      <a:avLst/>
-                    </a:prstGeom>
+                    <a:prstGeom prst="rect"/>
                   </pic:spPr>
                 </pic:pic>
               </a:graphicData>
@@ -26952,6 +27209,7 @@
         <w:t>Último mes y traducción a pesos.</w:t>
       </w:r>
       <w:r>
+        <w:rPr/>
         <w:t xml:space="preserve"> Entre el 6 de julio y el 5 de agosto de 2026 la banda cubrió el 88,8 % de las horas y el MAE fue 42,9 COP/kWh. Para el generador a 24 h, los cuatro métodos dieron ventaja positiva: «rodante» +144,9 COP/kWh en el 36,8 % de las horas, «híbrido» +142,5 en el 16,0 %, «banda» +86,1 en el 21,1 % y «fijo» +85,8 en el 50,1 %. Para un cliente de ejemplo de 100 kW que opere a potencia constante en las horas de acción, esto equivale a +3,84 millones de COP con «rodante», +1,64 con «híbrido», +1,31 con «banda» y +3,10 con «fijo» (Figura 10); en el informe de avance, con el pronóstico de N-BEATSx, «banda» perdía 0,65 millones en el mismo mes. La traducción a pesos es ilustrativa y no sustituye una evaluación económica completa [8].</w:t>
       </w:r>
     </w:p>
@@ -26962,26 +27220,22 @@
         <w:jc w:val="center"/>
       </w:pPr>
       <w:r>
-        <w:rPr>
-          <w:noProof/>
-        </w:rPr>
         <w:drawing>
-          <wp:inline distT="0" distB="0" distL="0" distR="0" wp14:anchorId="3DFDC985" wp14:editId="4C28D8C5">
+          <wp:inline xmlns:a="http://schemas.openxmlformats.org/drawingml/2006/main" xmlns:pic="http://schemas.openxmlformats.org/drawingml/2006/picture">
             <wp:extent cx="4482000" cy="1859524"/>
-            <wp:effectExtent l="0" t="0" r="0" b="0"/>
             <wp:docPr id="21" name="Picture 21"/>
             <wp:cNvGraphicFramePr>
-              <a:graphicFrameLocks xmlns:a="http://schemas.openxmlformats.org/drawingml/2006/main" noChangeAspect="1"/>
+              <a:graphicFrameLocks noChangeAspect="1"/>
             </wp:cNvGraphicFramePr>
-            <a:graphic xmlns:a="http://schemas.openxmlformats.org/drawingml/2006/main">
+            <a:graphic>
               <a:graphicData uri="http://schemas.openxmlformats.org/drawingml/2006/picture">
-                <pic:pic xmlns:pic="http://schemas.openxmlformats.org/drawingml/2006/picture">
+                <pic:pic>
                   <pic:nvPicPr>
                     <pic:cNvPr id="0" name="ultimo_mes_pesos.png"/>
                     <pic:cNvPicPr/>
                   </pic:nvPicPr>
                   <pic:blipFill>
-                    <a:blip r:embed="rId16"/>
+                    <a:blip r:embed="rId31"/>
                     <a:stretch>
                       <a:fillRect/>
                     </a:stretch>
@@ -26991,9 +27245,7 @@
                       <a:off x="0" y="0"/>
                       <a:ext cx="4482000" cy="1859524"/>
                     </a:xfrm>
-                    <a:prstGeom prst="rect">
-                      <a:avLst/>
-                    </a:prstGeom>
+                    <a:prstGeom prst="rect"/>
                   </pic:spPr>
                 </pic:pic>
               </a:graphicData>
@@ -27035,6 +27287,7 @@
         <w:t>Operación posterior al periodo del proyecto.</w:t>
       </w:r>
       <w:r>
+        <w:rPr/>
         <w:t xml:space="preserve"> Desde el 6 de agosto el sistema opera con los datos que XM publica cada día. Hasta el 11 de octubre (1.631 horas con precio publicado), el MAE fue 47,8 COP/kWh (MAPE 6,3 %), frente a 49,4 del predespacho solo; por mes, 28,6 en agosto, 55,3 en septiembre y 74,4 en lo corrido de octubre, meses más volátiles. La banda cubrió el 74,1 % de las horas, por debajo del objetivo, porque se calibra con los 60 días anteriores y el precio se volvió más volátil en septiembre y octubre.</w:t>
       </w:r>
     </w:p>
@@ -27050,6 +27303,7 @@
         <w:t>Eventos.</w:t>
       </w:r>
       <w:r>
+        <w:rPr/>
         <w:t xml:space="preserve"> El detector de picos y desplomes, con solo información pública, alcanza un AUC de 0,940 para desplomes y 0,969 para picos, frente a 0,659 y 0,874 de usar el predespacho solo como alarma.</w:t>
       </w:r>
     </w:p>
@@ -27065,6 +27319,7 @@
         <w:t>OE4 — Validación con usuarios.</w:t>
       </w:r>
       <w:r>
+        <w:rPr/>
         <w:t xml:space="preserve"> El dashboard se evaluó con </w:t>
       </w:r>
       <w:r>
@@ -27074,11 +27329,8 @@
         <w:t>N</w:t>
       </w:r>
       <w:r>
-        <w:t xml:space="preserve"> usuarios mediante un cuestionario anónimo en Microsoft Forms: perfil (relación con el sector, familiaridad con el mercado y dispositivo), once </w:t>
-      </w:r>
-      <w:r>
-        <w:lastRenderedPageBreak/>
-        <w:t xml:space="preserve">afirmaciones sobre la comprensión y la utilidad de cada imagen de decisión con una escala de acuerdo de cinco niveles, una nota global de 1 a 10 y tres preguntas abiertas (lo más útil, lo que cambiarían y lo que agregarían). </w:t>
+        <w:rPr/>
+        <w:t xml:space="preserve"> usuarios mediante un cuestionario anónimo en Microsoft Forms: perfil (relación con el sector, familiaridad con el mercado y dispositivo), once afirmaciones sobre la comprensión y la utilidad de cada imagen de decisión con una escala de acuerdo de cinco niveles, una nota global de 1 a 10 y tres preguntas abiertas (lo más útil, lo que cambiarían y lo que agregarían). </w:t>
       </w:r>
       <w:r>
         <w:rPr>
@@ -27140,9 +27392,9 @@
         <w:tblLook w:val="04A0" w:firstRow="1" w:lastRow="0" w:firstColumn="1" w:lastColumn="0" w:noHBand="0" w:noVBand="1"/>
       </w:tblPr>
       <w:tblGrid>
-        <w:gridCol w:w="5768"/>
-        <w:gridCol w:w="1791"/>
-        <w:gridCol w:w="1791"/>
+        <w:gridCol w:w="5800"/>
+        <w:gridCol w:w="1800"/>
+        <w:gridCol w:w="1800"/>
       </w:tblGrid>
       <w:tr>
         <w:trPr>
@@ -27245,6 +27497,9 @@
             <w:vAlign w:val="center"/>
           </w:tcPr>
           <w:p>
+            <w:pPr>
+              <w:jc w:val="left"/>
+            </w:pPr>
             <w:r>
               <w:rPr>
                 <w:sz w:val="17"/>
@@ -27319,6 +27574,9 @@
             <w:vAlign w:val="center"/>
           </w:tcPr>
           <w:p>
+            <w:pPr>
+              <w:jc w:val="left"/>
+            </w:pPr>
             <w:r>
               <w:rPr>
                 <w:sz w:val="17"/>
@@ -27393,6 +27651,9 @@
             <w:vAlign w:val="center"/>
           </w:tcPr>
           <w:p>
+            <w:pPr>
+              <w:jc w:val="left"/>
+            </w:pPr>
             <w:r>
               <w:rPr>
                 <w:sz w:val="17"/>
@@ -27467,6 +27728,9 @@
             <w:vAlign w:val="center"/>
           </w:tcPr>
           <w:p>
+            <w:pPr>
+              <w:jc w:val="left"/>
+            </w:pPr>
             <w:r>
               <w:rPr>
                 <w:sz w:val="17"/>
@@ -27541,6 +27805,9 @@
             <w:vAlign w:val="center"/>
           </w:tcPr>
           <w:p>
+            <w:pPr>
+              <w:jc w:val="left"/>
+            </w:pPr>
             <w:r>
               <w:rPr>
                 <w:sz w:val="17"/>
@@ -27615,6 +27882,9 @@
             <w:vAlign w:val="center"/>
           </w:tcPr>
           <w:p>
+            <w:pPr>
+              <w:jc w:val="left"/>
+            </w:pPr>
             <w:r>
               <w:rPr>
                 <w:sz w:val="17"/>
@@ -27689,6 +27959,9 @@
             <w:vAlign w:val="center"/>
           </w:tcPr>
           <w:p>
+            <w:pPr>
+              <w:jc w:val="left"/>
+            </w:pPr>
             <w:r>
               <w:rPr>
                 <w:sz w:val="17"/>
@@ -27763,6 +28036,9 @@
             <w:vAlign w:val="center"/>
           </w:tcPr>
           <w:p>
+            <w:pPr>
+              <w:jc w:val="left"/>
+            </w:pPr>
             <w:r>
               <w:rPr>
                 <w:sz w:val="17"/>
@@ -27837,6 +28113,9 @@
             <w:vAlign w:val="center"/>
           </w:tcPr>
           <w:p>
+            <w:pPr>
+              <w:jc w:val="left"/>
+            </w:pPr>
             <w:r>
               <w:rPr>
                 <w:sz w:val="17"/>
@@ -27911,6 +28190,9 @@
             <w:vAlign w:val="center"/>
           </w:tcPr>
           <w:p>
+            <w:pPr>
+              <w:jc w:val="left"/>
+            </w:pPr>
             <w:r>
               <w:rPr>
                 <w:sz w:val="17"/>
@@ -27985,6 +28267,9 @@
             <w:vAlign w:val="center"/>
           </w:tcPr>
           <w:p>
+            <w:pPr>
+              <w:jc w:val="left"/>
+            </w:pPr>
             <w:r>
               <w:rPr>
                 <w:sz w:val="17"/>
@@ -28059,6 +28344,9 @@
             <w:vAlign w:val="center"/>
           </w:tcPr>
           <w:p>
+            <w:pPr>
+              <w:jc w:val="left"/>
+            </w:pPr>
             <w:r>
               <w:rPr>
                 <w:sz w:val="17"/>
@@ -28130,7 +28418,7 @@
       <w:bookmarkStart w:id="120" w:name="_Toc240440265"/>
       <w:bookmarkStart w:id="121" w:name="_Toc241072140"/>
       <w:bookmarkStart w:id="122" w:name="_Toc241072504"/>
-      <w:bookmarkStart w:id="123" w:name="_Toc242994563"/>
+      <w:bookmarkStart w:id="123" w:name="_Toc241697489"/>
       <w:r>
         <w:t>Análisis e interpretación de resultados</w:t>
       </w:r>
@@ -28151,6 +28439,7 @@
         <w:t>Comparación con los criterios.</w:t>
       </w:r>
       <w:r>
+        <w:rPr/>
         <w:t xml:space="preserve"> El diseño definitivo cumple la precisión con holgura: rMAE de 0,32 frente a la persistencia realista y de 0,60 frente a la del día anterior a 24 h, y de 0,45 frente a la persistencia realista a 72 h. Cumple la robustez mensual (rMAE &lt; 1 en los ocho meses de 2026; peor mes 0,83 frente a la persistencia del día anterior) y el costo (actualización diaria completa en 7 min, menos de 15). La cobertura de la banda (80,6 % a 24 h y 83,2 % a 72 h) queda dentro de 80 ± 5 puntos en el periodo del proyecto; en la operación de agosto a octubre bajó al 74,1 %.</w:t>
       </w:r>
     </w:p>
@@ -28166,6 +28455,7 @@
         <w:t>Prueba de hipótesis.</w:t>
       </w:r>
       <w:r>
+        <w:rPr/>
         <w:t xml:space="preserve"> Diebold-Mariano del diseño definitivo frente a la persistencia realista: t = 13,27 a 24 h y t = 11,97 a 72 h, con p unilateral &lt; 0,001. Se rechaza H0 en ambos casos. Frente al predespacho solo, t = 8,57 (p &lt; 0,001): la corrección con CatBoost aporta información más allá de la que publica XM, sobre todo en temporada normal; en El Niño la diferencia no es significativa.</w:t>
       </w:r>
     </w:p>
@@ -28181,6 +28471,7 @@
         <w:t>Lectura honesta de la robustez.</w:t>
       </w:r>
       <w:r>
+        <w:rPr/>
         <w:t xml:space="preserve"> Con el precio del día anterior, ningún modelo individual supera de forma consistente a la persistencia en los orígenes históricos, pero el ensamble de seis votantes sí lo hace en 4 de 5 años. Las redes neuronales resultaron muy sensibles a cambios pequeños en los datos: al corregir el ONI histórico en ±0,1 en cuatro trimestres, su error cambió hasta 3 COP/kWh y seis de las 36 conclusiones de Diebold-Mariano se invirtieron, mientras XGBoost y ARX+GARCH casi no cambiaron. El hallazgo más importante, sin embargo, es de información y no de modelado: con solo lo publicado al corte el ensamble de 6 pierde casi toda su ventaja (rMAE 0,93) y el pronóstico solo es útil con el predespacho. Las variantes del diseño definitivo se eligieron observando 2026, pero la validación en los cinco años históricos lo confirma (Tabla 16). Persisten dos limitaciones: los desfases de nivel de días completos que comete el predespacho (por ejemplo, del 11 al 18 de junio de 2026) no se pueden anticipar con información pública, y el modelo hereda la amplitud de los picos que el predespacho anticipa y no ocurren.</w:t>
       </w:r>
     </w:p>
@@ -28193,10 +28484,10 @@
         <w:rPr>
           <w:b/>
         </w:rPr>
-        <w:lastRenderedPageBreak/>
         <w:t>Validación externa (Tabla 4).</w:t>
       </w:r>
       <w:r>
+        <w:rPr/>
         <w:t xml:space="preserve"> El MAPE (10,0 %) es mayor que el del antecedente colombiano horario [15] (6,7 %), que evaluó 2000-2017 sin los eventos extremos de 2023-2026 y con un modelo univariado que supone conocido el precio del día anterior. Frente a Nueva Zelanda [16], el error queda por debajo del de la referencia ingenua en todos los años evaluados, mientras ninguno de sus 33 modelos lo logra; se lee como «superar al propio ingenuo en una tarea más difícil», no como comparación numérica directa. La referencia comercial más cercana es la del propio operador: el predespacho ideal de XM, que el diseño definitivo mejora en 2026 y en los cinco años históricos.</w:t>
       </w:r>
     </w:p>
@@ -28212,6 +28503,7 @@
         <w:t>Interpretabilidad (criterio de OE2).</w:t>
       </w:r>
       <w:r>
+        <w:rPr/>
         <w:t xml:space="preserve"> SHAP [27] y permutación sobre XGBoost coinciden en las tres variables más importantes (precio rezagado 24 h, media de 24 h y precio rezagado 168 h; correlación de Spearman entre ambos rankings de 0,811), evidencia cruzada de que el modelo se apoya en las variables que la caracterización de OE1 ya señalaba como dominantes. En el diseño definitivo, el combinador da en promedio un peso de 0,60 al predespacho y de 0,37 al promedio de los CatBoost, de modo que cada pronóstico se puede explicar como el predespacho de XM corregido según el comportamiento reciente del mercado.</w:t>
       </w:r>
     </w:p>
@@ -28227,6 +28519,7 @@
         <w:t>Validación con usuarios.</w:t>
       </w:r>
       <w:r>
+        <w:rPr/>
         <w:t xml:space="preserve"> </w:t>
       </w:r>
       <w:r>
@@ -28249,7 +28542,7 @@
       <w:bookmarkStart w:id="124" w:name="_Toc241072141"/>
       <w:bookmarkStart w:id="125" w:name="_Toc241072505"/>
       <w:bookmarkStart w:id="126" w:name="_Toc240440266"/>
-      <w:bookmarkStart w:id="127" w:name="_Toc242994564"/>
+      <w:bookmarkStart w:id="127" w:name="_Toc241697490"/>
       <w:r>
         <w:t>Análisis de impacto del proyecto</w:t>
       </w:r>
@@ -28271,7 +28564,7 @@
         </w:numPr>
         <w:spacing w:before="300"/>
       </w:pPr>
-      <w:bookmarkStart w:id="128" w:name="_Toc242994565"/>
+      <w:bookmarkStart w:id="128" w:name="_Toc241697491"/>
       <w:r>
         <w:t>Impacto social</w:t>
       </w:r>
@@ -28296,7 +28589,7 @@
         </w:numPr>
         <w:spacing w:before="300"/>
       </w:pPr>
-      <w:bookmarkStart w:id="129" w:name="_Toc242994566"/>
+      <w:bookmarkStart w:id="129" w:name="_Toc241697492"/>
       <w:r>
         <w:t>Impacto ambiental</w:t>
       </w:r>
@@ -28321,7 +28614,7 @@
         </w:numPr>
         <w:spacing w:before="300"/>
       </w:pPr>
-      <w:bookmarkStart w:id="130" w:name="_Toc242994567"/>
+      <w:bookmarkStart w:id="130" w:name="_Toc241697493"/>
       <w:r>
         <w:t>Impacto legal y regulatorio</w:t>
       </w:r>
@@ -28346,9 +28639,8 @@
         </w:numPr>
         <w:spacing w:before="300"/>
       </w:pPr>
-      <w:bookmarkStart w:id="131" w:name="_Toc242994568"/>
-      <w:r>
-        <w:lastRenderedPageBreak/>
+      <w:bookmarkStart w:id="131" w:name="_Toc241697494"/>
+      <w:r>
         <w:t>Impacto económico y financiero</w:t>
       </w:r>
       <w:bookmarkEnd w:id="131"/>
@@ -28375,7 +28667,7 @@
       <w:bookmarkStart w:id="132" w:name="_Toc240440267"/>
       <w:bookmarkStart w:id="133" w:name="_Toc241072142"/>
       <w:bookmarkStart w:id="134" w:name="_Toc241072506"/>
-      <w:bookmarkStart w:id="135" w:name="_Toc242994569"/>
+      <w:bookmarkStart w:id="135" w:name="_Toc241697495"/>
       <w:r>
         <w:t>Conclusiones y recomendaciones</w:t>
       </w:r>
@@ -28451,9 +28743,8 @@
       <w:bookmarkStart w:id="136" w:name="_Toc240440268"/>
       <w:bookmarkStart w:id="137" w:name="_Toc241072143"/>
       <w:bookmarkStart w:id="138" w:name="_Toc241072507"/>
-      <w:bookmarkStart w:id="139" w:name="_Toc242994570"/>
-      <w:r>
-        <w:lastRenderedPageBreak/>
+      <w:bookmarkStart w:id="139" w:name="_Toc241697496"/>
+      <w:r>
         <w:t>Bibliografía (formato IEEE)</w:t>
       </w:r>
       <w:bookmarkEnd w:id="136"/>
@@ -28500,7 +28791,14 @@
           <w:szCs w:val="20"/>
         </w:rPr>
         <w:tab/>
-        <w:t>J. D. Barceló Barraza y R. A. Dede Perdomo, "Anexo 1 — Formulación del proyecto: Diseño de una plataforma de procesamiento y analítica de datos para el pronóstico del precio de la energía y el apoyo en la toma de decisiones," Depto. de Ingeniería Eléctrica y Electrónica, Universidad del Norte, Barranquilla, Colombia, 2026.</w:t>
+        <w:t>J. D. Barceló Barraza y R. A. Dede Perdomo, "Anexo 1 — Formulación del proyecto: Diseño de una plataforma de procesamiento y analítica de datos para el pronóstico del precio de la energía y el apoyo en la toma de decisiones," Depto. de Ingeniería Eléct</w:t>
+      </w:r>
+      <w:r>
+        <w:rPr>
+          <w:sz w:val="20"/>
+          <w:szCs w:val="20"/>
+        </w:rPr>
+        <w:t>rica y Electrónica, Universidad del Norte, Barranquilla, Colombia, 2026.</w:t>
       </w:r>
     </w:p>
     <w:p>
@@ -28557,7 +28855,14 @@
           <w:szCs w:val="20"/>
         </w:rPr>
         <w:tab/>
-        <w:t>XM S.A. E.S.P., "API de datos del Sistema de Información del Mercado de Energía Mayorista," servapibi.xm.com.co. Consultado: ago. 2026.</w:t>
+        <w:t>XM S</w:t>
+      </w:r>
+      <w:r>
+        <w:rPr>
+          <w:sz w:val="20"/>
+          <w:szCs w:val="20"/>
+        </w:rPr>
+        <w:t>.A. E.S.P., "API de datos del Sistema de Información del Mercado de Energía Mayorista," servapibi.xm.com.co. Consultado: ago. 2026.</w:t>
       </w:r>
     </w:p>
     <w:p>
@@ -28629,7 +28934,14 @@
           <w:sz w:val="20"/>
           <w:szCs w:val="20"/>
         </w:rPr>
-        <w:t>, vol. 293, art. 116983, 2021, doi: 10.1016/j.apenergy.2021.116983.</w:t>
+        <w:t>, vol</w:t>
+      </w:r>
+      <w:r>
+        <w:rPr>
+          <w:sz w:val="20"/>
+          <w:szCs w:val="20"/>
+        </w:rPr>
+        <w:t>. 293, art. 116983, 2021, doi: 10.1016/j.apenergy.2021.116983.</w:t>
       </w:r>
     </w:p>
     <w:p>
@@ -28642,6 +28954,7 @@
           <w:sz w:val="20"/>
           <w:szCs w:val="20"/>
         </w:rPr>
+        <w:lastRenderedPageBreak/>
         <w:t>[7]</w:t>
       </w:r>
       <w:r>
@@ -28686,7 +28999,14 @@
           <w:szCs w:val="20"/>
         </w:rPr>
         <w:tab/>
-        <w:t xml:space="preserve">K. Maciejowska, A. Lipiecki y B. Uniejewski, "Statistical and economic evaluation of forecasts in electricity markets: Beyond RMSE and MAE," </w:t>
+        <w:t>K. Maciejowska, A. Lipiecki y B. Uniejewski, "Statistical and eco</w:t>
+      </w:r>
+      <w:r>
+        <w:rPr>
+          <w:sz w:val="20"/>
+          <w:szCs w:val="20"/>
+        </w:rPr>
+        <w:t xml:space="preserve">nomic evaluation of forecasts in electricity markets: Beyond RMSE and MAE," </w:t>
       </w:r>
       <w:r>
         <w:rPr>
@@ -28722,7 +29042,14 @@
           <w:szCs w:val="20"/>
         </w:rPr>
         <w:tab/>
-        <w:t>NOAA Climate Prediction Center, "Cold &amp; Warm Episodes by Season — Oceanic Niño Index (ONI)," cpc.ncep.noaa.gov/products/analysis_monitoring/enso/oni. Consultado: 6-ago-2026.</w:t>
+        <w:t>NOAA Climate Prediction Center, "Cold &amp; Warm Episodes by Season — Oceanic Niño Index (</w:t>
+      </w:r>
+      <w:r>
+        <w:rPr>
+          <w:sz w:val="20"/>
+          <w:szCs w:val="20"/>
+        </w:rPr>
+        <w:t>ONI)," cpc.ncep.noaa.gov/products/analysis_monitoring/enso/oni. Consultado: 6-ago-2026.</w:t>
       </w:r>
     </w:p>
     <w:p>
@@ -28779,7 +29106,14 @@
           <w:szCs w:val="20"/>
         </w:rPr>
         <w:tab/>
-        <w:t xml:space="preserve">J. Nowotarski y R. Weron, "Computing electricity spot price prediction intervals using quantile regression and forecast averaging," </w:t>
+        <w:t>J. Nowotarski y R. Weron, "Comp</w:t>
+      </w:r>
+      <w:r>
+        <w:rPr>
+          <w:sz w:val="20"/>
+          <w:szCs w:val="20"/>
+        </w:rPr>
+        <w:t xml:space="preserve">uting electricity spot price prediction intervals using quantile regression and forecast averaging," </w:t>
       </w:r>
       <w:r>
         <w:rPr>
@@ -28815,7 +29149,14 @@
           <w:szCs w:val="20"/>
         </w:rPr>
         <w:tab/>
-        <w:t xml:space="preserve">A. P. Agudelo, J. M. López-Lezama y E. Velilla, "Predicción del precio de la electricidad en la bolsa mediante un modelo neuronal no-lineal autorregresivo con entradas exógenas," </w:t>
+        <w:t>A. P. Agudelo, J. M. López-Lezama y E. Velilla, "Predicción del prec</w:t>
+      </w:r>
+      <w:r>
+        <w:rPr>
+          <w:sz w:val="20"/>
+          <w:szCs w:val="20"/>
+        </w:rPr>
+        <w:t xml:space="preserve">io de la electricidad en la bolsa mediante un modelo neuronal no-lineal autorregresivo con entradas exógenas," </w:t>
       </w:r>
       <w:r>
         <w:rPr>
@@ -28851,7 +29192,14 @@
           <w:szCs w:val="20"/>
         </w:rPr>
         <w:tab/>
-        <w:t xml:space="preserve">A. Muñoz-Santiago, J. Urquijo-Vanstrahlengs, A. Castro-Otero y J. Lombana, "Pronóstico del precio de la energía en Colombia utilizando modelos ARIMA con IGARCH," </w:t>
+        <w:t>A. Muñoz-Santiago, J. Urquijo-Vanstrahlengs, A. Castro</w:t>
+      </w:r>
+      <w:r>
+        <w:rPr>
+          <w:sz w:val="20"/>
+          <w:szCs w:val="20"/>
+        </w:rPr>
+        <w:t xml:space="preserve">-Otero y J. Lombana, "Pronóstico del precio de la energía en Colombia utilizando modelos ARIMA con IGARCH," </w:t>
       </w:r>
       <w:r>
         <w:rPr>
@@ -28887,7 +29235,14 @@
           <w:szCs w:val="20"/>
         </w:rPr>
         <w:tab/>
-        <w:t xml:space="preserve">J. Barrientos Marín, E. Tabares Orozco y E. Velilla, "Forecasting electricity price in Colombia: A comparison between neural network, ARMA process and hybrid models," </w:t>
+        <w:t xml:space="preserve">J. Barrientos Marín, E. Tabares </w:t>
+      </w:r>
+      <w:r>
+        <w:rPr>
+          <w:sz w:val="20"/>
+          <w:szCs w:val="20"/>
+        </w:rPr>
+        <w:t xml:space="preserve">Orozco y E. Velilla, "Forecasting electricity price in Colombia: A comparison between neural network, ARMA process and hybrid models," </w:t>
       </w:r>
       <w:r>
         <w:rPr>
@@ -28923,7 +29278,14 @@
           <w:szCs w:val="20"/>
         </w:rPr>
         <w:tab/>
-        <w:t xml:space="preserve">S. Gallón y J. Barrientos, "Forecasting the Colombian electricity spot price under a functional approach," </w:t>
+        <w:t xml:space="preserve">S. Gallón y J. Barrientos, "Forecasting the Colombian </w:t>
+      </w:r>
+      <w:r>
+        <w:rPr>
+          <w:sz w:val="20"/>
+          <w:szCs w:val="20"/>
+        </w:rPr>
+        <w:t xml:space="preserve">electricity spot price under a functional approach," </w:t>
       </w:r>
       <w:r>
         <w:rPr>
@@ -28959,7 +29321,14 @@
           <w:szCs w:val="20"/>
         </w:rPr>
         <w:tab/>
-        <w:t xml:space="preserve">G. Kapoor y N. Wichitaksorn, "Electricity price forecasting in New Zealand: A comparative analysis of statistical and machine learning models with feature selection," </w:t>
+        <w:t>G. Kapoor y N. Wichitaksorn, "Electricity price forecasting in New Zealand: A comparative analysis of statist</w:t>
+      </w:r>
+      <w:r>
+        <w:rPr>
+          <w:sz w:val="20"/>
+          <w:szCs w:val="20"/>
+        </w:rPr>
+        <w:t xml:space="preserve">ical and machine learning models with feature selection," </w:t>
       </w:r>
       <w:r>
         <w:rPr>
@@ -28995,7 +29364,14 @@
           <w:szCs w:val="20"/>
         </w:rPr>
         <w:tab/>
-        <w:t xml:space="preserve">F. Ziel y R. Weron, "Day-ahead electricity price forecasting with high-dimensional structures: Univariate vs. multivariate modeling frameworks," </w:t>
+        <w:t>F. Ziel y R. Weron, "Day-ahead electricity price forecasting with high-dimensional structures: Univariate vs. mul</w:t>
+      </w:r>
+      <w:r>
+        <w:rPr>
+          <w:sz w:val="20"/>
+          <w:szCs w:val="20"/>
+        </w:rPr>
+        <w:t xml:space="preserve">tivariate modeling frameworks," </w:t>
       </w:r>
       <w:r>
         <w:rPr>
@@ -29046,7 +29422,14 @@
           <w:sz w:val="20"/>
           <w:szCs w:val="20"/>
         </w:rPr>
-        <w:t>, Vancouver, Canadá, 2019.</w:t>
+        <w:t>, Vancouver, Cana</w:t>
+      </w:r>
+      <w:r>
+        <w:rPr>
+          <w:sz w:val="20"/>
+          <w:szCs w:val="20"/>
+        </w:rPr>
+        <w:t>dá, 2019.</w:t>
       </w:r>
     </w:p>
     <w:p>
@@ -29059,7 +29442,6 @@
           <w:sz w:val="20"/>
           <w:szCs w:val="20"/>
         </w:rPr>
-        <w:lastRenderedPageBreak/>
         <w:t>[19]</w:t>
       </w:r>
       <w:r>
@@ -29112,77 +29494,7 @@
           <w:sz w:val="20"/>
           <w:szCs w:val="20"/>
         </w:rPr>
-        <w:t>Date and time — Representations for information interchange — Part 1: Basic rules</w:t>
-      </w:r>
-      <w:r>
-        <w:rPr>
-          <w:sz w:val="20"/>
-          <w:szCs w:val="20"/>
-        </w:rPr>
-        <w:t>, International Organization for Standardization, Ginebra, Suiza, 2019.</w:t>
-      </w:r>
-    </w:p>
-    <w:p>
-      <w:pPr>
-        <w:spacing w:after="80"/>
-        <w:ind w:left="567" w:hanging="567"/>
-      </w:pPr>
-      <w:r>
-        <w:rPr>
-          <w:sz w:val="20"/>
-          <w:szCs w:val="20"/>
-        </w:rPr>
-        <w:t>[21]</w:t>
-      </w:r>
-      <w:r>
-        <w:rPr>
-          <w:sz w:val="20"/>
-          <w:szCs w:val="20"/>
-        </w:rPr>
-        <w:tab/>
-        <w:t>Comisión de Regulación de Energía y Gas (CREG), "Resolución CREG 101 018 de 2022," Bogotá, Colombia, 2022.</w:t>
-      </w:r>
-    </w:p>
-    <w:p>
-      <w:pPr>
-        <w:spacing w:after="80"/>
-        <w:ind w:left="567" w:hanging="567"/>
-      </w:pPr>
-      <w:r>
-        <w:rPr>
-          <w:sz w:val="20"/>
-          <w:szCs w:val="20"/>
-        </w:rPr>
-        <w:t>[22]</w:t>
-      </w:r>
-      <w:r>
-        <w:rPr>
-          <w:sz w:val="20"/>
-          <w:szCs w:val="20"/>
-        </w:rPr>
-        <w:tab/>
-        <w:t>Congreso de la República de Colombia, "Ley Estatutaria 1581 de 2012, por la cual se dictan disposiciones generales para la protección de datos personales," Bogotá, Colombia, oct. 2012.</w:t>
-      </w:r>
-    </w:p>
-    <w:p>
-      <w:pPr>
-        <w:spacing w:after="80"/>
-        <w:ind w:left="567" w:hanging="567"/>
-      </w:pPr>
-      <w:r>
-        <w:rPr>
-          <w:sz w:val="20"/>
-          <w:szCs w:val="20"/>
-        </w:rPr>
-        <w:t>[23]</w:t>
-      </w:r>
-      <w:r>
-        <w:rPr>
-          <w:sz w:val="20"/>
-          <w:szCs w:val="20"/>
-        </w:rPr>
-        <w:tab/>
-        <w:t xml:space="preserve">ISO/IEC 25010:2011, </w:t>
+        <w:t>Date and time — Representations for informa</w:t>
       </w:r>
       <w:r>
         <w:rPr>
@@ -29190,14 +29502,14 @@
           <w:sz w:val="20"/>
           <w:szCs w:val="20"/>
         </w:rPr>
-        <w:t>Systems and software engineering — Systems and software Quality Requirements and Evaluation (SQuaRE) — System and software quality models</w:t>
+        <w:t>tion interchange — Part 1: Basic rules</w:t>
       </w:r>
       <w:r>
         <w:rPr>
           <w:sz w:val="20"/>
           <w:szCs w:val="20"/>
         </w:rPr>
-        <w:t>, ISO/IEC, Ginebra, Suiza, 2011.</w:t>
+        <w:t>, International Organization for Standardization, Ginebra, Suiza, 2019.</w:t>
       </w:r>
     </w:p>
     <w:p>
@@ -29210,7 +29522,7 @@
           <w:sz w:val="20"/>
           <w:szCs w:val="20"/>
         </w:rPr>
-        <w:t>[24]</w:t>
+        <w:t>[21]</w:t>
       </w:r>
       <w:r>
         <w:rPr>
@@ -29218,7 +29530,56 @@
           <w:szCs w:val="20"/>
         </w:rPr>
         <w:tab/>
-        <w:t xml:space="preserve">T. Bollerslev, "Generalized autoregressive conditional heteroskedasticity," </w:t>
+        <w:t>Comisión de Regulación de Energía y Gas (CREG), "Resolución CREG 101 018 de 2022," Bogotá, Colombia, 2022.</w:t>
+      </w:r>
+    </w:p>
+    <w:p>
+      <w:pPr>
+        <w:spacing w:after="80"/>
+        <w:ind w:left="567" w:hanging="567"/>
+      </w:pPr>
+      <w:r>
+        <w:rPr>
+          <w:sz w:val="20"/>
+          <w:szCs w:val="20"/>
+        </w:rPr>
+        <w:t>[22]</w:t>
+      </w:r>
+      <w:r>
+        <w:rPr>
+          <w:sz w:val="20"/>
+          <w:szCs w:val="20"/>
+        </w:rPr>
+        <w:tab/>
+        <w:t>Congreso de la República de C</w:t>
+      </w:r>
+      <w:r>
+        <w:rPr>
+          <w:sz w:val="20"/>
+          <w:szCs w:val="20"/>
+        </w:rPr>
+        <w:t>olombia, "Ley Estatutaria 1581 de 2012, por la cual se dictan disposiciones generales para la protección de datos personales," Bogotá, Colombia, oct. 2012.</w:t>
+      </w:r>
+    </w:p>
+    <w:p>
+      <w:pPr>
+        <w:spacing w:after="80"/>
+        <w:ind w:left="567" w:hanging="567"/>
+      </w:pPr>
+      <w:r>
+        <w:rPr>
+          <w:sz w:val="20"/>
+          <w:szCs w:val="20"/>
+        </w:rPr>
+        <w:t>[23]</w:t>
+      </w:r>
+      <w:r>
+        <w:rPr>
+          <w:sz w:val="20"/>
+          <w:szCs w:val="20"/>
+        </w:rPr>
+        <w:tab/>
+        <w:t xml:space="preserve">ISO/IEC 25010:2011, </w:t>
       </w:r>
       <w:r>
         <w:rPr>
@@ -29226,14 +29587,14 @@
           <w:sz w:val="20"/>
           <w:szCs w:val="20"/>
         </w:rPr>
-        <w:t>J. Econometrics</w:t>
+        <w:t>Systems and software engineering — Systems and software Quality Requirements and Evaluation (SQuaRE) — System and software quality models</w:t>
       </w:r>
       <w:r>
         <w:rPr>
           <w:sz w:val="20"/>
           <w:szCs w:val="20"/>
         </w:rPr>
-        <w:t>, vol. 31, no. 3, pp. 307–327, 1986.</w:t>
+        <w:t>, ISO/IEC, Ginebra, Suiza, 2011.</w:t>
       </w:r>
     </w:p>
     <w:p>
@@ -29246,7 +29607,7 @@
           <w:sz w:val="20"/>
           <w:szCs w:val="20"/>
         </w:rPr>
-        <w:t>[25]</w:t>
+        <w:t>[24]</w:t>
       </w:r>
       <w:r>
         <w:rPr>
@@ -29254,7 +29615,7 @@
           <w:szCs w:val="20"/>
         </w:rPr>
         <w:tab/>
-        <w:t xml:space="preserve">K. G. Olivares, C. Challu, G. Marcjasz, R. Weron y A. Dubrawski, "Neural basis expansion analysis with exogenous variables: Forecasting electricity prices with NBEATSx," </w:t>
+        <w:t xml:space="preserve">T. Bollerslev, "Generalized autoregressive conditional heteroskedasticity," </w:t>
       </w:r>
       <w:r>
         <w:rPr>
@@ -29262,35 +29623,7 @@
           <w:sz w:val="20"/>
           <w:szCs w:val="20"/>
         </w:rPr>
-        <w:t>Int. J. Forecast.</w:t>
-      </w:r>
-      <w:r>
-        <w:rPr>
-          <w:sz w:val="20"/>
-          <w:szCs w:val="20"/>
-        </w:rPr>
-        <w:t>, vol. 39, no. 2, pp. 884–900, 2023, doi: 10.1016/j.ijforecast.2022.03.001.</w:t>
-      </w:r>
-    </w:p>
-    <w:p>
-      <w:pPr>
-        <w:spacing w:after="80"/>
-        <w:ind w:left="567" w:hanging="567"/>
-      </w:pPr>
-      <w:r>
-        <w:rPr>
-          <w:sz w:val="20"/>
-          <w:szCs w:val="20"/>
-        </w:rPr>
-        <w:t>[26]</w:t>
-      </w:r>
-      <w:r>
-        <w:rPr>
-          <w:sz w:val="20"/>
-          <w:szCs w:val="20"/>
-        </w:rPr>
-        <w:tab/>
-        <w:t xml:space="preserve">R. J. Hyndman y A. B. Koehler, "Another look at measures of forecast accuracy," </w:t>
+        <w:t>J. Ec</w:t>
       </w:r>
       <w:r>
         <w:rPr>
@@ -29298,14 +29631,14 @@
           <w:sz w:val="20"/>
           <w:szCs w:val="20"/>
         </w:rPr>
-        <w:t>Int. J. Forecast.</w:t>
+        <w:t>onometrics</w:t>
       </w:r>
       <w:r>
         <w:rPr>
           <w:sz w:val="20"/>
           <w:szCs w:val="20"/>
         </w:rPr>
-        <w:t>, vol. 22, no. 4, pp. 679–688, 2006, doi: 10.1016/j.ijforecast.2006.03.001.</w:t>
+        <w:t>, vol. 31, no. 3, pp. 307–327, 1986.</w:t>
       </w:r>
     </w:p>
     <w:p>
@@ -29318,7 +29651,7 @@
           <w:sz w:val="20"/>
           <w:szCs w:val="20"/>
         </w:rPr>
-        <w:t>[27]</w:t>
+        <w:t>[25]</w:t>
       </w:r>
       <w:r>
         <w:rPr>
@@ -29326,7 +29659,7 @@
           <w:szCs w:val="20"/>
         </w:rPr>
         <w:tab/>
-        <w:t xml:space="preserve">S. M. Lundberg y S.-I. Lee, "A unified approach to interpreting model predictions," en </w:t>
+        <w:t xml:space="preserve">K. G. Olivares, C. Challu, G. Marcjasz, R. Weron y A. Dubrawski, "Neural basis expansion analysis with exogenous variables: Forecasting electricity prices with NBEATSx," </w:t>
       </w:r>
       <w:r>
         <w:rPr>
@@ -29334,14 +29667,21 @@
           <w:sz w:val="20"/>
           <w:szCs w:val="20"/>
         </w:rPr>
-        <w:t>Adv. Neural Inf. Process. Syst. 30 (NIPS 2017)</w:t>
+        <w:t>Int. J. Forecast.</w:t>
       </w:r>
       <w:r>
         <w:rPr>
           <w:sz w:val="20"/>
           <w:szCs w:val="20"/>
         </w:rPr>
-        <w:t>, Long Beach, CA, EE. UU., 2017.</w:t>
+        <w:t>, vol. 39, no. 2,</w:t>
+      </w:r>
+      <w:r>
+        <w:rPr>
+          <w:sz w:val="20"/>
+          <w:szCs w:val="20"/>
+        </w:rPr>
+        <w:t xml:space="preserve"> pp. 884–900, 2023, doi: 10.1016/j.ijforecast.2022.03.001.</w:t>
       </w:r>
     </w:p>
     <w:p>
@@ -29354,7 +29694,8 @@
           <w:sz w:val="20"/>
           <w:szCs w:val="20"/>
         </w:rPr>
-        <w:t>[28]</w:t>
+        <w:lastRenderedPageBreak/>
+        <w:t>[26]</w:t>
       </w:r>
       <w:r>
         <w:rPr>
@@ -29362,7 +29703,7 @@
           <w:szCs w:val="20"/>
         </w:rPr>
         <w:tab/>
-        <w:t xml:space="preserve">T. Chen y C. Guestrin, "XGBoost: A scalable tree boosting system," en </w:t>
+        <w:t xml:space="preserve">R. J. Hyndman y A. B. Koehler, "Another look at measures of forecast accuracy," </w:t>
       </w:r>
       <w:r>
         <w:rPr>
@@ -29370,14 +29711,14 @@
           <w:sz w:val="20"/>
           <w:szCs w:val="20"/>
         </w:rPr>
-        <w:t>Proc. 22nd ACM SIGKDD Int. Conf. Knowl. Discov. Data Min.</w:t>
+        <w:t>Int. J. Forecast.</w:t>
       </w:r>
       <w:r>
         <w:rPr>
           <w:sz w:val="20"/>
           <w:szCs w:val="20"/>
         </w:rPr>
-        <w:t>, San Francisco, CA, EE. UU., 2016, pp. 785–794.</w:t>
+        <w:t>, vol. 22, no. 4, pp. 679–688, 2006, doi: 10.1016/j.ijforecast.2006.03.001.</w:t>
       </w:r>
     </w:p>
     <w:p>
@@ -29390,7 +29731,7 @@
           <w:sz w:val="20"/>
           <w:szCs w:val="20"/>
         </w:rPr>
-        <w:t>[29]</w:t>
+        <w:t>[27]</w:t>
       </w:r>
       <w:r>
         <w:rPr>
@@ -29398,7 +29739,14 @@
           <w:szCs w:val="20"/>
         </w:rPr>
         <w:tab/>
-        <w:t xml:space="preserve">C. Challu, K. G. Olivares, B. N. Oreshkin, F. Garza Ramírez, M. Mergenthaler Canseco y A. Dubrawski, "NHITS: Neural hierarchical interpolation for time series forecasting," en </w:t>
+        <w:t>S. M. Lundberg</w:t>
+      </w:r>
+      <w:r>
+        <w:rPr>
+          <w:sz w:val="20"/>
+          <w:szCs w:val="20"/>
+        </w:rPr>
+        <w:t xml:space="preserve"> y S.-I. Lee, "A unified approach to interpreting model predictions," en </w:t>
       </w:r>
       <w:r>
         <w:rPr>
@@ -29406,14 +29754,14 @@
           <w:sz w:val="20"/>
           <w:szCs w:val="20"/>
         </w:rPr>
-        <w:t>Proc. AAAI Conf. Artif. Intell.</w:t>
+        <w:t>Adv. Neural Inf. Process. Syst. 30 (NIPS 2017)</w:t>
       </w:r>
       <w:r>
         <w:rPr>
           <w:sz w:val="20"/>
           <w:szCs w:val="20"/>
         </w:rPr>
-        <w:t>, vol. 37, no. 6, 2023, pp. 6989–6997, doi: 10.1609/aaai.v37i6.25854.</w:t>
+        <w:t>, Long Beach, CA, EE. UU., 2017.</w:t>
       </w:r>
     </w:p>
     <w:p>
@@ -29426,7 +29774,7 @@
           <w:sz w:val="20"/>
           <w:szCs w:val="20"/>
         </w:rPr>
-        <w:t>[30]</w:t>
+        <w:t>[28]</w:t>
       </w:r>
       <w:r>
         <w:rPr>
@@ -29434,7 +29782,7 @@
           <w:szCs w:val="20"/>
         </w:rPr>
         <w:tab/>
-        <w:t xml:space="preserve">D. B. Nelson, "Conditional heteroskedasticity in asset returns: A new approach," </w:t>
+        <w:t xml:space="preserve">T. Chen y C. Guestrin, "XGBoost: A scalable tree boosting system," en </w:t>
       </w:r>
       <w:r>
         <w:rPr>
@@ -29442,35 +29790,7 @@
           <w:sz w:val="20"/>
           <w:szCs w:val="20"/>
         </w:rPr>
-        <w:t>Econometrica</w:t>
-      </w:r>
-      <w:r>
-        <w:rPr>
-          <w:sz w:val="20"/>
-          <w:szCs w:val="20"/>
-        </w:rPr>
-        <w:t>, vol. 59, no. 2, pp. 347–370, 1991.</w:t>
-      </w:r>
-    </w:p>
-    <w:p>
-      <w:pPr>
-        <w:spacing w:after="80"/>
-        <w:ind w:left="567" w:hanging="567"/>
-      </w:pPr>
-      <w:r>
-        <w:rPr>
-          <w:sz w:val="20"/>
-          <w:szCs w:val="20"/>
-        </w:rPr>
-        <w:t>[31]</w:t>
-      </w:r>
-      <w:r>
-        <w:rPr>
-          <w:sz w:val="20"/>
-          <w:szCs w:val="20"/>
-        </w:rPr>
-        <w:tab/>
-        <w:t xml:space="preserve">J. W. Tukey, </w:t>
+        <w:t>Proc. 22nd ACM SIGKDD Int. Co</w:t>
       </w:r>
       <w:r>
         <w:rPr>
@@ -29478,14 +29798,14 @@
           <w:sz w:val="20"/>
           <w:szCs w:val="20"/>
         </w:rPr>
-        <w:t>Exploratory Data Analysis</w:t>
+        <w:t>nf. Knowl. Discov. Data Min.</w:t>
       </w:r>
       <w:r>
         <w:rPr>
           <w:sz w:val="20"/>
           <w:szCs w:val="20"/>
         </w:rPr>
-        <w:t>. Reading, MA, EE. UU.: Addison-Wesley, 1977.</w:t>
+        <w:t>, San Francisco, CA, EE. UU., 2016, pp. 785–794.</w:t>
       </w:r>
     </w:p>
     <w:p>
@@ -29498,7 +29818,7 @@
           <w:sz w:val="20"/>
           <w:szCs w:val="20"/>
         </w:rPr>
-        <w:t>[32]</w:t>
+        <w:t>[29]</w:t>
       </w:r>
       <w:r>
         <w:rPr>
@@ -29506,7 +29826,14 @@
           <w:szCs w:val="20"/>
         </w:rPr>
         <w:tab/>
-        <w:t xml:space="preserve">J. Gama, I. Žliobaitė, A. Bifet, M. Pechenizkiy y A. Bouchachia, "A survey on concept drift adaptation," </w:t>
+        <w:t>C. Challu, K. G. Olivares, B. N. Oreshkin, F. Garza Ramírez, M. Mergenthaler Canseco y A. Dubrawski, "NHITS: Neural hierarchical interpolation for time series forecasting," e</w:t>
+      </w:r>
+      <w:r>
+        <w:rPr>
+          <w:sz w:val="20"/>
+          <w:szCs w:val="20"/>
+        </w:rPr>
+        <w:t xml:space="preserve">n </w:t>
       </w:r>
       <w:r>
         <w:rPr>
@@ -29514,14 +29841,14 @@
           <w:sz w:val="20"/>
           <w:szCs w:val="20"/>
         </w:rPr>
-        <w:t>ACM Comput. Surv.</w:t>
+        <w:t>Proc. AAAI Conf. Artif. Intell.</w:t>
       </w:r>
       <w:r>
         <w:rPr>
           <w:sz w:val="20"/>
           <w:szCs w:val="20"/>
         </w:rPr>
-        <w:t>, vol. 46, no. 4, art. 44, 2014, doi: 10.1145/2523813.</w:t>
+        <w:t>, vol. 37, no. 6, 2023, pp. 6989–6997, doi: 10.1609/aaai.v37i6.25854.</w:t>
       </w:r>
     </w:p>
     <w:p>
@@ -29534,7 +29861,7 @@
           <w:sz w:val="20"/>
           <w:szCs w:val="20"/>
         </w:rPr>
-        <w:t>[33]</w:t>
+        <w:t>[30]</w:t>
       </w:r>
       <w:r>
         <w:rPr>
@@ -29542,7 +29869,7 @@
           <w:szCs w:val="20"/>
         </w:rPr>
         <w:tab/>
-        <w:t xml:space="preserve">A. Wald, </w:t>
+        <w:t xml:space="preserve">D. B. Nelson, "Conditional heteroskedasticity in asset returns: A new approach," </w:t>
       </w:r>
       <w:r>
         <w:rPr>
@@ -29550,14 +29877,14 @@
           <w:sz w:val="20"/>
           <w:szCs w:val="20"/>
         </w:rPr>
-        <w:t>Statistical Decision Functions</w:t>
+        <w:t>Econometrica</w:t>
       </w:r>
       <w:r>
         <w:rPr>
           <w:sz w:val="20"/>
           <w:szCs w:val="20"/>
         </w:rPr>
-        <w:t>. Nueva York, NY, EE. UU.: Wiley, 1950.</w:t>
+        <w:t>, vol. 59, no. 2, pp. 347–370, 1991.</w:t>
       </w:r>
     </w:p>
     <w:p>
@@ -29570,7 +29897,7 @@
           <w:sz w:val="20"/>
           <w:szCs w:val="20"/>
         </w:rPr>
-        <w:t>[34]</w:t>
+        <w:t>[31]</w:t>
       </w:r>
       <w:r>
         <w:rPr>
@@ -29578,7 +29905,7 @@
           <w:szCs w:val="20"/>
         </w:rPr>
         <w:tab/>
-        <w:t xml:space="preserve">W. K. Newey y K. D. West, "A simple, positive semi-definite, heteroskedasticity and autocorrelation consistent covariance matrix," </w:t>
+        <w:t xml:space="preserve">J. W. Tukey, </w:t>
       </w:r>
       <w:r>
         <w:rPr>
@@ -29586,14 +29913,14 @@
           <w:sz w:val="20"/>
           <w:szCs w:val="20"/>
         </w:rPr>
-        <w:t>Econometrica</w:t>
+        <w:t>Exploratory Data Analysis</w:t>
       </w:r>
       <w:r>
         <w:rPr>
           <w:sz w:val="20"/>
           <w:szCs w:val="20"/>
         </w:rPr>
-        <w:t>, vol. 55, no. 3, pp. 703–708, 1987, doi: 10.2307/1913610.</w:t>
+        <w:t>. Reading, MA, EE. UU.: Addison-Wesley, 1977.</w:t>
       </w:r>
     </w:p>
     <w:p>
@@ -29606,7 +29933,7 @@
           <w:sz w:val="20"/>
           <w:szCs w:val="20"/>
         </w:rPr>
-        <w:t>[35]</w:t>
+        <w:t>[32]</w:t>
       </w:r>
       <w:r>
         <w:rPr>
@@ -29614,7 +29941,7 @@
           <w:szCs w:val="20"/>
         </w:rPr>
         <w:tab/>
-        <w:t xml:space="preserve">A. V. Oppenheim y R. W. Schafer, </w:t>
+        <w:t xml:space="preserve">J. Gama, I. Žliobaitė, A. Bifet, M. Pechenizkiy y A. Bouchachia, "A survey on concept drift adaptation," </w:t>
       </w:r>
       <w:r>
         <w:rPr>
@@ -29622,14 +29949,21 @@
           <w:sz w:val="20"/>
           <w:szCs w:val="20"/>
         </w:rPr>
-        <w:t>Discrete-Time Signal Processing</w:t>
+        <w:t>ACM Comput. Surv.</w:t>
       </w:r>
       <w:r>
         <w:rPr>
           <w:sz w:val="20"/>
           <w:szCs w:val="20"/>
         </w:rPr>
-        <w:t>, 3.ª ed. Upper Saddle River, NJ, EE. UU.: Pearson, 2010.</w:t>
+        <w:t>, vol. 46, no. 4, art. 44, 2014, doi: 10</w:t>
+      </w:r>
+      <w:r>
+        <w:rPr>
+          <w:sz w:val="20"/>
+          <w:szCs w:val="20"/>
+        </w:rPr>
+        <w:t>.1145/2523813.</w:t>
       </w:r>
     </w:p>
     <w:p>
@@ -29642,7 +29976,7 @@
           <w:sz w:val="20"/>
           <w:szCs w:val="20"/>
         </w:rPr>
-        <w:t>[36]</w:t>
+        <w:t>[33]</w:t>
       </w:r>
       <w:r>
         <w:rPr>
@@ -29650,7 +29984,7 @@
           <w:szCs w:val="20"/>
         </w:rPr>
         <w:tab/>
-        <w:t xml:space="preserve">A. Savitzky y M. J. E. Golay, "Smoothing and differentiation of data by simplified least squares procedures," </w:t>
+        <w:t xml:space="preserve">A. Wald, </w:t>
       </w:r>
       <w:r>
         <w:rPr>
@@ -29658,14 +29992,14 @@
           <w:sz w:val="20"/>
           <w:szCs w:val="20"/>
         </w:rPr>
-        <w:t>Anal. Chem.</w:t>
+        <w:t>Statistical Decision Functions</w:t>
       </w:r>
       <w:r>
         <w:rPr>
           <w:sz w:val="20"/>
           <w:szCs w:val="20"/>
         </w:rPr>
-        <w:t>, vol. 36, no. 8, pp. 1627–1639, 1964, doi: 10.1021/ac60214a047.</w:t>
+        <w:t>. Nueva York, NY, EE. UU.: Wiley, 1950.</w:t>
       </w:r>
     </w:p>
     <w:p>
@@ -29678,7 +30012,7 @@
           <w:sz w:val="20"/>
           <w:szCs w:val="20"/>
         </w:rPr>
-        <w:t>[37]</w:t>
+        <w:t>[34]</w:t>
       </w:r>
       <w:r>
         <w:rPr>
@@ -29686,7 +30020,7 @@
           <w:szCs w:val="20"/>
         </w:rPr>
         <w:tab/>
-        <w:t xml:space="preserve">A. Garivier y E. Moulines, "On upper-confidence bound policies for switching bandit problems," en </w:t>
+        <w:t xml:space="preserve">W. K. Newey y K. D. West, "A simple, positive semi-definite, heteroskedasticity and autocorrelation consistent covariance matrix," </w:t>
       </w:r>
       <w:r>
         <w:rPr>
@@ -29694,14 +30028,21 @@
           <w:sz w:val="20"/>
           <w:szCs w:val="20"/>
         </w:rPr>
-        <w:t>Algorithmic Learning Theory (ALT 2011)</w:t>
+        <w:t>Econometrica</w:t>
       </w:r>
       <w:r>
         <w:rPr>
           <w:sz w:val="20"/>
           <w:szCs w:val="20"/>
         </w:rPr>
-        <w:t>, LNCS, vol. 6925. Berlín, Alemania: Springer, 2011, pp. 174–188.</w:t>
+        <w:t>, vol. 55</w:t>
+      </w:r>
+      <w:r>
+        <w:rPr>
+          <w:sz w:val="20"/>
+          <w:szCs w:val="20"/>
+        </w:rPr>
+        <w:t>, no. 3, pp. 703–708, 1987, doi: 10.2307/1913610.</w:t>
       </w:r>
     </w:p>
     <w:p>
@@ -29714,7 +30055,7 @@
           <w:sz w:val="20"/>
           <w:szCs w:val="20"/>
         </w:rPr>
-        <w:t>[38]</w:t>
+        <w:t>[35]</w:t>
       </w:r>
       <w:r>
         <w:rPr>
@@ -29722,7 +30063,22 @@
           <w:szCs w:val="20"/>
         </w:rPr>
         <w:tab/>
-        <w:t>L. Prokhorenkova, G. Gusev, A. Vorobev, A. V. Dorogush y A. Gulin, "CatBoost: unbiased boosting with categorical features," en Adv. Neural Inf. Process. Syst. 31 (NeurIPS 2018), Montreal, Canadá, 2018.</w:t>
+        <w:t xml:space="preserve">A. V. Oppenheim y R. W. Schafer, </w:t>
+      </w:r>
+      <w:r>
+        <w:rPr>
+          <w:i/>
+          <w:sz w:val="20"/>
+          <w:szCs w:val="20"/>
+        </w:rPr>
+        <w:t>Discrete-Time Signal Processing</w:t>
+      </w:r>
+      <w:r>
+        <w:rPr>
+          <w:sz w:val="20"/>
+          <w:szCs w:val="20"/>
+        </w:rPr>
+        <w:t>, 3.ª ed. Upper Saddle River, NJ, EE. UU.: Pearson, 2010.</w:t>
       </w:r>
     </w:p>
     <w:p>
@@ -29735,7 +30091,7 @@
           <w:sz w:val="20"/>
           <w:szCs w:val="20"/>
         </w:rPr>
-        <w:t>[39]</w:t>
+        <w:t>[36]</w:t>
       </w:r>
       <w:r>
         <w:rPr>
@@ -29743,7 +30099,29 @@
           <w:szCs w:val="20"/>
         </w:rPr>
         <w:tab/>
-        <w:t>XM S.A. E.S.P., "Informes de despacho: predespacho ideal y despacho programado," biblioteca pública del portal xm.com.co. Consultado: oct. 2026.</w:t>
+        <w:t>A. Savitzky y M. J. E. Golay, "Smoothing and differentiation of data by si</w:t>
+      </w:r>
+      <w:r>
+        <w:rPr>
+          <w:sz w:val="20"/>
+          <w:szCs w:val="20"/>
+        </w:rPr>
+        <w:t xml:space="preserve">mplified least squares procedures," </w:t>
+      </w:r>
+      <w:r>
+        <w:rPr>
+          <w:i/>
+          <w:sz w:val="20"/>
+          <w:szCs w:val="20"/>
+        </w:rPr>
+        <w:t>Anal. Chem.</w:t>
+      </w:r>
+      <w:r>
+        <w:rPr>
+          <w:sz w:val="20"/>
+          <w:szCs w:val="20"/>
+        </w:rPr>
+        <w:t>, vol. 36, no. 8, pp. 1627–1639, 1964, doi: 10.1021/ac60214a047.</w:t>
       </w:r>
     </w:p>
     <w:p>
@@ -29756,7 +30134,7 @@
           <w:sz w:val="20"/>
           <w:szCs w:val="20"/>
         </w:rPr>
-        <w:t>[40]</w:t>
+        <w:t>[37]</w:t>
       </w:r>
       <w:r>
         <w:rPr>
@@ -29764,7 +30142,29 @@
           <w:szCs w:val="20"/>
         </w:rPr>
         <w:tab/>
-        <w:t>V. Vovk, A. Gammerman y G. Shafer, Algorithmic Learning in a Random World. Nueva York, NY, EE. UU.: Springer, 2005.</w:t>
+        <w:t xml:space="preserve">A. Garivier y E. Moulines, "On upper-confidence bound policies for switching bandit problems," en </w:t>
+      </w:r>
+      <w:r>
+        <w:rPr>
+          <w:i/>
+          <w:sz w:val="20"/>
+          <w:szCs w:val="20"/>
+        </w:rPr>
+        <w:t>Algorithmic Learning Theory (ALT 2011)</w:t>
+      </w:r>
+      <w:r>
+        <w:rPr>
+          <w:sz w:val="20"/>
+          <w:szCs w:val="20"/>
+        </w:rPr>
+        <w:t>, L</w:t>
+      </w:r>
+      <w:r>
+        <w:rPr>
+          <w:sz w:val="20"/>
+          <w:szCs w:val="20"/>
+        </w:rPr>
+        <w:t>NCS, vol. 6925. Berlín, Alemania: Springer, 2011, pp. 174–188.</w:t>
       </w:r>
     </w:p>
     <w:p>
@@ -29777,14 +30177,52 @@
           <w:sz w:val="20"/>
           <w:szCs w:val="20"/>
         </w:rPr>
-        <w:lastRenderedPageBreak/>
-        <w:t>[41]</w:t>
-      </w:r>
+        <w:t>[38]</w:t>
+        <w:tab/>
+        <w:t>L. Prokhorenkova, G. Gusev, A. Vorobev, A. V. Dorogush y A. Gulin, "CatBoost: unbiased boosting with categorical features," en Adv. Neural Inf. Process. Syst. 31 (NeurIPS 2018), Montreal, Canadá, 2018.</w:t>
+      </w:r>
+    </w:p>
+    <w:p>
+      <w:pPr>
+        <w:spacing w:after="80"/>
+        <w:ind w:left="567" w:hanging="567"/>
+      </w:pPr>
       <w:r>
         <w:rPr>
           <w:sz w:val="20"/>
           <w:szCs w:val="20"/>
         </w:rPr>
+        <w:t>[39]</w:t>
+        <w:tab/>
+        <w:t>XM S.A. E.S.P., "Informes de despacho: predespacho ideal y despacho programado," biblioteca pública del portal xm.com.co. Consultado: oct. 2026.</w:t>
+      </w:r>
+    </w:p>
+    <w:p>
+      <w:pPr>
+        <w:spacing w:after="80"/>
+        <w:ind w:left="567" w:hanging="567"/>
+      </w:pPr>
+      <w:r>
+        <w:rPr>
+          <w:sz w:val="20"/>
+          <w:szCs w:val="20"/>
+        </w:rPr>
+        <w:t>[40]</w:t>
+        <w:tab/>
+        <w:t>V. Vovk, A. Gammerman y G. Shafer, Algorithmic Learning in a Random World. Nueva York, NY, EE. UU.: Springer, 2005.</w:t>
+      </w:r>
+    </w:p>
+    <w:p>
+      <w:pPr>
+        <w:spacing w:after="80"/>
+        <w:ind w:left="567" w:hanging="567"/>
+      </w:pPr>
+      <w:r>
+        <w:rPr>
+          <w:sz w:val="20"/>
+          <w:szCs w:val="20"/>
+        </w:rPr>
+        <w:t>[41]</w:t>
         <w:tab/>
         <w:t>Comisión de Regulación de Energía y Gas (CREG), "Resolución CREG 025 de 1995, por la cual se establece el Código de Redes," Bogotá, Colombia, 1995.</w:t>
       </w:r>
@@ -29802,7 +30240,7 @@
       <w:bookmarkStart w:id="140" w:name="_Toc240440270"/>
       <w:bookmarkStart w:id="141" w:name="_Toc241072144"/>
       <w:bookmarkStart w:id="142" w:name="_Toc241072508"/>
-      <w:bookmarkStart w:id="143" w:name="_Toc242994571"/>
+      <w:bookmarkStart w:id="143" w:name="_Toc241697497"/>
       <w:r>
         <w:t>Anexos</w:t>
       </w:r>
@@ -29902,7 +30340,10 @@
         <w:spacing w:after="80"/>
       </w:pPr>
       <w:r>
-        <w:t>Anexo 7 — Evidencia de trabajo en equipo (bitácoras, minutas, evaluación de pares / TEAMMATES)</w:t>
+        <w:t>Anexo 7 — Evidencia de trabajo en equipo (bitácoras, min</w:t>
+      </w:r>
+      <w:r>
+        <w:t>utas, evaluación de pares / TEAMMATES)</w:t>
       </w:r>
     </w:p>
     <w:p>
@@ -29938,8 +30379,8 @@
     </w:p>
     <w:p/>
     <w:sectPr>
-      <w:headerReference w:type="default" r:id="rId17"/>
-      <w:footerReference w:type="default" r:id="rId18"/>
+      <w:headerReference w:type="default" r:id="rId20"/>
+      <w:footerReference w:type="default" r:id="rId21"/>
       <w:pgSz w:w="12240" w:h="15840"/>
       <w:pgMar w:top="1440" w:right="1440" w:bottom="1440" w:left="1440" w:header="708" w:footer="708" w:gutter="0"/>
       <w:cols w:space="720"/>

</xml_diff>

<commit_message>
Leyenda de las graficas visible, referencias verificadas y app siempre despierta
- Dashboard: la barra Exportar va fuera del contenedor de la grafica; adentro, su alto fijo
  recortaba la leyenda (se veia un instante y desaparecia, sobre todo en Ampliar).
- Informe final: citas numeradas por orden de primera aparicion (IEEE); Vovk 2.a ed. (2022).
- Referencias del paper: notas de uso actualizadas contra el informe (XGBoost, N-BEATSx, N-HiTS,
  Nelson/GED, Ziel y Weron), CREG 178/2015 y 140/2017 como citadas, Hyndman y Ullah (2007) en
  lugar de Ramsay y Silverman, sin Cesa-Bianchi y Lugosi; titulos ISO completos.
- Workflow que visita la app cada 6 h y la despierta si Streamlit la durmio.
- Encuesta corta y videos finales (docs/video); proyectos de edicion fuera de git.

Co-Authored-By: Claude Opus 5.5 <noreply@anthropic.com>
</commit_message>
<xml_diff>
--- a/docs/Informe_Final_ABET_Barcelo_Dede.docx
+++ b/docs/Informe_Final_ABET_Barcelo_Dede.docx
@@ -192,7 +192,7 @@
       <w:bookmarkStart w:id="0" w:name="_Toc240440229"/>
       <w:bookmarkStart w:id="1" w:name="_Toc241072106"/>
       <w:bookmarkStart w:id="2" w:name="_Toc241072472"/>
-      <w:bookmarkStart w:id="3" w:name="_Toc243648425"/>
+      <w:bookmarkStart w:id="3" w:name="_Toc243918597"/>
       <w:r>
         <w:lastRenderedPageBreak/>
         <w:t>Tabla de contenido</w:t>
@@ -228,7 +228,7 @@
       <w:r>
         <w:fldChar w:fldCharType="separate"/>
       </w:r>
-      <w:hyperlink w:anchor="_Toc243648425" w:history="1">
+      <w:hyperlink w:anchor="_Toc243918597" w:history="1">
         <w:r>
           <w:rPr>
             <w:rStyle w:val="Hyperlink"/>
@@ -255,7 +255,7 @@
             <w:noProof/>
             <w:webHidden/>
           </w:rPr>
-          <w:instrText xml:space="preserve"> PAGEREF _Toc243648425 \h </w:instrText>
+          <w:instrText xml:space="preserve"> PAGEREF _Toc243918597 \h </w:instrText>
         </w:r>
         <w:r>
           <w:rPr>
@@ -304,7 +304,7 @@
           <w:lang w:eastAsia="es-CO"/>
         </w:rPr>
       </w:pPr>
-      <w:hyperlink w:anchor="_Toc243648426" w:history="1">
+      <w:hyperlink w:anchor="_Toc243918598" w:history="1">
         <w:r>
           <w:rPr>
             <w:rStyle w:val="Hyperlink"/>
@@ -351,7 +351,7 @@
             <w:noProof/>
             <w:webHidden/>
           </w:rPr>
-          <w:instrText xml:space="preserve"> PAGEREF _Toc243648426 \h </w:instrText>
+          <w:instrText xml:space="preserve"> PAGEREF _Toc243918598 \h </w:instrText>
         </w:r>
         <w:r>
           <w:rPr>
@@ -398,7 +398,7 @@
           <w:lang w:eastAsia="es-CO"/>
         </w:rPr>
       </w:pPr>
-      <w:hyperlink w:anchor="_Toc243648427" w:history="1">
+      <w:hyperlink w:anchor="_Toc243918599" w:history="1">
         <w:r>
           <w:rPr>
             <w:rStyle w:val="Hyperlink"/>
@@ -443,7 +443,7 @@
             <w:noProof/>
             <w:webHidden/>
           </w:rPr>
-          <w:instrText xml:space="preserve"> PAGEREF _Toc243648427 \h </w:instrText>
+          <w:instrText xml:space="preserve"> PAGEREF _Toc243918599 \h </w:instrText>
         </w:r>
         <w:r>
           <w:rPr>
@@ -490,7 +490,7 @@
           <w:lang w:eastAsia="es-CO"/>
         </w:rPr>
       </w:pPr>
-      <w:hyperlink w:anchor="_Toc243648428" w:history="1">
+      <w:hyperlink w:anchor="_Toc243918600" w:history="1">
         <w:r>
           <w:rPr>
             <w:rStyle w:val="Hyperlink"/>
@@ -535,7 +535,7 @@
             <w:noProof/>
             <w:webHidden/>
           </w:rPr>
-          <w:instrText xml:space="preserve"> PAGEREF _Toc243648428 \h </w:instrText>
+          <w:instrText xml:space="preserve"> PAGEREF _Toc243918600 \h </w:instrText>
         </w:r>
         <w:r>
           <w:rPr>
@@ -582,7 +582,7 @@
           <w:lang w:eastAsia="es-CO"/>
         </w:rPr>
       </w:pPr>
-      <w:hyperlink w:anchor="_Toc243648429" w:history="1">
+      <w:hyperlink w:anchor="_Toc243918601" w:history="1">
         <w:r>
           <w:rPr>
             <w:rStyle w:val="Hyperlink"/>
@@ -627,7 +627,7 @@
             <w:noProof/>
             <w:webHidden/>
           </w:rPr>
-          <w:instrText xml:space="preserve"> PAGEREF _Toc243648429 \h </w:instrText>
+          <w:instrText xml:space="preserve"> PAGEREF _Toc243918601 \h </w:instrText>
         </w:r>
         <w:r>
           <w:rPr>
@@ -676,7 +676,7 @@
           <w:lang w:eastAsia="es-CO"/>
         </w:rPr>
       </w:pPr>
-      <w:hyperlink w:anchor="_Toc243648430" w:history="1">
+      <w:hyperlink w:anchor="_Toc243918602" w:history="1">
         <w:r>
           <w:rPr>
             <w:rStyle w:val="Hyperlink"/>
@@ -723,7 +723,7 @@
             <w:noProof/>
             <w:webHidden/>
           </w:rPr>
-          <w:instrText xml:space="preserve"> PAGEREF _Toc243648430 \h </w:instrText>
+          <w:instrText xml:space="preserve"> PAGEREF _Toc243918602 \h </w:instrText>
         </w:r>
         <w:r>
           <w:rPr>
@@ -772,7 +772,7 @@
           <w:lang w:eastAsia="es-CO"/>
         </w:rPr>
       </w:pPr>
-      <w:hyperlink w:anchor="_Toc243648431" w:history="1">
+      <w:hyperlink w:anchor="_Toc243918603" w:history="1">
         <w:r>
           <w:rPr>
             <w:rStyle w:val="Hyperlink"/>
@@ -819,7 +819,7 @@
             <w:noProof/>
             <w:webHidden/>
           </w:rPr>
-          <w:instrText xml:space="preserve"> PAGEREF _Toc243648431 \h </w:instrText>
+          <w:instrText xml:space="preserve"> PAGEREF _Toc243918603 \h </w:instrText>
         </w:r>
         <w:r>
           <w:rPr>
@@ -866,7 +866,7 @@
           <w:lang w:eastAsia="es-CO"/>
         </w:rPr>
       </w:pPr>
-      <w:hyperlink w:anchor="_Toc243648432" w:history="1">
+      <w:hyperlink w:anchor="_Toc243918604" w:history="1">
         <w:r>
           <w:rPr>
             <w:rStyle w:val="Hyperlink"/>
@@ -911,7 +911,7 @@
             <w:noProof/>
             <w:webHidden/>
           </w:rPr>
-          <w:instrText xml:space="preserve"> PAGEREF _Toc243648432 \h </w:instrText>
+          <w:instrText xml:space="preserve"> PAGEREF _Toc243918604 \h </w:instrText>
         </w:r>
         <w:r>
           <w:rPr>
@@ -958,7 +958,7 @@
           <w:lang w:eastAsia="es-CO"/>
         </w:rPr>
       </w:pPr>
-      <w:hyperlink w:anchor="_Toc243648433" w:history="1">
+      <w:hyperlink w:anchor="_Toc243918605" w:history="1">
         <w:r>
           <w:rPr>
             <w:rStyle w:val="Hyperlink"/>
@@ -1003,7 +1003,7 @@
             <w:noProof/>
             <w:webHidden/>
           </w:rPr>
-          <w:instrText xml:space="preserve"> PAGEREF _Toc243648433 \h </w:instrText>
+          <w:instrText xml:space="preserve"> PAGEREF _Toc243918605 \h </w:instrText>
         </w:r>
         <w:r>
           <w:rPr>
@@ -1052,7 +1052,7 @@
           <w:lang w:eastAsia="es-CO"/>
         </w:rPr>
       </w:pPr>
-      <w:hyperlink w:anchor="_Toc243648434" w:history="1">
+      <w:hyperlink w:anchor="_Toc243918606" w:history="1">
         <w:r>
           <w:rPr>
             <w:rStyle w:val="Hyperlink"/>
@@ -1099,7 +1099,7 @@
             <w:noProof/>
             <w:webHidden/>
           </w:rPr>
-          <w:instrText xml:space="preserve"> PAGEREF _Toc243648434 \h </w:instrText>
+          <w:instrText xml:space="preserve"> PAGEREF _Toc243918606 \h </w:instrText>
         </w:r>
         <w:r>
           <w:rPr>
@@ -1146,7 +1146,7 @@
           <w:lang w:eastAsia="es-CO"/>
         </w:rPr>
       </w:pPr>
-      <w:hyperlink w:anchor="_Toc243648435" w:history="1">
+      <w:hyperlink w:anchor="_Toc243918607" w:history="1">
         <w:r>
           <w:rPr>
             <w:rStyle w:val="Hyperlink"/>
@@ -1191,7 +1191,7 @@
             <w:noProof/>
             <w:webHidden/>
           </w:rPr>
-          <w:instrText xml:space="preserve"> PAGEREF _Toc243648435 \h </w:instrText>
+          <w:instrText xml:space="preserve"> PAGEREF _Toc243918607 \h </w:instrText>
         </w:r>
         <w:r>
           <w:rPr>
@@ -1238,7 +1238,7 @@
           <w:lang w:eastAsia="es-CO"/>
         </w:rPr>
       </w:pPr>
-      <w:hyperlink w:anchor="_Toc243648436" w:history="1">
+      <w:hyperlink w:anchor="_Toc243918608" w:history="1">
         <w:r>
           <w:rPr>
             <w:rStyle w:val="Hyperlink"/>
@@ -1283,7 +1283,7 @@
             <w:noProof/>
             <w:webHidden/>
           </w:rPr>
-          <w:instrText xml:space="preserve"> PAGEREF _Toc243648436 \h </w:instrText>
+          <w:instrText xml:space="preserve"> PAGEREF _Toc243918608 \h </w:instrText>
         </w:r>
         <w:r>
           <w:rPr>
@@ -1330,7 +1330,7 @@
           <w:lang w:eastAsia="es-CO"/>
         </w:rPr>
       </w:pPr>
-      <w:hyperlink w:anchor="_Toc243648437" w:history="1">
+      <w:hyperlink w:anchor="_Toc243918609" w:history="1">
         <w:r>
           <w:rPr>
             <w:rStyle w:val="Hyperlink"/>
@@ -1375,7 +1375,7 @@
             <w:noProof/>
             <w:webHidden/>
           </w:rPr>
-          <w:instrText xml:space="preserve"> PAGEREF _Toc243648437 \h </w:instrText>
+          <w:instrText xml:space="preserve"> PAGEREF _Toc243918609 \h </w:instrText>
         </w:r>
         <w:r>
           <w:rPr>
@@ -1424,7 +1424,7 @@
           <w:lang w:eastAsia="es-CO"/>
         </w:rPr>
       </w:pPr>
-      <w:hyperlink w:anchor="_Toc243648438" w:history="1">
+      <w:hyperlink w:anchor="_Toc243918610" w:history="1">
         <w:r>
           <w:rPr>
             <w:rStyle w:val="Hyperlink"/>
@@ -1471,7 +1471,7 @@
             <w:noProof/>
             <w:webHidden/>
           </w:rPr>
-          <w:instrText xml:space="preserve"> PAGEREF _Toc243648438 \h </w:instrText>
+          <w:instrText xml:space="preserve"> PAGEREF _Toc243918610 \h </w:instrText>
         </w:r>
         <w:r>
           <w:rPr>
@@ -1518,7 +1518,7 @@
           <w:lang w:eastAsia="es-CO"/>
         </w:rPr>
       </w:pPr>
-      <w:hyperlink w:anchor="_Toc243648439" w:history="1">
+      <w:hyperlink w:anchor="_Toc243918611" w:history="1">
         <w:r>
           <w:rPr>
             <w:rStyle w:val="Hyperlink"/>
@@ -1563,7 +1563,7 @@
             <w:noProof/>
             <w:webHidden/>
           </w:rPr>
-          <w:instrText xml:space="preserve"> PAGEREF _Toc243648439 \h </w:instrText>
+          <w:instrText xml:space="preserve"> PAGEREF _Toc243918611 \h </w:instrText>
         </w:r>
         <w:r>
           <w:rPr>
@@ -1610,7 +1610,7 @@
           <w:lang w:eastAsia="es-CO"/>
         </w:rPr>
       </w:pPr>
-      <w:hyperlink w:anchor="_Toc243648440" w:history="1">
+      <w:hyperlink w:anchor="_Toc243918612" w:history="1">
         <w:r>
           <w:rPr>
             <w:rStyle w:val="Hyperlink"/>
@@ -1655,7 +1655,7 @@
             <w:noProof/>
             <w:webHidden/>
           </w:rPr>
-          <w:instrText xml:space="preserve"> PAGEREF _Toc243648440 \h </w:instrText>
+          <w:instrText xml:space="preserve"> PAGEREF _Toc243918612 \h </w:instrText>
         </w:r>
         <w:r>
           <w:rPr>
@@ -1704,7 +1704,7 @@
           <w:lang w:eastAsia="es-CO"/>
         </w:rPr>
       </w:pPr>
-      <w:hyperlink w:anchor="_Toc243648441" w:history="1">
+      <w:hyperlink w:anchor="_Toc243918613" w:history="1">
         <w:r>
           <w:rPr>
             <w:rStyle w:val="Hyperlink"/>
@@ -1751,7 +1751,7 @@
             <w:noProof/>
             <w:webHidden/>
           </w:rPr>
-          <w:instrText xml:space="preserve"> PAGEREF _Toc243648441 \h </w:instrText>
+          <w:instrText xml:space="preserve"> PAGEREF _Toc243918613 \h </w:instrText>
         </w:r>
         <w:r>
           <w:rPr>
@@ -1798,7 +1798,7 @@
           <w:lang w:eastAsia="es-CO"/>
         </w:rPr>
       </w:pPr>
-      <w:hyperlink w:anchor="_Toc243648442" w:history="1">
+      <w:hyperlink w:anchor="_Toc243918614" w:history="1">
         <w:r>
           <w:rPr>
             <w:rStyle w:val="Hyperlink"/>
@@ -1843,7 +1843,7 @@
             <w:noProof/>
             <w:webHidden/>
           </w:rPr>
-          <w:instrText xml:space="preserve"> PAGEREF _Toc243648442 \h </w:instrText>
+          <w:instrText xml:space="preserve"> PAGEREF _Toc243918614 \h </w:instrText>
         </w:r>
         <w:r>
           <w:rPr>
@@ -1890,7 +1890,7 @@
           <w:lang w:eastAsia="es-CO"/>
         </w:rPr>
       </w:pPr>
-      <w:hyperlink w:anchor="_Toc243648443" w:history="1">
+      <w:hyperlink w:anchor="_Toc243918615" w:history="1">
         <w:r>
           <w:rPr>
             <w:rStyle w:val="Hyperlink"/>
@@ -1935,7 +1935,7 @@
             <w:noProof/>
             <w:webHidden/>
           </w:rPr>
-          <w:instrText xml:space="preserve"> PAGEREF _Toc243648443 \h </w:instrText>
+          <w:instrText xml:space="preserve"> PAGEREF _Toc243918615 \h </w:instrText>
         </w:r>
         <w:r>
           <w:rPr>
@@ -1982,7 +1982,7 @@
           <w:lang w:eastAsia="es-CO"/>
         </w:rPr>
       </w:pPr>
-      <w:hyperlink w:anchor="_Toc243648444" w:history="1">
+      <w:hyperlink w:anchor="_Toc243918616" w:history="1">
         <w:r>
           <w:rPr>
             <w:rStyle w:val="Hyperlink"/>
@@ -2027,7 +2027,7 @@
             <w:noProof/>
             <w:webHidden/>
           </w:rPr>
-          <w:instrText xml:space="preserve"> PAGEREF _Toc243648444 \h </w:instrText>
+          <w:instrText xml:space="preserve"> PAGEREF _Toc243918616 \h </w:instrText>
         </w:r>
         <w:r>
           <w:rPr>
@@ -2074,7 +2074,7 @@
           <w:lang w:eastAsia="es-CO"/>
         </w:rPr>
       </w:pPr>
-      <w:hyperlink w:anchor="_Toc243648445" w:history="1">
+      <w:hyperlink w:anchor="_Toc243918617" w:history="1">
         <w:r>
           <w:rPr>
             <w:rStyle w:val="Hyperlink"/>
@@ -2119,7 +2119,7 @@
             <w:noProof/>
             <w:webHidden/>
           </w:rPr>
-          <w:instrText xml:space="preserve"> PAGEREF _Toc243648445 \h </w:instrText>
+          <w:instrText xml:space="preserve"> PAGEREF _Toc243918617 \h </w:instrText>
         </w:r>
         <w:r>
           <w:rPr>
@@ -2166,7 +2166,7 @@
           <w:lang w:eastAsia="es-CO"/>
         </w:rPr>
       </w:pPr>
-      <w:hyperlink w:anchor="_Toc243648446" w:history="1">
+      <w:hyperlink w:anchor="_Toc243918618" w:history="1">
         <w:r>
           <w:rPr>
             <w:rStyle w:val="Hyperlink"/>
@@ -2211,7 +2211,7 @@
             <w:noProof/>
             <w:webHidden/>
           </w:rPr>
-          <w:instrText xml:space="preserve"> PAGEREF _Toc243648446 \h </w:instrText>
+          <w:instrText xml:space="preserve"> PAGEREF _Toc243918618 \h </w:instrText>
         </w:r>
         <w:r>
           <w:rPr>
@@ -2258,7 +2258,7 @@
           <w:lang w:eastAsia="es-CO"/>
         </w:rPr>
       </w:pPr>
-      <w:hyperlink w:anchor="_Toc243648447" w:history="1">
+      <w:hyperlink w:anchor="_Toc243918619" w:history="1">
         <w:r>
           <w:rPr>
             <w:rStyle w:val="Hyperlink"/>
@@ -2303,7 +2303,7 @@
             <w:noProof/>
             <w:webHidden/>
           </w:rPr>
-          <w:instrText xml:space="preserve"> PAGEREF _Toc243648447 \h </w:instrText>
+          <w:instrText xml:space="preserve"> PAGEREF _Toc243918619 \h </w:instrText>
         </w:r>
         <w:r>
           <w:rPr>
@@ -2350,7 +2350,7 @@
           <w:lang w:eastAsia="es-CO"/>
         </w:rPr>
       </w:pPr>
-      <w:hyperlink w:anchor="_Toc243648448" w:history="1">
+      <w:hyperlink w:anchor="_Toc243918620" w:history="1">
         <w:r>
           <w:rPr>
             <w:rStyle w:val="Hyperlink"/>
@@ -2395,7 +2395,7 @@
             <w:noProof/>
             <w:webHidden/>
           </w:rPr>
-          <w:instrText xml:space="preserve"> PAGEREF _Toc243648448 \h </w:instrText>
+          <w:instrText xml:space="preserve"> PAGEREF _Toc243918620 \h </w:instrText>
         </w:r>
         <w:r>
           <w:rPr>
@@ -2444,7 +2444,7 @@
           <w:lang w:eastAsia="es-CO"/>
         </w:rPr>
       </w:pPr>
-      <w:hyperlink w:anchor="_Toc243648449" w:history="1">
+      <w:hyperlink w:anchor="_Toc243918621" w:history="1">
         <w:r>
           <w:rPr>
             <w:rStyle w:val="Hyperlink"/>
@@ -2491,7 +2491,7 @@
             <w:noProof/>
             <w:webHidden/>
           </w:rPr>
-          <w:instrText xml:space="preserve"> PAGEREF _Toc243648449 \h </w:instrText>
+          <w:instrText xml:space="preserve"> PAGEREF _Toc243918621 \h </w:instrText>
         </w:r>
         <w:r>
           <w:rPr>
@@ -2538,7 +2538,7 @@
           <w:lang w:eastAsia="es-CO"/>
         </w:rPr>
       </w:pPr>
-      <w:hyperlink w:anchor="_Toc243648450" w:history="1">
+      <w:hyperlink w:anchor="_Toc243918622" w:history="1">
         <w:r>
           <w:rPr>
             <w:rStyle w:val="Hyperlink"/>
@@ -2583,7 +2583,7 @@
             <w:noProof/>
             <w:webHidden/>
           </w:rPr>
-          <w:instrText xml:space="preserve"> PAGEREF _Toc243648450 \h </w:instrText>
+          <w:instrText xml:space="preserve"> PAGEREF _Toc243918622 \h </w:instrText>
         </w:r>
         <w:r>
           <w:rPr>
@@ -2631,7 +2631,7 @@
           <w:lang w:eastAsia="es-CO"/>
         </w:rPr>
       </w:pPr>
-      <w:hyperlink w:anchor="_Toc243648451" w:history="1">
+      <w:hyperlink w:anchor="_Toc243918623" w:history="1">
         <w:r>
           <w:rPr>
             <w:rStyle w:val="Hyperlink"/>
@@ -2677,7 +2677,7 @@
             <w:noProof/>
             <w:webHidden/>
           </w:rPr>
-          <w:instrText xml:space="preserve"> PAGEREF _Toc243648451 \h </w:instrText>
+          <w:instrText xml:space="preserve"> PAGEREF _Toc243918623 \h </w:instrText>
         </w:r>
         <w:r>
           <w:rPr>
@@ -2725,7 +2725,7 @@
           <w:lang w:eastAsia="es-CO"/>
         </w:rPr>
       </w:pPr>
-      <w:hyperlink w:anchor="_Toc243648452" w:history="1">
+      <w:hyperlink w:anchor="_Toc243918624" w:history="1">
         <w:r>
           <w:rPr>
             <w:rStyle w:val="Hyperlink"/>
@@ -2771,7 +2771,7 @@
             <w:noProof/>
             <w:webHidden/>
           </w:rPr>
-          <w:instrText xml:space="preserve"> PAGEREF _Toc243648452 \h </w:instrText>
+          <w:instrText xml:space="preserve"> PAGEREF _Toc243918624 \h </w:instrText>
         </w:r>
         <w:r>
           <w:rPr>
@@ -2818,7 +2818,7 @@
           <w:lang w:eastAsia="es-CO"/>
         </w:rPr>
       </w:pPr>
-      <w:hyperlink w:anchor="_Toc243648453" w:history="1">
+      <w:hyperlink w:anchor="_Toc243918625" w:history="1">
         <w:r>
           <w:rPr>
             <w:rStyle w:val="Hyperlink"/>
@@ -2863,7 +2863,7 @@
             <w:noProof/>
             <w:webHidden/>
           </w:rPr>
-          <w:instrText xml:space="preserve"> PAGEREF _Toc243648453 \h </w:instrText>
+          <w:instrText xml:space="preserve"> PAGEREF _Toc243918625 \h </w:instrText>
         </w:r>
         <w:r>
           <w:rPr>
@@ -2910,7 +2910,7 @@
           <w:lang w:eastAsia="es-CO"/>
         </w:rPr>
       </w:pPr>
-      <w:hyperlink w:anchor="_Toc243648454" w:history="1">
+      <w:hyperlink w:anchor="_Toc243918626" w:history="1">
         <w:r>
           <w:rPr>
             <w:rStyle w:val="Hyperlink"/>
@@ -2955,7 +2955,7 @@
             <w:noProof/>
             <w:webHidden/>
           </w:rPr>
-          <w:instrText xml:space="preserve"> PAGEREF _Toc243648454 \h </w:instrText>
+          <w:instrText xml:space="preserve"> PAGEREF _Toc243918626 \h </w:instrText>
         </w:r>
         <w:r>
           <w:rPr>
@@ -3002,7 +3002,7 @@
           <w:lang w:eastAsia="es-CO"/>
         </w:rPr>
       </w:pPr>
-      <w:hyperlink w:anchor="_Toc243648455" w:history="1">
+      <w:hyperlink w:anchor="_Toc243918627" w:history="1">
         <w:r>
           <w:rPr>
             <w:rStyle w:val="Hyperlink"/>
@@ -3047,7 +3047,7 @@
             <w:noProof/>
             <w:webHidden/>
           </w:rPr>
-          <w:instrText xml:space="preserve"> PAGEREF _Toc243648455 \h </w:instrText>
+          <w:instrText xml:space="preserve"> PAGEREF _Toc243918627 \h </w:instrText>
         </w:r>
         <w:r>
           <w:rPr>
@@ -3096,7 +3096,7 @@
           <w:lang w:eastAsia="es-CO"/>
         </w:rPr>
       </w:pPr>
-      <w:hyperlink w:anchor="_Toc243648456" w:history="1">
+      <w:hyperlink w:anchor="_Toc243918628" w:history="1">
         <w:r>
           <w:rPr>
             <w:rStyle w:val="Hyperlink"/>
@@ -3143,7 +3143,7 @@
             <w:noProof/>
             <w:webHidden/>
           </w:rPr>
-          <w:instrText xml:space="preserve"> PAGEREF _Toc243648456 \h </w:instrText>
+          <w:instrText xml:space="preserve"> PAGEREF _Toc243918628 \h </w:instrText>
         </w:r>
         <w:r>
           <w:rPr>
@@ -3190,7 +3190,7 @@
           <w:lang w:eastAsia="es-CO"/>
         </w:rPr>
       </w:pPr>
-      <w:hyperlink w:anchor="_Toc243648457" w:history="1">
+      <w:hyperlink w:anchor="_Toc243918629" w:history="1">
         <w:r>
           <w:rPr>
             <w:rStyle w:val="Hyperlink"/>
@@ -3235,7 +3235,7 @@
             <w:noProof/>
             <w:webHidden/>
           </w:rPr>
-          <w:instrText xml:space="preserve"> PAGEREF _Toc243648457 \h </w:instrText>
+          <w:instrText xml:space="preserve"> PAGEREF _Toc243918629 \h </w:instrText>
         </w:r>
         <w:r>
           <w:rPr>
@@ -3282,7 +3282,7 @@
           <w:lang w:eastAsia="es-CO"/>
         </w:rPr>
       </w:pPr>
-      <w:hyperlink w:anchor="_Toc243648458" w:history="1">
+      <w:hyperlink w:anchor="_Toc243918630" w:history="1">
         <w:r>
           <w:rPr>
             <w:rStyle w:val="Hyperlink"/>
@@ -3327,7 +3327,7 @@
             <w:noProof/>
             <w:webHidden/>
           </w:rPr>
-          <w:instrText xml:space="preserve"> PAGEREF _Toc243648458 \h </w:instrText>
+          <w:instrText xml:space="preserve"> PAGEREF _Toc243918630 \h </w:instrText>
         </w:r>
         <w:r>
           <w:rPr>
@@ -3374,7 +3374,7 @@
           <w:lang w:eastAsia="es-CO"/>
         </w:rPr>
       </w:pPr>
-      <w:hyperlink w:anchor="_Toc243648459" w:history="1">
+      <w:hyperlink w:anchor="_Toc243918631" w:history="1">
         <w:r>
           <w:rPr>
             <w:rStyle w:val="Hyperlink"/>
@@ -3419,7 +3419,7 @@
             <w:noProof/>
             <w:webHidden/>
           </w:rPr>
-          <w:instrText xml:space="preserve"> PAGEREF _Toc243648459 \h </w:instrText>
+          <w:instrText xml:space="preserve"> PAGEREF _Toc243918631 \h </w:instrText>
         </w:r>
         <w:r>
           <w:rPr>
@@ -3466,7 +3466,7 @@
           <w:lang w:eastAsia="es-CO"/>
         </w:rPr>
       </w:pPr>
-      <w:hyperlink w:anchor="_Toc243648460" w:history="1">
+      <w:hyperlink w:anchor="_Toc243918632" w:history="1">
         <w:r>
           <w:rPr>
             <w:rStyle w:val="Hyperlink"/>
@@ -3511,7 +3511,7 @@
             <w:noProof/>
             <w:webHidden/>
           </w:rPr>
-          <w:instrText xml:space="preserve"> PAGEREF _Toc243648460 \h </w:instrText>
+          <w:instrText xml:space="preserve"> PAGEREF _Toc243918632 \h </w:instrText>
         </w:r>
         <w:r>
           <w:rPr>
@@ -3560,7 +3560,7 @@
           <w:lang w:eastAsia="es-CO"/>
         </w:rPr>
       </w:pPr>
-      <w:hyperlink w:anchor="_Toc243648461" w:history="1">
+      <w:hyperlink w:anchor="_Toc243918633" w:history="1">
         <w:r>
           <w:rPr>
             <w:rStyle w:val="Hyperlink"/>
@@ -3607,7 +3607,7 @@
             <w:noProof/>
             <w:webHidden/>
           </w:rPr>
-          <w:instrText xml:space="preserve"> PAGEREF _Toc243648461 \h </w:instrText>
+          <w:instrText xml:space="preserve"> PAGEREF _Toc243918633 \h </w:instrText>
         </w:r>
         <w:r>
           <w:rPr>
@@ -3656,7 +3656,7 @@
           <w:lang w:eastAsia="es-CO"/>
         </w:rPr>
       </w:pPr>
-      <w:hyperlink w:anchor="_Toc243648462" w:history="1">
+      <w:hyperlink w:anchor="_Toc243918634" w:history="1">
         <w:r>
           <w:rPr>
             <w:rStyle w:val="Hyperlink"/>
@@ -3703,7 +3703,7 @@
             <w:noProof/>
             <w:webHidden/>
           </w:rPr>
-          <w:instrText xml:space="preserve"> PAGEREF _Toc243648462 \h </w:instrText>
+          <w:instrText xml:space="preserve"> PAGEREF _Toc243918634 \h </w:instrText>
         </w:r>
         <w:r>
           <w:rPr>
@@ -3752,7 +3752,7 @@
           <w:lang w:eastAsia="es-CO"/>
         </w:rPr>
       </w:pPr>
-      <w:hyperlink w:anchor="_Toc243648463" w:history="1">
+      <w:hyperlink w:anchor="_Toc243918635" w:history="1">
         <w:r>
           <w:rPr>
             <w:rStyle w:val="Hyperlink"/>
@@ -3799,7 +3799,7 @@
             <w:noProof/>
             <w:webHidden/>
           </w:rPr>
-          <w:instrText xml:space="preserve"> PAGEREF _Toc243648463 \h </w:instrText>
+          <w:instrText xml:space="preserve"> PAGEREF _Toc243918635 \h </w:instrText>
         </w:r>
         <w:r>
           <w:rPr>
@@ -3853,7 +3853,7 @@
       <w:bookmarkStart w:id="4" w:name="_Toc240440230"/>
       <w:bookmarkStart w:id="5" w:name="_Toc241072107"/>
       <w:bookmarkStart w:id="6" w:name="_Toc241072473"/>
-      <w:bookmarkStart w:id="7" w:name="_Toc243648426"/>
+      <w:bookmarkStart w:id="7" w:name="_Toc243918598"/>
       <w:r>
         <w:lastRenderedPageBreak/>
         <w:t>Información principal del proyecto</w:t>
@@ -3876,7 +3876,7 @@
       <w:bookmarkStart w:id="8" w:name="_Toc240440231"/>
       <w:bookmarkStart w:id="9" w:name="_Toc241072108"/>
       <w:bookmarkStart w:id="10" w:name="_Toc241072474"/>
-      <w:bookmarkStart w:id="11" w:name="_Toc243648427"/>
+      <w:bookmarkStart w:id="11" w:name="_Toc243918599"/>
       <w:r>
         <w:t>Título del proyecto</w:t>
       </w:r>
@@ -3910,7 +3910,7 @@
       <w:bookmarkStart w:id="12" w:name="_Toc240440232"/>
       <w:bookmarkStart w:id="13" w:name="_Toc241072109"/>
       <w:bookmarkStart w:id="14" w:name="_Toc241072475"/>
-      <w:bookmarkStart w:id="15" w:name="_Toc243648428"/>
+      <w:bookmarkStart w:id="15" w:name="_Toc243918600"/>
       <w:r>
         <w:t>Resumen ejecutivo</w:t>
       </w:r>
@@ -3962,7 +3962,7 @@
       <w:bookmarkStart w:id="16" w:name="_Toc240440236"/>
       <w:bookmarkStart w:id="17" w:name="_Toc241072110"/>
       <w:bookmarkStart w:id="18" w:name="_Toc241072476"/>
-      <w:bookmarkStart w:id="19" w:name="_Toc243648429"/>
+      <w:bookmarkStart w:id="19" w:name="_Toc243918601"/>
       <w:r>
         <w:t>Costo total del proyecto</w:t>
       </w:r>
@@ -4847,7 +4847,7 @@
       <w:bookmarkStart w:id="20" w:name="_Toc240440237"/>
       <w:bookmarkStart w:id="21" w:name="_Toc241072111"/>
       <w:bookmarkStart w:id="22" w:name="_Toc241072477"/>
-      <w:bookmarkStart w:id="23" w:name="_Toc243648430"/>
+      <w:bookmarkStart w:id="23" w:name="_Toc243918602"/>
       <w:r>
         <w:lastRenderedPageBreak/>
         <w:t>Introducción</w:t>
@@ -4925,7 +4925,7 @@
       <w:bookmarkStart w:id="24" w:name="_Toc240440238"/>
       <w:bookmarkStart w:id="25" w:name="_Toc241072112"/>
       <w:bookmarkStart w:id="26" w:name="_Toc241072478"/>
-      <w:bookmarkStart w:id="27" w:name="_Toc243648431"/>
+      <w:bookmarkStart w:id="27" w:name="_Toc243918603"/>
       <w:r>
         <w:lastRenderedPageBreak/>
         <w:t>Objetivos</w:t>
@@ -4948,7 +4948,7 @@
       <w:bookmarkStart w:id="28" w:name="_Toc240440239"/>
       <w:bookmarkStart w:id="29" w:name="_Toc241072113"/>
       <w:bookmarkStart w:id="30" w:name="_Toc241072479"/>
-      <w:bookmarkStart w:id="31" w:name="_Toc243648432"/>
+      <w:bookmarkStart w:id="31" w:name="_Toc243918604"/>
       <w:r>
         <w:t>Objetivo general</w:t>
       </w:r>
@@ -4979,7 +4979,7 @@
       <w:bookmarkStart w:id="32" w:name="_Toc240440240"/>
       <w:bookmarkStart w:id="33" w:name="_Toc241072114"/>
       <w:bookmarkStart w:id="34" w:name="_Toc241072480"/>
-      <w:bookmarkStart w:id="35" w:name="_Toc243648433"/>
+      <w:bookmarkStart w:id="35" w:name="_Toc243918605"/>
       <w:r>
         <w:t>Objetivos específicos</w:t>
       </w:r>
@@ -5089,7 +5089,7 @@
       <w:bookmarkStart w:id="36" w:name="_Toc240440241"/>
       <w:bookmarkStart w:id="37" w:name="_Toc241072115"/>
       <w:bookmarkStart w:id="38" w:name="_Toc241072481"/>
-      <w:bookmarkStart w:id="39" w:name="_Toc243648434"/>
+      <w:bookmarkStart w:id="39" w:name="_Toc243918606"/>
       <w:r>
         <w:t>Delimitación</w:t>
       </w:r>
@@ -5111,7 +5111,7 @@
       <w:bookmarkStart w:id="40" w:name="_Toc240440242"/>
       <w:bookmarkStart w:id="41" w:name="_Toc241072116"/>
       <w:bookmarkStart w:id="42" w:name="_Toc241072482"/>
-      <w:bookmarkStart w:id="43" w:name="_Toc243648435"/>
+      <w:bookmarkStart w:id="43" w:name="_Toc243918607"/>
       <w:r>
         <w:t>Alcances</w:t>
       </w:r>
@@ -5668,7 +5668,7 @@
       <w:bookmarkStart w:id="44" w:name="_Toc240440243"/>
       <w:bookmarkStart w:id="45" w:name="_Toc241072117"/>
       <w:bookmarkStart w:id="46" w:name="_Toc241072483"/>
-      <w:bookmarkStart w:id="47" w:name="_Toc243648436"/>
+      <w:bookmarkStart w:id="47" w:name="_Toc243918608"/>
       <w:r>
         <w:t>Limitaciones</w:t>
       </w:r>
@@ -6069,7 +6069,7 @@
       <w:bookmarkStart w:id="48" w:name="_Toc240440244"/>
       <w:bookmarkStart w:id="49" w:name="_Toc241072118"/>
       <w:bookmarkStart w:id="50" w:name="_Toc241072484"/>
-      <w:bookmarkStart w:id="51" w:name="_Toc243648437"/>
+      <w:bookmarkStart w:id="51" w:name="_Toc243918609"/>
       <w:r>
         <w:t>Entregables</w:t>
       </w:r>
@@ -6321,7 +6321,7 @@
       </w:pPr>
       <w:bookmarkStart w:id="53" w:name="_Toc241072119"/>
       <w:bookmarkStart w:id="54" w:name="_Toc241072485"/>
-      <w:bookmarkStart w:id="55" w:name="_Toc243648438"/>
+      <w:bookmarkStart w:id="55" w:name="_Toc243918610"/>
       <w:r>
         <w:t>Revisión bibliográfica</w:t>
       </w:r>
@@ -6346,7 +6346,7 @@
       <w:bookmarkStart w:id="56" w:name="_Toc240440246"/>
       <w:bookmarkStart w:id="57" w:name="_Toc241072120"/>
       <w:bookmarkStart w:id="58" w:name="_Toc241072486"/>
-      <w:bookmarkStart w:id="59" w:name="_Toc243648439"/>
+      <w:bookmarkStart w:id="59" w:name="_Toc243918611"/>
       <w:r>
         <w:t>Planteamiento del problema</w:t>
       </w:r>
@@ -6384,7 +6384,7 @@
           <w:noProof/>
         </w:rPr>
         <w:drawing>
-          <wp:inline distT="0" distB="0" distL="0" distR="0" wp14:anchorId="2BB2FF17" wp14:editId="0CF0D57F">
+          <wp:inline distT="0" distB="0" distL="0" distR="0" wp14:anchorId="0C3E1CAB" wp14:editId="45DE8943">
             <wp:extent cx="4320000" cy="1753663"/>
             <wp:effectExtent l="0" t="0" r="0" b="0"/>
             <wp:docPr id="1" name="Picture 1"/>
@@ -6512,7 +6512,7 @@
       <w:bookmarkStart w:id="60" w:name="_Toc240440247"/>
       <w:bookmarkStart w:id="61" w:name="_Toc241072121"/>
       <w:bookmarkStart w:id="62" w:name="_Toc241072487"/>
-      <w:bookmarkStart w:id="63" w:name="_Toc243648440"/>
+      <w:bookmarkStart w:id="63" w:name="_Toc243918612"/>
       <w:r>
         <w:t>Descripción de avances tecnológicos</w:t>
       </w:r>
@@ -7524,7 +7524,7 @@
         <w:jc w:val="both"/>
       </w:pPr>
       <w:r>
-        <w:t>Ninguno de los tres trabajos colombianos cuantifica la incertidumbre ni la traduce en una recomendación, y ninguno de los referentes internacionales cubre un mercado colombiano horario, aunque fijan el método de evaluación [6], [7] y muestran que modelos simples compiten con el aprendizaje profundo [6], [16]; además, las 24 horas de un día se fijan en una sola subasta, por lo que conviene modelarlas como un vector diario [17]. No existe una plataforma que combine procesamiento de señales, un ensamble validado por regímenes y un motor de decisión por rol. Además, ninguno aprovecha la información que el operador del mercado publica antes del día de despacho, como el predespacho ideal de XM [39].</w:t>
+        <w:t>Ninguno de los tres trabajos colombianos cuantifica la incertidumbre ni la traduce en una recomendación, y ninguno de los referentes internacionales cubre un mercado colombiano horario, aunque fijan el método de evaluación [6], [7] y muestran que modelos simples compiten con el aprendizaje profundo [6], [16]; además, las 24 horas de un día se fijan en una sola subasta, por lo que conviene modelarlas como un vector diario [17]. No existe una plataforma que combine procesamiento de señales, un ensamble validado por regímenes y un motor de decisión por rol. Además, ninguno aprovecha la información que el operador del mercado publica antes del día de despacho, como el predespacho ideal de XM [18].</w:t>
       </w:r>
     </w:p>
     <w:p>
@@ -7546,7 +7546,7 @@
       </w:pPr>
       <w:bookmarkStart w:id="65" w:name="_Toc241072122"/>
       <w:bookmarkStart w:id="66" w:name="_Toc241072488"/>
-      <w:bookmarkStart w:id="67" w:name="_Toc243648441"/>
+      <w:bookmarkStart w:id="67" w:name="_Toc243918613"/>
       <w:r>
         <w:t>Descripción detallada del diseño en ingeniería</w:t>
       </w:r>
@@ -7568,7 +7568,7 @@
       <w:bookmarkStart w:id="68" w:name="_Toc240440249"/>
       <w:bookmarkStart w:id="69" w:name="_Toc241072123"/>
       <w:bookmarkStart w:id="70" w:name="_Toc241072489"/>
-      <w:bookmarkStart w:id="71" w:name="_Toc243648442"/>
+      <w:bookmarkStart w:id="71" w:name="_Toc243918614"/>
       <w:r>
         <w:t>Problema</w:t>
       </w:r>
@@ -7605,7 +7605,7 @@
       </w:r>
       <w:r>
         <w:lastRenderedPageBreak/>
-        <w:t>predespacho ideal del día D, que XM calcula con las ofertas de los generadores, se publica hacia las 10:30 de D-1 en la biblioteca pública de su portal [39]. Un diseño que suponga conocido el precio del día anterior no se puede operar con fuentes públicas; por eso el diseño definitivo se evaluó en este escenario realista.</w:t>
+        <w:t>predespacho ideal del día D, que XM calcula con las ofertas de los generadores, se publica hacia las 10:30 de D-1 en la biblioteca pública de su portal [18]. Un diseño que suponga conocido el precio del día anterior no se puede operar con fuentes públicas; por eso el diseño definitivo se evaluó en este escenario realista.</w:t>
       </w:r>
     </w:p>
     <w:p>
@@ -7621,7 +7621,7 @@
       <w:bookmarkStart w:id="72" w:name="_Toc240440250"/>
       <w:bookmarkStart w:id="73" w:name="_Toc241072124"/>
       <w:bookmarkStart w:id="74" w:name="_Toc241072490"/>
-      <w:bookmarkStart w:id="75" w:name="_Toc243648443"/>
+      <w:bookmarkStart w:id="75" w:name="_Toc243918615"/>
       <w:r>
         <w:t>Análisis de requerimientos</w:t>
       </w:r>
@@ -8060,7 +8060,7 @@
                 <w:sz w:val="17"/>
                 <w:szCs w:val="17"/>
               </w:rPr>
-              <w:t>Inferencia conforme [18]</w:t>
+              <w:t>Inferencia conforme [19]</w:t>
             </w:r>
           </w:p>
         </w:tc>
@@ -8129,7 +8129,7 @@
                 <w:sz w:val="17"/>
                 <w:szCs w:val="17"/>
               </w:rPr>
-              <w:t>Validación de origen móvil [19]</w:t>
+              <w:t>Validación de origen móvil [20]</w:t>
             </w:r>
           </w:p>
         </w:tc>
@@ -8499,7 +8499,7 @@
       <w:bookmarkStart w:id="76" w:name="_Toc240440251"/>
       <w:bookmarkStart w:id="77" w:name="_Toc241072125"/>
       <w:bookmarkStart w:id="78" w:name="_Toc241072491"/>
-      <w:bookmarkStart w:id="79" w:name="_Toc243648444"/>
+      <w:bookmarkStart w:id="79" w:name="_Toc243918616"/>
       <w:r>
         <w:t>Estándares, normas y regulaciones</w:t>
       </w:r>
@@ -8633,7 +8633,7 @@
                 <w:sz w:val="18"/>
                 <w:szCs w:val="18"/>
               </w:rPr>
-              <w:t>ISO 8601-1:2019 [20]</w:t>
+              <w:t>ISO 8601-1:2019 [21]</w:t>
             </w:r>
           </w:p>
         </w:tc>
@@ -8679,7 +8679,7 @@
                 <w:szCs w:val="18"/>
               </w:rPr>
               <w:lastRenderedPageBreak/>
-              <w:t>Resolución CREG 101 018 de 2022 [21]</w:t>
+              <w:t>Resolución CREG 101 018 de 2022 [22]</w:t>
             </w:r>
           </w:p>
         </w:tc>
@@ -8724,7 +8724,7 @@
                 <w:sz w:val="18"/>
                 <w:szCs w:val="18"/>
               </w:rPr>
-              <w:t>Ley 1581 de 2012 [22]</w:t>
+              <w:t>Ley 1581 de 2012 [23]</w:t>
             </w:r>
           </w:p>
         </w:tc>
@@ -8769,7 +8769,7 @@
                 <w:sz w:val="18"/>
                 <w:szCs w:val="18"/>
               </w:rPr>
-              <w:t>ISO/IEC 25010:2011 [23]</w:t>
+              <w:t>ISO/IEC 25010:2011 [24]</w:t>
             </w:r>
           </w:p>
         </w:tc>
@@ -8814,7 +8814,7 @@
                 <w:sz w:val="18"/>
                 <w:szCs w:val="18"/>
               </w:rPr>
-              <w:t>Resolución CREG 025 de 1995 [41]</w:t>
+              <w:t>Resolución CREG 025 de 1995 [25]</w:t>
             </w:r>
           </w:p>
         </w:tc>
@@ -8873,7 +8873,7 @@
       <w:bookmarkStart w:id="80" w:name="_Toc240440252"/>
       <w:bookmarkStart w:id="81" w:name="_Toc241072126"/>
       <w:bookmarkStart w:id="82" w:name="_Toc241072492"/>
-      <w:bookmarkStart w:id="83" w:name="_Toc243648445"/>
+      <w:bookmarkStart w:id="83" w:name="_Toc243918617"/>
       <w:r>
         <w:t>Alternativas de solución</w:t>
       </w:r>
@@ -8903,7 +8903,7 @@
         <w:t>Solución 1: ensamble heterogéneo de seis modelos (diseño del informe de avance).</w:t>
       </w:r>
       <w:r>
-        <w:t xml:space="preserve"> Combina persistencia, árboles de gradiente (XGBoost [28]), un modelo econométrico ARX con varianza GARCH [13], [24], dos redes neuronales (N-BEATSx [25] y N-HiTS [29]) y un GARCH con errores GED [30] y selección LASSO [10], con un peso no negativo por modelo y por franja horaria de 6 h [11]. El principio es el de diversificar un portafolio: si los errores de los modelos no están perfectamente correlacionados, su combinación reduce el error total. Con el precio del día anterior su MAE era 43,1 COP/kWh, 27 % menor que el de la persistencia; pero ese precio no es público al corte. Con lo publicado, los modelos trabajan con información de hace cuatro días y el MAE sube a 100,7 COP/kWh.</w:t>
+        <w:t xml:space="preserve"> Combina persistencia, árboles de gradiente (XGBoost [26]), un modelo econométrico ARX con varianza GARCH [13], [27], dos redes neuronales (N-BEATSx [28] y N-HiTS [29]) y un GARCH con errores GED [30] y selección LASSO [10], con un peso no negativo por modelo y por franja horaria de 6 h [11]. El principio es el de diversificar un portafolio: si los errores de los modelos no están perfectamente correlacionados, su combinación reduce el error total. Con el precio del día anterior su MAE era 43,1 COP/kWh, 27 % menor que el de la persistencia; pero ese precio no es público al corte. Con lo publicado, los modelos trabajan con información de hace cuatro días y el MAE sube a 100,7 COP/kWh.</w:t>
       </w:r>
     </w:p>
     <w:p>
@@ -8933,7 +8933,7 @@
         <w:t>Solución 3: predespacho corregido con tres CatBoost.</w:t>
       </w:r>
       <w:r>
-        <w:t xml:space="preserve"> Tres modelos de árboles CatBoost [38] aprenden a corregir el predespacho: en lugar del precio pronostican el logaritmo de la razón entre el precio y el predespacho, con pérdida de error absoluto y con conjuntos de variables distintos (las variables públicas y las del predespacho; además, la forma intradía del predespacho y el despacho programado; o el error reciente del predespacho). Se reentrenan cada mes con lo publicado y su promedio se combina con el predespacho por regresión cuantílica (QRA). Es la alternativa más liviana, pero depende de que XM publique el predespacho.</w:t>
+        <w:t xml:space="preserve"> Tres modelos de árboles CatBoost [31] aprenden a corregir el predespacho: en lugar del precio pronostican el logaritmo de la razón entre el precio y el predespacho, con pérdida de error absoluto y con conjuntos de variables distintos (las variables públicas y las del predespacho; además, la forma intradía del predespacho y el despacho programado; o el error reciente del predespacho). Se reentrenan cada mes con lo publicado y su promedio se combina con el predespacho por regresión cuantílica (QRA). Es la alternativa más liviana, pero depende de que XM publique el predespacho.</w:t>
       </w:r>
     </w:p>
     <w:p>
@@ -9342,7 +9342,7 @@
       <w:bookmarkStart w:id="84" w:name="_Toc240440253"/>
       <w:bookmarkStart w:id="85" w:name="_Toc241072127"/>
       <w:bookmarkStart w:id="86" w:name="_Toc241072493"/>
-      <w:bookmarkStart w:id="87" w:name="_Toc243648446"/>
+      <w:bookmarkStart w:id="87" w:name="_Toc243918618"/>
       <w:r>
         <w:t>Evaluación y selección de la alternativa óptima</w:t>
       </w:r>
@@ -9542,7 +9542,7 @@
                 <w:sz w:val="18"/>
                 <w:szCs w:val="18"/>
               </w:rPr>
-              <w:t>[6], [26]</w:t>
+              <w:t>[6], [32]</w:t>
             </w:r>
           </w:p>
         </w:tc>
@@ -9607,7 +9607,7 @@
                 <w:sz w:val="18"/>
                 <w:szCs w:val="18"/>
               </w:rPr>
-              <w:t>[19]</w:t>
+              <w:t>[20]</w:t>
             </w:r>
           </w:p>
         </w:tc>
@@ -9672,7 +9672,7 @@
                 <w:sz w:val="18"/>
                 <w:szCs w:val="18"/>
               </w:rPr>
-              <w:t>[18]</w:t>
+              <w:t>[19]</w:t>
             </w:r>
           </w:p>
         </w:tc>
@@ -9802,7 +9802,7 @@
                 <w:sz w:val="18"/>
                 <w:szCs w:val="18"/>
               </w:rPr>
-              <w:t>[27]</w:t>
+              <w:t>[33]</w:t>
             </w:r>
           </w:p>
         </w:tc>
@@ -10742,7 +10742,7 @@
       <w:bookmarkStart w:id="88" w:name="_Toc240440255"/>
       <w:bookmarkStart w:id="89" w:name="_Toc241072130"/>
       <w:bookmarkStart w:id="90" w:name="_Toc241072496"/>
-      <w:bookmarkStart w:id="91" w:name="_Toc243648447"/>
+      <w:bookmarkStart w:id="91" w:name="_Toc243918619"/>
       <w:r>
         <w:t>Análisis de riesgo del diseño definitivo</w:t>
       </w:r>
@@ -11711,7 +11711,7 @@
       <w:bookmarkStart w:id="92" w:name="_Toc240440254"/>
       <w:bookmarkStart w:id="93" w:name="_Toc241072129"/>
       <w:bookmarkStart w:id="94" w:name="_Toc241072495"/>
-      <w:bookmarkStart w:id="95" w:name="_Toc243648448"/>
+      <w:bookmarkStart w:id="95" w:name="_Toc243918620"/>
       <w:r>
         <w:lastRenderedPageBreak/>
         <w:t>Diseño definitivo</w:t>
@@ -11747,7 +11747,7 @@
           <w:noProof/>
         </w:rPr>
         <w:drawing>
-          <wp:inline distT="0" distB="0" distL="0" distR="0" wp14:anchorId="0E3B2F33" wp14:editId="0F8E64A3">
+          <wp:inline distT="0" distB="0" distL="0" distR="0" wp14:anchorId="0544B193" wp14:editId="375D0CE6">
             <wp:extent cx="3780000" cy="2888781"/>
             <wp:effectExtent l="0" t="0" r="0" b="0"/>
             <wp:docPr id="14" name="Picture 14"/>
@@ -11825,7 +11825,7 @@
         <w:jc w:val="both"/>
       </w:pPr>
       <w:r>
-        <w:t>De las fuentes públicas se descargaron, para enero de 2019 a agosto de 2026, 66.576 registros horarios de cada una de las tres series horarias de XM (precio de bolsa, demanda real y generación total), 2.776 registros diarios de cada una de las dos series hidrológicas (volumen útil de embalses y aportes hídricos) y los 90 valores trimestrales publicados del ONI (de DJF 2019 a MJJ 2026). Cada familia de variables sale de una sola de esas fuentes: las de precio rezagado, medias móviles y volatilidad (9 variables), de la serie horaria de precio; la de demanda (4), de la demanda horaria; la de hidrología (12), seis de los embalses y seis de los aportes; el ONI, de la serie de NOAA; y el indicador de pandemia y las 13 variables de calendario y festivos, de la marca de tiempo y del calendario oficial de festivos de Colombia. La generación total se usó en la caracterización, pero no como predictora: su valor en la hora objetivo se fija en el mismo despacho que el precio y su valor rezagado repite la información de la demanda, con la que tiene una correlación de 0,996. Para el diseño definitivo se descargaron además, de la biblioteca pública del portal de XM [39], 3.192 archivos diarios del predespacho ideal (enero de 2018 a agosto de 2026) y los del costo marginal y la demanda del despacho programado (dMAR y dDEM), con su fecha de creación y de modificación para verificar que cada uno estuviera disponible antes del corte.</w:t>
+        <w:t>De las fuentes públicas se descargaron, para enero de 2019 a agosto de 2026, 66.576 registros horarios de cada una de las tres series horarias de XM (precio de bolsa, demanda real y generación total), 2.776 registros diarios de cada una de las dos series hidrológicas (volumen útil de embalses y aportes hídricos) y los 90 valores trimestrales publicados del ONI (de DJF 2019 a MJJ 2026). Cada familia de variables sale de una sola de esas fuentes: las de precio rezagado, medias móviles y volatilidad (9 variables), de la serie horaria de precio; la de demanda (4), de la demanda horaria; la de hidrología (12), seis de los embalses y seis de los aportes; el ONI, de la serie de NOAA; y el indicador de pandemia y las 13 variables de calendario y festivos, de la marca de tiempo y del calendario oficial de festivos de Colombia. La generación total se usó en la caracterización, pero no como predictora: su valor en la hora objetivo se fija en el mismo despacho que el precio y su valor rezagado repite la información de la demanda, con la que tiene una correlación de 0,996. Para el diseño definitivo se descargaron además, de la biblioteca pública del portal de XM [18], 3.192 archivos diarios del predespacho ideal (enero de 2018 a agosto de 2026) y los del costo marginal y la demanda del despacho programado (dMAR y dDEM), con su fecha de creación y de modificación para verificar que cada uno estuviera disponible antes del corte.</w:t>
       </w:r>
     </w:p>
     <w:p>
@@ -11841,7 +11841,7 @@
         <w:t>Ventana de datos.</w:t>
       </w:r>
       <w:r>
-        <w:t xml:space="preserve"> Se usa enero de 2019 a agosto de 2026 por tres razones. Primero, durante El Niño 2015-2016 el mercado operó con medidas transitorias de escasez, entre ellas un piso al precio de escasez (Resolución CREG 178 de 2015 [42]), es decir, con reglas de excepción. Segundo, desde el 1 de diciembre de 2017 rige el precio marginal de escasez (Resolución CREG 140 de 2017 [43]), que cambió la regla que activa la condición crítica y pone techo al precio que paga la demanda en bolsa; empezar en 2019 deja un año completo de operación con la regla vigente. Tercero, los datos lo confirman: 2017 y 2018 forman un régimen de precios más bajo y comprimido (medias de 106 y 116 COP/kWh, frente a 228 COP/kWh o más desde 2019), y extender el entrenamiento a 2017 no mejoró ninguno de los modelos evaluados.</w:t>
+        <w:t xml:space="preserve"> Se usa enero de 2019 a agosto de 2026 por tres razones. Primero, durante El Niño 2015-2016 el mercado operó con medidas transitorias de escasez, entre ellas un piso al precio de escasez (Resolución CREG 178 de 2015 [34]), es decir, con reglas de excepción. Segundo, desde el 1 de diciembre de 2017 rige el precio marginal de escasez (Resolución CREG 140 de 2017 [35]), que cambió la regla que activa la condición crítica y pone techo al precio que paga la demanda en bolsa; empezar en 2019 deja un año completo de operación con la regla vigente. Tercero, los datos lo confirman: 2017 y 2018 forman un régimen de precios más bajo y comprimido (medias de 106 y 116 COP/kWh, frente a 228 COP/kWh o más desde 2019), y extender el entrenamiento a 2017 no mejoró ninguno de los modelos evaluados.</w:t>
       </w:r>
     </w:p>
     <w:p>
@@ -12954,7 +12954,7 @@
                 <w:sz w:val="16"/>
                 <w:szCs w:val="16"/>
               </w:rPr>
-              <w:t>Estimación del precio del día siguiente que publica XM [39]</w:t>
+              <w:t>Estimación del precio del día siguiente que publica XM [18]</w:t>
             </w:r>
           </w:p>
         </w:tc>
@@ -13044,7 +13044,7 @@
                 <w:sz w:val="16"/>
                 <w:szCs w:val="16"/>
               </w:rPr>
-              <w:t>Árboles con gradiente ordenado [38]</w:t>
+              <w:t>Árboles con gradiente ordenado [31]</w:t>
             </w:r>
           </w:p>
         </w:tc>
@@ -13405,7 +13405,7 @@
                 <w:sz w:val="16"/>
                 <w:szCs w:val="16"/>
               </w:rPr>
-              <w:t>Inferencia conforme por grupos [18], [40]</w:t>
+              <w:t>Inferencia conforme por grupos [19], [36]</w:t>
             </w:r>
           </w:p>
         </w:tc>
@@ -15236,7 +15236,7 @@
         <w:t>Motor de decisión (cuatro métodos, filtro intradía y selección por estabilidad).</w:t>
       </w:r>
       <w:r>
-        <w:t xml:space="preserve"> (1) Cada método fija un umbral bajo y uno alto y compara con ellos la mediana q50 de cada hora: por debajo del bajo el comercializador recibe «comprar» y el generador «retener»; por encima del alto, «evitar compra» y «vender»; en otro caso, «esperar». Los umbrales por defecto son los percentiles 25 y 75, el rango intercuartílico convencional para separar valores típicos de extremos [31]. (2) Los métodos difieren en la referencia: «fijo» usa los percentiles del precio de 2019-2025; «rodante», los de una ventana móvil causal de 30 días sobre q50, que se adapta al régimen vigente [32]; «banda» es el fijo más un filtro que emite «esperar» cuando el ancho relativo de la banda supera su percentil 75 en las horas anteriores; e «híbrido» combina el umbral rodante con ese filtro de confianza. (3) Un filtro intradía conserva la señal favorable (vender o comprar) solo en la mitad del día que el pronóstico ubica más cara (generador) o más barata (comercializador), y la desfavorable solo en la mitad opuesta: los umbrales deciden en qué temporada conviene la bolsa y el filtro, a qué hora del día actuar. (4) El método activo se elige por backtesting: solo son admisibles los que actúan entre 10 % y 40 % de las horas y, entre ellos, gana el de mayor ventaja en la mitad más débil del periodo (criterio maximin [33]), no el de mayor ventaja promedio.</w:t>
+        <w:t xml:space="preserve"> (1) Cada método fija un umbral bajo y uno alto y compara con ellos la mediana q50 de cada hora: por debajo del bajo el comercializador recibe «comprar» y el generador «retener»; por encima del alto, «evitar compra» y «vender»; en otro caso, «esperar». Los umbrales por defecto son los percentiles 25 y 75, el rango intercuartílico convencional para separar valores típicos de extremos [37]. (2) Los métodos difieren en la referencia: «fijo» usa los percentiles del precio de 2019-2025; «rodante», los de una ventana móvil causal de 30 días sobre q50, que se adapta al régimen vigente [38]; «banda» es el fijo más un filtro que emite «esperar» cuando el ancho relativo de la banda supera su percentil 75 en las horas anteriores; e «híbrido» combina el umbral rodante con ese filtro de confianza. (3) Un filtro intradía conserva la señal favorable (vender o comprar) solo en la mitad del día que el pronóstico ubica más cara (generador) o más barata (comercializador), y la desfavorable solo en la mitad opuesta: los umbrales deciden en qué temporada conviene la bolsa y el filtro, a qué hora del día actuar. (4) El método activo se elige por backtesting: solo son admisibles los que actúan entre 10 % y 40 % de las horas y, entre ellos, gana el de mayor ventaja en la mitad más débil del periodo (criterio maximin [39]), no el de mayor ventaja promedio.</w:t>
       </w:r>
     </w:p>
     <w:p>
@@ -15260,7 +15260,7 @@
         </w:rPr>
         <w:lastRenderedPageBreak/>
         <w:drawing>
-          <wp:inline distT="0" distB="0" distL="0" distR="0" wp14:anchorId="64B78207" wp14:editId="6F0424F3">
+          <wp:inline distT="0" distB="0" distL="0" distR="0" wp14:anchorId="07C4ABC0" wp14:editId="1EFD9036">
             <wp:extent cx="4500000" cy="2592528"/>
             <wp:effectExtent l="0" t="0" r="0" b="0"/>
             <wp:docPr id="15" name="Picture 15"/>
@@ -15374,7 +15374,7 @@
           <w:noProof/>
         </w:rPr>
         <w:drawing>
-          <wp:inline distT="0" distB="0" distL="0" distR="0" wp14:anchorId="0D0A7963" wp14:editId="65DF8F39">
+          <wp:inline distT="0" distB="0" distL="0" distR="0" wp14:anchorId="00922896" wp14:editId="022BA21E">
             <wp:extent cx="5760720" cy="3419094"/>
             <wp:effectExtent l="0" t="0" r="0" b="0"/>
             <wp:docPr id="16" name="Picture 16"/>
@@ -15458,7 +15458,7 @@
         </w:rPr>
         <w:lastRenderedPageBreak/>
         <w:drawing>
-          <wp:inline distT="0" distB="0" distL="0" distR="0" wp14:anchorId="4C8669C1" wp14:editId="5B93E81B">
+          <wp:inline distT="0" distB="0" distL="0" distR="0" wp14:anchorId="5EF6FF09" wp14:editId="44A2F311">
             <wp:extent cx="5486400" cy="2544896"/>
             <wp:effectExtent l="0" t="0" r="0" b="0"/>
             <wp:docPr id="17" name="Picture 17"/>
@@ -15542,7 +15542,7 @@
         </w:rPr>
         <w:lastRenderedPageBreak/>
         <w:drawing>
-          <wp:inline distT="0" distB="0" distL="0" distR="0" wp14:anchorId="543C293A" wp14:editId="2306729C">
+          <wp:inline distT="0" distB="0" distL="0" distR="0" wp14:anchorId="3A53A8E5" wp14:editId="36832B3D">
             <wp:extent cx="3931920" cy="4212251"/>
             <wp:effectExtent l="0" t="0" r="0" b="0"/>
             <wp:docPr id="18" name="Picture 18"/>
@@ -15623,7 +15623,7 @@
       </w:pPr>
       <w:bookmarkStart w:id="97" w:name="_Toc241072132"/>
       <w:bookmarkStart w:id="98" w:name="_Toc241072498"/>
-      <w:bookmarkStart w:id="99" w:name="_Toc243648449"/>
+      <w:bookmarkStart w:id="99" w:name="_Toc243918621"/>
       <w:r>
         <w:t>Pruebas, resultados y análisis de resultados</w:t>
       </w:r>
@@ -15645,7 +15645,7 @@
       <w:bookmarkStart w:id="100" w:name="_Toc240440258"/>
       <w:bookmarkStart w:id="101" w:name="_Toc241072133"/>
       <w:bookmarkStart w:id="102" w:name="_Toc241072499"/>
-      <w:bookmarkStart w:id="103" w:name="_Toc243648450"/>
+      <w:bookmarkStart w:id="103" w:name="_Toc243918622"/>
       <w:r>
         <w:t>Planeación del diseño del experimento</w:t>
       </w:r>
@@ -15700,7 +15700,7 @@
       </w:r>
       <w:r>
         <w:lastRenderedPageBreak/>
-        <w:t>información (con el precio del día anterior o solo con lo publicado), horizonte (3 tramos de 24 h), origen temporal (6 regímenes ENSO) y, en el motor, rol (2) y método (4). El método es una evaluación fuera de muestra con origen móvil (walk-forward) [19] con comparaciones pareadas hora a hora.</w:t>
+        <w:t>información (con el precio del día anterior o solo con lo publicado), horizonte (3 tramos de 24 h), origen temporal (6 regímenes ENSO) y, en el motor, rol (2) y método (4). El método es una evaluación fuera de muestra con origen móvil (walk-forward) [20] con comparaciones pareadas hora a hora.</w:t>
       </w:r>
     </w:p>
     <w:p>
@@ -15720,7 +15720,7 @@
       <w:bookmarkStart w:id="104" w:name="_Toc240440261"/>
       <w:bookmarkStart w:id="105" w:name="_Toc241072136"/>
       <w:bookmarkStart w:id="106" w:name="_Toc241072500"/>
-      <w:bookmarkStart w:id="107" w:name="_Toc243648451"/>
+      <w:bookmarkStart w:id="107" w:name="_Toc243918623"/>
       <w:r>
         <w:t>Instrumentación y validación</w:t>
       </w:r>
@@ -15735,7 +15735,7 @@
         <w:jc w:val="both"/>
       </w:pPr>
       <w:r>
-        <w:t>Instrumento: la serie oficial de precio de XM [4], horaria y con hasta cinco decimales en COP/kWh; su error es despreciable frente a los de pronóstico. Equipo: AMD Ryzen 7 7730U, 15,4 GB de RAM, sin GPU. Repeticiones: 4.848 pares hora a hora en las mismas horas de 2026 para comparar modelos (202 días, del 15 de enero al 5 de agosto) y 5.184 en el contrato completo, muy por encima de 30; la autocorrelación se corrige con la varianza de Newey-West [34]. El walk-forward suma seis orígenes de 5.184 a 8.784 horas. Significancia: α = 0,05.</w:t>
+        <w:t>Instrumento: la serie oficial de precio de XM [4], horaria y con hasta cinco decimales en COP/kWh; su error es despreciable frente a los de pronóstico. Equipo: AMD Ryzen 7 7730U, 15,4 GB de RAM, sin GPU. Repeticiones: 4.848 pares hora a hora en las mismas horas de 2026 para comparar modelos (202 días, del 15 de enero al 5 de agosto) y 5.184 en el contrato completo, muy por encima de 30; la autocorrelación se corrige con la varianza de Newey-West [40]. El walk-forward suma seis orígenes de 5.184 a 8.784 horas. Significancia: α = 0,05.</w:t>
       </w:r>
     </w:p>
     <w:p>
@@ -15765,7 +15765,7 @@
       <w:bookmarkStart w:id="108" w:name="_Toc240440262"/>
       <w:bookmarkStart w:id="109" w:name="_Toc241072137"/>
       <w:bookmarkStart w:id="110" w:name="_Toc241072501"/>
-      <w:bookmarkStart w:id="111" w:name="_Toc243648452"/>
+      <w:bookmarkStart w:id="111" w:name="_Toc243918624"/>
       <w:r>
         <w:t>Marco normativo de las pruebas</w:t>
       </w:r>
@@ -15780,7 +15780,7 @@
         <w:jc w:val="both"/>
       </w:pPr>
       <w:r>
-        <w:t>No existe una norma IEC o IEEE para evaluar pronósticos de precio de electricidad. Se sigue el protocolo del benchmark abierto de Lago et al. [6], referente de la comunidad EPF: evaluación fuera de muestra, referencia ingenua, error relativo y prueba de Diebold-Mariano [7] con varianza HAC [34]; las métricas adimensionales siguen a Hyndman y Koehler [26] y las fechas, la ISO 8601 [20].</w:t>
+        <w:t>No existe una norma IEC o IEEE para evaluar pronósticos de precio de electricidad. Se sigue el protocolo del benchmark abierto de Lago et al. [6], referente de la comunidad EPF: evaluación fuera de muestra, referencia ingenua, error relativo y prueba de Diebold-Mariano [7] con varianza HAC [40]; las métricas adimensionales siguen a Hyndman y Koehler [32] y las fechas, la ISO 8601 [21].</w:t>
       </w:r>
     </w:p>
     <w:p>
@@ -15796,7 +15796,7 @@
       <w:bookmarkStart w:id="112" w:name="_Toc240440263"/>
       <w:bookmarkStart w:id="113" w:name="_Toc241072138"/>
       <w:bookmarkStart w:id="114" w:name="_Toc241072502"/>
-      <w:bookmarkStart w:id="115" w:name="_Toc243648453"/>
+      <w:bookmarkStart w:id="115" w:name="_Toc243918625"/>
       <w:r>
         <w:t>Ejecución del plan experimental</w:t>
       </w:r>
@@ -17639,7 +17639,7 @@
         <w:jc w:val="both"/>
       </w:pPr>
       <w:r>
-        <w:t>La Ecuación 6 es el periodograma de la serie sin tendencia [35]; con f</w:t>
+        <w:t>La Ecuación 6 es el periodograma de la serie sin tendencia [41]; con f</w:t>
       </w:r>
       <w:r>
         <w:rPr>
@@ -17648,7 +17648,7 @@
         <w:t>s</w:t>
       </w:r>
       <w:r>
-        <w:t xml:space="preserve"> = 1 muestra/h, el período en horas es 1/f. El filtro de Savitzky-Golay [36] ajusta en cada ventana de 721 h un polinomio de orden 3 por mínimos cuadrados; en la Ecuación 4, T es el número de horas de entrenamiento. La cobertura es el porcentaje de horas con q10 ≤ y</w:t>
+        <w:t xml:space="preserve"> = 1 muestra/h, el período en horas es 1/f. El filtro de Savitzky-Golay [42] ajusta en cada ventana de 721 h un polinomio de orden 3 por mínimos cuadrados; en la Ecuación 4, T es el número de horas de entrenamiento. La cobertura es el porcentaje de horas con q10 ≤ y</w:t>
       </w:r>
       <w:r>
         <w:rPr>
@@ -17673,7 +17673,7 @@
       <w:bookmarkStart w:id="116" w:name="_Toc240440264"/>
       <w:bookmarkStart w:id="117" w:name="_Toc241072139"/>
       <w:bookmarkStart w:id="118" w:name="_Toc241072503"/>
-      <w:bookmarkStart w:id="119" w:name="_Toc243648454"/>
+      <w:bookmarkStart w:id="119" w:name="_Toc243918626"/>
       <w:r>
         <w:t>Resultados</w:t>
       </w:r>
@@ -17708,7 +17708,7 @@
           <w:noProof/>
         </w:rPr>
         <w:drawing>
-          <wp:inline distT="0" distB="0" distL="0" distR="0" wp14:anchorId="49678AA9" wp14:editId="243F53E2">
+          <wp:inline distT="0" distB="0" distL="0" distR="0" wp14:anchorId="611E9907" wp14:editId="6DE18186">
             <wp:extent cx="4140000" cy="1776493"/>
             <wp:effectExtent l="0" t="0" r="0" b="0"/>
             <wp:docPr id="10" name="Picture 10"/>
@@ -26808,7 +26808,7 @@
           <w:noProof/>
         </w:rPr>
         <w:drawing>
-          <wp:inline distT="0" distB="0" distL="0" distR="0" wp14:anchorId="2C81BA74" wp14:editId="07DAB435">
+          <wp:inline distT="0" distB="0" distL="0" distR="0" wp14:anchorId="7F32E5AA" wp14:editId="5EA1B1DA">
             <wp:extent cx="4482000" cy="1859524"/>
             <wp:effectExtent l="0" t="0" r="0" b="0"/>
             <wp:docPr id="19" name="Picture 19"/>
@@ -26895,7 +26895,7 @@
           <w:noProof/>
         </w:rPr>
         <w:drawing>
-          <wp:inline distT="0" distB="0" distL="0" distR="0" wp14:anchorId="6C401457" wp14:editId="71594B8F">
+          <wp:inline distT="0" distB="0" distL="0" distR="0" wp14:anchorId="7C30E536" wp14:editId="7AD653D5">
             <wp:extent cx="4482000" cy="1859524"/>
             <wp:effectExtent l="0" t="0" r="0" b="0"/>
             <wp:docPr id="20" name="Picture 20"/>
@@ -26978,7 +26978,7 @@
           <w:noProof/>
         </w:rPr>
         <w:drawing>
-          <wp:inline distT="0" distB="0" distL="0" distR="0" wp14:anchorId="09B493D4" wp14:editId="6F97EEA0">
+          <wp:inline distT="0" distB="0" distL="0" distR="0" wp14:anchorId="0B5AFF1A" wp14:editId="3CF95180">
             <wp:extent cx="4482000" cy="1859524"/>
             <wp:effectExtent l="0" t="0" r="0" b="0"/>
             <wp:docPr id="21" name="Picture 21"/>
@@ -28139,7 +28139,7 @@
       <w:bookmarkStart w:id="120" w:name="_Toc240440265"/>
       <w:bookmarkStart w:id="121" w:name="_Toc241072140"/>
       <w:bookmarkStart w:id="122" w:name="_Toc241072504"/>
-      <w:bookmarkStart w:id="123" w:name="_Toc243648455"/>
+      <w:bookmarkStart w:id="123" w:name="_Toc243918627"/>
       <w:r>
         <w:t>Análisis e interpretación de resultados</w:t>
       </w:r>
@@ -28224,7 +28224,7 @@
         <w:t>Interpretabilidad (criterio de OE2).</w:t>
       </w:r>
       <w:r>
-        <w:t xml:space="preserve"> SHAP [27] y permutación sobre XGBoost coinciden en las tres variables más importantes (precio rezagado 24 h, media de 24 h y precio rezagado 168 h; correlación de Spearman entre ambos rankings de 0,811), evidencia cruzada de que el modelo se apoya en las variables que la caracterización de OE1 ya señalaba como dominantes. En el diseño definitivo, el combinador da en promedio un peso de 0,60 al predespacho y de 0,37 al promedio de los CatBoost, de modo que cada pronóstico se puede explicar como el predespacho de XM corregido según el comportamiento reciente del mercado.</w:t>
+        <w:t xml:space="preserve"> SHAP [33] y permutación sobre XGBoost coinciden en las tres variables más importantes (precio rezagado 24 h, media de 24 h y precio rezagado 168 h; correlación de Spearman entre ambos rankings de 0,811), evidencia cruzada de que el modelo se apoya en las variables que la caracterización de OE1 ya señalaba como dominantes. En el diseño definitivo, el combinador da en promedio un peso de 0,60 al predespacho y de 0,37 al promedio de los CatBoost, de modo que cada pronóstico se puede explicar como el predespacho de XM corregido según el comportamiento reciente del mercado.</w:t>
       </w:r>
     </w:p>
     <w:p>
@@ -28261,7 +28261,7 @@
       <w:bookmarkStart w:id="124" w:name="_Toc241072141"/>
       <w:bookmarkStart w:id="125" w:name="_Toc241072505"/>
       <w:bookmarkStart w:id="126" w:name="_Toc240440266"/>
-      <w:bookmarkStart w:id="127" w:name="_Toc243648456"/>
+      <w:bookmarkStart w:id="127" w:name="_Toc243918628"/>
       <w:r>
         <w:t>Análisis de impacto del proyecto</w:t>
       </w:r>
@@ -28283,7 +28283,7 @@
         </w:numPr>
         <w:spacing w:before="300"/>
       </w:pPr>
-      <w:bookmarkStart w:id="128" w:name="_Toc243648457"/>
+      <w:bookmarkStart w:id="128" w:name="_Toc243918629"/>
       <w:r>
         <w:t>Impacto social</w:t>
       </w:r>
@@ -28308,7 +28308,7 @@
         </w:numPr>
         <w:spacing w:before="300"/>
       </w:pPr>
-      <w:bookmarkStart w:id="129" w:name="_Toc243648458"/>
+      <w:bookmarkStart w:id="129" w:name="_Toc243918630"/>
       <w:r>
         <w:t>Impacto ambiental</w:t>
       </w:r>
@@ -28333,7 +28333,7 @@
         </w:numPr>
         <w:spacing w:before="300"/>
       </w:pPr>
-      <w:bookmarkStart w:id="130" w:name="_Toc243648459"/>
+      <w:bookmarkStart w:id="130" w:name="_Toc243918631"/>
       <w:r>
         <w:t>Impacto legal y regulatorio</w:t>
       </w:r>
@@ -28345,7 +28345,7 @@
         <w:jc w:val="both"/>
       </w:pPr>
       <w:r>
-        <w:t>Solo se usa información pública de XM/SIMEM [21], incluido el predespacho ideal que XM publica sin restricción en su portal [39]; no se recolectan datos personales [22] y no se ejecutan transacciones. El pronóstico con predespacho se presenta para decisiones posteriores a su publicación (10:30 de D-1), no para formular ofertas, que cierran a las 08:00 [41]. Ante intervenciones transitorias de la CREG en la formación del precio, los modelos se reentrenan cada mes de forma automática y cada imagen indica la versión del modelo.</w:t>
+        <w:t>Solo se usa información pública de XM/SIMEM [22], incluido el predespacho ideal que XM publica sin restricción en su portal [18]; no se recolectan datos personales [23] y no se ejecutan transacciones. El pronóstico con predespacho se presenta para decisiones posteriores a su publicación (10:30 de D-1), no para formular ofertas, que cierran a las 08:00 [25]. Ante intervenciones transitorias de la CREG en la formación del precio, los modelos se reentrenan cada mes de forma automática y cada imagen indica la versión del modelo.</w:t>
       </w:r>
     </w:p>
     <w:p>
@@ -28358,7 +28358,7 @@
         </w:numPr>
         <w:spacing w:before="300"/>
       </w:pPr>
-      <w:bookmarkStart w:id="131" w:name="_Toc243648460"/>
+      <w:bookmarkStart w:id="131" w:name="_Toc243918632"/>
       <w:r>
         <w:lastRenderedPageBreak/>
         <w:t>Impacto económico y financiero</w:t>
@@ -28387,7 +28387,7 @@
       <w:bookmarkStart w:id="132" w:name="_Toc240440267"/>
       <w:bookmarkStart w:id="133" w:name="_Toc241072142"/>
       <w:bookmarkStart w:id="134" w:name="_Toc241072506"/>
-      <w:bookmarkStart w:id="135" w:name="_Toc243648461"/>
+      <w:bookmarkStart w:id="135" w:name="_Toc243918633"/>
       <w:r>
         <w:t>Conclusiones y recomendaciones</w:t>
       </w:r>
@@ -28447,7 +28447,7 @@
         <w:jc w:val="both"/>
       </w:pPr>
       <w:r>
-        <w:t>Como recomendaciones para una fase siguiente: (1) evaluar el pronóstico y el motor durante más meses de operación, ya que la cobertura de la banda bajó al 74,1 % entre agosto y octubre de 2026, y considerar una ventana de calibración más corta en periodos volátiles; (2) ofrecer un pronóstico sin predespacho para los generadores, que deben ofertar antes de las 08:00 de D-1; (3) estudiar los desfases de nivel diarios del predespacho, que hoy no se anticipan con información pública; (4) incorporar al motor métricas de decisión basadas en la forma del día [8] y evaluar el criterio de estabilidad con más de dos subperiodos o con una formulación de bandits no estacionarios [37]; y (5) ampliar la validación con usuarios a un estudio formal de usabilidad.</w:t>
+        <w:t>Como recomendaciones para una fase siguiente: (1) evaluar el pronóstico y el motor durante más meses de operación, ya que la cobertura de la banda bajó al 74,1 % entre agosto y octubre de 2026, y considerar una ventana de calibración más corta en periodos volátiles; (2) ofrecer un pronóstico sin predespacho para los generadores, que deben ofertar antes de las 08:00 de D-1; (3) estudiar los desfases de nivel diarios del predespacho, que hoy no se anticipan con información pública; (4) incorporar al motor métricas de decisión basadas en la forma del día [8] y evaluar el criterio de estabilidad con más de dos subperiodos o con una formulación de bandits no estacionarios [43]; y (5) ampliar la validación con usuarios a un estudio formal de usabilidad.</w:t>
       </w:r>
     </w:p>
     <w:p>
@@ -28463,7 +28463,7 @@
       <w:bookmarkStart w:id="136" w:name="_Toc240440268"/>
       <w:bookmarkStart w:id="137" w:name="_Toc241072143"/>
       <w:bookmarkStart w:id="138" w:name="_Toc241072507"/>
-      <w:bookmarkStart w:id="139" w:name="_Toc243648462"/>
+      <w:bookmarkStart w:id="139" w:name="_Toc243918634"/>
       <w:r>
         <w:lastRenderedPageBreak/>
         <w:t>Bibliografía (formato IEEE)</w:t>
@@ -29043,6 +29043,28 @@
           <w:szCs w:val="20"/>
         </w:rPr>
         <w:tab/>
+        <w:t>XM S.A. E.S.P., "Informes de despacho: predespacho ideal y despacho programado," biblioteca pública del portal xm.com.co. Consultado: oct. 2026.</w:t>
+      </w:r>
+    </w:p>
+    <w:p>
+      <w:pPr>
+        <w:spacing w:after="80"/>
+        <w:ind w:left="567" w:hanging="567"/>
+      </w:pPr>
+      <w:r>
+        <w:rPr>
+          <w:sz w:val="20"/>
+          <w:szCs w:val="20"/>
+        </w:rPr>
+        <w:lastRenderedPageBreak/>
+        <w:t>[19]</w:t>
+      </w:r>
+      <w:r>
+        <w:rPr>
+          <w:sz w:val="20"/>
+          <w:szCs w:val="20"/>
+        </w:rPr>
+        <w:tab/>
         <w:t xml:space="preserve">Y. Romano, E. Patterson y E. Candès, "Conformalized quantile regression," en </w:t>
       </w:r>
       <w:r>
@@ -29071,8 +29093,7 @@
           <w:sz w:val="20"/>
           <w:szCs w:val="20"/>
         </w:rPr>
-        <w:lastRenderedPageBreak/>
-        <w:t>[19]</w:t>
+        <w:t>[20]</w:t>
       </w:r>
       <w:r>
         <w:rPr>
@@ -29108,7 +29129,7 @@
           <w:sz w:val="20"/>
           <w:szCs w:val="20"/>
         </w:rPr>
-        <w:t>[20]</w:t>
+        <w:t>[21]</w:t>
       </w:r>
       <w:r>
         <w:rPr>
@@ -29144,7 +29165,7 @@
           <w:sz w:val="20"/>
           <w:szCs w:val="20"/>
         </w:rPr>
-        <w:t>[21]</w:t>
+        <w:t>[22]</w:t>
       </w:r>
       <w:r>
         <w:rPr>
@@ -29165,7 +29186,7 @@
           <w:sz w:val="20"/>
           <w:szCs w:val="20"/>
         </w:rPr>
-        <w:t>[22]</w:t>
+        <w:t>[23]</w:t>
       </w:r>
       <w:r>
         <w:rPr>
@@ -29186,7 +29207,7 @@
           <w:sz w:val="20"/>
           <w:szCs w:val="20"/>
         </w:rPr>
-        <w:t>[23]</w:t>
+        <w:t>[24]</w:t>
       </w:r>
       <w:r>
         <w:rPr>
@@ -29222,7 +29243,7 @@
           <w:sz w:val="20"/>
           <w:szCs w:val="20"/>
         </w:rPr>
-        <w:t>[24]</w:t>
+        <w:t>[25]</w:t>
       </w:r>
       <w:r>
         <w:rPr>
@@ -29230,7 +29251,28 @@
           <w:szCs w:val="20"/>
         </w:rPr>
         <w:tab/>
-        <w:t xml:space="preserve">T. Bollerslev, "Generalized autoregressive conditional heteroskedasticity," </w:t>
+        <w:t>Comisión de Regulación de Energía y Gas (CREG), "Resolución CREG 025 de 1995, por la cual se establece el Código de Redes," Bogotá, Colombia, 1995.</w:t>
+      </w:r>
+    </w:p>
+    <w:p>
+      <w:pPr>
+        <w:spacing w:after="80"/>
+        <w:ind w:left="567" w:hanging="567"/>
+      </w:pPr>
+      <w:r>
+        <w:rPr>
+          <w:sz w:val="20"/>
+          <w:szCs w:val="20"/>
+        </w:rPr>
+        <w:t>[26]</w:t>
+      </w:r>
+      <w:r>
+        <w:rPr>
+          <w:sz w:val="20"/>
+          <w:szCs w:val="20"/>
+        </w:rPr>
+        <w:tab/>
+        <w:t xml:space="preserve">T. Chen y C. Guestrin, "XGBoost: A scalable tree boosting system," en </w:t>
       </w:r>
       <w:r>
         <w:rPr>
@@ -29238,14 +29280,14 @@
           <w:sz w:val="20"/>
           <w:szCs w:val="20"/>
         </w:rPr>
-        <w:t>J. Econometrics</w:t>
+        <w:t>Proc. 22nd ACM SIGKDD Int. Conf. Knowl. Discov. Data Min.</w:t>
       </w:r>
       <w:r>
         <w:rPr>
           <w:sz w:val="20"/>
           <w:szCs w:val="20"/>
         </w:rPr>
-        <w:t>, vol. 31, no. 3, pp. 307–327, 1986.</w:t>
+        <w:t>, San Francisco, CA, EE. UU., 2016, pp. 785–794.</w:t>
       </w:r>
     </w:p>
     <w:p>
@@ -29258,7 +29300,7 @@
           <w:sz w:val="20"/>
           <w:szCs w:val="20"/>
         </w:rPr>
-        <w:t>[25]</w:t>
+        <w:t>[27]</w:t>
       </w:r>
       <w:r>
         <w:rPr>
@@ -29266,7 +29308,7 @@
           <w:szCs w:val="20"/>
         </w:rPr>
         <w:tab/>
-        <w:t xml:space="preserve">K. G. Olivares, C. Challu, G. Marcjasz, R. Weron y A. Dubrawski, "Neural basis expansion analysis with exogenous variables: Forecasting electricity prices with NBEATSx," </w:t>
+        <w:t xml:space="preserve">T. Bollerslev, "Generalized autoregressive conditional heteroskedasticity," </w:t>
       </w:r>
       <w:r>
         <w:rPr>
@@ -29274,14 +29316,14 @@
           <w:sz w:val="20"/>
           <w:szCs w:val="20"/>
         </w:rPr>
-        <w:t>Int. J. Forecast.</w:t>
+        <w:t>J. Econometrics</w:t>
       </w:r>
       <w:r>
         <w:rPr>
           <w:sz w:val="20"/>
           <w:szCs w:val="20"/>
         </w:rPr>
-        <w:t>, vol. 39, no. 2, pp. 884–900, 2023, doi: 10.1016/j.ijforecast.2022.03.001.</w:t>
+        <w:t>, vol. 31, no. 3, pp. 307–327, 1986.</w:t>
       </w:r>
     </w:p>
     <w:p>
@@ -29294,7 +29336,7 @@
           <w:sz w:val="20"/>
           <w:szCs w:val="20"/>
         </w:rPr>
-        <w:t>[26]</w:t>
+        <w:t>[28]</w:t>
       </w:r>
       <w:r>
         <w:rPr>
@@ -29302,7 +29344,7 @@
           <w:szCs w:val="20"/>
         </w:rPr>
         <w:tab/>
-        <w:t xml:space="preserve">R. J. Hyndman y A. B. Koehler, "Another look at measures of forecast accuracy," </w:t>
+        <w:t xml:space="preserve">K. G. Olivares, C. Challu, G. Marcjasz, R. Weron y A. Dubrawski, "Neural basis expansion analysis with exogenous variables: Forecasting electricity prices with NBEATSx," </w:t>
       </w:r>
       <w:r>
         <w:rPr>
@@ -29317,7 +29359,7 @@
           <w:sz w:val="20"/>
           <w:szCs w:val="20"/>
         </w:rPr>
-        <w:t>, vol. 22, no. 4, pp. 679–688, 2006, doi: 10.1016/j.ijforecast.2006.03.001.</w:t>
+        <w:t>, vol. 39, no. 2, pp. 884–900, 2023, doi: 10.1016/j.ijforecast.2022.03.001.</w:t>
       </w:r>
     </w:p>
     <w:p>
@@ -29330,7 +29372,7 @@
           <w:sz w:val="20"/>
           <w:szCs w:val="20"/>
         </w:rPr>
-        <w:t>[27]</w:t>
+        <w:t>[29]</w:t>
       </w:r>
       <w:r>
         <w:rPr>
@@ -29338,7 +29380,7 @@
           <w:szCs w:val="20"/>
         </w:rPr>
         <w:tab/>
-        <w:t xml:space="preserve">S. M. Lundberg y S.-I. Lee, "A unified approach to interpreting model predictions," en </w:t>
+        <w:t xml:space="preserve">C. Challu, K. G. Olivares, B. N. Oreshkin, F. Garza Ramírez, M. Mergenthaler Canseco y A. Dubrawski, "NHITS: Neural hierarchical interpolation for time series forecasting," en </w:t>
       </w:r>
       <w:r>
         <w:rPr>
@@ -29346,14 +29388,14 @@
           <w:sz w:val="20"/>
           <w:szCs w:val="20"/>
         </w:rPr>
-        <w:t>Adv. Neural Inf. Process. Syst. 30 (NIPS 2017)</w:t>
+        <w:t>Proc. AAAI Conf. Artif. Intell.</w:t>
       </w:r>
       <w:r>
         <w:rPr>
           <w:sz w:val="20"/>
           <w:szCs w:val="20"/>
         </w:rPr>
-        <w:t>, Long Beach, CA, EE. UU., 2017.</w:t>
+        <w:t>, vol. 37, no. 6, 2023, pp. 6989–6997, doi: 10.1609/aaai.v37i6.25854.</w:t>
       </w:r>
     </w:p>
     <w:p>
@@ -29366,7 +29408,7 @@
           <w:sz w:val="20"/>
           <w:szCs w:val="20"/>
         </w:rPr>
-        <w:t>[28]</w:t>
+        <w:t>[30]</w:t>
       </w:r>
       <w:r>
         <w:rPr>
@@ -29374,7 +29416,7 @@
           <w:szCs w:val="20"/>
         </w:rPr>
         <w:tab/>
-        <w:t xml:space="preserve">T. Chen y C. Guestrin, "XGBoost: A scalable tree boosting system," en </w:t>
+        <w:t xml:space="preserve">D. B. Nelson, "Conditional heteroskedasticity in asset returns: A new approach," </w:t>
       </w:r>
       <w:r>
         <w:rPr>
@@ -29382,14 +29424,14 @@
           <w:sz w:val="20"/>
           <w:szCs w:val="20"/>
         </w:rPr>
-        <w:t>Proc. 22nd ACM SIGKDD Int. Conf. Knowl. Discov. Data Min.</w:t>
+        <w:t>Econometrica</w:t>
       </w:r>
       <w:r>
         <w:rPr>
           <w:sz w:val="20"/>
           <w:szCs w:val="20"/>
         </w:rPr>
-        <w:t>, San Francisco, CA, EE. UU., 2016, pp. 785–794.</w:t>
+        <w:t>, vol. 59, no. 2, pp. 347–370, 1991.</w:t>
       </w:r>
     </w:p>
     <w:p>
@@ -29402,7 +29444,7 @@
           <w:sz w:val="20"/>
           <w:szCs w:val="20"/>
         </w:rPr>
-        <w:t>[29]</w:t>
+        <w:t>[31]</w:t>
       </w:r>
       <w:r>
         <w:rPr>
@@ -29410,7 +29452,28 @@
           <w:szCs w:val="20"/>
         </w:rPr>
         <w:tab/>
-        <w:t xml:space="preserve">C. Challu, K. G. Olivares, B. N. Oreshkin, F. Garza Ramírez, M. Mergenthaler Canseco y A. Dubrawski, "NHITS: Neural hierarchical interpolation for time series forecasting," en </w:t>
+        <w:t>L. Prokhorenkova, G. Gusev, A. Vorobev, A. V. Dorogush y A. Gulin, "CatBoost: unbiased boosting with categorical features," en Adv. Neural Inf. Process. Syst. 31 (NeurIPS 2018), Montreal, Canadá, 2018.</w:t>
+      </w:r>
+    </w:p>
+    <w:p>
+      <w:pPr>
+        <w:spacing w:after="80"/>
+        <w:ind w:left="567" w:hanging="567"/>
+      </w:pPr>
+      <w:r>
+        <w:rPr>
+          <w:sz w:val="20"/>
+          <w:szCs w:val="20"/>
+        </w:rPr>
+        <w:t>[32]</w:t>
+      </w:r>
+      <w:r>
+        <w:rPr>
+          <w:sz w:val="20"/>
+          <w:szCs w:val="20"/>
+        </w:rPr>
+        <w:tab/>
+        <w:t xml:space="preserve">R. J. Hyndman y A. B. Koehler, "Another look at measures of forecast accuracy," </w:t>
       </w:r>
       <w:r>
         <w:rPr>
@@ -29418,14 +29481,14 @@
           <w:sz w:val="20"/>
           <w:szCs w:val="20"/>
         </w:rPr>
-        <w:t>Proc. AAAI Conf. Artif. Intell.</w:t>
+        <w:t>Int. J. Forecast.</w:t>
       </w:r>
       <w:r>
         <w:rPr>
           <w:sz w:val="20"/>
           <w:szCs w:val="20"/>
         </w:rPr>
-        <w:t>, vol. 37, no. 6, 2023, pp. 6989–6997, doi: 10.1609/aaai.v37i6.25854.</w:t>
+        <w:t>, vol. 22, no. 4, pp. 679–688, 2006, doi: 10.1016/j.ijforecast.2006.03.001.</w:t>
       </w:r>
     </w:p>
     <w:p>
@@ -29438,7 +29501,7 @@
           <w:sz w:val="20"/>
           <w:szCs w:val="20"/>
         </w:rPr>
-        <w:t>[30]</w:t>
+        <w:t>[33]</w:t>
       </w:r>
       <w:r>
         <w:rPr>
@@ -29446,7 +29509,7 @@
           <w:szCs w:val="20"/>
         </w:rPr>
         <w:tab/>
-        <w:t xml:space="preserve">D. B. Nelson, "Conditional heteroskedasticity in asset returns: A new approach," </w:t>
+        <w:t xml:space="preserve">S. M. Lundberg y S.-I. Lee, "A unified approach to interpreting model predictions," en </w:t>
       </w:r>
       <w:r>
         <w:rPr>
@@ -29454,14 +29517,14 @@
           <w:sz w:val="20"/>
           <w:szCs w:val="20"/>
         </w:rPr>
-        <w:t>Econometrica</w:t>
+        <w:t>Adv. Neural Inf. Process. Syst. 30 (NIPS 2017)</w:t>
       </w:r>
       <w:r>
         <w:rPr>
           <w:sz w:val="20"/>
           <w:szCs w:val="20"/>
         </w:rPr>
-        <w:t>, vol. 59, no. 2, pp. 347–370, 1991.</w:t>
+        <w:t>, Long Beach, CA, EE. UU., 2017.</w:t>
       </w:r>
     </w:p>
     <w:p>
@@ -29474,7 +29537,70 @@
           <w:sz w:val="20"/>
           <w:szCs w:val="20"/>
         </w:rPr>
-        <w:t>[31]</w:t>
+        <w:t>[34]</w:t>
+      </w:r>
+      <w:r>
+        <w:rPr>
+          <w:sz w:val="20"/>
+          <w:szCs w:val="20"/>
+        </w:rPr>
+        <w:tab/>
+        <w:t>Comisión de Regulación de Energía y Gas (CREG), "Resolución CREG 178 de 2015, por la cual se establecen medidas para garantizar la prestación del servicio público de energía eléctrica," Bogotá, Colombia, 27 de octubre de 2015.</w:t>
+      </w:r>
+    </w:p>
+    <w:p>
+      <w:pPr>
+        <w:spacing w:after="80"/>
+        <w:ind w:left="567" w:hanging="567"/>
+      </w:pPr>
+      <w:r>
+        <w:rPr>
+          <w:sz w:val="20"/>
+          <w:szCs w:val="20"/>
+        </w:rPr>
+        <w:t>[35]</w:t>
+      </w:r>
+      <w:r>
+        <w:rPr>
+          <w:sz w:val="20"/>
+          <w:szCs w:val="20"/>
+        </w:rPr>
+        <w:tab/>
+        <w:t>Comisión de Regulación de Energía y Gas (CREG), "Resolución CREG 140 de 2017, por la cual se define el precio marginal de escasez del Cargo por Confiabilidad y se hacen modificaciones a la Resolución CREG 071 de 2006," Bogotá, Colombia, 2017.</w:t>
+      </w:r>
+    </w:p>
+    <w:p>
+      <w:pPr>
+        <w:spacing w:after="80"/>
+        <w:ind w:left="567" w:hanging="567"/>
+      </w:pPr>
+      <w:r>
+        <w:rPr>
+          <w:sz w:val="20"/>
+          <w:szCs w:val="20"/>
+        </w:rPr>
+        <w:t>[36]</w:t>
+      </w:r>
+      <w:r>
+        <w:rPr>
+          <w:sz w:val="20"/>
+          <w:szCs w:val="20"/>
+        </w:rPr>
+        <w:tab/>
+        <w:t>V. Vovk, A. Gammerman y G. Shafer, Algorithmic Learning in a Random World, 2.ª ed. Cham, Suiza: Springer, 2022.</w:t>
+      </w:r>
+    </w:p>
+    <w:p>
+      <w:pPr>
+        <w:spacing w:after="80"/>
+        <w:ind w:left="567" w:hanging="567"/>
+      </w:pPr>
+      <w:r>
+        <w:rPr>
+          <w:sz w:val="20"/>
+          <w:szCs w:val="20"/>
+        </w:rPr>
+        <w:t>[37]</w:t>
       </w:r>
       <w:r>
         <w:rPr>
@@ -29510,7 +29636,7 @@
           <w:sz w:val="20"/>
           <w:szCs w:val="20"/>
         </w:rPr>
-        <w:t>[32]</w:t>
+        <w:t>[38]</w:t>
       </w:r>
       <w:r>
         <w:rPr>
@@ -29546,7 +29672,7 @@
           <w:sz w:val="20"/>
           <w:szCs w:val="20"/>
         </w:rPr>
-        <w:t>[33]</w:t>
+        <w:t>[39]</w:t>
       </w:r>
       <w:r>
         <w:rPr>
@@ -29582,7 +29708,7 @@
           <w:sz w:val="20"/>
           <w:szCs w:val="20"/>
         </w:rPr>
-        <w:t>[34]</w:t>
+        <w:t>[40]</w:t>
       </w:r>
       <w:r>
         <w:rPr>
@@ -29618,7 +29744,8 @@
           <w:sz w:val="20"/>
           <w:szCs w:val="20"/>
         </w:rPr>
-        <w:t>[35]</w:t>
+        <w:lastRenderedPageBreak/>
+        <w:t>[41]</w:t>
       </w:r>
       <w:r>
         <w:rPr>
@@ -29654,7 +29781,7 @@
           <w:sz w:val="20"/>
           <w:szCs w:val="20"/>
         </w:rPr>
-        <w:t>[36]</w:t>
+        <w:t>[42]</w:t>
       </w:r>
       <w:r>
         <w:rPr>
@@ -29690,7 +29817,7 @@
           <w:sz w:val="20"/>
           <w:szCs w:val="20"/>
         </w:rPr>
-        <w:t>[37]</w:t>
+        <w:t>[43]</w:t>
       </w:r>
       <w:r>
         <w:rPr>
@@ -29714,133 +29841,6 @@
           <w:szCs w:val="20"/>
         </w:rPr>
         <w:t>, LNCS, vol. 6925. Berlín, Alemania: Springer, 2011, pp. 174–188.</w:t>
-      </w:r>
-    </w:p>
-    <w:p>
-      <w:pPr>
-        <w:spacing w:after="80"/>
-        <w:ind w:left="567" w:hanging="567"/>
-      </w:pPr>
-      <w:r>
-        <w:rPr>
-          <w:sz w:val="20"/>
-          <w:szCs w:val="20"/>
-        </w:rPr>
-        <w:t>[38]</w:t>
-      </w:r>
-      <w:r>
-        <w:rPr>
-          <w:sz w:val="20"/>
-          <w:szCs w:val="20"/>
-        </w:rPr>
-        <w:tab/>
-        <w:t>L. Prokhorenkova, G. Gusev, A. Vorobev, A. V. Dorogush y A. Gulin, "CatBoost: unbiased boosting with categorical features," en Adv. Neural Inf. Process. Syst. 31 (NeurIPS 2018), Montreal, Canadá, 2018.</w:t>
-      </w:r>
-    </w:p>
-    <w:p>
-      <w:pPr>
-        <w:spacing w:after="80"/>
-        <w:ind w:left="567" w:hanging="567"/>
-      </w:pPr>
-      <w:r>
-        <w:rPr>
-          <w:sz w:val="20"/>
-          <w:szCs w:val="20"/>
-        </w:rPr>
-        <w:t>[39]</w:t>
-      </w:r>
-      <w:r>
-        <w:rPr>
-          <w:sz w:val="20"/>
-          <w:szCs w:val="20"/>
-        </w:rPr>
-        <w:tab/>
-        <w:t>XM S.A. E.S.P., "Informes de despacho: predespacho ideal y despacho programado," biblioteca pública del portal xm.com.co. Consultado: oct. 2026.</w:t>
-      </w:r>
-    </w:p>
-    <w:p>
-      <w:pPr>
-        <w:spacing w:after="80"/>
-        <w:ind w:left="567" w:hanging="567"/>
-      </w:pPr>
-      <w:r>
-        <w:rPr>
-          <w:sz w:val="20"/>
-          <w:szCs w:val="20"/>
-        </w:rPr>
-        <w:t>[40]</w:t>
-      </w:r>
-      <w:r>
-        <w:rPr>
-          <w:sz w:val="20"/>
-          <w:szCs w:val="20"/>
-        </w:rPr>
-        <w:tab/>
-        <w:t>V. Vovk, A. Gammerman y G. Shafer, Algorithmic Learning in a Random World. Nueva York, NY, EE. UU.: Springer, 2005.</w:t>
-      </w:r>
-    </w:p>
-    <w:p>
-      <w:pPr>
-        <w:spacing w:after="80"/>
-        <w:ind w:left="567" w:hanging="567"/>
-      </w:pPr>
-      <w:r>
-        <w:rPr>
-          <w:sz w:val="20"/>
-          <w:szCs w:val="20"/>
-        </w:rPr>
-        <w:lastRenderedPageBreak/>
-        <w:t>[41]</w:t>
-      </w:r>
-      <w:r>
-        <w:rPr>
-          <w:sz w:val="20"/>
-          <w:szCs w:val="20"/>
-        </w:rPr>
-        <w:tab/>
-        <w:t>Comisión de Regulación de Energía y Gas (CREG), "Resolución CREG 025 de 1995, por la cual se establece el Código de Redes," Bogotá, Colombia, 1995.</w:t>
-      </w:r>
-    </w:p>
-    <w:p>
-      <w:pPr>
-        <w:spacing w:after="80"/>
-        <w:ind w:left="567" w:hanging="567"/>
-      </w:pPr>
-      <w:r>
-        <w:rPr>
-          <w:sz w:val="20"/>
-          <w:szCs w:val="20"/>
-        </w:rPr>
-        <w:t>[42]</w:t>
-      </w:r>
-      <w:r>
-        <w:rPr>
-          <w:sz w:val="20"/>
-          <w:szCs w:val="20"/>
-        </w:rPr>
-        <w:tab/>
-        <w:t>Comisión de Regulación de Energía y Gas (CREG), "Resolución CREG 178 de 2015, por la cual se establecen medidas para garantizar la prestación del servicio público de energía eléctrica," Bogotá, Colombia, 27 de octubre de 2015.</w:t>
-      </w:r>
-    </w:p>
-    <w:p>
-      <w:pPr>
-        <w:spacing w:after="80"/>
-        <w:ind w:left="567" w:hanging="567"/>
-      </w:pPr>
-      <w:r>
-        <w:rPr>
-          <w:sz w:val="20"/>
-          <w:szCs w:val="20"/>
-        </w:rPr>
-        <w:t>[43]</w:t>
-      </w:r>
-      <w:r>
-        <w:rPr>
-          <w:sz w:val="20"/>
-          <w:szCs w:val="20"/>
-        </w:rPr>
-        <w:tab/>
-        <w:t>Comisión de Regulación de Energía y Gas (CREG), "Resolución CREG 140 de 2017, por la cual se define el precio marginal de escasez del Cargo por Confiabilidad y se hacen modificaciones a la Resolución CREG 071 de 2006," Bogotá, Colombia, 2017.</w:t>
       </w:r>
     </w:p>
     <w:p>
@@ -29856,7 +29856,7 @@
       <w:bookmarkStart w:id="140" w:name="_Toc240440270"/>
       <w:bookmarkStart w:id="141" w:name="_Toc241072144"/>
       <w:bookmarkStart w:id="142" w:name="_Toc241072508"/>
-      <w:bookmarkStart w:id="143" w:name="_Toc243648463"/>
+      <w:bookmarkStart w:id="143" w:name="_Toc243918635"/>
       <w:r>
         <w:t>Anexos</w:t>
       </w:r>

</xml_diff>

<commit_message>
Validacion de todo 2026 en la app (en vivo) y en el informe final; enlace del video en el anexo 8
- Metodologia: la tarjeta de validacion agrega todo 2026 hasta el ultimo precio publicado, con el mismo
  predespacho de referencia del informe (el disponible al corte).
- Informe final: frase con todo 2026 hasta el 11-oct, el mismo corte de la operacion que ya reporta
  (informe_final_todo2026.py -> cifras_todo2026.json): MAE 37,0, 9 % menor que el predespacho, DM p < 0,001.
- Anexo 8: enlace del video en YouTube.

Co-Authored-By: Claude Opus 5.5 <noreply@anthropic.com>
</commit_message>
<xml_diff>
--- a/docs/Informe_Final_ABET_Barcelo_Dede.docx
+++ b/docs/Informe_Final_ABET_Barcelo_Dede.docx
@@ -192,7 +192,7 @@
       <w:bookmarkStart w:id="0" w:name="_Toc240440229"/>
       <w:bookmarkStart w:id="1" w:name="_Toc241072106"/>
       <w:bookmarkStart w:id="2" w:name="_Toc241072472"/>
-      <w:bookmarkStart w:id="3" w:name="_Toc243918597"/>
+      <w:bookmarkStart w:id="3" w:name="_Toc243929925"/>
       <w:r>
         <w:lastRenderedPageBreak/>
         <w:t>Tabla de contenido</w:t>
@@ -228,7 +228,7 @@
       <w:r>
         <w:fldChar w:fldCharType="separate"/>
       </w:r>
-      <w:hyperlink w:anchor="_Toc243918597" w:history="1">
+      <w:hyperlink w:anchor="_Toc243929925" w:history="1">
         <w:r>
           <w:rPr>
             <w:rStyle w:val="Hyperlink"/>
@@ -255,7 +255,7 @@
             <w:noProof/>
             <w:webHidden/>
           </w:rPr>
-          <w:instrText xml:space="preserve"> PAGEREF _Toc243918597 \h </w:instrText>
+          <w:instrText xml:space="preserve"> PAGEREF _Toc243929925 \h </w:instrText>
         </w:r>
         <w:r>
           <w:rPr>
@@ -304,7 +304,7 @@
           <w:lang w:eastAsia="es-CO"/>
         </w:rPr>
       </w:pPr>
-      <w:hyperlink w:anchor="_Toc243918598" w:history="1">
+      <w:hyperlink w:anchor="_Toc243929926" w:history="1">
         <w:r>
           <w:rPr>
             <w:rStyle w:val="Hyperlink"/>
@@ -351,7 +351,7 @@
             <w:noProof/>
             <w:webHidden/>
           </w:rPr>
-          <w:instrText xml:space="preserve"> PAGEREF _Toc243918598 \h </w:instrText>
+          <w:instrText xml:space="preserve"> PAGEREF _Toc243929926 \h </w:instrText>
         </w:r>
         <w:r>
           <w:rPr>
@@ -398,7 +398,7 @@
           <w:lang w:eastAsia="es-CO"/>
         </w:rPr>
       </w:pPr>
-      <w:hyperlink w:anchor="_Toc243918599" w:history="1">
+      <w:hyperlink w:anchor="_Toc243929927" w:history="1">
         <w:r>
           <w:rPr>
             <w:rStyle w:val="Hyperlink"/>
@@ -443,7 +443,7 @@
             <w:noProof/>
             <w:webHidden/>
           </w:rPr>
-          <w:instrText xml:space="preserve"> PAGEREF _Toc243918599 \h </w:instrText>
+          <w:instrText xml:space="preserve"> PAGEREF _Toc243929927 \h </w:instrText>
         </w:r>
         <w:r>
           <w:rPr>
@@ -490,7 +490,7 @@
           <w:lang w:eastAsia="es-CO"/>
         </w:rPr>
       </w:pPr>
-      <w:hyperlink w:anchor="_Toc243918600" w:history="1">
+      <w:hyperlink w:anchor="_Toc243929928" w:history="1">
         <w:r>
           <w:rPr>
             <w:rStyle w:val="Hyperlink"/>
@@ -535,7 +535,7 @@
             <w:noProof/>
             <w:webHidden/>
           </w:rPr>
-          <w:instrText xml:space="preserve"> PAGEREF _Toc243918600 \h </w:instrText>
+          <w:instrText xml:space="preserve"> PAGEREF _Toc243929928 \h </w:instrText>
         </w:r>
         <w:r>
           <w:rPr>
@@ -582,7 +582,7 @@
           <w:lang w:eastAsia="es-CO"/>
         </w:rPr>
       </w:pPr>
-      <w:hyperlink w:anchor="_Toc243918601" w:history="1">
+      <w:hyperlink w:anchor="_Toc243929929" w:history="1">
         <w:r>
           <w:rPr>
             <w:rStyle w:val="Hyperlink"/>
@@ -627,7 +627,7 @@
             <w:noProof/>
             <w:webHidden/>
           </w:rPr>
-          <w:instrText xml:space="preserve"> PAGEREF _Toc243918601 \h </w:instrText>
+          <w:instrText xml:space="preserve"> PAGEREF _Toc243929929 \h </w:instrText>
         </w:r>
         <w:r>
           <w:rPr>
@@ -676,7 +676,7 @@
           <w:lang w:eastAsia="es-CO"/>
         </w:rPr>
       </w:pPr>
-      <w:hyperlink w:anchor="_Toc243918602" w:history="1">
+      <w:hyperlink w:anchor="_Toc243929930" w:history="1">
         <w:r>
           <w:rPr>
             <w:rStyle w:val="Hyperlink"/>
@@ -723,7 +723,7 @@
             <w:noProof/>
             <w:webHidden/>
           </w:rPr>
-          <w:instrText xml:space="preserve"> PAGEREF _Toc243918602 \h </w:instrText>
+          <w:instrText xml:space="preserve"> PAGEREF _Toc243929930 \h </w:instrText>
         </w:r>
         <w:r>
           <w:rPr>
@@ -772,7 +772,7 @@
           <w:lang w:eastAsia="es-CO"/>
         </w:rPr>
       </w:pPr>
-      <w:hyperlink w:anchor="_Toc243918603" w:history="1">
+      <w:hyperlink w:anchor="_Toc243929931" w:history="1">
         <w:r>
           <w:rPr>
             <w:rStyle w:val="Hyperlink"/>
@@ -819,7 +819,7 @@
             <w:noProof/>
             <w:webHidden/>
           </w:rPr>
-          <w:instrText xml:space="preserve"> PAGEREF _Toc243918603 \h </w:instrText>
+          <w:instrText xml:space="preserve"> PAGEREF _Toc243929931 \h </w:instrText>
         </w:r>
         <w:r>
           <w:rPr>
@@ -866,7 +866,7 @@
           <w:lang w:eastAsia="es-CO"/>
         </w:rPr>
       </w:pPr>
-      <w:hyperlink w:anchor="_Toc243918604" w:history="1">
+      <w:hyperlink w:anchor="_Toc243929932" w:history="1">
         <w:r>
           <w:rPr>
             <w:rStyle w:val="Hyperlink"/>
@@ -911,7 +911,7 @@
             <w:noProof/>
             <w:webHidden/>
           </w:rPr>
-          <w:instrText xml:space="preserve"> PAGEREF _Toc243918604 \h </w:instrText>
+          <w:instrText xml:space="preserve"> PAGEREF _Toc243929932 \h </w:instrText>
         </w:r>
         <w:r>
           <w:rPr>
@@ -958,7 +958,7 @@
           <w:lang w:eastAsia="es-CO"/>
         </w:rPr>
       </w:pPr>
-      <w:hyperlink w:anchor="_Toc243918605" w:history="1">
+      <w:hyperlink w:anchor="_Toc243929933" w:history="1">
         <w:r>
           <w:rPr>
             <w:rStyle w:val="Hyperlink"/>
@@ -1003,7 +1003,7 @@
             <w:noProof/>
             <w:webHidden/>
           </w:rPr>
-          <w:instrText xml:space="preserve"> PAGEREF _Toc243918605 \h </w:instrText>
+          <w:instrText xml:space="preserve"> PAGEREF _Toc243929933 \h </w:instrText>
         </w:r>
         <w:r>
           <w:rPr>
@@ -1052,7 +1052,7 @@
           <w:lang w:eastAsia="es-CO"/>
         </w:rPr>
       </w:pPr>
-      <w:hyperlink w:anchor="_Toc243918606" w:history="1">
+      <w:hyperlink w:anchor="_Toc243929934" w:history="1">
         <w:r>
           <w:rPr>
             <w:rStyle w:val="Hyperlink"/>
@@ -1099,7 +1099,7 @@
             <w:noProof/>
             <w:webHidden/>
           </w:rPr>
-          <w:instrText xml:space="preserve"> PAGEREF _Toc243918606 \h </w:instrText>
+          <w:instrText xml:space="preserve"> PAGEREF _Toc243929934 \h </w:instrText>
         </w:r>
         <w:r>
           <w:rPr>
@@ -1146,7 +1146,7 @@
           <w:lang w:eastAsia="es-CO"/>
         </w:rPr>
       </w:pPr>
-      <w:hyperlink w:anchor="_Toc243918607" w:history="1">
+      <w:hyperlink w:anchor="_Toc243929935" w:history="1">
         <w:r>
           <w:rPr>
             <w:rStyle w:val="Hyperlink"/>
@@ -1191,7 +1191,7 @@
             <w:noProof/>
             <w:webHidden/>
           </w:rPr>
-          <w:instrText xml:space="preserve"> PAGEREF _Toc243918607 \h </w:instrText>
+          <w:instrText xml:space="preserve"> PAGEREF _Toc243929935 \h </w:instrText>
         </w:r>
         <w:r>
           <w:rPr>
@@ -1238,7 +1238,7 @@
           <w:lang w:eastAsia="es-CO"/>
         </w:rPr>
       </w:pPr>
-      <w:hyperlink w:anchor="_Toc243918608" w:history="1">
+      <w:hyperlink w:anchor="_Toc243929936" w:history="1">
         <w:r>
           <w:rPr>
             <w:rStyle w:val="Hyperlink"/>
@@ -1283,7 +1283,7 @@
             <w:noProof/>
             <w:webHidden/>
           </w:rPr>
-          <w:instrText xml:space="preserve"> PAGEREF _Toc243918608 \h </w:instrText>
+          <w:instrText xml:space="preserve"> PAGEREF _Toc243929936 \h </w:instrText>
         </w:r>
         <w:r>
           <w:rPr>
@@ -1330,7 +1330,7 @@
           <w:lang w:eastAsia="es-CO"/>
         </w:rPr>
       </w:pPr>
-      <w:hyperlink w:anchor="_Toc243918609" w:history="1">
+      <w:hyperlink w:anchor="_Toc243929937" w:history="1">
         <w:r>
           <w:rPr>
             <w:rStyle w:val="Hyperlink"/>
@@ -1375,7 +1375,7 @@
             <w:noProof/>
             <w:webHidden/>
           </w:rPr>
-          <w:instrText xml:space="preserve"> PAGEREF _Toc243918609 \h </w:instrText>
+          <w:instrText xml:space="preserve"> PAGEREF _Toc243929937 \h </w:instrText>
         </w:r>
         <w:r>
           <w:rPr>
@@ -1424,7 +1424,7 @@
           <w:lang w:eastAsia="es-CO"/>
         </w:rPr>
       </w:pPr>
-      <w:hyperlink w:anchor="_Toc243918610" w:history="1">
+      <w:hyperlink w:anchor="_Toc243929938" w:history="1">
         <w:r>
           <w:rPr>
             <w:rStyle w:val="Hyperlink"/>
@@ -1471,7 +1471,7 @@
             <w:noProof/>
             <w:webHidden/>
           </w:rPr>
-          <w:instrText xml:space="preserve"> PAGEREF _Toc243918610 \h </w:instrText>
+          <w:instrText xml:space="preserve"> PAGEREF _Toc243929938 \h </w:instrText>
         </w:r>
         <w:r>
           <w:rPr>
@@ -1518,7 +1518,7 @@
           <w:lang w:eastAsia="es-CO"/>
         </w:rPr>
       </w:pPr>
-      <w:hyperlink w:anchor="_Toc243918611" w:history="1">
+      <w:hyperlink w:anchor="_Toc243929939" w:history="1">
         <w:r>
           <w:rPr>
             <w:rStyle w:val="Hyperlink"/>
@@ -1563,7 +1563,7 @@
             <w:noProof/>
             <w:webHidden/>
           </w:rPr>
-          <w:instrText xml:space="preserve"> PAGEREF _Toc243918611 \h </w:instrText>
+          <w:instrText xml:space="preserve"> PAGEREF _Toc243929939 \h </w:instrText>
         </w:r>
         <w:r>
           <w:rPr>
@@ -1610,7 +1610,7 @@
           <w:lang w:eastAsia="es-CO"/>
         </w:rPr>
       </w:pPr>
-      <w:hyperlink w:anchor="_Toc243918612" w:history="1">
+      <w:hyperlink w:anchor="_Toc243929940" w:history="1">
         <w:r>
           <w:rPr>
             <w:rStyle w:val="Hyperlink"/>
@@ -1655,7 +1655,7 @@
             <w:noProof/>
             <w:webHidden/>
           </w:rPr>
-          <w:instrText xml:space="preserve"> PAGEREF _Toc243918612 \h </w:instrText>
+          <w:instrText xml:space="preserve"> PAGEREF _Toc243929940 \h </w:instrText>
         </w:r>
         <w:r>
           <w:rPr>
@@ -1704,7 +1704,7 @@
           <w:lang w:eastAsia="es-CO"/>
         </w:rPr>
       </w:pPr>
-      <w:hyperlink w:anchor="_Toc243918613" w:history="1">
+      <w:hyperlink w:anchor="_Toc243929941" w:history="1">
         <w:r>
           <w:rPr>
             <w:rStyle w:val="Hyperlink"/>
@@ -1751,7 +1751,7 @@
             <w:noProof/>
             <w:webHidden/>
           </w:rPr>
-          <w:instrText xml:space="preserve"> PAGEREF _Toc243918613 \h </w:instrText>
+          <w:instrText xml:space="preserve"> PAGEREF _Toc243929941 \h </w:instrText>
         </w:r>
         <w:r>
           <w:rPr>
@@ -1798,7 +1798,7 @@
           <w:lang w:eastAsia="es-CO"/>
         </w:rPr>
       </w:pPr>
-      <w:hyperlink w:anchor="_Toc243918614" w:history="1">
+      <w:hyperlink w:anchor="_Toc243929942" w:history="1">
         <w:r>
           <w:rPr>
             <w:rStyle w:val="Hyperlink"/>
@@ -1843,7 +1843,7 @@
             <w:noProof/>
             <w:webHidden/>
           </w:rPr>
-          <w:instrText xml:space="preserve"> PAGEREF _Toc243918614 \h </w:instrText>
+          <w:instrText xml:space="preserve"> PAGEREF _Toc243929942 \h </w:instrText>
         </w:r>
         <w:r>
           <w:rPr>
@@ -1890,7 +1890,7 @@
           <w:lang w:eastAsia="es-CO"/>
         </w:rPr>
       </w:pPr>
-      <w:hyperlink w:anchor="_Toc243918615" w:history="1">
+      <w:hyperlink w:anchor="_Toc243929943" w:history="1">
         <w:r>
           <w:rPr>
             <w:rStyle w:val="Hyperlink"/>
@@ -1935,7 +1935,7 @@
             <w:noProof/>
             <w:webHidden/>
           </w:rPr>
-          <w:instrText xml:space="preserve"> PAGEREF _Toc243918615 \h </w:instrText>
+          <w:instrText xml:space="preserve"> PAGEREF _Toc243929943 \h </w:instrText>
         </w:r>
         <w:r>
           <w:rPr>
@@ -1982,7 +1982,7 @@
           <w:lang w:eastAsia="es-CO"/>
         </w:rPr>
       </w:pPr>
-      <w:hyperlink w:anchor="_Toc243918616" w:history="1">
+      <w:hyperlink w:anchor="_Toc243929944" w:history="1">
         <w:r>
           <w:rPr>
             <w:rStyle w:val="Hyperlink"/>
@@ -2027,7 +2027,7 @@
             <w:noProof/>
             <w:webHidden/>
           </w:rPr>
-          <w:instrText xml:space="preserve"> PAGEREF _Toc243918616 \h </w:instrText>
+          <w:instrText xml:space="preserve"> PAGEREF _Toc243929944 \h </w:instrText>
         </w:r>
         <w:r>
           <w:rPr>
@@ -2074,7 +2074,7 @@
           <w:lang w:eastAsia="es-CO"/>
         </w:rPr>
       </w:pPr>
-      <w:hyperlink w:anchor="_Toc243918617" w:history="1">
+      <w:hyperlink w:anchor="_Toc243929945" w:history="1">
         <w:r>
           <w:rPr>
             <w:rStyle w:val="Hyperlink"/>
@@ -2119,7 +2119,7 @@
             <w:noProof/>
             <w:webHidden/>
           </w:rPr>
-          <w:instrText xml:space="preserve"> PAGEREF _Toc243918617 \h </w:instrText>
+          <w:instrText xml:space="preserve"> PAGEREF _Toc243929945 \h </w:instrText>
         </w:r>
         <w:r>
           <w:rPr>
@@ -2166,7 +2166,7 @@
           <w:lang w:eastAsia="es-CO"/>
         </w:rPr>
       </w:pPr>
-      <w:hyperlink w:anchor="_Toc243918618" w:history="1">
+      <w:hyperlink w:anchor="_Toc243929946" w:history="1">
         <w:r>
           <w:rPr>
             <w:rStyle w:val="Hyperlink"/>
@@ -2211,7 +2211,7 @@
             <w:noProof/>
             <w:webHidden/>
           </w:rPr>
-          <w:instrText xml:space="preserve"> PAGEREF _Toc243918618 \h </w:instrText>
+          <w:instrText xml:space="preserve"> PAGEREF _Toc243929946 \h </w:instrText>
         </w:r>
         <w:r>
           <w:rPr>
@@ -2258,7 +2258,7 @@
           <w:lang w:eastAsia="es-CO"/>
         </w:rPr>
       </w:pPr>
-      <w:hyperlink w:anchor="_Toc243918619" w:history="1">
+      <w:hyperlink w:anchor="_Toc243929947" w:history="1">
         <w:r>
           <w:rPr>
             <w:rStyle w:val="Hyperlink"/>
@@ -2303,7 +2303,7 @@
             <w:noProof/>
             <w:webHidden/>
           </w:rPr>
-          <w:instrText xml:space="preserve"> PAGEREF _Toc243918619 \h </w:instrText>
+          <w:instrText xml:space="preserve"> PAGEREF _Toc243929947 \h </w:instrText>
         </w:r>
         <w:r>
           <w:rPr>
@@ -2350,7 +2350,7 @@
           <w:lang w:eastAsia="es-CO"/>
         </w:rPr>
       </w:pPr>
-      <w:hyperlink w:anchor="_Toc243918620" w:history="1">
+      <w:hyperlink w:anchor="_Toc243929948" w:history="1">
         <w:r>
           <w:rPr>
             <w:rStyle w:val="Hyperlink"/>
@@ -2395,7 +2395,7 @@
             <w:noProof/>
             <w:webHidden/>
           </w:rPr>
-          <w:instrText xml:space="preserve"> PAGEREF _Toc243918620 \h </w:instrText>
+          <w:instrText xml:space="preserve"> PAGEREF _Toc243929948 \h </w:instrText>
         </w:r>
         <w:r>
           <w:rPr>
@@ -2444,7 +2444,7 @@
           <w:lang w:eastAsia="es-CO"/>
         </w:rPr>
       </w:pPr>
-      <w:hyperlink w:anchor="_Toc243918621" w:history="1">
+      <w:hyperlink w:anchor="_Toc243929949" w:history="1">
         <w:r>
           <w:rPr>
             <w:rStyle w:val="Hyperlink"/>
@@ -2491,7 +2491,7 @@
             <w:noProof/>
             <w:webHidden/>
           </w:rPr>
-          <w:instrText xml:space="preserve"> PAGEREF _Toc243918621 \h </w:instrText>
+          <w:instrText xml:space="preserve"> PAGEREF _Toc243929949 \h </w:instrText>
         </w:r>
         <w:r>
           <w:rPr>
@@ -2538,7 +2538,7 @@
           <w:lang w:eastAsia="es-CO"/>
         </w:rPr>
       </w:pPr>
-      <w:hyperlink w:anchor="_Toc243918622" w:history="1">
+      <w:hyperlink w:anchor="_Toc243929950" w:history="1">
         <w:r>
           <w:rPr>
             <w:rStyle w:val="Hyperlink"/>
@@ -2583,7 +2583,7 @@
             <w:noProof/>
             <w:webHidden/>
           </w:rPr>
-          <w:instrText xml:space="preserve"> PAGEREF _Toc243918622 \h </w:instrText>
+          <w:instrText xml:space="preserve"> PAGEREF _Toc243929950 \h </w:instrText>
         </w:r>
         <w:r>
           <w:rPr>
@@ -2631,7 +2631,7 @@
           <w:lang w:eastAsia="es-CO"/>
         </w:rPr>
       </w:pPr>
-      <w:hyperlink w:anchor="_Toc243918623" w:history="1">
+      <w:hyperlink w:anchor="_Toc243929951" w:history="1">
         <w:r>
           <w:rPr>
             <w:rStyle w:val="Hyperlink"/>
@@ -2677,7 +2677,7 @@
             <w:noProof/>
             <w:webHidden/>
           </w:rPr>
-          <w:instrText xml:space="preserve"> PAGEREF _Toc243918623 \h </w:instrText>
+          <w:instrText xml:space="preserve"> PAGEREF _Toc243929951 \h </w:instrText>
         </w:r>
         <w:r>
           <w:rPr>
@@ -2725,7 +2725,7 @@
           <w:lang w:eastAsia="es-CO"/>
         </w:rPr>
       </w:pPr>
-      <w:hyperlink w:anchor="_Toc243918624" w:history="1">
+      <w:hyperlink w:anchor="_Toc243929952" w:history="1">
         <w:r>
           <w:rPr>
             <w:rStyle w:val="Hyperlink"/>
@@ -2771,7 +2771,7 @@
             <w:noProof/>
             <w:webHidden/>
           </w:rPr>
-          <w:instrText xml:space="preserve"> PAGEREF _Toc243918624 \h </w:instrText>
+          <w:instrText xml:space="preserve"> PAGEREF _Toc243929952 \h </w:instrText>
         </w:r>
         <w:r>
           <w:rPr>
@@ -2818,7 +2818,7 @@
           <w:lang w:eastAsia="es-CO"/>
         </w:rPr>
       </w:pPr>
-      <w:hyperlink w:anchor="_Toc243918625" w:history="1">
+      <w:hyperlink w:anchor="_Toc243929953" w:history="1">
         <w:r>
           <w:rPr>
             <w:rStyle w:val="Hyperlink"/>
@@ -2863,7 +2863,7 @@
             <w:noProof/>
             <w:webHidden/>
           </w:rPr>
-          <w:instrText xml:space="preserve"> PAGEREF _Toc243918625 \h </w:instrText>
+          <w:instrText xml:space="preserve"> PAGEREF _Toc243929953 \h </w:instrText>
         </w:r>
         <w:r>
           <w:rPr>
@@ -2910,7 +2910,7 @@
           <w:lang w:eastAsia="es-CO"/>
         </w:rPr>
       </w:pPr>
-      <w:hyperlink w:anchor="_Toc243918626" w:history="1">
+      <w:hyperlink w:anchor="_Toc243929954" w:history="1">
         <w:r>
           <w:rPr>
             <w:rStyle w:val="Hyperlink"/>
@@ -2955,7 +2955,7 @@
             <w:noProof/>
             <w:webHidden/>
           </w:rPr>
-          <w:instrText xml:space="preserve"> PAGEREF _Toc243918626 \h </w:instrText>
+          <w:instrText xml:space="preserve"> PAGEREF _Toc243929954 \h </w:instrText>
         </w:r>
         <w:r>
           <w:rPr>
@@ -3002,7 +3002,7 @@
           <w:lang w:eastAsia="es-CO"/>
         </w:rPr>
       </w:pPr>
-      <w:hyperlink w:anchor="_Toc243918627" w:history="1">
+      <w:hyperlink w:anchor="_Toc243929955" w:history="1">
         <w:r>
           <w:rPr>
             <w:rStyle w:val="Hyperlink"/>
@@ -3047,7 +3047,7 @@
             <w:noProof/>
             <w:webHidden/>
           </w:rPr>
-          <w:instrText xml:space="preserve"> PAGEREF _Toc243918627 \h </w:instrText>
+          <w:instrText xml:space="preserve"> PAGEREF _Toc243929955 \h </w:instrText>
         </w:r>
         <w:r>
           <w:rPr>
@@ -3096,7 +3096,7 @@
           <w:lang w:eastAsia="es-CO"/>
         </w:rPr>
       </w:pPr>
-      <w:hyperlink w:anchor="_Toc243918628" w:history="1">
+      <w:hyperlink w:anchor="_Toc243929956" w:history="1">
         <w:r>
           <w:rPr>
             <w:rStyle w:val="Hyperlink"/>
@@ -3143,7 +3143,7 @@
             <w:noProof/>
             <w:webHidden/>
           </w:rPr>
-          <w:instrText xml:space="preserve"> PAGEREF _Toc243918628 \h </w:instrText>
+          <w:instrText xml:space="preserve"> PAGEREF _Toc243929956 \h </w:instrText>
         </w:r>
         <w:r>
           <w:rPr>
@@ -3190,7 +3190,7 @@
           <w:lang w:eastAsia="es-CO"/>
         </w:rPr>
       </w:pPr>
-      <w:hyperlink w:anchor="_Toc243918629" w:history="1">
+      <w:hyperlink w:anchor="_Toc243929957" w:history="1">
         <w:r>
           <w:rPr>
             <w:rStyle w:val="Hyperlink"/>
@@ -3235,7 +3235,7 @@
             <w:noProof/>
             <w:webHidden/>
           </w:rPr>
-          <w:instrText xml:space="preserve"> PAGEREF _Toc243918629 \h </w:instrText>
+          <w:instrText xml:space="preserve"> PAGEREF _Toc243929957 \h </w:instrText>
         </w:r>
         <w:r>
           <w:rPr>
@@ -3282,7 +3282,7 @@
           <w:lang w:eastAsia="es-CO"/>
         </w:rPr>
       </w:pPr>
-      <w:hyperlink w:anchor="_Toc243918630" w:history="1">
+      <w:hyperlink w:anchor="_Toc243929958" w:history="1">
         <w:r>
           <w:rPr>
             <w:rStyle w:val="Hyperlink"/>
@@ -3327,7 +3327,7 @@
             <w:noProof/>
             <w:webHidden/>
           </w:rPr>
-          <w:instrText xml:space="preserve"> PAGEREF _Toc243918630 \h </w:instrText>
+          <w:instrText xml:space="preserve"> PAGEREF _Toc243929958 \h </w:instrText>
         </w:r>
         <w:r>
           <w:rPr>
@@ -3374,7 +3374,7 @@
           <w:lang w:eastAsia="es-CO"/>
         </w:rPr>
       </w:pPr>
-      <w:hyperlink w:anchor="_Toc243918631" w:history="1">
+      <w:hyperlink w:anchor="_Toc243929959" w:history="1">
         <w:r>
           <w:rPr>
             <w:rStyle w:val="Hyperlink"/>
@@ -3419,7 +3419,7 @@
             <w:noProof/>
             <w:webHidden/>
           </w:rPr>
-          <w:instrText xml:space="preserve"> PAGEREF _Toc243918631 \h </w:instrText>
+          <w:instrText xml:space="preserve"> PAGEREF _Toc243929959 \h </w:instrText>
         </w:r>
         <w:r>
           <w:rPr>
@@ -3466,7 +3466,7 @@
           <w:lang w:eastAsia="es-CO"/>
         </w:rPr>
       </w:pPr>
-      <w:hyperlink w:anchor="_Toc243918632" w:history="1">
+      <w:hyperlink w:anchor="_Toc243929960" w:history="1">
         <w:r>
           <w:rPr>
             <w:rStyle w:val="Hyperlink"/>
@@ -3511,7 +3511,7 @@
             <w:noProof/>
             <w:webHidden/>
           </w:rPr>
-          <w:instrText xml:space="preserve"> PAGEREF _Toc243918632 \h </w:instrText>
+          <w:instrText xml:space="preserve"> PAGEREF _Toc243929960 \h </w:instrText>
         </w:r>
         <w:r>
           <w:rPr>
@@ -3560,7 +3560,7 @@
           <w:lang w:eastAsia="es-CO"/>
         </w:rPr>
       </w:pPr>
-      <w:hyperlink w:anchor="_Toc243918633" w:history="1">
+      <w:hyperlink w:anchor="_Toc243929961" w:history="1">
         <w:r>
           <w:rPr>
             <w:rStyle w:val="Hyperlink"/>
@@ -3607,7 +3607,7 @@
             <w:noProof/>
             <w:webHidden/>
           </w:rPr>
-          <w:instrText xml:space="preserve"> PAGEREF _Toc243918633 \h </w:instrText>
+          <w:instrText xml:space="preserve"> PAGEREF _Toc243929961 \h </w:instrText>
         </w:r>
         <w:r>
           <w:rPr>
@@ -3656,7 +3656,7 @@
           <w:lang w:eastAsia="es-CO"/>
         </w:rPr>
       </w:pPr>
-      <w:hyperlink w:anchor="_Toc243918634" w:history="1">
+      <w:hyperlink w:anchor="_Toc243929962" w:history="1">
         <w:r>
           <w:rPr>
             <w:rStyle w:val="Hyperlink"/>
@@ -3703,7 +3703,7 @@
             <w:noProof/>
             <w:webHidden/>
           </w:rPr>
-          <w:instrText xml:space="preserve"> PAGEREF _Toc243918634 \h </w:instrText>
+          <w:instrText xml:space="preserve"> PAGEREF _Toc243929962 \h </w:instrText>
         </w:r>
         <w:r>
           <w:rPr>
@@ -3752,7 +3752,7 @@
           <w:lang w:eastAsia="es-CO"/>
         </w:rPr>
       </w:pPr>
-      <w:hyperlink w:anchor="_Toc243918635" w:history="1">
+      <w:hyperlink w:anchor="_Toc243929963" w:history="1">
         <w:r>
           <w:rPr>
             <w:rStyle w:val="Hyperlink"/>
@@ -3799,7 +3799,7 @@
             <w:noProof/>
             <w:webHidden/>
           </w:rPr>
-          <w:instrText xml:space="preserve"> PAGEREF _Toc243918635 \h </w:instrText>
+          <w:instrText xml:space="preserve"> PAGEREF _Toc243929963 \h </w:instrText>
         </w:r>
         <w:r>
           <w:rPr>
@@ -3853,7 +3853,7 @@
       <w:bookmarkStart w:id="4" w:name="_Toc240440230"/>
       <w:bookmarkStart w:id="5" w:name="_Toc241072107"/>
       <w:bookmarkStart w:id="6" w:name="_Toc241072473"/>
-      <w:bookmarkStart w:id="7" w:name="_Toc243918598"/>
+      <w:bookmarkStart w:id="7" w:name="_Toc243929926"/>
       <w:r>
         <w:lastRenderedPageBreak/>
         <w:t>Información principal del proyecto</w:t>
@@ -3876,7 +3876,7 @@
       <w:bookmarkStart w:id="8" w:name="_Toc240440231"/>
       <w:bookmarkStart w:id="9" w:name="_Toc241072108"/>
       <w:bookmarkStart w:id="10" w:name="_Toc241072474"/>
-      <w:bookmarkStart w:id="11" w:name="_Toc243918599"/>
+      <w:bookmarkStart w:id="11" w:name="_Toc243929927"/>
       <w:r>
         <w:t>Título del proyecto</w:t>
       </w:r>
@@ -3910,7 +3910,7 @@
       <w:bookmarkStart w:id="12" w:name="_Toc240440232"/>
       <w:bookmarkStart w:id="13" w:name="_Toc241072109"/>
       <w:bookmarkStart w:id="14" w:name="_Toc241072475"/>
-      <w:bookmarkStart w:id="15" w:name="_Toc243918600"/>
+      <w:bookmarkStart w:id="15" w:name="_Toc243929928"/>
       <w:r>
         <w:t>Resumen ejecutivo</w:t>
       </w:r>
@@ -3962,7 +3962,7 @@
       <w:bookmarkStart w:id="16" w:name="_Toc240440236"/>
       <w:bookmarkStart w:id="17" w:name="_Toc241072110"/>
       <w:bookmarkStart w:id="18" w:name="_Toc241072476"/>
-      <w:bookmarkStart w:id="19" w:name="_Toc243918601"/>
+      <w:bookmarkStart w:id="19" w:name="_Toc243929929"/>
       <w:r>
         <w:t>Costo total del proyecto</w:t>
       </w:r>
@@ -4847,7 +4847,7 @@
       <w:bookmarkStart w:id="20" w:name="_Toc240440237"/>
       <w:bookmarkStart w:id="21" w:name="_Toc241072111"/>
       <w:bookmarkStart w:id="22" w:name="_Toc241072477"/>
-      <w:bookmarkStart w:id="23" w:name="_Toc243918602"/>
+      <w:bookmarkStart w:id="23" w:name="_Toc243929930"/>
       <w:r>
         <w:lastRenderedPageBreak/>
         <w:t>Introducción</w:t>
@@ -4925,7 +4925,7 @@
       <w:bookmarkStart w:id="24" w:name="_Toc240440238"/>
       <w:bookmarkStart w:id="25" w:name="_Toc241072112"/>
       <w:bookmarkStart w:id="26" w:name="_Toc241072478"/>
-      <w:bookmarkStart w:id="27" w:name="_Toc243918603"/>
+      <w:bookmarkStart w:id="27" w:name="_Toc243929931"/>
       <w:r>
         <w:lastRenderedPageBreak/>
         <w:t>Objetivos</w:t>
@@ -4948,7 +4948,7 @@
       <w:bookmarkStart w:id="28" w:name="_Toc240440239"/>
       <w:bookmarkStart w:id="29" w:name="_Toc241072113"/>
       <w:bookmarkStart w:id="30" w:name="_Toc241072479"/>
-      <w:bookmarkStart w:id="31" w:name="_Toc243918604"/>
+      <w:bookmarkStart w:id="31" w:name="_Toc243929932"/>
       <w:r>
         <w:t>Objetivo general</w:t>
       </w:r>
@@ -4979,7 +4979,7 @@
       <w:bookmarkStart w:id="32" w:name="_Toc240440240"/>
       <w:bookmarkStart w:id="33" w:name="_Toc241072114"/>
       <w:bookmarkStart w:id="34" w:name="_Toc241072480"/>
-      <w:bookmarkStart w:id="35" w:name="_Toc243918605"/>
+      <w:bookmarkStart w:id="35" w:name="_Toc243929933"/>
       <w:r>
         <w:t>Objetivos específicos</w:t>
       </w:r>
@@ -5089,7 +5089,7 @@
       <w:bookmarkStart w:id="36" w:name="_Toc240440241"/>
       <w:bookmarkStart w:id="37" w:name="_Toc241072115"/>
       <w:bookmarkStart w:id="38" w:name="_Toc241072481"/>
-      <w:bookmarkStart w:id="39" w:name="_Toc243918606"/>
+      <w:bookmarkStart w:id="39" w:name="_Toc243929934"/>
       <w:r>
         <w:t>Delimitación</w:t>
       </w:r>
@@ -5111,7 +5111,7 @@
       <w:bookmarkStart w:id="40" w:name="_Toc240440242"/>
       <w:bookmarkStart w:id="41" w:name="_Toc241072116"/>
       <w:bookmarkStart w:id="42" w:name="_Toc241072482"/>
-      <w:bookmarkStart w:id="43" w:name="_Toc243918607"/>
+      <w:bookmarkStart w:id="43" w:name="_Toc243929935"/>
       <w:r>
         <w:t>Alcances</w:t>
       </w:r>
@@ -5668,7 +5668,7 @@
       <w:bookmarkStart w:id="44" w:name="_Toc240440243"/>
       <w:bookmarkStart w:id="45" w:name="_Toc241072117"/>
       <w:bookmarkStart w:id="46" w:name="_Toc241072483"/>
-      <w:bookmarkStart w:id="47" w:name="_Toc243918608"/>
+      <w:bookmarkStart w:id="47" w:name="_Toc243929936"/>
       <w:r>
         <w:t>Limitaciones</w:t>
       </w:r>
@@ -6069,7 +6069,7 @@
       <w:bookmarkStart w:id="48" w:name="_Toc240440244"/>
       <w:bookmarkStart w:id="49" w:name="_Toc241072118"/>
       <w:bookmarkStart w:id="50" w:name="_Toc241072484"/>
-      <w:bookmarkStart w:id="51" w:name="_Toc243918609"/>
+      <w:bookmarkStart w:id="51" w:name="_Toc243929937"/>
       <w:r>
         <w:t>Entregables</w:t>
       </w:r>
@@ -6321,7 +6321,7 @@
       </w:pPr>
       <w:bookmarkStart w:id="53" w:name="_Toc241072119"/>
       <w:bookmarkStart w:id="54" w:name="_Toc241072485"/>
-      <w:bookmarkStart w:id="55" w:name="_Toc243918610"/>
+      <w:bookmarkStart w:id="55" w:name="_Toc243929938"/>
       <w:r>
         <w:t>Revisión bibliográfica</w:t>
       </w:r>
@@ -6346,7 +6346,7 @@
       <w:bookmarkStart w:id="56" w:name="_Toc240440246"/>
       <w:bookmarkStart w:id="57" w:name="_Toc241072120"/>
       <w:bookmarkStart w:id="58" w:name="_Toc241072486"/>
-      <w:bookmarkStart w:id="59" w:name="_Toc243918611"/>
+      <w:bookmarkStart w:id="59" w:name="_Toc243929939"/>
       <w:r>
         <w:t>Planteamiento del problema</w:t>
       </w:r>
@@ -6384,7 +6384,7 @@
           <w:noProof/>
         </w:rPr>
         <w:drawing>
-          <wp:inline distT="0" distB="0" distL="0" distR="0" wp14:anchorId="0C3E1CAB" wp14:editId="45DE8943">
+          <wp:inline distT="0" distB="0" distL="0" distR="0" wp14:anchorId="291F1FFF" wp14:editId="2A1B4098">
             <wp:extent cx="4320000" cy="1753663"/>
             <wp:effectExtent l="0" t="0" r="0" b="0"/>
             <wp:docPr id="1" name="Picture 1"/>
@@ -6512,7 +6512,7 @@
       <w:bookmarkStart w:id="60" w:name="_Toc240440247"/>
       <w:bookmarkStart w:id="61" w:name="_Toc241072121"/>
       <w:bookmarkStart w:id="62" w:name="_Toc241072487"/>
-      <w:bookmarkStart w:id="63" w:name="_Toc243918612"/>
+      <w:bookmarkStart w:id="63" w:name="_Toc243929940"/>
       <w:r>
         <w:t>Descripción de avances tecnológicos</w:t>
       </w:r>
@@ -7546,7 +7546,7 @@
       </w:pPr>
       <w:bookmarkStart w:id="65" w:name="_Toc241072122"/>
       <w:bookmarkStart w:id="66" w:name="_Toc241072488"/>
-      <w:bookmarkStart w:id="67" w:name="_Toc243918613"/>
+      <w:bookmarkStart w:id="67" w:name="_Toc243929941"/>
       <w:r>
         <w:t>Descripción detallada del diseño en ingeniería</w:t>
       </w:r>
@@ -7568,7 +7568,7 @@
       <w:bookmarkStart w:id="68" w:name="_Toc240440249"/>
       <w:bookmarkStart w:id="69" w:name="_Toc241072123"/>
       <w:bookmarkStart w:id="70" w:name="_Toc241072489"/>
-      <w:bookmarkStart w:id="71" w:name="_Toc243918614"/>
+      <w:bookmarkStart w:id="71" w:name="_Toc243929942"/>
       <w:r>
         <w:t>Problema</w:t>
       </w:r>
@@ -7621,7 +7621,7 @@
       <w:bookmarkStart w:id="72" w:name="_Toc240440250"/>
       <w:bookmarkStart w:id="73" w:name="_Toc241072124"/>
       <w:bookmarkStart w:id="74" w:name="_Toc241072490"/>
-      <w:bookmarkStart w:id="75" w:name="_Toc243918615"/>
+      <w:bookmarkStart w:id="75" w:name="_Toc243929943"/>
       <w:r>
         <w:t>Análisis de requerimientos</w:t>
       </w:r>
@@ -8499,7 +8499,7 @@
       <w:bookmarkStart w:id="76" w:name="_Toc240440251"/>
       <w:bookmarkStart w:id="77" w:name="_Toc241072125"/>
       <w:bookmarkStart w:id="78" w:name="_Toc241072491"/>
-      <w:bookmarkStart w:id="79" w:name="_Toc243918616"/>
+      <w:bookmarkStart w:id="79" w:name="_Toc243929944"/>
       <w:r>
         <w:t>Estándares, normas y regulaciones</w:t>
       </w:r>
@@ -8873,7 +8873,7 @@
       <w:bookmarkStart w:id="80" w:name="_Toc240440252"/>
       <w:bookmarkStart w:id="81" w:name="_Toc241072126"/>
       <w:bookmarkStart w:id="82" w:name="_Toc241072492"/>
-      <w:bookmarkStart w:id="83" w:name="_Toc243918617"/>
+      <w:bookmarkStart w:id="83" w:name="_Toc243929945"/>
       <w:r>
         <w:t>Alternativas de solución</w:t>
       </w:r>
@@ -9342,7 +9342,7 @@
       <w:bookmarkStart w:id="84" w:name="_Toc240440253"/>
       <w:bookmarkStart w:id="85" w:name="_Toc241072127"/>
       <w:bookmarkStart w:id="86" w:name="_Toc241072493"/>
-      <w:bookmarkStart w:id="87" w:name="_Toc243918618"/>
+      <w:bookmarkStart w:id="87" w:name="_Toc243929946"/>
       <w:r>
         <w:t>Evaluación y selección de la alternativa óptima</w:t>
       </w:r>
@@ -10742,7 +10742,7 @@
       <w:bookmarkStart w:id="88" w:name="_Toc240440255"/>
       <w:bookmarkStart w:id="89" w:name="_Toc241072130"/>
       <w:bookmarkStart w:id="90" w:name="_Toc241072496"/>
-      <w:bookmarkStart w:id="91" w:name="_Toc243918619"/>
+      <w:bookmarkStart w:id="91" w:name="_Toc243929947"/>
       <w:r>
         <w:t>Análisis de riesgo del diseño definitivo</w:t>
       </w:r>
@@ -11711,7 +11711,7 @@
       <w:bookmarkStart w:id="92" w:name="_Toc240440254"/>
       <w:bookmarkStart w:id="93" w:name="_Toc241072129"/>
       <w:bookmarkStart w:id="94" w:name="_Toc241072495"/>
-      <w:bookmarkStart w:id="95" w:name="_Toc243918620"/>
+      <w:bookmarkStart w:id="95" w:name="_Toc243929948"/>
       <w:r>
         <w:lastRenderedPageBreak/>
         <w:t>Diseño definitivo</w:t>
@@ -11747,7 +11747,7 @@
           <w:noProof/>
         </w:rPr>
         <w:drawing>
-          <wp:inline distT="0" distB="0" distL="0" distR="0" wp14:anchorId="0544B193" wp14:editId="375D0CE6">
+          <wp:inline distT="0" distB="0" distL="0" distR="0" wp14:anchorId="7289E194" wp14:editId="2E9FED38">
             <wp:extent cx="3780000" cy="2888781"/>
             <wp:effectExtent l="0" t="0" r="0" b="0"/>
             <wp:docPr id="14" name="Picture 14"/>
@@ -15260,7 +15260,7 @@
         </w:rPr>
         <w:lastRenderedPageBreak/>
         <w:drawing>
-          <wp:inline distT="0" distB="0" distL="0" distR="0" wp14:anchorId="07C4ABC0" wp14:editId="1EFD9036">
+          <wp:inline distT="0" distB="0" distL="0" distR="0" wp14:anchorId="485C39F6" wp14:editId="15286A30">
             <wp:extent cx="4500000" cy="2592528"/>
             <wp:effectExtent l="0" t="0" r="0" b="0"/>
             <wp:docPr id="15" name="Picture 15"/>
@@ -15374,7 +15374,7 @@
           <w:noProof/>
         </w:rPr>
         <w:drawing>
-          <wp:inline distT="0" distB="0" distL="0" distR="0" wp14:anchorId="00922896" wp14:editId="022BA21E">
+          <wp:inline distT="0" distB="0" distL="0" distR="0" wp14:anchorId="4A7E626B" wp14:editId="6D927870">
             <wp:extent cx="5760720" cy="3419094"/>
             <wp:effectExtent l="0" t="0" r="0" b="0"/>
             <wp:docPr id="16" name="Picture 16"/>
@@ -15458,7 +15458,7 @@
         </w:rPr>
         <w:lastRenderedPageBreak/>
         <w:drawing>
-          <wp:inline distT="0" distB="0" distL="0" distR="0" wp14:anchorId="5EF6FF09" wp14:editId="44A2F311">
+          <wp:inline distT="0" distB="0" distL="0" distR="0" wp14:anchorId="27234B2A" wp14:editId="10074215">
             <wp:extent cx="5486400" cy="2544896"/>
             <wp:effectExtent l="0" t="0" r="0" b="0"/>
             <wp:docPr id="17" name="Picture 17"/>
@@ -15542,7 +15542,7 @@
         </w:rPr>
         <w:lastRenderedPageBreak/>
         <w:drawing>
-          <wp:inline distT="0" distB="0" distL="0" distR="0" wp14:anchorId="3A53A8E5" wp14:editId="36832B3D">
+          <wp:inline distT="0" distB="0" distL="0" distR="0" wp14:anchorId="017EDF79" wp14:editId="7B4FCF23">
             <wp:extent cx="3931920" cy="4212251"/>
             <wp:effectExtent l="0" t="0" r="0" b="0"/>
             <wp:docPr id="18" name="Picture 18"/>
@@ -15623,7 +15623,7 @@
       </w:pPr>
       <w:bookmarkStart w:id="97" w:name="_Toc241072132"/>
       <w:bookmarkStart w:id="98" w:name="_Toc241072498"/>
-      <w:bookmarkStart w:id="99" w:name="_Toc243918621"/>
+      <w:bookmarkStart w:id="99" w:name="_Toc243929949"/>
       <w:r>
         <w:t>Pruebas, resultados y análisis de resultados</w:t>
       </w:r>
@@ -15645,7 +15645,7 @@
       <w:bookmarkStart w:id="100" w:name="_Toc240440258"/>
       <w:bookmarkStart w:id="101" w:name="_Toc241072133"/>
       <w:bookmarkStart w:id="102" w:name="_Toc241072499"/>
-      <w:bookmarkStart w:id="103" w:name="_Toc243918622"/>
+      <w:bookmarkStart w:id="103" w:name="_Toc243929950"/>
       <w:r>
         <w:t>Planeación del diseño del experimento</w:t>
       </w:r>
@@ -15720,7 +15720,7 @@
       <w:bookmarkStart w:id="104" w:name="_Toc240440261"/>
       <w:bookmarkStart w:id="105" w:name="_Toc241072136"/>
       <w:bookmarkStart w:id="106" w:name="_Toc241072500"/>
-      <w:bookmarkStart w:id="107" w:name="_Toc243918623"/>
+      <w:bookmarkStart w:id="107" w:name="_Toc243929951"/>
       <w:r>
         <w:t>Instrumentación y validación</w:t>
       </w:r>
@@ -15765,7 +15765,7 @@
       <w:bookmarkStart w:id="108" w:name="_Toc240440262"/>
       <w:bookmarkStart w:id="109" w:name="_Toc241072137"/>
       <w:bookmarkStart w:id="110" w:name="_Toc241072501"/>
-      <w:bookmarkStart w:id="111" w:name="_Toc243918624"/>
+      <w:bookmarkStart w:id="111" w:name="_Toc243929952"/>
       <w:r>
         <w:t>Marco normativo de las pruebas</w:t>
       </w:r>
@@ -15796,7 +15796,7 @@
       <w:bookmarkStart w:id="112" w:name="_Toc240440263"/>
       <w:bookmarkStart w:id="113" w:name="_Toc241072138"/>
       <w:bookmarkStart w:id="114" w:name="_Toc241072502"/>
-      <w:bookmarkStart w:id="115" w:name="_Toc243918625"/>
+      <w:bookmarkStart w:id="115" w:name="_Toc243929953"/>
       <w:r>
         <w:t>Ejecución del plan experimental</w:t>
       </w:r>
@@ -17673,7 +17673,7 @@
       <w:bookmarkStart w:id="116" w:name="_Toc240440264"/>
       <w:bookmarkStart w:id="117" w:name="_Toc241072139"/>
       <w:bookmarkStart w:id="118" w:name="_Toc241072503"/>
-      <w:bookmarkStart w:id="119" w:name="_Toc243918626"/>
+      <w:bookmarkStart w:id="119" w:name="_Toc243929954"/>
       <w:r>
         <w:t>Resultados</w:t>
       </w:r>
@@ -17708,7 +17708,7 @@
           <w:noProof/>
         </w:rPr>
         <w:drawing>
-          <wp:inline distT="0" distB="0" distL="0" distR="0" wp14:anchorId="611E9907" wp14:editId="6DE18186">
+          <wp:inline distT="0" distB="0" distL="0" distR="0" wp14:anchorId="3FCA7C09" wp14:editId="5605301F">
             <wp:extent cx="4140000" cy="1776493"/>
             <wp:effectExtent l="0" t="0" r="0" b="0"/>
             <wp:docPr id="10" name="Picture 10"/>
@@ -26808,7 +26808,7 @@
           <w:noProof/>
         </w:rPr>
         <w:drawing>
-          <wp:inline distT="0" distB="0" distL="0" distR="0" wp14:anchorId="7F32E5AA" wp14:editId="5EA1B1DA">
+          <wp:inline distT="0" distB="0" distL="0" distR="0" wp14:anchorId="201400B6" wp14:editId="3A6C0BBA">
             <wp:extent cx="4482000" cy="1859524"/>
             <wp:effectExtent l="0" t="0" r="0" b="0"/>
             <wp:docPr id="19" name="Picture 19"/>
@@ -26895,7 +26895,7 @@
           <w:noProof/>
         </w:rPr>
         <w:drawing>
-          <wp:inline distT="0" distB="0" distL="0" distR="0" wp14:anchorId="7C30E536" wp14:editId="7AD653D5">
+          <wp:inline distT="0" distB="0" distL="0" distR="0" wp14:anchorId="5E0AAE98" wp14:editId="5AD8D6C2">
             <wp:extent cx="4482000" cy="1859524"/>
             <wp:effectExtent l="0" t="0" r="0" b="0"/>
             <wp:docPr id="20" name="Picture 20"/>
@@ -26978,7 +26978,7 @@
           <w:noProof/>
         </w:rPr>
         <w:drawing>
-          <wp:inline distT="0" distB="0" distL="0" distR="0" wp14:anchorId="0B5AFF1A" wp14:editId="3CF95180">
+          <wp:inline distT="0" distB="0" distL="0" distR="0" wp14:anchorId="4BB3ACA3" wp14:editId="46F2D317">
             <wp:extent cx="4482000" cy="1859524"/>
             <wp:effectExtent l="0" t="0" r="0" b="0"/>
             <wp:docPr id="21" name="Picture 21"/>
@@ -27047,7 +27047,7 @@
         <w:t>Operación posterior al periodo del proyecto.</w:t>
       </w:r>
       <w:r>
-        <w:t xml:space="preserve"> Desde el 6 de agosto el sistema opera con los datos que XM publica cada día. Hasta el 11 de octubre (1.631 horas con precio publicado), el MAE fue 47,8 COP/kWh (MAPE 6,3 %), frente a 49,4 del predespacho solo; por mes, 28,6 en agosto, 55,3 en septiembre y 74,4 en lo corrido de octubre, meses más volátiles. La banda cubrió el 74,1 % de las horas, por debajo del objetivo, porque se calibra con los 60 días anteriores y el precio se volvió más volátil en septiembre y octubre.</w:t>
+        <w:t xml:space="preserve"> Desde el 6 de agosto el sistema opera con los datos que XM publica cada día. Hasta el 11 de octubre (1.631 horas con precio publicado), el MAE fue 47,8 COP/kWh (MAPE 6,3 %), frente a 49,4 del predespacho solo; por mes, 28,6 en agosto, 55,3 en septiembre y 74,4 en lo corrido de octubre, meses más volátiles. La banda cubrió el 74,1 % de las horas, por debajo del objetivo, porque se calibra con los 60 días anteriores y el precio se volvió más volátil en septiembre y octubre. Sumando el periodo del proyecto y la operación, en todo 2026 hasta el 11 de octubre (6.815 horas) el MAE es 37,0 COP/kWh (MAPE 9,1 %), 9 % menor que el del predespacho (40,6; Diebold-Mariano t = 8,8, p &lt; 0,001), y la banda cubre el 79,0 % de las horas: la ventaja sobre el predespacho se mantiene aun con los meses más volátiles.</w:t>
       </w:r>
     </w:p>
     <w:p>
@@ -27059,6 +27059,7 @@
         <w:rPr>
           <w:b/>
         </w:rPr>
+        <w:lastRenderedPageBreak/>
         <w:t>Eventos.</w:t>
       </w:r>
       <w:r>
@@ -27074,7 +27075,6 @@
         <w:rPr>
           <w:b/>
         </w:rPr>
-        <w:lastRenderedPageBreak/>
         <w:t>OE4 — Validación con usuarios.</w:t>
       </w:r>
       <w:r>
@@ -28139,7 +28139,7 @@
       <w:bookmarkStart w:id="120" w:name="_Toc240440265"/>
       <w:bookmarkStart w:id="121" w:name="_Toc241072140"/>
       <w:bookmarkStart w:id="122" w:name="_Toc241072504"/>
-      <w:bookmarkStart w:id="123" w:name="_Toc243918627"/>
+      <w:bookmarkStart w:id="123" w:name="_Toc243929955"/>
       <w:r>
         <w:t>Análisis e interpretación de resultados</w:t>
       </w:r>
@@ -28190,11 +28190,11 @@
         <w:t>Lectura honesta de la robustez.</w:t>
       </w:r>
       <w:r>
-        <w:t xml:space="preserve"> Con el precio del día anterior, ningún modelo individual supera de forma consistente a la persistencia en los orígenes históricos, pero el ensamble de seis votantes sí lo hace en 4 de 5 años. Las redes neuronales resultaron muy sensibles a cambios pequeños en los datos: al corregir el ONI histórico en ±0,1 en cuatro trimestres, su error cambió hasta 3 COP/kWh y seis de las 36 conclusiones de Diebold-Mariano se invirtieron, mientras XGBoost y ARX+GARCH casi no cambiaron. El hallazgo más importante, sin embargo, es de información y no de modelado: con solo lo publicado al corte el ensamble de 6 pierde casi toda su ventaja (rMAE 0,93) y el pronóstico solo es útil con el predespacho. Las variantes del diseño definitivo se eligieron observando 2026, pero la validación en los cinco años históricos lo confirma (Tabla 16). Persisten dos limitaciones: los desfases de nivel de días completos que comete el </w:t>
+        <w:t xml:space="preserve"> Con el precio del día anterior, ningún modelo individual supera de forma consistente a la persistencia en los orígenes históricos, pero el ensamble de seis votantes sí lo hace en 4 de 5 años. Las redes neuronales resultaron muy sensibles a cambios pequeños en los datos: al corregir el ONI histórico en ±0,1 en cuatro trimestres, su error cambió hasta 3 COP/kWh y seis de las 36 conclusiones de Diebold-Mariano se invirtieron, mientras XGBoost y ARX+GARCH casi no cambiaron. El hallazgo más importante, sin embargo, es de información y no de modelado: con solo lo publicado al corte el ensamble de 6 pierde casi toda su ventaja (rMAE 0,93) y el pronóstico solo es útil con el predespacho. Las variantes </w:t>
       </w:r>
       <w:r>
         <w:lastRenderedPageBreak/>
-        <w:t>predespacho (por ejemplo, del 11 al 18 de junio de 2026) no se pueden anticipar con información pública, y el modelo hereda la amplitud de los picos que el predespacho anticipa y no ocurren.</w:t>
+        <w:t>del diseño definitivo se eligieron observando 2026, pero la validación en los cinco años históricos lo confirma (Tabla 16). Persisten dos limitaciones: los desfases de nivel de días completos que comete el predespacho (por ejemplo, del 11 al 18 de junio de 2026) no se pueden anticipar con información pública, y el modelo hereda la amplitud de los picos que el predespacho anticipa y no ocurren.</w:t>
       </w:r>
     </w:p>
     <w:p>
@@ -28261,7 +28261,7 @@
       <w:bookmarkStart w:id="124" w:name="_Toc241072141"/>
       <w:bookmarkStart w:id="125" w:name="_Toc241072505"/>
       <w:bookmarkStart w:id="126" w:name="_Toc240440266"/>
-      <w:bookmarkStart w:id="127" w:name="_Toc243918628"/>
+      <w:bookmarkStart w:id="127" w:name="_Toc243929956"/>
       <w:r>
         <w:t>Análisis de impacto del proyecto</w:t>
       </w:r>
@@ -28283,7 +28283,7 @@
         </w:numPr>
         <w:spacing w:before="300"/>
       </w:pPr>
-      <w:bookmarkStart w:id="128" w:name="_Toc243918629"/>
+      <w:bookmarkStart w:id="128" w:name="_Toc243929957"/>
       <w:r>
         <w:t>Impacto social</w:t>
       </w:r>
@@ -28308,7 +28308,7 @@
         </w:numPr>
         <w:spacing w:before="300"/>
       </w:pPr>
-      <w:bookmarkStart w:id="129" w:name="_Toc243918630"/>
+      <w:bookmarkStart w:id="129" w:name="_Toc243929958"/>
       <w:r>
         <w:t>Impacto ambiental</w:t>
       </w:r>
@@ -28333,7 +28333,7 @@
         </w:numPr>
         <w:spacing w:before="300"/>
       </w:pPr>
-      <w:bookmarkStart w:id="130" w:name="_Toc243918631"/>
+      <w:bookmarkStart w:id="130" w:name="_Toc243929959"/>
       <w:r>
         <w:t>Impacto legal y regulatorio</w:t>
       </w:r>
@@ -28345,7 +28345,11 @@
         <w:jc w:val="both"/>
       </w:pPr>
       <w:r>
-        <w:t>Solo se usa información pública de XM/SIMEM [22], incluido el predespacho ideal que XM publica sin restricción en su portal [18]; no se recolectan datos personales [23] y no se ejecutan transacciones. El pronóstico con predespacho se presenta para decisiones posteriores a su publicación (10:30 de D-1), no para formular ofertas, que cierran a las 08:00 [25]. Ante intervenciones transitorias de la CREG en la formación del precio, los modelos se reentrenan cada mes de forma automática y cada imagen indica la versión del modelo.</w:t>
+        <w:t xml:space="preserve">Solo se usa información pública de XM/SIMEM [22], incluido el predespacho ideal que XM publica sin restricción en su portal [18]; no se recolectan datos personales [23] y no se ejecutan transacciones. El pronóstico con predespacho se presenta para decisiones posteriores a su publicación (10:30 de D-1), no para formular ofertas, que cierran a las 08:00 [25]. Ante intervenciones transitorias de la CREG en la </w:t>
+      </w:r>
+      <w:r>
+        <w:lastRenderedPageBreak/>
+        <w:t>formación del precio, los modelos se reentrenan cada mes de forma automática y cada imagen indica la versión del modelo.</w:t>
       </w:r>
     </w:p>
     <w:p>
@@ -28358,9 +28362,8 @@
         </w:numPr>
         <w:spacing w:before="300"/>
       </w:pPr>
-      <w:bookmarkStart w:id="131" w:name="_Toc243918632"/>
-      <w:r>
-        <w:lastRenderedPageBreak/>
+      <w:bookmarkStart w:id="131" w:name="_Toc243929960"/>
+      <w:r>
         <w:t>Impacto económico y financiero</w:t>
       </w:r>
       <w:bookmarkEnd w:id="131"/>
@@ -28387,7 +28390,7 @@
       <w:bookmarkStart w:id="132" w:name="_Toc240440267"/>
       <w:bookmarkStart w:id="133" w:name="_Toc241072142"/>
       <w:bookmarkStart w:id="134" w:name="_Toc241072506"/>
-      <w:bookmarkStart w:id="135" w:name="_Toc243918633"/>
+      <w:bookmarkStart w:id="135" w:name="_Toc243929961"/>
       <w:r>
         <w:t>Conclusiones y recomendaciones</w:t>
       </w:r>
@@ -28447,7 +28450,11 @@
         <w:jc w:val="both"/>
       </w:pPr>
       <w:r>
-        <w:t>Como recomendaciones para una fase siguiente: (1) evaluar el pronóstico y el motor durante más meses de operación, ya que la cobertura de la banda bajó al 74,1 % entre agosto y octubre de 2026, y considerar una ventana de calibración más corta en periodos volátiles; (2) ofrecer un pronóstico sin predespacho para los generadores, que deben ofertar antes de las 08:00 de D-1; (3) estudiar los desfases de nivel diarios del predespacho, que hoy no se anticipan con información pública; (4) incorporar al motor métricas de decisión basadas en la forma del día [8] y evaluar el criterio de estabilidad con más de dos subperiodos o con una formulación de bandits no estacionarios [43]; y (5) ampliar la validación con usuarios a un estudio formal de usabilidad.</w:t>
+        <w:t xml:space="preserve">Como recomendaciones para una fase siguiente: (1) evaluar el pronóstico y el motor durante más meses de operación, ya que la cobertura de la banda bajó al 74,1 % entre agosto y octubre de 2026, y considerar una ventana de calibración más corta en periodos volátiles; (2) ofrecer un pronóstico sin predespacho para los generadores, que deben ofertar antes de las 08:00 de D-1; (3) estudiar los desfases de nivel diarios del predespacho, que hoy no se anticipan con información pública; (4) incorporar al motor métricas de decisión basadas en la forma del día [8] y evaluar el criterio de estabilidad con más de dos subperiodos o </w:t>
+      </w:r>
+      <w:r>
+        <w:lastRenderedPageBreak/>
+        <w:t>con una formulación de bandits no estacionarios [43]; y (5) ampliar la validación con usuarios a un estudio formal de usabilidad.</w:t>
       </w:r>
     </w:p>
     <w:p>
@@ -28463,9 +28470,8 @@
       <w:bookmarkStart w:id="136" w:name="_Toc240440268"/>
       <w:bookmarkStart w:id="137" w:name="_Toc241072143"/>
       <w:bookmarkStart w:id="138" w:name="_Toc241072507"/>
-      <w:bookmarkStart w:id="139" w:name="_Toc243918634"/>
-      <w:r>
-        <w:lastRenderedPageBreak/>
+      <w:bookmarkStart w:id="139" w:name="_Toc243929962"/>
+      <w:r>
         <w:t>Bibliografía (formato IEEE)</w:t>
       </w:r>
       <w:bookmarkEnd w:id="136"/>
@@ -28999,6 +29005,7 @@
           <w:sz w:val="20"/>
           <w:szCs w:val="20"/>
         </w:rPr>
+        <w:lastRenderedPageBreak/>
         <w:t>[17]</w:t>
       </w:r>
       <w:r>
@@ -29056,7 +29063,6 @@
           <w:sz w:val="20"/>
           <w:szCs w:val="20"/>
         </w:rPr>
-        <w:lastRenderedPageBreak/>
         <w:t>[19]</w:t>
       </w:r>
       <w:r>
@@ -29636,6 +29642,7 @@
           <w:sz w:val="20"/>
           <w:szCs w:val="20"/>
         </w:rPr>
+        <w:lastRenderedPageBreak/>
         <w:t>[38]</w:t>
       </w:r>
       <w:r>
@@ -29744,7 +29751,6 @@
           <w:sz w:val="20"/>
           <w:szCs w:val="20"/>
         </w:rPr>
-        <w:lastRenderedPageBreak/>
         <w:t>[41]</w:t>
       </w:r>
       <w:r>
@@ -29856,7 +29862,7 @@
       <w:bookmarkStart w:id="140" w:name="_Toc240440270"/>
       <w:bookmarkStart w:id="141" w:name="_Toc241072144"/>
       <w:bookmarkStart w:id="142" w:name="_Toc241072508"/>
-      <w:bookmarkStart w:id="143" w:name="_Toc243918635"/>
+      <w:bookmarkStart w:id="143" w:name="_Toc243929963"/>
       <w:r>
         <w:t>Anexos</w:t>
       </w:r>
@@ -29978,16 +29984,7 @@
         <w:jc w:val="both"/>
       </w:pPr>
       <w:r>
-        <w:t>Los anexos 1, 3 y 5 están en el repositorio del proyecto (github.com/Ziskito/xm-spot-price-predictor): formulación en docs/, código fuente en notebooks/, src/, dashboard/ y scripts_experimento/, y datos y predicciones en data/. El anexo 2 corresponde a docs/tabla_riesgos_proyecto.xlsx; el anexo 4, al manual de usuario (docs/Manual_Usuario_augur.pdf); el anexo 7, a la bitácora del README y al historial de commits; y el anexo 8, al video del proyecto (</w:t>
-      </w:r>
-      <w:r>
-        <w:rPr>
-          <w:highlight w:val="yellow"/>
-        </w:rPr>
-        <w:t>completar enlace</w:t>
-      </w:r>
-      <w:r>
-        <w:t>). El dashboard está publicado en augurpredictor.streamlit.app.</w:t>
+        <w:t>Los anexos 1, 3 y 5 están en el repositorio del proyecto (github.com/Ziskito/xm-spot-price-predictor): formulación en docs/, código fuente en notebooks/, src/, dashboard/ y scripts_experimento/, y datos y predicciones en data/. El anexo 2 corresponde a docs/tabla_riesgos_proyecto.xlsx; el anexo 4, al manual de usuario (docs/Manual_Usuario_augur.pdf); el anexo 7, a la bitácora del README y al historial de commits; y el anexo 8, al video del proyecto (youtu.be/aOOvyiJHD24, también al inicio de la vista Metodología del dashboard). El dashboard está publicado en augurpredictor.streamlit.app.</w:t>
       </w:r>
     </w:p>
     <w:p/>

</xml_diff>

<commit_message>
Manual de usuario rev. 1.5 y Figura 5 del informe con las capturas nuevas
- Manual: capturas del 23-oct, 08:00 (las mismas del informe), video y validacion de todo 2026 en
  Metodologia, horas de accion sobre el pronostico en la semana, colores de pico y desplome por rol,
  tabla con coma decimal y parametros dia/hora de la direccion. 20 paginas.
- App: ?dia=AAAA-MM-DD&hora=H abren la vista Operador en ese dia y hora (capturas reproducibles).
- Informe final: Figura 5 (mapa de calor) con la etiqueta de cada dia.

Co-Authored-By: Claude Opus 5.5 <noreply@anthropic.com>
</commit_message>
<xml_diff>
--- a/docs/Informe_Final_ABET_Barcelo_Dede.docx
+++ b/docs/Informe_Final_ABET_Barcelo_Dede.docx
@@ -192,7 +192,7 @@
       <w:bookmarkStart w:id="0" w:name="_Toc240440229"/>
       <w:bookmarkStart w:id="1" w:name="_Toc241072106"/>
       <w:bookmarkStart w:id="2" w:name="_Toc241072472"/>
-      <w:bookmarkStart w:id="3" w:name="_Toc243929925"/>
+      <w:bookmarkStart w:id="3" w:name="_Toc243987207"/>
       <w:r>
         <w:lastRenderedPageBreak/>
         <w:t>Tabla de contenido</w:t>
@@ -228,7 +228,7 @@
       <w:r>
         <w:fldChar w:fldCharType="separate"/>
       </w:r>
-      <w:hyperlink w:anchor="_Toc243929925" w:history="1">
+      <w:hyperlink w:anchor="_Toc243987207" w:history="1">
         <w:r>
           <w:rPr>
             <w:rStyle w:val="Hyperlink"/>
@@ -255,7 +255,7 @@
             <w:noProof/>
             <w:webHidden/>
           </w:rPr>
-          <w:instrText xml:space="preserve"> PAGEREF _Toc243929925 \h </w:instrText>
+          <w:instrText xml:space="preserve"> PAGEREF _Toc243987207 \h </w:instrText>
         </w:r>
         <w:r>
           <w:rPr>
@@ -304,7 +304,7 @@
           <w:lang w:eastAsia="es-CO"/>
         </w:rPr>
       </w:pPr>
-      <w:hyperlink w:anchor="_Toc243929926" w:history="1">
+      <w:hyperlink w:anchor="_Toc243987208" w:history="1">
         <w:r>
           <w:rPr>
             <w:rStyle w:val="Hyperlink"/>
@@ -351,7 +351,7 @@
             <w:noProof/>
             <w:webHidden/>
           </w:rPr>
-          <w:instrText xml:space="preserve"> PAGEREF _Toc243929926 \h </w:instrText>
+          <w:instrText xml:space="preserve"> PAGEREF _Toc243987208 \h </w:instrText>
         </w:r>
         <w:r>
           <w:rPr>
@@ -398,7 +398,7 @@
           <w:lang w:eastAsia="es-CO"/>
         </w:rPr>
       </w:pPr>
-      <w:hyperlink w:anchor="_Toc243929927" w:history="1">
+      <w:hyperlink w:anchor="_Toc243987209" w:history="1">
         <w:r>
           <w:rPr>
             <w:rStyle w:val="Hyperlink"/>
@@ -443,7 +443,7 @@
             <w:noProof/>
             <w:webHidden/>
           </w:rPr>
-          <w:instrText xml:space="preserve"> PAGEREF _Toc243929927 \h </w:instrText>
+          <w:instrText xml:space="preserve"> PAGEREF _Toc243987209 \h </w:instrText>
         </w:r>
         <w:r>
           <w:rPr>
@@ -490,7 +490,7 @@
           <w:lang w:eastAsia="es-CO"/>
         </w:rPr>
       </w:pPr>
-      <w:hyperlink w:anchor="_Toc243929928" w:history="1">
+      <w:hyperlink w:anchor="_Toc243987210" w:history="1">
         <w:r>
           <w:rPr>
             <w:rStyle w:val="Hyperlink"/>
@@ -535,7 +535,7 @@
             <w:noProof/>
             <w:webHidden/>
           </w:rPr>
-          <w:instrText xml:space="preserve"> PAGEREF _Toc243929928 \h </w:instrText>
+          <w:instrText xml:space="preserve"> PAGEREF _Toc243987210 \h </w:instrText>
         </w:r>
         <w:r>
           <w:rPr>
@@ -582,7 +582,7 @@
           <w:lang w:eastAsia="es-CO"/>
         </w:rPr>
       </w:pPr>
-      <w:hyperlink w:anchor="_Toc243929929" w:history="1">
+      <w:hyperlink w:anchor="_Toc243987211" w:history="1">
         <w:r>
           <w:rPr>
             <w:rStyle w:val="Hyperlink"/>
@@ -627,7 +627,7 @@
             <w:noProof/>
             <w:webHidden/>
           </w:rPr>
-          <w:instrText xml:space="preserve"> PAGEREF _Toc243929929 \h </w:instrText>
+          <w:instrText xml:space="preserve"> PAGEREF _Toc243987211 \h </w:instrText>
         </w:r>
         <w:r>
           <w:rPr>
@@ -676,7 +676,7 @@
           <w:lang w:eastAsia="es-CO"/>
         </w:rPr>
       </w:pPr>
-      <w:hyperlink w:anchor="_Toc243929930" w:history="1">
+      <w:hyperlink w:anchor="_Toc243987212" w:history="1">
         <w:r>
           <w:rPr>
             <w:rStyle w:val="Hyperlink"/>
@@ -723,7 +723,7 @@
             <w:noProof/>
             <w:webHidden/>
           </w:rPr>
-          <w:instrText xml:space="preserve"> PAGEREF _Toc243929930 \h </w:instrText>
+          <w:instrText xml:space="preserve"> PAGEREF _Toc243987212 \h </w:instrText>
         </w:r>
         <w:r>
           <w:rPr>
@@ -772,7 +772,7 @@
           <w:lang w:eastAsia="es-CO"/>
         </w:rPr>
       </w:pPr>
-      <w:hyperlink w:anchor="_Toc243929931" w:history="1">
+      <w:hyperlink w:anchor="_Toc243987213" w:history="1">
         <w:r>
           <w:rPr>
             <w:rStyle w:val="Hyperlink"/>
@@ -819,7 +819,7 @@
             <w:noProof/>
             <w:webHidden/>
           </w:rPr>
-          <w:instrText xml:space="preserve"> PAGEREF _Toc243929931 \h </w:instrText>
+          <w:instrText xml:space="preserve"> PAGEREF _Toc243987213 \h </w:instrText>
         </w:r>
         <w:r>
           <w:rPr>
@@ -866,7 +866,7 @@
           <w:lang w:eastAsia="es-CO"/>
         </w:rPr>
       </w:pPr>
-      <w:hyperlink w:anchor="_Toc243929932" w:history="1">
+      <w:hyperlink w:anchor="_Toc243987214" w:history="1">
         <w:r>
           <w:rPr>
             <w:rStyle w:val="Hyperlink"/>
@@ -911,7 +911,7 @@
             <w:noProof/>
             <w:webHidden/>
           </w:rPr>
-          <w:instrText xml:space="preserve"> PAGEREF _Toc243929932 \h </w:instrText>
+          <w:instrText xml:space="preserve"> PAGEREF _Toc243987214 \h </w:instrText>
         </w:r>
         <w:r>
           <w:rPr>
@@ -958,7 +958,7 @@
           <w:lang w:eastAsia="es-CO"/>
         </w:rPr>
       </w:pPr>
-      <w:hyperlink w:anchor="_Toc243929933" w:history="1">
+      <w:hyperlink w:anchor="_Toc243987215" w:history="1">
         <w:r>
           <w:rPr>
             <w:rStyle w:val="Hyperlink"/>
@@ -1003,7 +1003,7 @@
             <w:noProof/>
             <w:webHidden/>
           </w:rPr>
-          <w:instrText xml:space="preserve"> PAGEREF _Toc243929933 \h </w:instrText>
+          <w:instrText xml:space="preserve"> PAGEREF _Toc243987215 \h </w:instrText>
         </w:r>
         <w:r>
           <w:rPr>
@@ -1052,7 +1052,7 @@
           <w:lang w:eastAsia="es-CO"/>
         </w:rPr>
       </w:pPr>
-      <w:hyperlink w:anchor="_Toc243929934" w:history="1">
+      <w:hyperlink w:anchor="_Toc243987216" w:history="1">
         <w:r>
           <w:rPr>
             <w:rStyle w:val="Hyperlink"/>
@@ -1099,7 +1099,7 @@
             <w:noProof/>
             <w:webHidden/>
           </w:rPr>
-          <w:instrText xml:space="preserve"> PAGEREF _Toc243929934 \h </w:instrText>
+          <w:instrText xml:space="preserve"> PAGEREF _Toc243987216 \h </w:instrText>
         </w:r>
         <w:r>
           <w:rPr>
@@ -1146,7 +1146,7 @@
           <w:lang w:eastAsia="es-CO"/>
         </w:rPr>
       </w:pPr>
-      <w:hyperlink w:anchor="_Toc243929935" w:history="1">
+      <w:hyperlink w:anchor="_Toc243987217" w:history="1">
         <w:r>
           <w:rPr>
             <w:rStyle w:val="Hyperlink"/>
@@ -1191,7 +1191,7 @@
             <w:noProof/>
             <w:webHidden/>
           </w:rPr>
-          <w:instrText xml:space="preserve"> PAGEREF _Toc243929935 \h </w:instrText>
+          <w:instrText xml:space="preserve"> PAGEREF _Toc243987217 \h </w:instrText>
         </w:r>
         <w:r>
           <w:rPr>
@@ -1238,7 +1238,7 @@
           <w:lang w:eastAsia="es-CO"/>
         </w:rPr>
       </w:pPr>
-      <w:hyperlink w:anchor="_Toc243929936" w:history="1">
+      <w:hyperlink w:anchor="_Toc243987218" w:history="1">
         <w:r>
           <w:rPr>
             <w:rStyle w:val="Hyperlink"/>
@@ -1283,7 +1283,7 @@
             <w:noProof/>
             <w:webHidden/>
           </w:rPr>
-          <w:instrText xml:space="preserve"> PAGEREF _Toc243929936 \h </w:instrText>
+          <w:instrText xml:space="preserve"> PAGEREF _Toc243987218 \h </w:instrText>
         </w:r>
         <w:r>
           <w:rPr>
@@ -1330,7 +1330,7 @@
           <w:lang w:eastAsia="es-CO"/>
         </w:rPr>
       </w:pPr>
-      <w:hyperlink w:anchor="_Toc243929937" w:history="1">
+      <w:hyperlink w:anchor="_Toc243987219" w:history="1">
         <w:r>
           <w:rPr>
             <w:rStyle w:val="Hyperlink"/>
@@ -1375,7 +1375,7 @@
             <w:noProof/>
             <w:webHidden/>
           </w:rPr>
-          <w:instrText xml:space="preserve"> PAGEREF _Toc243929937 \h </w:instrText>
+          <w:instrText xml:space="preserve"> PAGEREF _Toc243987219 \h </w:instrText>
         </w:r>
         <w:r>
           <w:rPr>
@@ -1424,7 +1424,7 @@
           <w:lang w:eastAsia="es-CO"/>
         </w:rPr>
       </w:pPr>
-      <w:hyperlink w:anchor="_Toc243929938" w:history="1">
+      <w:hyperlink w:anchor="_Toc243987220" w:history="1">
         <w:r>
           <w:rPr>
             <w:rStyle w:val="Hyperlink"/>
@@ -1471,7 +1471,7 @@
             <w:noProof/>
             <w:webHidden/>
           </w:rPr>
-          <w:instrText xml:space="preserve"> PAGEREF _Toc243929938 \h </w:instrText>
+          <w:instrText xml:space="preserve"> PAGEREF _Toc243987220 \h </w:instrText>
         </w:r>
         <w:r>
           <w:rPr>
@@ -1518,7 +1518,7 @@
           <w:lang w:eastAsia="es-CO"/>
         </w:rPr>
       </w:pPr>
-      <w:hyperlink w:anchor="_Toc243929939" w:history="1">
+      <w:hyperlink w:anchor="_Toc243987221" w:history="1">
         <w:r>
           <w:rPr>
             <w:rStyle w:val="Hyperlink"/>
@@ -1563,7 +1563,7 @@
             <w:noProof/>
             <w:webHidden/>
           </w:rPr>
-          <w:instrText xml:space="preserve"> PAGEREF _Toc243929939 \h </w:instrText>
+          <w:instrText xml:space="preserve"> PAGEREF _Toc243987221 \h </w:instrText>
         </w:r>
         <w:r>
           <w:rPr>
@@ -1610,7 +1610,7 @@
           <w:lang w:eastAsia="es-CO"/>
         </w:rPr>
       </w:pPr>
-      <w:hyperlink w:anchor="_Toc243929940" w:history="1">
+      <w:hyperlink w:anchor="_Toc243987222" w:history="1">
         <w:r>
           <w:rPr>
             <w:rStyle w:val="Hyperlink"/>
@@ -1655,7 +1655,7 @@
             <w:noProof/>
             <w:webHidden/>
           </w:rPr>
-          <w:instrText xml:space="preserve"> PAGEREF _Toc243929940 \h </w:instrText>
+          <w:instrText xml:space="preserve"> PAGEREF _Toc243987222 \h </w:instrText>
         </w:r>
         <w:r>
           <w:rPr>
@@ -1704,7 +1704,7 @@
           <w:lang w:eastAsia="es-CO"/>
         </w:rPr>
       </w:pPr>
-      <w:hyperlink w:anchor="_Toc243929941" w:history="1">
+      <w:hyperlink w:anchor="_Toc243987223" w:history="1">
         <w:r>
           <w:rPr>
             <w:rStyle w:val="Hyperlink"/>
@@ -1751,7 +1751,7 @@
             <w:noProof/>
             <w:webHidden/>
           </w:rPr>
-          <w:instrText xml:space="preserve"> PAGEREF _Toc243929941 \h </w:instrText>
+          <w:instrText xml:space="preserve"> PAGEREF _Toc243987223 \h </w:instrText>
         </w:r>
         <w:r>
           <w:rPr>
@@ -1798,7 +1798,7 @@
           <w:lang w:eastAsia="es-CO"/>
         </w:rPr>
       </w:pPr>
-      <w:hyperlink w:anchor="_Toc243929942" w:history="1">
+      <w:hyperlink w:anchor="_Toc243987224" w:history="1">
         <w:r>
           <w:rPr>
             <w:rStyle w:val="Hyperlink"/>
@@ -1843,7 +1843,7 @@
             <w:noProof/>
             <w:webHidden/>
           </w:rPr>
-          <w:instrText xml:space="preserve"> PAGEREF _Toc243929942 \h </w:instrText>
+          <w:instrText xml:space="preserve"> PAGEREF _Toc243987224 \h </w:instrText>
         </w:r>
         <w:r>
           <w:rPr>
@@ -1890,7 +1890,7 @@
           <w:lang w:eastAsia="es-CO"/>
         </w:rPr>
       </w:pPr>
-      <w:hyperlink w:anchor="_Toc243929943" w:history="1">
+      <w:hyperlink w:anchor="_Toc243987225" w:history="1">
         <w:r>
           <w:rPr>
             <w:rStyle w:val="Hyperlink"/>
@@ -1935,7 +1935,7 @@
             <w:noProof/>
             <w:webHidden/>
           </w:rPr>
-          <w:instrText xml:space="preserve"> PAGEREF _Toc243929943 \h </w:instrText>
+          <w:instrText xml:space="preserve"> PAGEREF _Toc243987225 \h </w:instrText>
         </w:r>
         <w:r>
           <w:rPr>
@@ -1982,7 +1982,7 @@
           <w:lang w:eastAsia="es-CO"/>
         </w:rPr>
       </w:pPr>
-      <w:hyperlink w:anchor="_Toc243929944" w:history="1">
+      <w:hyperlink w:anchor="_Toc243987226" w:history="1">
         <w:r>
           <w:rPr>
             <w:rStyle w:val="Hyperlink"/>
@@ -2027,7 +2027,7 @@
             <w:noProof/>
             <w:webHidden/>
           </w:rPr>
-          <w:instrText xml:space="preserve"> PAGEREF _Toc243929944 \h </w:instrText>
+          <w:instrText xml:space="preserve"> PAGEREF _Toc243987226 \h </w:instrText>
         </w:r>
         <w:r>
           <w:rPr>
@@ -2074,7 +2074,7 @@
           <w:lang w:eastAsia="es-CO"/>
         </w:rPr>
       </w:pPr>
-      <w:hyperlink w:anchor="_Toc243929945" w:history="1">
+      <w:hyperlink w:anchor="_Toc243987227" w:history="1">
         <w:r>
           <w:rPr>
             <w:rStyle w:val="Hyperlink"/>
@@ -2119,7 +2119,7 @@
             <w:noProof/>
             <w:webHidden/>
           </w:rPr>
-          <w:instrText xml:space="preserve"> PAGEREF _Toc243929945 \h </w:instrText>
+          <w:instrText xml:space="preserve"> PAGEREF _Toc243987227 \h </w:instrText>
         </w:r>
         <w:r>
           <w:rPr>
@@ -2166,7 +2166,7 @@
           <w:lang w:eastAsia="es-CO"/>
         </w:rPr>
       </w:pPr>
-      <w:hyperlink w:anchor="_Toc243929946" w:history="1">
+      <w:hyperlink w:anchor="_Toc243987228" w:history="1">
         <w:r>
           <w:rPr>
             <w:rStyle w:val="Hyperlink"/>
@@ -2211,7 +2211,7 @@
             <w:noProof/>
             <w:webHidden/>
           </w:rPr>
-          <w:instrText xml:space="preserve"> PAGEREF _Toc243929946 \h </w:instrText>
+          <w:instrText xml:space="preserve"> PAGEREF _Toc243987228 \h </w:instrText>
         </w:r>
         <w:r>
           <w:rPr>
@@ -2258,7 +2258,7 @@
           <w:lang w:eastAsia="es-CO"/>
         </w:rPr>
       </w:pPr>
-      <w:hyperlink w:anchor="_Toc243929947" w:history="1">
+      <w:hyperlink w:anchor="_Toc243987229" w:history="1">
         <w:r>
           <w:rPr>
             <w:rStyle w:val="Hyperlink"/>
@@ -2303,7 +2303,7 @@
             <w:noProof/>
             <w:webHidden/>
           </w:rPr>
-          <w:instrText xml:space="preserve"> PAGEREF _Toc243929947 \h </w:instrText>
+          <w:instrText xml:space="preserve"> PAGEREF _Toc243987229 \h </w:instrText>
         </w:r>
         <w:r>
           <w:rPr>
@@ -2350,7 +2350,7 @@
           <w:lang w:eastAsia="es-CO"/>
         </w:rPr>
       </w:pPr>
-      <w:hyperlink w:anchor="_Toc243929948" w:history="1">
+      <w:hyperlink w:anchor="_Toc243987230" w:history="1">
         <w:r>
           <w:rPr>
             <w:rStyle w:val="Hyperlink"/>
@@ -2395,7 +2395,7 @@
             <w:noProof/>
             <w:webHidden/>
           </w:rPr>
-          <w:instrText xml:space="preserve"> PAGEREF _Toc243929948 \h </w:instrText>
+          <w:instrText xml:space="preserve"> PAGEREF _Toc243987230 \h </w:instrText>
         </w:r>
         <w:r>
           <w:rPr>
@@ -2444,7 +2444,7 @@
           <w:lang w:eastAsia="es-CO"/>
         </w:rPr>
       </w:pPr>
-      <w:hyperlink w:anchor="_Toc243929949" w:history="1">
+      <w:hyperlink w:anchor="_Toc243987231" w:history="1">
         <w:r>
           <w:rPr>
             <w:rStyle w:val="Hyperlink"/>
@@ -2491,7 +2491,7 @@
             <w:noProof/>
             <w:webHidden/>
           </w:rPr>
-          <w:instrText xml:space="preserve"> PAGEREF _Toc243929949 \h </w:instrText>
+          <w:instrText xml:space="preserve"> PAGEREF _Toc243987231 \h </w:instrText>
         </w:r>
         <w:r>
           <w:rPr>
@@ -2538,7 +2538,7 @@
           <w:lang w:eastAsia="es-CO"/>
         </w:rPr>
       </w:pPr>
-      <w:hyperlink w:anchor="_Toc243929950" w:history="1">
+      <w:hyperlink w:anchor="_Toc243987232" w:history="1">
         <w:r>
           <w:rPr>
             <w:rStyle w:val="Hyperlink"/>
@@ -2583,7 +2583,7 @@
             <w:noProof/>
             <w:webHidden/>
           </w:rPr>
-          <w:instrText xml:space="preserve"> PAGEREF _Toc243929950 \h </w:instrText>
+          <w:instrText xml:space="preserve"> PAGEREF _Toc243987232 \h </w:instrText>
         </w:r>
         <w:r>
           <w:rPr>
@@ -2631,7 +2631,7 @@
           <w:lang w:eastAsia="es-CO"/>
         </w:rPr>
       </w:pPr>
-      <w:hyperlink w:anchor="_Toc243929951" w:history="1">
+      <w:hyperlink w:anchor="_Toc243987233" w:history="1">
         <w:r>
           <w:rPr>
             <w:rStyle w:val="Hyperlink"/>
@@ -2677,7 +2677,7 @@
             <w:noProof/>
             <w:webHidden/>
           </w:rPr>
-          <w:instrText xml:space="preserve"> PAGEREF _Toc243929951 \h </w:instrText>
+          <w:instrText xml:space="preserve"> PAGEREF _Toc243987233 \h </w:instrText>
         </w:r>
         <w:r>
           <w:rPr>
@@ -2725,7 +2725,7 @@
           <w:lang w:eastAsia="es-CO"/>
         </w:rPr>
       </w:pPr>
-      <w:hyperlink w:anchor="_Toc243929952" w:history="1">
+      <w:hyperlink w:anchor="_Toc243987234" w:history="1">
         <w:r>
           <w:rPr>
             <w:rStyle w:val="Hyperlink"/>
@@ -2771,7 +2771,7 @@
             <w:noProof/>
             <w:webHidden/>
           </w:rPr>
-          <w:instrText xml:space="preserve"> PAGEREF _Toc243929952 \h </w:instrText>
+          <w:instrText xml:space="preserve"> PAGEREF _Toc243987234 \h </w:instrText>
         </w:r>
         <w:r>
           <w:rPr>
@@ -2818,7 +2818,7 @@
           <w:lang w:eastAsia="es-CO"/>
         </w:rPr>
       </w:pPr>
-      <w:hyperlink w:anchor="_Toc243929953" w:history="1">
+      <w:hyperlink w:anchor="_Toc243987235" w:history="1">
         <w:r>
           <w:rPr>
             <w:rStyle w:val="Hyperlink"/>
@@ -2863,7 +2863,7 @@
             <w:noProof/>
             <w:webHidden/>
           </w:rPr>
-          <w:instrText xml:space="preserve"> PAGEREF _Toc243929953 \h </w:instrText>
+          <w:instrText xml:space="preserve"> PAGEREF _Toc243987235 \h </w:instrText>
         </w:r>
         <w:r>
           <w:rPr>
@@ -2910,7 +2910,7 @@
           <w:lang w:eastAsia="es-CO"/>
         </w:rPr>
       </w:pPr>
-      <w:hyperlink w:anchor="_Toc243929954" w:history="1">
+      <w:hyperlink w:anchor="_Toc243987236" w:history="1">
         <w:r>
           <w:rPr>
             <w:rStyle w:val="Hyperlink"/>
@@ -2955,7 +2955,7 @@
             <w:noProof/>
             <w:webHidden/>
           </w:rPr>
-          <w:instrText xml:space="preserve"> PAGEREF _Toc243929954 \h </w:instrText>
+          <w:instrText xml:space="preserve"> PAGEREF _Toc243987236 \h </w:instrText>
         </w:r>
         <w:r>
           <w:rPr>
@@ -3002,7 +3002,7 @@
           <w:lang w:eastAsia="es-CO"/>
         </w:rPr>
       </w:pPr>
-      <w:hyperlink w:anchor="_Toc243929955" w:history="1">
+      <w:hyperlink w:anchor="_Toc243987237" w:history="1">
         <w:r>
           <w:rPr>
             <w:rStyle w:val="Hyperlink"/>
@@ -3047,7 +3047,7 @@
             <w:noProof/>
             <w:webHidden/>
           </w:rPr>
-          <w:instrText xml:space="preserve"> PAGEREF _Toc243929955 \h </w:instrText>
+          <w:instrText xml:space="preserve"> PAGEREF _Toc243987237 \h </w:instrText>
         </w:r>
         <w:r>
           <w:rPr>
@@ -3096,7 +3096,7 @@
           <w:lang w:eastAsia="es-CO"/>
         </w:rPr>
       </w:pPr>
-      <w:hyperlink w:anchor="_Toc243929956" w:history="1">
+      <w:hyperlink w:anchor="_Toc243987238" w:history="1">
         <w:r>
           <w:rPr>
             <w:rStyle w:val="Hyperlink"/>
@@ -3143,7 +3143,7 @@
             <w:noProof/>
             <w:webHidden/>
           </w:rPr>
-          <w:instrText xml:space="preserve"> PAGEREF _Toc243929956 \h </w:instrText>
+          <w:instrText xml:space="preserve"> PAGEREF _Toc243987238 \h </w:instrText>
         </w:r>
         <w:r>
           <w:rPr>
@@ -3190,7 +3190,7 @@
           <w:lang w:eastAsia="es-CO"/>
         </w:rPr>
       </w:pPr>
-      <w:hyperlink w:anchor="_Toc243929957" w:history="1">
+      <w:hyperlink w:anchor="_Toc243987239" w:history="1">
         <w:r>
           <w:rPr>
             <w:rStyle w:val="Hyperlink"/>
@@ -3235,7 +3235,7 @@
             <w:noProof/>
             <w:webHidden/>
           </w:rPr>
-          <w:instrText xml:space="preserve"> PAGEREF _Toc243929957 \h </w:instrText>
+          <w:instrText xml:space="preserve"> PAGEREF _Toc243987239 \h </w:instrText>
         </w:r>
         <w:r>
           <w:rPr>
@@ -3282,7 +3282,7 @@
           <w:lang w:eastAsia="es-CO"/>
         </w:rPr>
       </w:pPr>
-      <w:hyperlink w:anchor="_Toc243929958" w:history="1">
+      <w:hyperlink w:anchor="_Toc243987240" w:history="1">
         <w:r>
           <w:rPr>
             <w:rStyle w:val="Hyperlink"/>
@@ -3327,7 +3327,7 @@
             <w:noProof/>
             <w:webHidden/>
           </w:rPr>
-          <w:instrText xml:space="preserve"> PAGEREF _Toc243929958 \h </w:instrText>
+          <w:instrText xml:space="preserve"> PAGEREF _Toc243987240 \h </w:instrText>
         </w:r>
         <w:r>
           <w:rPr>
@@ -3374,7 +3374,7 @@
           <w:lang w:eastAsia="es-CO"/>
         </w:rPr>
       </w:pPr>
-      <w:hyperlink w:anchor="_Toc243929959" w:history="1">
+      <w:hyperlink w:anchor="_Toc243987241" w:history="1">
         <w:r>
           <w:rPr>
             <w:rStyle w:val="Hyperlink"/>
@@ -3419,7 +3419,7 @@
             <w:noProof/>
             <w:webHidden/>
           </w:rPr>
-          <w:instrText xml:space="preserve"> PAGEREF _Toc243929959 \h </w:instrText>
+          <w:instrText xml:space="preserve"> PAGEREF _Toc243987241 \h </w:instrText>
         </w:r>
         <w:r>
           <w:rPr>
@@ -3466,7 +3466,7 @@
           <w:lang w:eastAsia="es-CO"/>
         </w:rPr>
       </w:pPr>
-      <w:hyperlink w:anchor="_Toc243929960" w:history="1">
+      <w:hyperlink w:anchor="_Toc243987242" w:history="1">
         <w:r>
           <w:rPr>
             <w:rStyle w:val="Hyperlink"/>
@@ -3511,7 +3511,7 @@
             <w:noProof/>
             <w:webHidden/>
           </w:rPr>
-          <w:instrText xml:space="preserve"> PAGEREF _Toc243929960 \h </w:instrText>
+          <w:instrText xml:space="preserve"> PAGEREF _Toc243987242 \h </w:instrText>
         </w:r>
         <w:r>
           <w:rPr>
@@ -3560,7 +3560,7 @@
           <w:lang w:eastAsia="es-CO"/>
         </w:rPr>
       </w:pPr>
-      <w:hyperlink w:anchor="_Toc243929961" w:history="1">
+      <w:hyperlink w:anchor="_Toc243987243" w:history="1">
         <w:r>
           <w:rPr>
             <w:rStyle w:val="Hyperlink"/>
@@ -3607,7 +3607,7 @@
             <w:noProof/>
             <w:webHidden/>
           </w:rPr>
-          <w:instrText xml:space="preserve"> PAGEREF _Toc243929961 \h </w:instrText>
+          <w:instrText xml:space="preserve"> PAGEREF _Toc243987243 \h </w:instrText>
         </w:r>
         <w:r>
           <w:rPr>
@@ -3656,7 +3656,7 @@
           <w:lang w:eastAsia="es-CO"/>
         </w:rPr>
       </w:pPr>
-      <w:hyperlink w:anchor="_Toc243929962" w:history="1">
+      <w:hyperlink w:anchor="_Toc243987244" w:history="1">
         <w:r>
           <w:rPr>
             <w:rStyle w:val="Hyperlink"/>
@@ -3703,7 +3703,7 @@
             <w:noProof/>
             <w:webHidden/>
           </w:rPr>
-          <w:instrText xml:space="preserve"> PAGEREF _Toc243929962 \h </w:instrText>
+          <w:instrText xml:space="preserve"> PAGEREF _Toc243987244 \h </w:instrText>
         </w:r>
         <w:r>
           <w:rPr>
@@ -3752,7 +3752,7 @@
           <w:lang w:eastAsia="es-CO"/>
         </w:rPr>
       </w:pPr>
-      <w:hyperlink w:anchor="_Toc243929963" w:history="1">
+      <w:hyperlink w:anchor="_Toc243987245" w:history="1">
         <w:r>
           <w:rPr>
             <w:rStyle w:val="Hyperlink"/>
@@ -3799,7 +3799,7 @@
             <w:noProof/>
             <w:webHidden/>
           </w:rPr>
-          <w:instrText xml:space="preserve"> PAGEREF _Toc243929963 \h </w:instrText>
+          <w:instrText xml:space="preserve"> PAGEREF _Toc243987245 \h </w:instrText>
         </w:r>
         <w:r>
           <w:rPr>
@@ -3853,7 +3853,7 @@
       <w:bookmarkStart w:id="4" w:name="_Toc240440230"/>
       <w:bookmarkStart w:id="5" w:name="_Toc241072107"/>
       <w:bookmarkStart w:id="6" w:name="_Toc241072473"/>
-      <w:bookmarkStart w:id="7" w:name="_Toc243929926"/>
+      <w:bookmarkStart w:id="7" w:name="_Toc243987208"/>
       <w:r>
         <w:lastRenderedPageBreak/>
         <w:t>Información principal del proyecto</w:t>
@@ -3876,7 +3876,7 @@
       <w:bookmarkStart w:id="8" w:name="_Toc240440231"/>
       <w:bookmarkStart w:id="9" w:name="_Toc241072108"/>
       <w:bookmarkStart w:id="10" w:name="_Toc241072474"/>
-      <w:bookmarkStart w:id="11" w:name="_Toc243929927"/>
+      <w:bookmarkStart w:id="11" w:name="_Toc243987209"/>
       <w:r>
         <w:t>Título del proyecto</w:t>
       </w:r>
@@ -3910,7 +3910,7 @@
       <w:bookmarkStart w:id="12" w:name="_Toc240440232"/>
       <w:bookmarkStart w:id="13" w:name="_Toc241072109"/>
       <w:bookmarkStart w:id="14" w:name="_Toc241072475"/>
-      <w:bookmarkStart w:id="15" w:name="_Toc243929928"/>
+      <w:bookmarkStart w:id="15" w:name="_Toc243987210"/>
       <w:r>
         <w:t>Resumen ejecutivo</w:t>
       </w:r>
@@ -3962,7 +3962,7 @@
       <w:bookmarkStart w:id="16" w:name="_Toc240440236"/>
       <w:bookmarkStart w:id="17" w:name="_Toc241072110"/>
       <w:bookmarkStart w:id="18" w:name="_Toc241072476"/>
-      <w:bookmarkStart w:id="19" w:name="_Toc243929929"/>
+      <w:bookmarkStart w:id="19" w:name="_Toc243987211"/>
       <w:r>
         <w:t>Costo total del proyecto</w:t>
       </w:r>
@@ -4847,7 +4847,7 @@
       <w:bookmarkStart w:id="20" w:name="_Toc240440237"/>
       <w:bookmarkStart w:id="21" w:name="_Toc241072111"/>
       <w:bookmarkStart w:id="22" w:name="_Toc241072477"/>
-      <w:bookmarkStart w:id="23" w:name="_Toc243929930"/>
+      <w:bookmarkStart w:id="23" w:name="_Toc243987212"/>
       <w:r>
         <w:lastRenderedPageBreak/>
         <w:t>Introducción</w:t>
@@ -4925,7 +4925,7 @@
       <w:bookmarkStart w:id="24" w:name="_Toc240440238"/>
       <w:bookmarkStart w:id="25" w:name="_Toc241072112"/>
       <w:bookmarkStart w:id="26" w:name="_Toc241072478"/>
-      <w:bookmarkStart w:id="27" w:name="_Toc243929931"/>
+      <w:bookmarkStart w:id="27" w:name="_Toc243987213"/>
       <w:r>
         <w:lastRenderedPageBreak/>
         <w:t>Objetivos</w:t>
@@ -4948,7 +4948,7 @@
       <w:bookmarkStart w:id="28" w:name="_Toc240440239"/>
       <w:bookmarkStart w:id="29" w:name="_Toc241072113"/>
       <w:bookmarkStart w:id="30" w:name="_Toc241072479"/>
-      <w:bookmarkStart w:id="31" w:name="_Toc243929932"/>
+      <w:bookmarkStart w:id="31" w:name="_Toc243987214"/>
       <w:r>
         <w:t>Objetivo general</w:t>
       </w:r>
@@ -4979,7 +4979,7 @@
       <w:bookmarkStart w:id="32" w:name="_Toc240440240"/>
       <w:bookmarkStart w:id="33" w:name="_Toc241072114"/>
       <w:bookmarkStart w:id="34" w:name="_Toc241072480"/>
-      <w:bookmarkStart w:id="35" w:name="_Toc243929933"/>
+      <w:bookmarkStart w:id="35" w:name="_Toc243987215"/>
       <w:r>
         <w:t>Objetivos específicos</w:t>
       </w:r>
@@ -5089,7 +5089,7 @@
       <w:bookmarkStart w:id="36" w:name="_Toc240440241"/>
       <w:bookmarkStart w:id="37" w:name="_Toc241072115"/>
       <w:bookmarkStart w:id="38" w:name="_Toc241072481"/>
-      <w:bookmarkStart w:id="39" w:name="_Toc243929934"/>
+      <w:bookmarkStart w:id="39" w:name="_Toc243987216"/>
       <w:r>
         <w:t>Delimitación</w:t>
       </w:r>
@@ -5111,7 +5111,7 @@
       <w:bookmarkStart w:id="40" w:name="_Toc240440242"/>
       <w:bookmarkStart w:id="41" w:name="_Toc241072116"/>
       <w:bookmarkStart w:id="42" w:name="_Toc241072482"/>
-      <w:bookmarkStart w:id="43" w:name="_Toc243929935"/>
+      <w:bookmarkStart w:id="43" w:name="_Toc243987217"/>
       <w:r>
         <w:t>Alcances</w:t>
       </w:r>
@@ -5668,7 +5668,7 @@
       <w:bookmarkStart w:id="44" w:name="_Toc240440243"/>
       <w:bookmarkStart w:id="45" w:name="_Toc241072117"/>
       <w:bookmarkStart w:id="46" w:name="_Toc241072483"/>
-      <w:bookmarkStart w:id="47" w:name="_Toc243929936"/>
+      <w:bookmarkStart w:id="47" w:name="_Toc243987218"/>
       <w:r>
         <w:t>Limitaciones</w:t>
       </w:r>
@@ -6069,7 +6069,7 @@
       <w:bookmarkStart w:id="48" w:name="_Toc240440244"/>
       <w:bookmarkStart w:id="49" w:name="_Toc241072118"/>
       <w:bookmarkStart w:id="50" w:name="_Toc241072484"/>
-      <w:bookmarkStart w:id="51" w:name="_Toc243929937"/>
+      <w:bookmarkStart w:id="51" w:name="_Toc243987219"/>
       <w:r>
         <w:t>Entregables</w:t>
       </w:r>
@@ -6321,7 +6321,7 @@
       </w:pPr>
       <w:bookmarkStart w:id="53" w:name="_Toc241072119"/>
       <w:bookmarkStart w:id="54" w:name="_Toc241072485"/>
-      <w:bookmarkStart w:id="55" w:name="_Toc243929938"/>
+      <w:bookmarkStart w:id="55" w:name="_Toc243987220"/>
       <w:r>
         <w:t>Revisión bibliográfica</w:t>
       </w:r>
@@ -6346,7 +6346,7 @@
       <w:bookmarkStart w:id="56" w:name="_Toc240440246"/>
       <w:bookmarkStart w:id="57" w:name="_Toc241072120"/>
       <w:bookmarkStart w:id="58" w:name="_Toc241072486"/>
-      <w:bookmarkStart w:id="59" w:name="_Toc243929939"/>
+      <w:bookmarkStart w:id="59" w:name="_Toc243987221"/>
       <w:r>
         <w:t>Planteamiento del problema</w:t>
       </w:r>
@@ -6384,7 +6384,7 @@
           <w:noProof/>
         </w:rPr>
         <w:drawing>
-          <wp:inline distT="0" distB="0" distL="0" distR="0" wp14:anchorId="291F1FFF" wp14:editId="2A1B4098">
+          <wp:inline distT="0" distB="0" distL="0" distR="0" wp14:anchorId="13411A71" wp14:editId="43A02FF3">
             <wp:extent cx="4320000" cy="1753663"/>
             <wp:effectExtent l="0" t="0" r="0" b="0"/>
             <wp:docPr id="1" name="Picture 1"/>
@@ -6512,7 +6512,7 @@
       <w:bookmarkStart w:id="60" w:name="_Toc240440247"/>
       <w:bookmarkStart w:id="61" w:name="_Toc241072121"/>
       <w:bookmarkStart w:id="62" w:name="_Toc241072487"/>
-      <w:bookmarkStart w:id="63" w:name="_Toc243929940"/>
+      <w:bookmarkStart w:id="63" w:name="_Toc243987222"/>
       <w:r>
         <w:t>Descripción de avances tecnológicos</w:t>
       </w:r>
@@ -7546,7 +7546,7 @@
       </w:pPr>
       <w:bookmarkStart w:id="65" w:name="_Toc241072122"/>
       <w:bookmarkStart w:id="66" w:name="_Toc241072488"/>
-      <w:bookmarkStart w:id="67" w:name="_Toc243929941"/>
+      <w:bookmarkStart w:id="67" w:name="_Toc243987223"/>
       <w:r>
         <w:t>Descripción detallada del diseño en ingeniería</w:t>
       </w:r>
@@ -7568,7 +7568,7 @@
       <w:bookmarkStart w:id="68" w:name="_Toc240440249"/>
       <w:bookmarkStart w:id="69" w:name="_Toc241072123"/>
       <w:bookmarkStart w:id="70" w:name="_Toc241072489"/>
-      <w:bookmarkStart w:id="71" w:name="_Toc243929942"/>
+      <w:bookmarkStart w:id="71" w:name="_Toc243987224"/>
       <w:r>
         <w:t>Problema</w:t>
       </w:r>
@@ -7621,7 +7621,7 @@
       <w:bookmarkStart w:id="72" w:name="_Toc240440250"/>
       <w:bookmarkStart w:id="73" w:name="_Toc241072124"/>
       <w:bookmarkStart w:id="74" w:name="_Toc241072490"/>
-      <w:bookmarkStart w:id="75" w:name="_Toc243929943"/>
+      <w:bookmarkStart w:id="75" w:name="_Toc243987225"/>
       <w:r>
         <w:t>Análisis de requerimientos</w:t>
       </w:r>
@@ -8499,7 +8499,7 @@
       <w:bookmarkStart w:id="76" w:name="_Toc240440251"/>
       <w:bookmarkStart w:id="77" w:name="_Toc241072125"/>
       <w:bookmarkStart w:id="78" w:name="_Toc241072491"/>
-      <w:bookmarkStart w:id="79" w:name="_Toc243929944"/>
+      <w:bookmarkStart w:id="79" w:name="_Toc243987226"/>
       <w:r>
         <w:t>Estándares, normas y regulaciones</w:t>
       </w:r>
@@ -8873,7 +8873,7 @@
       <w:bookmarkStart w:id="80" w:name="_Toc240440252"/>
       <w:bookmarkStart w:id="81" w:name="_Toc241072126"/>
       <w:bookmarkStart w:id="82" w:name="_Toc241072492"/>
-      <w:bookmarkStart w:id="83" w:name="_Toc243929945"/>
+      <w:bookmarkStart w:id="83" w:name="_Toc243987227"/>
       <w:r>
         <w:t>Alternativas de solución</w:t>
       </w:r>
@@ -9342,7 +9342,7 @@
       <w:bookmarkStart w:id="84" w:name="_Toc240440253"/>
       <w:bookmarkStart w:id="85" w:name="_Toc241072127"/>
       <w:bookmarkStart w:id="86" w:name="_Toc241072493"/>
-      <w:bookmarkStart w:id="87" w:name="_Toc243929946"/>
+      <w:bookmarkStart w:id="87" w:name="_Toc243987228"/>
       <w:r>
         <w:t>Evaluación y selección de la alternativa óptima</w:t>
       </w:r>
@@ -10742,7 +10742,7 @@
       <w:bookmarkStart w:id="88" w:name="_Toc240440255"/>
       <w:bookmarkStart w:id="89" w:name="_Toc241072130"/>
       <w:bookmarkStart w:id="90" w:name="_Toc241072496"/>
-      <w:bookmarkStart w:id="91" w:name="_Toc243929947"/>
+      <w:bookmarkStart w:id="91" w:name="_Toc243987229"/>
       <w:r>
         <w:t>Análisis de riesgo del diseño definitivo</w:t>
       </w:r>
@@ -11711,7 +11711,7 @@
       <w:bookmarkStart w:id="92" w:name="_Toc240440254"/>
       <w:bookmarkStart w:id="93" w:name="_Toc241072129"/>
       <w:bookmarkStart w:id="94" w:name="_Toc241072495"/>
-      <w:bookmarkStart w:id="95" w:name="_Toc243929948"/>
+      <w:bookmarkStart w:id="95" w:name="_Toc243987230"/>
       <w:r>
         <w:lastRenderedPageBreak/>
         <w:t>Diseño definitivo</w:t>
@@ -11747,7 +11747,7 @@
           <w:noProof/>
         </w:rPr>
         <w:drawing>
-          <wp:inline distT="0" distB="0" distL="0" distR="0" wp14:anchorId="7289E194" wp14:editId="2E9FED38">
+          <wp:inline distT="0" distB="0" distL="0" distR="0" wp14:anchorId="735C6161" wp14:editId="3A10B9DA">
             <wp:extent cx="3780000" cy="2888781"/>
             <wp:effectExtent l="0" t="0" r="0" b="0"/>
             <wp:docPr id="14" name="Picture 14"/>
@@ -15260,7 +15260,7 @@
         </w:rPr>
         <w:lastRenderedPageBreak/>
         <w:drawing>
-          <wp:inline distT="0" distB="0" distL="0" distR="0" wp14:anchorId="485C39F6" wp14:editId="15286A30">
+          <wp:inline distT="0" distB="0" distL="0" distR="0" wp14:anchorId="2EB6C487" wp14:editId="349E2AD6">
             <wp:extent cx="4500000" cy="2592528"/>
             <wp:effectExtent l="0" t="0" r="0" b="0"/>
             <wp:docPr id="15" name="Picture 15"/>
@@ -15374,7 +15374,7 @@
           <w:noProof/>
         </w:rPr>
         <w:drawing>
-          <wp:inline distT="0" distB="0" distL="0" distR="0" wp14:anchorId="4A7E626B" wp14:editId="6D927870">
+          <wp:inline distT="0" distB="0" distL="0" distR="0" wp14:anchorId="32DE2BA2" wp14:editId="103CC22B">
             <wp:extent cx="5760720" cy="3419094"/>
             <wp:effectExtent l="0" t="0" r="0" b="0"/>
             <wp:docPr id="16" name="Picture 16"/>
@@ -15458,8 +15458,8 @@
         </w:rPr>
         <w:lastRenderedPageBreak/>
         <w:drawing>
-          <wp:inline distT="0" distB="0" distL="0" distR="0" wp14:anchorId="27234B2A" wp14:editId="10074215">
-            <wp:extent cx="5486400" cy="2544896"/>
+          <wp:inline distT="0" distB="0" distL="0" distR="0" wp14:anchorId="05F196B5" wp14:editId="202F623E">
+            <wp:extent cx="5486400" cy="2809301"/>
             <wp:effectExtent l="0" t="0" r="0" b="0"/>
             <wp:docPr id="17" name="Picture 17"/>
             <wp:cNvGraphicFramePr>
@@ -15481,7 +15481,7 @@
                   <pic:spPr>
                     <a:xfrm>
                       <a:off x="0" y="0"/>
-                      <a:ext cx="5486400" cy="2544896"/>
+                      <a:ext cx="5486400" cy="2809301"/>
                     </a:xfrm>
                     <a:prstGeom prst="rect">
                       <a:avLst/>
@@ -15542,7 +15542,7 @@
         </w:rPr>
         <w:lastRenderedPageBreak/>
         <w:drawing>
-          <wp:inline distT="0" distB="0" distL="0" distR="0" wp14:anchorId="017EDF79" wp14:editId="7B4FCF23">
+          <wp:inline distT="0" distB="0" distL="0" distR="0" wp14:anchorId="54D898BF" wp14:editId="1468C862">
             <wp:extent cx="3931920" cy="4212251"/>
             <wp:effectExtent l="0" t="0" r="0" b="0"/>
             <wp:docPr id="18" name="Picture 18"/>
@@ -15623,7 +15623,7 @@
       </w:pPr>
       <w:bookmarkStart w:id="97" w:name="_Toc241072132"/>
       <w:bookmarkStart w:id="98" w:name="_Toc241072498"/>
-      <w:bookmarkStart w:id="99" w:name="_Toc243929949"/>
+      <w:bookmarkStart w:id="99" w:name="_Toc243987231"/>
       <w:r>
         <w:t>Pruebas, resultados y análisis de resultados</w:t>
       </w:r>
@@ -15645,7 +15645,7 @@
       <w:bookmarkStart w:id="100" w:name="_Toc240440258"/>
       <w:bookmarkStart w:id="101" w:name="_Toc241072133"/>
       <w:bookmarkStart w:id="102" w:name="_Toc241072499"/>
-      <w:bookmarkStart w:id="103" w:name="_Toc243929950"/>
+      <w:bookmarkStart w:id="103" w:name="_Toc243987232"/>
       <w:r>
         <w:t>Planeación del diseño del experimento</w:t>
       </w:r>
@@ -15720,7 +15720,7 @@
       <w:bookmarkStart w:id="104" w:name="_Toc240440261"/>
       <w:bookmarkStart w:id="105" w:name="_Toc241072136"/>
       <w:bookmarkStart w:id="106" w:name="_Toc241072500"/>
-      <w:bookmarkStart w:id="107" w:name="_Toc243929951"/>
+      <w:bookmarkStart w:id="107" w:name="_Toc243987233"/>
       <w:r>
         <w:t>Instrumentación y validación</w:t>
       </w:r>
@@ -15765,7 +15765,7 @@
       <w:bookmarkStart w:id="108" w:name="_Toc240440262"/>
       <w:bookmarkStart w:id="109" w:name="_Toc241072137"/>
       <w:bookmarkStart w:id="110" w:name="_Toc241072501"/>
-      <w:bookmarkStart w:id="111" w:name="_Toc243929952"/>
+      <w:bookmarkStart w:id="111" w:name="_Toc243987234"/>
       <w:r>
         <w:t>Marco normativo de las pruebas</w:t>
       </w:r>
@@ -15796,7 +15796,7 @@
       <w:bookmarkStart w:id="112" w:name="_Toc240440263"/>
       <w:bookmarkStart w:id="113" w:name="_Toc241072138"/>
       <w:bookmarkStart w:id="114" w:name="_Toc241072502"/>
-      <w:bookmarkStart w:id="115" w:name="_Toc243929953"/>
+      <w:bookmarkStart w:id="115" w:name="_Toc243987235"/>
       <w:r>
         <w:t>Ejecución del plan experimental</w:t>
       </w:r>
@@ -17673,7 +17673,7 @@
       <w:bookmarkStart w:id="116" w:name="_Toc240440264"/>
       <w:bookmarkStart w:id="117" w:name="_Toc241072139"/>
       <w:bookmarkStart w:id="118" w:name="_Toc241072503"/>
-      <w:bookmarkStart w:id="119" w:name="_Toc243929954"/>
+      <w:bookmarkStart w:id="119" w:name="_Toc243987236"/>
       <w:r>
         <w:t>Resultados</w:t>
       </w:r>
@@ -17708,7 +17708,7 @@
           <w:noProof/>
         </w:rPr>
         <w:drawing>
-          <wp:inline distT="0" distB="0" distL="0" distR="0" wp14:anchorId="3FCA7C09" wp14:editId="5605301F">
+          <wp:inline distT="0" distB="0" distL="0" distR="0" wp14:anchorId="12DC07C9" wp14:editId="1E2355A1">
             <wp:extent cx="4140000" cy="1776493"/>
             <wp:effectExtent l="0" t="0" r="0" b="0"/>
             <wp:docPr id="10" name="Picture 10"/>
@@ -26808,7 +26808,7 @@
           <w:noProof/>
         </w:rPr>
         <w:drawing>
-          <wp:inline distT="0" distB="0" distL="0" distR="0" wp14:anchorId="201400B6" wp14:editId="3A6C0BBA">
+          <wp:inline distT="0" distB="0" distL="0" distR="0" wp14:anchorId="4C98D063" wp14:editId="1D7F4A12">
             <wp:extent cx="4482000" cy="1859524"/>
             <wp:effectExtent l="0" t="0" r="0" b="0"/>
             <wp:docPr id="19" name="Picture 19"/>
@@ -26895,7 +26895,7 @@
           <w:noProof/>
         </w:rPr>
         <w:drawing>
-          <wp:inline distT="0" distB="0" distL="0" distR="0" wp14:anchorId="5E0AAE98" wp14:editId="5AD8D6C2">
+          <wp:inline distT="0" distB="0" distL="0" distR="0" wp14:anchorId="374961CA" wp14:editId="153966A4">
             <wp:extent cx="4482000" cy="1859524"/>
             <wp:effectExtent l="0" t="0" r="0" b="0"/>
             <wp:docPr id="20" name="Picture 20"/>
@@ -26978,7 +26978,7 @@
           <w:noProof/>
         </w:rPr>
         <w:drawing>
-          <wp:inline distT="0" distB="0" distL="0" distR="0" wp14:anchorId="4BB3ACA3" wp14:editId="46F2D317">
+          <wp:inline distT="0" distB="0" distL="0" distR="0" wp14:anchorId="56235667" wp14:editId="24B6896F">
             <wp:extent cx="4482000" cy="1859524"/>
             <wp:effectExtent l="0" t="0" r="0" b="0"/>
             <wp:docPr id="21" name="Picture 21"/>
@@ -28139,7 +28139,7 @@
       <w:bookmarkStart w:id="120" w:name="_Toc240440265"/>
       <w:bookmarkStart w:id="121" w:name="_Toc241072140"/>
       <w:bookmarkStart w:id="122" w:name="_Toc241072504"/>
-      <w:bookmarkStart w:id="123" w:name="_Toc243929955"/>
+      <w:bookmarkStart w:id="123" w:name="_Toc243987237"/>
       <w:r>
         <w:t>Análisis e interpretación de resultados</w:t>
       </w:r>
@@ -28261,7 +28261,7 @@
       <w:bookmarkStart w:id="124" w:name="_Toc241072141"/>
       <w:bookmarkStart w:id="125" w:name="_Toc241072505"/>
       <w:bookmarkStart w:id="126" w:name="_Toc240440266"/>
-      <w:bookmarkStart w:id="127" w:name="_Toc243929956"/>
+      <w:bookmarkStart w:id="127" w:name="_Toc243987238"/>
       <w:r>
         <w:t>Análisis de impacto del proyecto</w:t>
       </w:r>
@@ -28283,7 +28283,7 @@
         </w:numPr>
         <w:spacing w:before="300"/>
       </w:pPr>
-      <w:bookmarkStart w:id="128" w:name="_Toc243929957"/>
+      <w:bookmarkStart w:id="128" w:name="_Toc243987239"/>
       <w:r>
         <w:t>Impacto social</w:t>
       </w:r>
@@ -28308,7 +28308,7 @@
         </w:numPr>
         <w:spacing w:before="300"/>
       </w:pPr>
-      <w:bookmarkStart w:id="129" w:name="_Toc243929958"/>
+      <w:bookmarkStart w:id="129" w:name="_Toc243987240"/>
       <w:r>
         <w:t>Impacto ambiental</w:t>
       </w:r>
@@ -28333,7 +28333,7 @@
         </w:numPr>
         <w:spacing w:before="300"/>
       </w:pPr>
-      <w:bookmarkStart w:id="130" w:name="_Toc243929959"/>
+      <w:bookmarkStart w:id="130" w:name="_Toc243987241"/>
       <w:r>
         <w:t>Impacto legal y regulatorio</w:t>
       </w:r>
@@ -28362,7 +28362,7 @@
         </w:numPr>
         <w:spacing w:before="300"/>
       </w:pPr>
-      <w:bookmarkStart w:id="131" w:name="_Toc243929960"/>
+      <w:bookmarkStart w:id="131" w:name="_Toc243987242"/>
       <w:r>
         <w:t>Impacto económico y financiero</w:t>
       </w:r>
@@ -28390,7 +28390,7 @@
       <w:bookmarkStart w:id="132" w:name="_Toc240440267"/>
       <w:bookmarkStart w:id="133" w:name="_Toc241072142"/>
       <w:bookmarkStart w:id="134" w:name="_Toc241072506"/>
-      <w:bookmarkStart w:id="135" w:name="_Toc243929961"/>
+      <w:bookmarkStart w:id="135" w:name="_Toc243987243"/>
       <w:r>
         <w:t>Conclusiones y recomendaciones</w:t>
       </w:r>
@@ -28470,7 +28470,7 @@
       <w:bookmarkStart w:id="136" w:name="_Toc240440268"/>
       <w:bookmarkStart w:id="137" w:name="_Toc241072143"/>
       <w:bookmarkStart w:id="138" w:name="_Toc241072507"/>
-      <w:bookmarkStart w:id="139" w:name="_Toc243929962"/>
+      <w:bookmarkStart w:id="139" w:name="_Toc243987244"/>
       <w:r>
         <w:t>Bibliografía (formato IEEE)</w:t>
       </w:r>
@@ -29862,7 +29862,7 @@
       <w:bookmarkStart w:id="140" w:name="_Toc240440270"/>
       <w:bookmarkStart w:id="141" w:name="_Toc241072144"/>
       <w:bookmarkStart w:id="142" w:name="_Toc241072508"/>
-      <w:bookmarkStart w:id="143" w:name="_Toc243929963"/>
+      <w:bookmarkStart w:id="143" w:name="_Toc243987245"/>
       <w:r>
         <w:t>Anexos</w:t>
       </w:r>

</xml_diff>